<commit_message>
How to Manage Hundreds of Kubernetes clusters ???
</commit_message>
<xml_diff>
--- a/Kubernetes/Kubernetes.docx
+++ b/Kubernetes/Kubernetes.docx
@@ -2650,45 +2650,27 @@
         </w:tabs>
       </w:pPr>
       <w:r>
-        <w:t xml:space="preserve">                 </w:t>
-      </w:r>
-      <w:r>
-        <w:t xml:space="preserve">                                                      </w:t>
-      </w:r>
-      <w:r>
-        <w:t>Kubernetes Cluster</w:t>
-      </w:r>
-    </w:p>
-    <w:p>
-      <w:pPr>
-        <w:tabs>
-          <w:tab w:val="left" w:pos="6067"/>
-        </w:tabs>
-      </w:pPr>
-      <w:r>
-        <w:t xml:space="preserve">                        </w:t>
-      </w:r>
-      <w:r>
-        <w:t xml:space="preserve">                                                           </w:t>
-      </w:r>
-      <w:r>
-        <w:t>|</w:t>
-      </w:r>
-    </w:p>
-    <w:p>
-      <w:pPr>
-        <w:tabs>
-          <w:tab w:val="left" w:pos="6067"/>
-        </w:tabs>
-      </w:pPr>
-      <w:r>
-        <w:t xml:space="preserve">             ┌───────</w:t>
-      </w:r>
-      <w:r>
-        <w:t>--------------------------------</w:t>
-      </w:r>
-      <w:r>
-        <w:t>───</w:t>
+        <w:t xml:space="preserve">                                                                       Kubernetes Cluster</w:t>
+      </w:r>
+    </w:p>
+    <w:p>
+      <w:pPr>
+        <w:tabs>
+          <w:tab w:val="left" w:pos="6067"/>
+        </w:tabs>
+      </w:pPr>
+      <w:r>
+        <w:t xml:space="preserve">                                                                                   |</w:t>
+      </w:r>
+    </w:p>
+    <w:p>
+      <w:pPr>
+        <w:tabs>
+          <w:tab w:val="left" w:pos="6067"/>
+        </w:tabs>
+      </w:pPr>
+      <w:r>
+        <w:t xml:space="preserve">             ┌───────--------------------------------───</w:t>
       </w:r>
       <w:r>
         <w:rPr>
@@ -2700,51 +2682,27 @@
         <w:rPr>
           <w:rFonts w:ascii="Calibri" w:hAnsi="Calibri" w:cs="Calibri"/>
         </w:rPr>
-        <w:t>───────</w:t>
-      </w:r>
-      <w:r>
-        <w:rPr>
-          <w:rFonts w:ascii="Calibri" w:hAnsi="Calibri" w:cs="Calibri"/>
-        </w:rPr>
-        <w:t>--------------------------------</w:t>
-      </w:r>
-      <w:r>
-        <w:rPr>
-          <w:rFonts w:ascii="Calibri" w:hAnsi="Calibri" w:cs="Calibri"/>
-        </w:rPr>
-        <w:t>───┐</w:t>
-      </w:r>
-    </w:p>
-    <w:p>
-      <w:pPr>
-        <w:tabs>
-          <w:tab w:val="left" w:pos="6067"/>
-        </w:tabs>
-      </w:pPr>
-      <w:r>
-        <w:t xml:space="preserve">             ↓                     </w:t>
-      </w:r>
-      <w:r>
-        <w:t xml:space="preserve">                                                                                                               </w:t>
-      </w:r>
-      <w:r>
-        <w:t>↓</w:t>
-      </w:r>
-    </w:p>
-    <w:p>
-      <w:pPr>
-        <w:tabs>
-          <w:tab w:val="left" w:pos="6067"/>
-        </w:tabs>
-      </w:pPr>
-      <w:r>
-        <w:t xml:space="preserve">       CONTROL PLANE           </w:t>
-      </w:r>
-      <w:r>
-        <w:t xml:space="preserve">                                                                                         </w:t>
-      </w:r>
-      <w:r>
-        <w:t>DATA PLANE</w:t>
+        <w:t>───────--------------------------------───┐</w:t>
+      </w:r>
+    </w:p>
+    <w:p>
+      <w:pPr>
+        <w:tabs>
+          <w:tab w:val="left" w:pos="6067"/>
+        </w:tabs>
+      </w:pPr>
+      <w:r>
+        <w:t xml:space="preserve">             ↓                                                                                                                                    ↓</w:t>
+      </w:r>
+    </w:p>
+    <w:p>
+      <w:pPr>
+        <w:tabs>
+          <w:tab w:val="left" w:pos="6067"/>
+        </w:tabs>
+      </w:pPr>
+      <w:r>
+        <w:t xml:space="preserve">       CONTROL PLANE                                                                                                    DATA PLANE</w:t>
       </w:r>
     </w:p>
     <w:p>
@@ -2762,17 +2720,11 @@
       </w:r>
       <w:proofErr w:type="gramEnd"/>
       <w:r>
-        <w:t xml:space="preserve">           </w:t>
-      </w:r>
-      <w:r>
-        <w:t xml:space="preserve">                                                                                                 </w:t>
+        <w:t xml:space="preserve">                                                                                                            </w:t>
       </w:r>
       <w:proofErr w:type="gramStart"/>
       <w:r>
-        <w:t xml:space="preserve">   </w:t>
-      </w:r>
-      <w:r>
-        <w:t>(</w:t>
+        <w:t xml:space="preserve">   (</w:t>
       </w:r>
       <w:proofErr w:type="gramEnd"/>
       <w:r>
@@ -2786,29 +2738,17 @@
         </w:tabs>
       </w:pPr>
       <w:r>
-        <w:t xml:space="preserve">             |                    </w:t>
-      </w:r>
-      <w:r>
-        <w:t xml:space="preserve">                                                                                                                 </w:t>
-      </w:r>
-      <w:r>
-        <w:t xml:space="preserve"> |</w:t>
-      </w:r>
-    </w:p>
-    <w:p>
-      <w:pPr>
-        <w:tabs>
-          <w:tab w:val="left" w:pos="6067"/>
-        </w:tabs>
-      </w:pPr>
-      <w:r>
-        <w:t xml:space="preserve">       Manages cluster      </w:t>
-      </w:r>
-      <w:r>
-        <w:t xml:space="preserve">                                                                                             </w:t>
-      </w:r>
-      <w:r>
-        <w:t xml:space="preserve">   Runs Pods</w:t>
+        <w:t xml:space="preserve">             |                                                                                                                                      |</w:t>
+      </w:r>
+    </w:p>
+    <w:p>
+      <w:pPr>
+        <w:tabs>
+          <w:tab w:val="left" w:pos="6067"/>
+        </w:tabs>
+      </w:pPr>
+      <w:r>
+        <w:t xml:space="preserve">       Manages cluster                                                                                                      Runs Pods</w:t>
       </w:r>
     </w:p>
     <w:p>
@@ -5165,45 +5105,27 @@
         </w:tabs>
       </w:pPr>
       <w:r>
-        <w:t xml:space="preserve">                  </w:t>
-      </w:r>
-      <w:r>
-        <w:t xml:space="preserve">                                                           </w:t>
-      </w:r>
-      <w:r>
-        <w:t>Kubernetes Cluster</w:t>
-      </w:r>
-    </w:p>
-    <w:p>
-      <w:pPr>
-        <w:tabs>
-          <w:tab w:val="left" w:pos="6067"/>
-        </w:tabs>
-      </w:pPr>
-      <w:r>
-        <w:t xml:space="preserve">                         </w:t>
-      </w:r>
-      <w:r>
-        <w:t xml:space="preserve">                                                                 </w:t>
-      </w:r>
-      <w:r>
-        <w:t>│</w:t>
-      </w:r>
-    </w:p>
-    <w:p>
-      <w:pPr>
-        <w:tabs>
-          <w:tab w:val="left" w:pos="6067"/>
-        </w:tabs>
-      </w:pPr>
-      <w:r>
-        <w:t xml:space="preserve">          ┌───────────</w:t>
-      </w:r>
-      <w:r>
-        <w:t>---------------------------------</w:t>
-      </w:r>
-      <w:r>
-        <w:t>───</w:t>
+        <w:t xml:space="preserve">                                                                             Kubernetes Cluster</w:t>
+      </w:r>
+    </w:p>
+    <w:p>
+      <w:pPr>
+        <w:tabs>
+          <w:tab w:val="left" w:pos="6067"/>
+        </w:tabs>
+      </w:pPr>
+      <w:r>
+        <w:t xml:space="preserve">                                                                                          │</w:t>
+      </w:r>
+    </w:p>
+    <w:p>
+      <w:pPr>
+        <w:tabs>
+          <w:tab w:val="left" w:pos="6067"/>
+        </w:tabs>
+      </w:pPr>
+      <w:r>
+        <w:t xml:space="preserve">          ┌───────────---------------------------------───</w:t>
       </w:r>
       <w:r>
         <w:rPr>
@@ -5215,51 +5137,27 @@
         <w:rPr>
           <w:rFonts w:ascii="Calibri" w:hAnsi="Calibri" w:cs="Calibri"/>
         </w:rPr>
-        <w:t>─</w:t>
-      </w:r>
-      <w:r>
-        <w:rPr>
-          <w:rFonts w:ascii="Calibri" w:hAnsi="Calibri" w:cs="Calibri"/>
-        </w:rPr>
-        <w:t>-----------------------</w:t>
-      </w:r>
-      <w:r>
-        <w:rPr>
-          <w:rFonts w:ascii="Calibri" w:hAnsi="Calibri" w:cs="Calibri"/>
-        </w:rPr>
-        <w:t>─────────────┐</w:t>
-      </w:r>
-    </w:p>
-    <w:p>
-      <w:pPr>
-        <w:tabs>
-          <w:tab w:val="left" w:pos="6067"/>
-        </w:tabs>
-      </w:pPr>
-      <w:r>
-        <w:t xml:space="preserve">          │                        </w:t>
-      </w:r>
-      <w:r>
-        <w:t xml:space="preserve">                                                                                                                </w:t>
-      </w:r>
-      <w:r>
-        <w:t xml:space="preserve">     │</w:t>
-      </w:r>
-    </w:p>
-    <w:p>
-      <w:pPr>
-        <w:tabs>
-          <w:tab w:val="left" w:pos="6067"/>
-        </w:tabs>
-      </w:pPr>
-      <w:r>
-        <w:t xml:space="preserve">     CONTROL PLANE                  </w:t>
-      </w:r>
-      <w:r>
-        <w:t xml:space="preserve">                                                                                       </w:t>
-      </w:r>
-      <w:r>
-        <w:t>DATA PLANE</w:t>
+        <w:t>─-----------------------─────────────┐</w:t>
+      </w:r>
+    </w:p>
+    <w:p>
+      <w:pPr>
+        <w:tabs>
+          <w:tab w:val="left" w:pos="6067"/>
+        </w:tabs>
+      </w:pPr>
+      <w:r>
+        <w:t xml:space="preserve">          │                                                                                                                                             │</w:t>
+      </w:r>
+    </w:p>
+    <w:p>
+      <w:pPr>
+        <w:tabs>
+          <w:tab w:val="left" w:pos="6067"/>
+        </w:tabs>
+      </w:pPr>
+      <w:r>
+        <w:t xml:space="preserve">     CONTROL PLANE                                                                                                         DATA PLANE</w:t>
       </w:r>
     </w:p>
     <w:p>
@@ -5277,17 +5175,11 @@
       </w:r>
       <w:proofErr w:type="gramEnd"/>
       <w:r>
-        <w:t xml:space="preserve">                 </w:t>
-      </w:r>
-      <w:r>
-        <w:t xml:space="preserve">                                                                                           </w:t>
+        <w:t xml:space="preserve">                                                                                                            </w:t>
       </w:r>
       <w:proofErr w:type="gramStart"/>
       <w:r>
-        <w:t xml:space="preserve">   </w:t>
-      </w:r>
-      <w:r>
-        <w:t>(</w:t>
+        <w:t xml:space="preserve">   (</w:t>
       </w:r>
       <w:proofErr w:type="gramEnd"/>
       <w:r>
@@ -5301,13 +5193,7 @@
         </w:tabs>
       </w:pPr>
       <w:r>
-        <w:t xml:space="preserve">          │                           </w:t>
-      </w:r>
-      <w:r>
-        <w:t xml:space="preserve">                                                                                                             </w:t>
-      </w:r>
-      <w:r>
-        <w:t xml:space="preserve">  │</w:t>
+        <w:t xml:space="preserve">          │                                                                                                                                          │</w:t>
       </w:r>
     </w:p>
     <w:p>
@@ -6355,8 +6241,3216 @@
         </w:tabs>
       </w:pPr>
     </w:p>
+    <w:p>
+      <w:pPr>
+        <w:tabs>
+          <w:tab w:val="left" w:pos="6067"/>
+        </w:tabs>
+      </w:pPr>
+    </w:p>
+    <w:p>
+      <w:pPr>
+        <w:tabs>
+          <w:tab w:val="left" w:pos="6067"/>
+        </w:tabs>
+      </w:pPr>
+    </w:p>
+    <w:p>
+      <w:pPr>
+        <w:tabs>
+          <w:tab w:val="left" w:pos="6067"/>
+        </w:tabs>
+      </w:pPr>
+    </w:p>
+    <w:p>
+      <w:pPr>
+        <w:tabs>
+          <w:tab w:val="left" w:pos="6067"/>
+        </w:tabs>
+      </w:pPr>
+    </w:p>
+    <w:p>
+      <w:pPr>
+        <w:tabs>
+          <w:tab w:val="left" w:pos="6067"/>
+        </w:tabs>
+      </w:pPr>
+    </w:p>
+    <w:p>
+      <w:pPr>
+        <w:tabs>
+          <w:tab w:val="left" w:pos="6067"/>
+        </w:tabs>
+      </w:pPr>
+    </w:p>
+    <w:p>
+      <w:pPr>
+        <w:tabs>
+          <w:tab w:val="left" w:pos="6067"/>
+        </w:tabs>
+      </w:pPr>
+    </w:p>
+    <w:p>
+      <w:pPr>
+        <w:tabs>
+          <w:tab w:val="left" w:pos="6067"/>
+        </w:tabs>
+      </w:pPr>
+    </w:p>
+    <w:p>
+      <w:pPr>
+        <w:tabs>
+          <w:tab w:val="left" w:pos="6067"/>
+        </w:tabs>
+      </w:pPr>
+    </w:p>
+    <w:p>
+      <w:pPr>
+        <w:tabs>
+          <w:tab w:val="left" w:pos="6067"/>
+        </w:tabs>
+        <w:rPr>
+          <w:b/>
+          <w:bCs/>
+          <w:sz w:val="32"/>
+          <w:szCs w:val="32"/>
+        </w:rPr>
+      </w:pPr>
+      <w:r>
+        <w:rPr>
+          <w:b/>
+          <w:bCs/>
+          <w:sz w:val="32"/>
+          <w:szCs w:val="32"/>
+        </w:rPr>
+        <w:lastRenderedPageBreak/>
+        <w:t xml:space="preserve">3.) How to Manage Hundreds of Kubernetes </w:t>
+      </w:r>
+      <w:proofErr w:type="gramStart"/>
+      <w:r>
+        <w:rPr>
+          <w:b/>
+          <w:bCs/>
+          <w:sz w:val="32"/>
+          <w:szCs w:val="32"/>
+        </w:rPr>
+        <w:t>clusters ???</w:t>
+      </w:r>
+      <w:proofErr w:type="gramEnd"/>
+      <w:r>
+        <w:rPr>
+          <w:b/>
+          <w:bCs/>
+          <w:sz w:val="32"/>
+          <w:szCs w:val="32"/>
+        </w:rPr>
+        <w:t xml:space="preserve"> | KOPS</w:t>
+      </w:r>
+    </w:p>
+    <w:p>
+      <w:pPr>
+        <w:tabs>
+          <w:tab w:val="left" w:pos="6067"/>
+        </w:tabs>
+        <w:rPr>
+          <w:b/>
+          <w:bCs/>
+        </w:rPr>
+      </w:pPr>
+      <w:r>
+        <w:rPr>
+          <w:b/>
+          <w:bCs/>
+        </w:rPr>
+        <w:t>1. Why Production Kubernetes?</w:t>
+      </w:r>
+    </w:p>
+    <w:p>
+      <w:pPr>
+        <w:tabs>
+          <w:tab w:val="left" w:pos="6067"/>
+        </w:tabs>
+      </w:pPr>
+      <w:r>
+        <w:t>When learning Kubernetes, we commonly use:</w:t>
+      </w:r>
+    </w:p>
+    <w:p>
+      <w:pPr>
+        <w:numPr>
+          <w:ilvl w:val="0"/>
+          <w:numId w:val="10"/>
+        </w:numPr>
+        <w:tabs>
+          <w:tab w:val="left" w:pos="6067"/>
+        </w:tabs>
+      </w:pPr>
+      <w:proofErr w:type="spellStart"/>
+      <w:r>
+        <w:t>Minikube</w:t>
+      </w:r>
+      <w:proofErr w:type="spellEnd"/>
+      <w:r>
+        <w:t xml:space="preserve"> </w:t>
+      </w:r>
+    </w:p>
+    <w:p>
+      <w:pPr>
+        <w:numPr>
+          <w:ilvl w:val="0"/>
+          <w:numId w:val="10"/>
+        </w:numPr>
+        <w:tabs>
+          <w:tab w:val="left" w:pos="6067"/>
+        </w:tabs>
+      </w:pPr>
+      <w:r>
+        <w:t xml:space="preserve">K3s </w:t>
+      </w:r>
+    </w:p>
+    <w:p>
+      <w:pPr>
+        <w:numPr>
+          <w:ilvl w:val="0"/>
+          <w:numId w:val="10"/>
+        </w:numPr>
+        <w:tabs>
+          <w:tab w:val="left" w:pos="6067"/>
+        </w:tabs>
+      </w:pPr>
+      <w:r>
+        <w:t xml:space="preserve">Docker Desktop Kubernetes </w:t>
+      </w:r>
+    </w:p>
+    <w:p>
+      <w:pPr>
+        <w:tabs>
+          <w:tab w:val="left" w:pos="6067"/>
+        </w:tabs>
+      </w:pPr>
+      <w:r>
+        <w:t xml:space="preserve">These are mainly useful for </w:t>
+      </w:r>
+      <w:r>
+        <w:rPr>
+          <w:b/>
+          <w:bCs/>
+        </w:rPr>
+        <w:t>learning/development/testing</w:t>
+      </w:r>
+      <w:r>
+        <w:t>.</w:t>
+      </w:r>
+    </w:p>
+    <w:p>
+      <w:pPr>
+        <w:tabs>
+          <w:tab w:val="left" w:pos="6067"/>
+        </w:tabs>
+      </w:pPr>
+      <w:r>
+        <w:t>In production, organizations need to manage:</w:t>
+      </w:r>
+    </w:p>
+    <w:p>
+      <w:pPr>
+        <w:numPr>
+          <w:ilvl w:val="0"/>
+          <w:numId w:val="11"/>
+        </w:numPr>
+        <w:tabs>
+          <w:tab w:val="left" w:pos="6067"/>
+        </w:tabs>
+      </w:pPr>
+      <w:r>
+        <w:t xml:space="preserve">Cluster creation </w:t>
+      </w:r>
+    </w:p>
+    <w:p>
+      <w:pPr>
+        <w:numPr>
+          <w:ilvl w:val="0"/>
+          <w:numId w:val="11"/>
+        </w:numPr>
+        <w:tabs>
+          <w:tab w:val="left" w:pos="6067"/>
+        </w:tabs>
+      </w:pPr>
+      <w:r>
+        <w:t xml:space="preserve">Cluster configuration </w:t>
+      </w:r>
+    </w:p>
+    <w:p>
+      <w:pPr>
+        <w:numPr>
+          <w:ilvl w:val="0"/>
+          <w:numId w:val="11"/>
+        </w:numPr>
+        <w:tabs>
+          <w:tab w:val="left" w:pos="6067"/>
+        </w:tabs>
+      </w:pPr>
+      <w:r>
+        <w:t xml:space="preserve">Upgrades </w:t>
+      </w:r>
+    </w:p>
+    <w:p>
+      <w:pPr>
+        <w:numPr>
+          <w:ilvl w:val="0"/>
+          <w:numId w:val="11"/>
+        </w:numPr>
+        <w:tabs>
+          <w:tab w:val="left" w:pos="6067"/>
+        </w:tabs>
+      </w:pPr>
+      <w:r>
+        <w:t xml:space="preserve">Scaling </w:t>
+      </w:r>
+    </w:p>
+    <w:p>
+      <w:pPr>
+        <w:numPr>
+          <w:ilvl w:val="0"/>
+          <w:numId w:val="11"/>
+        </w:numPr>
+        <w:tabs>
+          <w:tab w:val="left" w:pos="6067"/>
+        </w:tabs>
+      </w:pPr>
+      <w:r>
+        <w:t xml:space="preserve">Security </w:t>
+      </w:r>
+    </w:p>
+    <w:p>
+      <w:pPr>
+        <w:numPr>
+          <w:ilvl w:val="0"/>
+          <w:numId w:val="11"/>
+        </w:numPr>
+        <w:tabs>
+          <w:tab w:val="left" w:pos="6067"/>
+        </w:tabs>
+      </w:pPr>
+      <w:r>
+        <w:t xml:space="preserve">Networking </w:t>
+      </w:r>
+    </w:p>
+    <w:p>
+      <w:pPr>
+        <w:numPr>
+          <w:ilvl w:val="0"/>
+          <w:numId w:val="11"/>
+        </w:numPr>
+        <w:tabs>
+          <w:tab w:val="left" w:pos="6067"/>
+        </w:tabs>
+      </w:pPr>
+      <w:r>
+        <w:t xml:space="preserve">Storage </w:t>
+      </w:r>
+    </w:p>
+    <w:p>
+      <w:pPr>
+        <w:numPr>
+          <w:ilvl w:val="0"/>
+          <w:numId w:val="11"/>
+        </w:numPr>
+        <w:tabs>
+          <w:tab w:val="left" w:pos="6067"/>
+        </w:tabs>
+      </w:pPr>
+      <w:r>
+        <w:t xml:space="preserve">Monitoring </w:t>
+      </w:r>
+    </w:p>
+    <w:p>
+      <w:pPr>
+        <w:numPr>
+          <w:ilvl w:val="0"/>
+          <w:numId w:val="11"/>
+        </w:numPr>
+        <w:tabs>
+          <w:tab w:val="left" w:pos="6067"/>
+        </w:tabs>
+      </w:pPr>
+      <w:r>
+        <w:t xml:space="preserve">Cluster deletion </w:t>
+      </w:r>
+    </w:p>
+    <w:p>
+      <w:pPr>
+        <w:numPr>
+          <w:ilvl w:val="0"/>
+          <w:numId w:val="11"/>
+        </w:numPr>
+        <w:tabs>
+          <w:tab w:val="left" w:pos="6067"/>
+        </w:tabs>
+      </w:pPr>
+      <w:r>
+        <w:t xml:space="preserve">Multiple clusters </w:t>
+      </w:r>
+    </w:p>
+    <w:p>
+      <w:pPr>
+        <w:tabs>
+          <w:tab w:val="left" w:pos="6067"/>
+        </w:tabs>
+      </w:pPr>
+      <w:proofErr w:type="gramStart"/>
+      <w:r>
+        <w:t>So</w:t>
+      </w:r>
+      <w:proofErr w:type="gramEnd"/>
+      <w:r>
+        <w:t xml:space="preserve"> a DevOps engineer needs tools that can manage the </w:t>
+      </w:r>
+      <w:r>
+        <w:rPr>
+          <w:b/>
+          <w:bCs/>
+        </w:rPr>
+        <w:t>entire Kubernetes cluster lifecycle</w:t>
+      </w:r>
+      <w:r>
+        <w:t>.</w:t>
+      </w:r>
+    </w:p>
+    <w:p>
+      <w:pPr>
+        <w:tabs>
+          <w:tab w:val="left" w:pos="6067"/>
+        </w:tabs>
+      </w:pPr>
+    </w:p>
+    <w:p>
+      <w:pPr>
+        <w:tabs>
+          <w:tab w:val="left" w:pos="6067"/>
+        </w:tabs>
+      </w:pPr>
+      <w:r>
+        <w:t>2. Local Kubernetes vs Production Kubernetes</w:t>
+      </w:r>
+    </w:p>
+    <w:tbl>
+      <w:tblPr>
+        <w:tblW w:w="10469" w:type="dxa"/>
+        <w:tblCellSpacing w:w="15" w:type="dxa"/>
+        <w:tblCellMar>
+          <w:top w:w="15" w:type="dxa"/>
+          <w:left w:w="15" w:type="dxa"/>
+          <w:bottom w:w="15" w:type="dxa"/>
+          <w:right w:w="15" w:type="dxa"/>
+        </w:tblCellMar>
+        <w:tblLook w:val="04A0" w:firstRow="1" w:lastRow="0" w:firstColumn="1" w:lastColumn="0" w:noHBand="0" w:noVBand="1"/>
+      </w:tblPr>
+      <w:tblGrid>
+        <w:gridCol w:w="3492"/>
+        <w:gridCol w:w="6977"/>
+      </w:tblGrid>
+      <w:tr>
+        <w:trPr>
+          <w:trHeight w:val="470"/>
+          <w:tblHeader/>
+          <w:tblCellSpacing w:w="15" w:type="dxa"/>
+        </w:trPr>
+        <w:tc>
+          <w:tcPr>
+            <w:tcW w:w="0" w:type="auto"/>
+            <w:vAlign w:val="center"/>
+            <w:hideMark/>
+          </w:tcPr>
+          <w:p>
+            <w:pPr>
+              <w:tabs>
+                <w:tab w:val="left" w:pos="6067"/>
+              </w:tabs>
+              <w:rPr>
+                <w:b/>
+                <w:bCs/>
+              </w:rPr>
+            </w:pPr>
+            <w:r>
+              <w:rPr>
+                <w:b/>
+                <w:bCs/>
+              </w:rPr>
+              <w:t>Local</w:t>
+            </w:r>
+          </w:p>
+        </w:tc>
+        <w:tc>
+          <w:tcPr>
+            <w:tcW w:w="0" w:type="auto"/>
+            <w:vAlign w:val="center"/>
+            <w:hideMark/>
+          </w:tcPr>
+          <w:p>
+            <w:pPr>
+              <w:tabs>
+                <w:tab w:val="left" w:pos="6067"/>
+              </w:tabs>
+              <w:rPr>
+                <w:b/>
+                <w:bCs/>
+              </w:rPr>
+            </w:pPr>
+            <w:r>
+              <w:rPr>
+                <w:b/>
+                <w:bCs/>
+              </w:rPr>
+              <w:t>Production</w:t>
+            </w:r>
+          </w:p>
+        </w:tc>
+      </w:tr>
+      <w:tr>
+        <w:trPr>
+          <w:trHeight w:val="456"/>
+          <w:tblCellSpacing w:w="15" w:type="dxa"/>
+        </w:trPr>
+        <w:tc>
+          <w:tcPr>
+            <w:tcW w:w="0" w:type="auto"/>
+            <w:vAlign w:val="center"/>
+            <w:hideMark/>
+          </w:tcPr>
+          <w:p>
+            <w:pPr>
+              <w:tabs>
+                <w:tab w:val="left" w:pos="6067"/>
+              </w:tabs>
+            </w:pPr>
+            <w:proofErr w:type="spellStart"/>
+            <w:r>
+              <w:t>Minikube</w:t>
+            </w:r>
+            <w:proofErr w:type="spellEnd"/>
+          </w:p>
+        </w:tc>
+        <w:tc>
+          <w:tcPr>
+            <w:tcW w:w="0" w:type="auto"/>
+            <w:vAlign w:val="center"/>
+            <w:hideMark/>
+          </w:tcPr>
+          <w:p>
+            <w:pPr>
+              <w:tabs>
+                <w:tab w:val="left" w:pos="6067"/>
+              </w:tabs>
+            </w:pPr>
+            <w:r>
+              <w:t>EKS / GKE / AKS / KOPS / OpenShift etc.</w:t>
+            </w:r>
+          </w:p>
+        </w:tc>
+      </w:tr>
+      <w:tr>
+        <w:trPr>
+          <w:trHeight w:val="470"/>
+          <w:tblCellSpacing w:w="15" w:type="dxa"/>
+        </w:trPr>
+        <w:tc>
+          <w:tcPr>
+            <w:tcW w:w="0" w:type="auto"/>
+            <w:vAlign w:val="center"/>
+            <w:hideMark/>
+          </w:tcPr>
+          <w:p>
+            <w:pPr>
+              <w:tabs>
+                <w:tab w:val="left" w:pos="6067"/>
+              </w:tabs>
+            </w:pPr>
+            <w:proofErr w:type="gramStart"/>
+            <w:r>
+              <w:t>Usually</w:t>
+            </w:r>
+            <w:proofErr w:type="gramEnd"/>
+            <w:r>
+              <w:t xml:space="preserve"> single node</w:t>
+            </w:r>
+          </w:p>
+        </w:tc>
+        <w:tc>
+          <w:tcPr>
+            <w:tcW w:w="0" w:type="auto"/>
+            <w:vAlign w:val="center"/>
+            <w:hideMark/>
+          </w:tcPr>
+          <w:p>
+            <w:pPr>
+              <w:tabs>
+                <w:tab w:val="left" w:pos="6067"/>
+              </w:tabs>
+            </w:pPr>
+            <w:r>
+              <w:t>Multiple nodes</w:t>
+            </w:r>
+          </w:p>
+        </w:tc>
+      </w:tr>
+      <w:tr>
+        <w:trPr>
+          <w:trHeight w:val="456"/>
+          <w:tblCellSpacing w:w="15" w:type="dxa"/>
+        </w:trPr>
+        <w:tc>
+          <w:tcPr>
+            <w:tcW w:w="0" w:type="auto"/>
+            <w:vAlign w:val="center"/>
+            <w:hideMark/>
+          </w:tcPr>
+          <w:p>
+            <w:pPr>
+              <w:tabs>
+                <w:tab w:val="left" w:pos="6067"/>
+              </w:tabs>
+            </w:pPr>
+            <w:r>
+              <w:t>Small resources</w:t>
+            </w:r>
+          </w:p>
+        </w:tc>
+        <w:tc>
+          <w:tcPr>
+            <w:tcW w:w="0" w:type="auto"/>
+            <w:vAlign w:val="center"/>
+            <w:hideMark/>
+          </w:tcPr>
+          <w:p>
+            <w:pPr>
+              <w:tabs>
+                <w:tab w:val="left" w:pos="6067"/>
+              </w:tabs>
+            </w:pPr>
+            <w:r>
+              <w:t>Large resources</w:t>
+            </w:r>
+          </w:p>
+        </w:tc>
+      </w:tr>
+      <w:tr>
+        <w:trPr>
+          <w:trHeight w:val="470"/>
+          <w:tblCellSpacing w:w="15" w:type="dxa"/>
+        </w:trPr>
+        <w:tc>
+          <w:tcPr>
+            <w:tcW w:w="0" w:type="auto"/>
+            <w:vAlign w:val="center"/>
+            <w:hideMark/>
+          </w:tcPr>
+          <w:p>
+            <w:pPr>
+              <w:tabs>
+                <w:tab w:val="left" w:pos="6067"/>
+              </w:tabs>
+            </w:pPr>
+            <w:r>
+              <w:t>Development</w:t>
+            </w:r>
+          </w:p>
+        </w:tc>
+        <w:tc>
+          <w:tcPr>
+            <w:tcW w:w="0" w:type="auto"/>
+            <w:vAlign w:val="center"/>
+            <w:hideMark/>
+          </w:tcPr>
+          <w:p>
+            <w:pPr>
+              <w:tabs>
+                <w:tab w:val="left" w:pos="6067"/>
+              </w:tabs>
+            </w:pPr>
+            <w:r>
+              <w:t>Production</w:t>
+            </w:r>
+          </w:p>
+        </w:tc>
+      </w:tr>
+      <w:tr>
+        <w:trPr>
+          <w:trHeight w:val="456"/>
+          <w:tblCellSpacing w:w="15" w:type="dxa"/>
+        </w:trPr>
+        <w:tc>
+          <w:tcPr>
+            <w:tcW w:w="0" w:type="auto"/>
+            <w:vAlign w:val="center"/>
+            <w:hideMark/>
+          </w:tcPr>
+          <w:p>
+            <w:pPr>
+              <w:tabs>
+                <w:tab w:val="left" w:pos="6067"/>
+              </w:tabs>
+            </w:pPr>
+            <w:r>
+              <w:t>Easy setup</w:t>
+            </w:r>
+          </w:p>
+        </w:tc>
+        <w:tc>
+          <w:tcPr>
+            <w:tcW w:w="0" w:type="auto"/>
+            <w:vAlign w:val="center"/>
+            <w:hideMark/>
+          </w:tcPr>
+          <w:p>
+            <w:pPr>
+              <w:tabs>
+                <w:tab w:val="left" w:pos="6067"/>
+              </w:tabs>
+            </w:pPr>
+            <w:r>
+              <w:t>Highly configurable</w:t>
+            </w:r>
+          </w:p>
+        </w:tc>
+      </w:tr>
+      <w:tr>
+        <w:trPr>
+          <w:trHeight w:val="470"/>
+          <w:tblCellSpacing w:w="15" w:type="dxa"/>
+        </w:trPr>
+        <w:tc>
+          <w:tcPr>
+            <w:tcW w:w="0" w:type="auto"/>
+            <w:vAlign w:val="center"/>
+            <w:hideMark/>
+          </w:tcPr>
+          <w:p>
+            <w:pPr>
+              <w:tabs>
+                <w:tab w:val="left" w:pos="6067"/>
+              </w:tabs>
+            </w:pPr>
+            <w:r>
+              <w:t>Limited HA</w:t>
+            </w:r>
+          </w:p>
+        </w:tc>
+        <w:tc>
+          <w:tcPr>
+            <w:tcW w:w="0" w:type="auto"/>
+            <w:vAlign w:val="center"/>
+            <w:hideMark/>
+          </w:tcPr>
+          <w:p>
+            <w:pPr>
+              <w:tabs>
+                <w:tab w:val="left" w:pos="6067"/>
+              </w:tabs>
+            </w:pPr>
+            <w:r>
+              <w:t>High Availability</w:t>
+            </w:r>
+          </w:p>
+        </w:tc>
+      </w:tr>
+      <w:tr>
+        <w:trPr>
+          <w:trHeight w:val="456"/>
+          <w:tblCellSpacing w:w="15" w:type="dxa"/>
+        </w:trPr>
+        <w:tc>
+          <w:tcPr>
+            <w:tcW w:w="0" w:type="auto"/>
+            <w:vAlign w:val="center"/>
+            <w:hideMark/>
+          </w:tcPr>
+          <w:p>
+            <w:pPr>
+              <w:tabs>
+                <w:tab w:val="left" w:pos="6067"/>
+              </w:tabs>
+            </w:pPr>
+            <w:r>
+              <w:t>Local machine</w:t>
+            </w:r>
+          </w:p>
+        </w:tc>
+        <w:tc>
+          <w:tcPr>
+            <w:tcW w:w="0" w:type="auto"/>
+            <w:vAlign w:val="center"/>
+            <w:hideMark/>
+          </w:tcPr>
+          <w:p>
+            <w:pPr>
+              <w:tabs>
+                <w:tab w:val="left" w:pos="6067"/>
+              </w:tabs>
+            </w:pPr>
+            <w:r>
+              <w:t xml:space="preserve">Cloud / Data </w:t>
+            </w:r>
+            <w:proofErr w:type="spellStart"/>
+            <w:r>
+              <w:t>Center</w:t>
+            </w:r>
+            <w:proofErr w:type="spellEnd"/>
+          </w:p>
+        </w:tc>
+      </w:tr>
+    </w:tbl>
+    <w:p>
+      <w:pPr>
+        <w:tabs>
+          <w:tab w:val="left" w:pos="6067"/>
+        </w:tabs>
+        <w:rPr>
+          <w:b/>
+          <w:bCs/>
+        </w:rPr>
+      </w:pPr>
+      <w:r>
+        <w:rPr>
+          <w:b/>
+          <w:bCs/>
+        </w:rPr>
+        <w:lastRenderedPageBreak/>
+        <w:t>Important</w:t>
+      </w:r>
+      <w:r>
+        <w:rPr>
+          <w:b/>
+          <w:bCs/>
+        </w:rPr>
+        <w:t xml:space="preserve">: </w:t>
+      </w:r>
+      <w:proofErr w:type="spellStart"/>
+      <w:r>
+        <w:t>Minikube</w:t>
+      </w:r>
+      <w:proofErr w:type="spellEnd"/>
+      <w:r>
+        <w:t xml:space="preserve"> is NOT a replacement for a production Kubernetes cluster.</w:t>
+      </w:r>
+    </w:p>
+    <w:p>
+      <w:pPr>
+        <w:tabs>
+          <w:tab w:val="left" w:pos="6067"/>
+        </w:tabs>
+      </w:pPr>
+      <w:proofErr w:type="spellStart"/>
+      <w:r>
+        <w:t>Minikube</w:t>
+      </w:r>
+      <w:proofErr w:type="spellEnd"/>
+      <w:r>
+        <w:t xml:space="preserve"> is excellent for learning Kubernetes concepts, but production environments require much more infrastructure.</w:t>
+      </w:r>
+    </w:p>
+    <w:p>
+      <w:pPr>
+        <w:tabs>
+          <w:tab w:val="left" w:pos="6067"/>
+        </w:tabs>
+      </w:pPr>
+    </w:p>
+    <w:p>
+      <w:pPr>
+        <w:tabs>
+          <w:tab w:val="left" w:pos="6067"/>
+        </w:tabs>
+        <w:rPr>
+          <w:b/>
+          <w:bCs/>
+        </w:rPr>
+      </w:pPr>
+      <w:r>
+        <w:rPr>
+          <w:b/>
+          <w:bCs/>
+        </w:rPr>
+        <w:t>3. What is a Kubernetes Distribution?</w:t>
+      </w:r>
+    </w:p>
+    <w:p>
+      <w:pPr>
+        <w:tabs>
+          <w:tab w:val="left" w:pos="6067"/>
+        </w:tabs>
+      </w:pPr>
+      <w:r>
+        <w:t xml:space="preserve">A </w:t>
+      </w:r>
+      <w:r>
+        <w:rPr>
+          <w:b/>
+          <w:bCs/>
+        </w:rPr>
+        <w:t>Kubernetes distribution</w:t>
+      </w:r>
+      <w:r>
+        <w:t xml:space="preserve"> is Kubernetes packaged with additional components, configuration, tooling, support, and integrations.</w:t>
+      </w:r>
+    </w:p>
+    <w:p>
+      <w:pPr>
+        <w:tabs>
+          <w:tab w:val="left" w:pos="6067"/>
+        </w:tabs>
+      </w:pPr>
+      <w:r>
+        <w:t>Examples:</w:t>
+      </w:r>
+    </w:p>
+    <w:p>
+      <w:pPr>
+        <w:numPr>
+          <w:ilvl w:val="0"/>
+          <w:numId w:val="12"/>
+        </w:numPr>
+        <w:tabs>
+          <w:tab w:val="left" w:pos="6067"/>
+        </w:tabs>
+      </w:pPr>
+      <w:r>
+        <w:t xml:space="preserve">Amazon EKS </w:t>
+      </w:r>
+    </w:p>
+    <w:p>
+      <w:pPr>
+        <w:numPr>
+          <w:ilvl w:val="0"/>
+          <w:numId w:val="12"/>
+        </w:numPr>
+        <w:tabs>
+          <w:tab w:val="left" w:pos="6067"/>
+        </w:tabs>
+      </w:pPr>
+      <w:r>
+        <w:t xml:space="preserve">Google GKE </w:t>
+      </w:r>
+    </w:p>
+    <w:p>
+      <w:pPr>
+        <w:numPr>
+          <w:ilvl w:val="0"/>
+          <w:numId w:val="12"/>
+        </w:numPr>
+        <w:tabs>
+          <w:tab w:val="left" w:pos="6067"/>
+        </w:tabs>
+      </w:pPr>
+      <w:r>
+        <w:t xml:space="preserve">Azure AKS </w:t>
+      </w:r>
+    </w:p>
+    <w:p>
+      <w:pPr>
+        <w:numPr>
+          <w:ilvl w:val="0"/>
+          <w:numId w:val="12"/>
+        </w:numPr>
+        <w:tabs>
+          <w:tab w:val="left" w:pos="6067"/>
+        </w:tabs>
+      </w:pPr>
+      <w:r>
+        <w:t xml:space="preserve">Red Hat OpenShift </w:t>
+      </w:r>
+    </w:p>
+    <w:p>
+      <w:pPr>
+        <w:numPr>
+          <w:ilvl w:val="0"/>
+          <w:numId w:val="12"/>
+        </w:numPr>
+        <w:tabs>
+          <w:tab w:val="left" w:pos="6067"/>
+        </w:tabs>
+      </w:pPr>
+      <w:r>
+        <w:t xml:space="preserve">KOPS </w:t>
+      </w:r>
+    </w:p>
+    <w:p>
+      <w:pPr>
+        <w:numPr>
+          <w:ilvl w:val="0"/>
+          <w:numId w:val="12"/>
+        </w:numPr>
+        <w:tabs>
+          <w:tab w:val="left" w:pos="6067"/>
+        </w:tabs>
+      </w:pPr>
+      <w:r>
+        <w:t xml:space="preserve">Rancher </w:t>
+      </w:r>
+    </w:p>
+    <w:p>
+      <w:pPr>
+        <w:numPr>
+          <w:ilvl w:val="0"/>
+          <w:numId w:val="12"/>
+        </w:numPr>
+        <w:tabs>
+          <w:tab w:val="left" w:pos="6067"/>
+        </w:tabs>
+      </w:pPr>
+      <w:r>
+        <w:t xml:space="preserve">Tanzu </w:t>
+      </w:r>
+    </w:p>
+    <w:p>
+      <w:pPr>
+        <w:tabs>
+          <w:tab w:val="left" w:pos="6067"/>
+        </w:tabs>
+      </w:pPr>
+      <w:r>
+        <w:t>For example:</w:t>
+      </w:r>
+    </w:p>
+    <w:p>
+      <w:pPr>
+        <w:tabs>
+          <w:tab w:val="left" w:pos="6067"/>
+        </w:tabs>
+      </w:pPr>
+      <w:r>
+        <w:t xml:space="preserve">                                                        Kubernetes</w:t>
+      </w:r>
+    </w:p>
+    <w:p>
+      <w:pPr>
+        <w:tabs>
+          <w:tab w:val="left" w:pos="6067"/>
+        </w:tabs>
+      </w:pPr>
+      <w:r>
+        <w:t xml:space="preserve">                                                                 |</w:t>
+      </w:r>
+    </w:p>
+    <w:p>
+      <w:pPr>
+        <w:tabs>
+          <w:tab w:val="left" w:pos="6067"/>
+        </w:tabs>
+      </w:pPr>
+      <w:r>
+        <w:t xml:space="preserve">       +-----------------------------------------+------------------------------------------+</w:t>
+      </w:r>
+    </w:p>
+    <w:p>
+      <w:pPr>
+        <w:tabs>
+          <w:tab w:val="left" w:pos="6067"/>
+        </w:tabs>
+      </w:pPr>
+      <w:r>
+        <w:t xml:space="preserve">       |                                                       |                                                          |</w:t>
+      </w:r>
+    </w:p>
+    <w:p>
+      <w:pPr>
+        <w:tabs>
+          <w:tab w:val="left" w:pos="6067"/>
+        </w:tabs>
+      </w:pPr>
+      <w:r>
+        <w:t xml:space="preserve">      EKS                                                  GKE                                                   AKS</w:t>
+      </w:r>
+    </w:p>
+    <w:p>
+      <w:pPr>
+        <w:tabs>
+          <w:tab w:val="left" w:pos="6067"/>
+        </w:tabs>
+      </w:pPr>
+      <w:r>
+        <w:t xml:space="preserve">       |                                                        |                                                         |</w:t>
+      </w:r>
+    </w:p>
+    <w:p>
+      <w:pPr>
+        <w:tabs>
+          <w:tab w:val="left" w:pos="6067"/>
+        </w:tabs>
+      </w:pPr>
+      <w:r>
+        <w:t xml:space="preserve">     AWS                                              Google                                               Azure</w:t>
+      </w:r>
+    </w:p>
+    <w:p>
+      <w:pPr>
+        <w:tabs>
+          <w:tab w:val="left" w:pos="6067"/>
+        </w:tabs>
+      </w:pPr>
+      <w:r>
+        <w:sym w:font="Wingdings" w:char="F0E0"/>
+      </w:r>
+      <w:r>
+        <w:t xml:space="preserve"> </w:t>
+      </w:r>
+      <w:r>
+        <w:t>Managed distributions provide cloud-specific integrations and operational support.</w:t>
+      </w:r>
+    </w:p>
+    <w:p>
+      <w:pPr>
+        <w:tabs>
+          <w:tab w:val="left" w:pos="6067"/>
+        </w:tabs>
+      </w:pPr>
+    </w:p>
+    <w:p>
+      <w:pPr>
+        <w:tabs>
+          <w:tab w:val="left" w:pos="6067"/>
+        </w:tabs>
+        <w:rPr>
+          <w:b/>
+          <w:bCs/>
+        </w:rPr>
+      </w:pPr>
+      <w:r>
+        <w:rPr>
+          <w:b/>
+          <w:bCs/>
+        </w:rPr>
+        <w:t>4. Kubernetes vs EKS</w:t>
+      </w:r>
+    </w:p>
+    <w:p>
+      <w:pPr>
+        <w:tabs>
+          <w:tab w:val="left" w:pos="6067"/>
+        </w:tabs>
+        <w:rPr>
+          <w:b/>
+          <w:bCs/>
+        </w:rPr>
+      </w:pPr>
+      <w:r>
+        <w:rPr>
+          <w:b/>
+          <w:bCs/>
+        </w:rPr>
+        <w:t>Kubernetes</w:t>
+      </w:r>
+    </w:p>
+    <w:p>
+      <w:pPr>
+        <w:tabs>
+          <w:tab w:val="left" w:pos="6067"/>
+        </w:tabs>
+      </w:pPr>
+      <w:r>
+        <w:t>You can manually install Kubernetes on AWS EC2 instances.</w:t>
+      </w:r>
+    </w:p>
+    <w:p>
+      <w:pPr>
+        <w:tabs>
+          <w:tab w:val="left" w:pos="6067"/>
+        </w:tabs>
+      </w:pPr>
+      <w:r>
+        <w:t>Example:</w:t>
+      </w:r>
+    </w:p>
+    <w:p>
+      <w:pPr>
+        <w:tabs>
+          <w:tab w:val="left" w:pos="6067"/>
+        </w:tabs>
+        <w:ind w:left="720"/>
+      </w:pPr>
+      <w:r>
+        <w:t>AWS EC2</w:t>
+      </w:r>
+    </w:p>
+    <w:p>
+      <w:pPr>
+        <w:tabs>
+          <w:tab w:val="left" w:pos="6067"/>
+        </w:tabs>
+        <w:ind w:left="720"/>
+      </w:pPr>
+      <w:r>
+        <w:t xml:space="preserve">   |</w:t>
+      </w:r>
+    </w:p>
+    <w:p>
+      <w:pPr>
+        <w:tabs>
+          <w:tab w:val="left" w:pos="6067"/>
+        </w:tabs>
+        <w:ind w:left="720"/>
+      </w:pPr>
+      <w:r>
+        <w:t xml:space="preserve">   +-- Kubernetes Control Plane</w:t>
+      </w:r>
+    </w:p>
+    <w:p>
+      <w:pPr>
+        <w:tabs>
+          <w:tab w:val="left" w:pos="6067"/>
+        </w:tabs>
+        <w:ind w:left="720"/>
+      </w:pPr>
+      <w:r>
+        <w:lastRenderedPageBreak/>
+        <w:t xml:space="preserve">   |</w:t>
+      </w:r>
+    </w:p>
+    <w:p>
+      <w:pPr>
+        <w:tabs>
+          <w:tab w:val="left" w:pos="6067"/>
+        </w:tabs>
+        <w:ind w:left="720"/>
+      </w:pPr>
+      <w:r>
+        <w:t xml:space="preserve">   +-- Worker Nodes</w:t>
+      </w:r>
+    </w:p>
+    <w:p>
+      <w:pPr>
+        <w:tabs>
+          <w:tab w:val="left" w:pos="6067"/>
+        </w:tabs>
+      </w:pPr>
+      <w:r>
+        <w:sym w:font="Wingdings" w:char="F0E0"/>
+      </w:r>
+      <w:r>
+        <w:t xml:space="preserve"> </w:t>
+      </w:r>
+      <w:r>
+        <w:t>But you are responsible for managing the Kubernetes infrastructure.</w:t>
+      </w:r>
+    </w:p>
+    <w:p>
+      <w:pPr>
+        <w:tabs>
+          <w:tab w:val="left" w:pos="6067"/>
+        </w:tabs>
+        <w:rPr>
+          <w:b/>
+          <w:bCs/>
+        </w:rPr>
+      </w:pPr>
+      <w:r>
+        <w:rPr>
+          <w:b/>
+          <w:bCs/>
+        </w:rPr>
+        <w:t>EKS</w:t>
+      </w:r>
+    </w:p>
+    <w:p>
+      <w:pPr>
+        <w:tabs>
+          <w:tab w:val="left" w:pos="6067"/>
+        </w:tabs>
+      </w:pPr>
+      <w:r>
+        <w:t>Amazon provides a managed Kubernetes service.</w:t>
+      </w:r>
+    </w:p>
+    <w:p>
+      <w:pPr>
+        <w:tabs>
+          <w:tab w:val="left" w:pos="6067"/>
+        </w:tabs>
+        <w:ind w:left="720"/>
+      </w:pPr>
+      <w:r>
+        <w:t>AWS</w:t>
+      </w:r>
+    </w:p>
+    <w:p>
+      <w:pPr>
+        <w:tabs>
+          <w:tab w:val="left" w:pos="6067"/>
+        </w:tabs>
+        <w:ind w:left="720"/>
+      </w:pPr>
+      <w:r>
+        <w:t xml:space="preserve"> |</w:t>
+      </w:r>
+    </w:p>
+    <w:p>
+      <w:pPr>
+        <w:tabs>
+          <w:tab w:val="left" w:pos="6067"/>
+        </w:tabs>
+        <w:ind w:left="720"/>
+      </w:pPr>
+      <w:r>
+        <w:t xml:space="preserve"> +-- EKS</w:t>
+      </w:r>
+    </w:p>
+    <w:p>
+      <w:pPr>
+        <w:tabs>
+          <w:tab w:val="left" w:pos="6067"/>
+        </w:tabs>
+        <w:ind w:left="720"/>
+      </w:pPr>
+      <w:r>
+        <w:t xml:space="preserve">      |</w:t>
+      </w:r>
+    </w:p>
+    <w:p>
+      <w:pPr>
+        <w:tabs>
+          <w:tab w:val="left" w:pos="6067"/>
+        </w:tabs>
+        <w:ind w:left="720"/>
+      </w:pPr>
+      <w:r>
+        <w:t xml:space="preserve">      +-- Kubernetes Control Plane</w:t>
+      </w:r>
+    </w:p>
+    <w:p>
+      <w:pPr>
+        <w:tabs>
+          <w:tab w:val="left" w:pos="6067"/>
+        </w:tabs>
+        <w:ind w:left="720"/>
+      </w:pPr>
+      <w:r>
+        <w:t xml:space="preserve">      |</w:t>
+      </w:r>
+    </w:p>
+    <w:p>
+      <w:pPr>
+        <w:tabs>
+          <w:tab w:val="left" w:pos="6067"/>
+        </w:tabs>
+        <w:ind w:left="720"/>
+      </w:pPr>
+      <w:r>
+        <w:t xml:space="preserve">      +-- Worker Nodes</w:t>
+      </w:r>
+    </w:p>
+    <w:p>
+      <w:pPr>
+        <w:tabs>
+          <w:tab w:val="left" w:pos="6067"/>
+        </w:tabs>
+      </w:pPr>
+      <w:r>
+        <w:sym w:font="Wingdings" w:char="F0E0"/>
+      </w:r>
+      <w:r>
+        <w:t xml:space="preserve"> </w:t>
+      </w:r>
+      <w:r>
+        <w:t>The cloud provider handles significant portions of the control-plane management.</w:t>
+      </w:r>
+    </w:p>
+    <w:p>
+      <w:pPr>
+        <w:tabs>
+          <w:tab w:val="left" w:pos="6067"/>
+        </w:tabs>
+      </w:pPr>
+      <w:r>
+        <w:rPr>
+          <w:b/>
+          <w:bCs/>
+        </w:rPr>
+        <w:t>Interview point:</w:t>
+      </w:r>
+      <w:r>
+        <w:t xml:space="preserve"> </w:t>
+      </w:r>
+      <w:r>
+        <w:t>Kubernetes is the open-source orchestration platform; EKS is AWS's managed Kubernetes service.</w:t>
+      </w:r>
+    </w:p>
+    <w:p>
+      <w:pPr>
+        <w:tabs>
+          <w:tab w:val="left" w:pos="6067"/>
+        </w:tabs>
+      </w:pPr>
+    </w:p>
+    <w:p>
+      <w:pPr>
+        <w:tabs>
+          <w:tab w:val="left" w:pos="6067"/>
+        </w:tabs>
+        <w:rPr>
+          <w:b/>
+          <w:bCs/>
+        </w:rPr>
+      </w:pPr>
+      <w:r>
+        <w:rPr>
+          <w:b/>
+          <w:bCs/>
+        </w:rPr>
+        <w:t>5. Why Do We Need Tools Like KOPS?</w:t>
+      </w:r>
+    </w:p>
+    <w:p>
+      <w:pPr>
+        <w:tabs>
+          <w:tab w:val="left" w:pos="6067"/>
+        </w:tabs>
+      </w:pPr>
+      <w:r>
+        <w:t>Imagine an organization has:</w:t>
+      </w:r>
+    </w:p>
+    <w:p>
+      <w:pPr>
+        <w:tabs>
+          <w:tab w:val="left" w:pos="6067"/>
+        </w:tabs>
+        <w:ind w:left="720"/>
+      </w:pPr>
+      <w:r>
+        <w:t>Cluster 1</w:t>
+      </w:r>
+    </w:p>
+    <w:p>
+      <w:pPr>
+        <w:tabs>
+          <w:tab w:val="left" w:pos="6067"/>
+        </w:tabs>
+        <w:ind w:left="720"/>
+      </w:pPr>
+      <w:r>
+        <w:t>Cluster 2</w:t>
+      </w:r>
+    </w:p>
+    <w:p>
+      <w:pPr>
+        <w:tabs>
+          <w:tab w:val="left" w:pos="6067"/>
+        </w:tabs>
+        <w:ind w:left="720"/>
+      </w:pPr>
+      <w:r>
+        <w:t>Cluster 3</w:t>
+      </w:r>
+    </w:p>
+    <w:p>
+      <w:pPr>
+        <w:tabs>
+          <w:tab w:val="left" w:pos="6067"/>
+        </w:tabs>
+        <w:ind w:left="720"/>
+      </w:pPr>
+      <w:r>
+        <w:t>...</w:t>
+      </w:r>
+    </w:p>
+    <w:p>
+      <w:pPr>
+        <w:tabs>
+          <w:tab w:val="left" w:pos="6067"/>
+        </w:tabs>
+        <w:ind w:left="720"/>
+      </w:pPr>
+      <w:r>
+        <w:t>Cluster 100</w:t>
+      </w:r>
+    </w:p>
+    <w:p>
+      <w:pPr>
+        <w:tabs>
+          <w:tab w:val="left" w:pos="6067"/>
+        </w:tabs>
+      </w:pPr>
+      <w:r>
+        <w:t>Creating and maintaining every cluster manually would be extremely difficult.</w:t>
+      </w:r>
+    </w:p>
+    <w:p>
+      <w:pPr>
+        <w:tabs>
+          <w:tab w:val="left" w:pos="6067"/>
+        </w:tabs>
+      </w:pPr>
+      <w:r>
+        <w:t>Instead, use automation.</w:t>
+      </w:r>
+    </w:p>
+    <w:p>
+      <w:pPr>
+        <w:tabs>
+          <w:tab w:val="left" w:pos="6067"/>
+        </w:tabs>
+      </w:pPr>
+      <w:r>
+        <w:t xml:space="preserve">              </w:t>
+      </w:r>
+    </w:p>
+    <w:p>
+      <w:pPr>
+        <w:tabs>
+          <w:tab w:val="left" w:pos="6067"/>
+        </w:tabs>
+      </w:pPr>
+    </w:p>
+    <w:p>
+      <w:pPr>
+        <w:tabs>
+          <w:tab w:val="left" w:pos="6067"/>
+        </w:tabs>
+      </w:pPr>
+    </w:p>
+    <w:p>
+      <w:pPr>
+        <w:tabs>
+          <w:tab w:val="left" w:pos="6067"/>
+        </w:tabs>
+      </w:pPr>
+    </w:p>
+    <w:p>
+      <w:pPr>
+        <w:tabs>
+          <w:tab w:val="left" w:pos="6067"/>
+        </w:tabs>
+      </w:pPr>
+    </w:p>
+    <w:p>
+      <w:pPr>
+        <w:tabs>
+          <w:tab w:val="left" w:pos="6067"/>
+        </w:tabs>
+      </w:pPr>
+    </w:p>
+    <w:p>
+      <w:pPr>
+        <w:tabs>
+          <w:tab w:val="left" w:pos="6067"/>
+        </w:tabs>
+      </w:pPr>
+      <w:r>
+        <w:lastRenderedPageBreak/>
+        <w:t xml:space="preserve">                                                                                  </w:t>
+      </w:r>
+      <w:r>
+        <w:t>KOPS</w:t>
+      </w:r>
+    </w:p>
+    <w:p>
+      <w:pPr>
+        <w:tabs>
+          <w:tab w:val="left" w:pos="6067"/>
+        </w:tabs>
+      </w:pPr>
+      <w:r>
+        <w:t xml:space="preserve">                </w:t>
+      </w:r>
+      <w:r>
+        <w:t xml:space="preserve">                                                                      </w:t>
+      </w:r>
+      <w:r>
+        <w:t>|</w:t>
+      </w:r>
+    </w:p>
+    <w:p>
+      <w:pPr>
+        <w:tabs>
+          <w:tab w:val="left" w:pos="6067"/>
+        </w:tabs>
+      </w:pPr>
+      <w:r>
+        <w:t xml:space="preserve">       +-----</w:t>
+      </w:r>
+      <w:r>
+        <w:t>-------------------------------------------------</w:t>
+      </w:r>
+      <w:r>
+        <w:t>---+----</w:t>
+      </w:r>
+      <w:r>
+        <w:t>------------------------------------------------</w:t>
+      </w:r>
+      <w:r>
+        <w:t>----+</w:t>
+      </w:r>
+    </w:p>
+    <w:p>
+      <w:pPr>
+        <w:tabs>
+          <w:tab w:val="left" w:pos="6067"/>
+        </w:tabs>
+      </w:pPr>
+      <w:r>
+        <w:t xml:space="preserve">       |        </w:t>
+      </w:r>
+      <w:r>
+        <w:t xml:space="preserve">                                                                      </w:t>
+      </w:r>
+      <w:r>
+        <w:t>|</w:t>
+      </w:r>
+      <w:r>
+        <w:t xml:space="preserve">                                                                    </w:t>
+      </w:r>
+      <w:r>
+        <w:t xml:space="preserve">        |</w:t>
+      </w:r>
+    </w:p>
+    <w:p>
+      <w:pPr>
+        <w:tabs>
+          <w:tab w:val="left" w:pos="6067"/>
+        </w:tabs>
+      </w:pPr>
+      <w:r>
+        <w:t xml:space="preserve">    Cluster1 </w:t>
+      </w:r>
+      <w:r>
+        <w:t xml:space="preserve">                                                            </w:t>
+      </w:r>
+      <w:r>
+        <w:t xml:space="preserve">Cluster2 </w:t>
+      </w:r>
+      <w:r>
+        <w:t xml:space="preserve">                                                              </w:t>
+      </w:r>
+      <w:r>
+        <w:t>Cluster3</w:t>
+      </w:r>
+    </w:p>
+    <w:p>
+      <w:pPr>
+        <w:tabs>
+          <w:tab w:val="left" w:pos="6067"/>
+        </w:tabs>
+      </w:pPr>
+      <w:r>
+        <w:t xml:space="preserve">       |       </w:t>
+      </w:r>
+      <w:r>
+        <w:t xml:space="preserve">                                                                      </w:t>
+      </w:r>
+      <w:r>
+        <w:t xml:space="preserve"> |        </w:t>
+      </w:r>
+      <w:r>
+        <w:t xml:space="preserve">                                                                     </w:t>
+      </w:r>
+      <w:r>
+        <w:t>|</w:t>
+      </w:r>
+    </w:p>
+    <w:p>
+      <w:pPr>
+        <w:tabs>
+          <w:tab w:val="left" w:pos="6067"/>
+        </w:tabs>
+      </w:pPr>
+      <w:r>
+        <w:t xml:space="preserve">    Workers  </w:t>
+      </w:r>
+      <w:r>
+        <w:t xml:space="preserve">                                                            </w:t>
+      </w:r>
+      <w:proofErr w:type="spellStart"/>
+      <w:r>
+        <w:t>Workers</w:t>
+      </w:r>
+      <w:proofErr w:type="spellEnd"/>
+      <w:r>
+        <w:t xml:space="preserve">  </w:t>
+      </w:r>
+      <w:r>
+        <w:t xml:space="preserve">                                                              </w:t>
+      </w:r>
+      <w:proofErr w:type="spellStart"/>
+      <w:r>
+        <w:t>Workers</w:t>
+      </w:r>
+      <w:proofErr w:type="spellEnd"/>
+    </w:p>
+    <w:p>
+      <w:pPr>
+        <w:tabs>
+          <w:tab w:val="left" w:pos="6067"/>
+        </w:tabs>
+      </w:pPr>
+      <w:r>
+        <w:t>KOPS automates many cluster lifecycle operations.</w:t>
+      </w:r>
+    </w:p>
+    <w:p>
+      <w:pPr>
+        <w:tabs>
+          <w:tab w:val="left" w:pos="6067"/>
+        </w:tabs>
+      </w:pPr>
+    </w:p>
+    <w:p>
+      <w:pPr>
+        <w:tabs>
+          <w:tab w:val="left" w:pos="6067"/>
+        </w:tabs>
+      </w:pPr>
+      <w:r>
+        <w:t>6. What is KOPS?</w:t>
+      </w:r>
+    </w:p>
+    <w:p>
+      <w:pPr>
+        <w:tabs>
+          <w:tab w:val="left" w:pos="6067"/>
+        </w:tabs>
+      </w:pPr>
+      <w:r>
+        <w:t>KOPS = Kubernetes Operations</w:t>
+      </w:r>
+    </w:p>
+    <w:p>
+      <w:pPr>
+        <w:tabs>
+          <w:tab w:val="left" w:pos="6067"/>
+        </w:tabs>
+      </w:pPr>
+      <w:r>
+        <w:t>KOPS is a tool used to create and manage Kubernetes clusters, particularly on AWS.</w:t>
+      </w:r>
+    </w:p>
+    <w:p>
+      <w:pPr>
+        <w:tabs>
+          <w:tab w:val="left" w:pos="6067"/>
+        </w:tabs>
+      </w:pPr>
+      <w:r>
+        <w:t>It helps with:</w:t>
+      </w:r>
+    </w:p>
+    <w:p>
+      <w:pPr>
+        <w:numPr>
+          <w:ilvl w:val="0"/>
+          <w:numId w:val="13"/>
+        </w:numPr>
+        <w:tabs>
+          <w:tab w:val="left" w:pos="6067"/>
+        </w:tabs>
+      </w:pPr>
+      <w:r>
+        <w:t xml:space="preserve">Cluster creation </w:t>
+      </w:r>
+    </w:p>
+    <w:p>
+      <w:pPr>
+        <w:numPr>
+          <w:ilvl w:val="0"/>
+          <w:numId w:val="13"/>
+        </w:numPr>
+        <w:tabs>
+          <w:tab w:val="left" w:pos="6067"/>
+        </w:tabs>
+      </w:pPr>
+      <w:r>
+        <w:t xml:space="preserve">Configuration </w:t>
+      </w:r>
+    </w:p>
+    <w:p>
+      <w:pPr>
+        <w:numPr>
+          <w:ilvl w:val="0"/>
+          <w:numId w:val="13"/>
+        </w:numPr>
+        <w:tabs>
+          <w:tab w:val="left" w:pos="6067"/>
+        </w:tabs>
+      </w:pPr>
+      <w:r>
+        <w:t xml:space="preserve">Updates </w:t>
+      </w:r>
+    </w:p>
+    <w:p>
+      <w:pPr>
+        <w:numPr>
+          <w:ilvl w:val="0"/>
+          <w:numId w:val="13"/>
+        </w:numPr>
+        <w:tabs>
+          <w:tab w:val="left" w:pos="6067"/>
+        </w:tabs>
+      </w:pPr>
+      <w:r>
+        <w:t xml:space="preserve">Upgrades </w:t>
+      </w:r>
+    </w:p>
+    <w:p>
+      <w:pPr>
+        <w:numPr>
+          <w:ilvl w:val="0"/>
+          <w:numId w:val="13"/>
+        </w:numPr>
+        <w:tabs>
+          <w:tab w:val="left" w:pos="6067"/>
+        </w:tabs>
+      </w:pPr>
+      <w:r>
+        <w:t xml:space="preserve">Cluster lifecycle management </w:t>
+      </w:r>
+    </w:p>
+    <w:p>
+      <w:pPr>
+        <w:numPr>
+          <w:ilvl w:val="0"/>
+          <w:numId w:val="13"/>
+        </w:numPr>
+        <w:tabs>
+          <w:tab w:val="left" w:pos="6067"/>
+        </w:tabs>
+      </w:pPr>
+      <w:r>
+        <w:t>Cluster deletion</w:t>
+      </w:r>
+    </w:p>
+    <w:p>
+      <w:pPr>
+        <w:tabs>
+          <w:tab w:val="left" w:pos="6067"/>
+        </w:tabs>
+      </w:pPr>
+    </w:p>
+    <w:p>
+      <w:pPr>
+        <w:tabs>
+          <w:tab w:val="left" w:pos="6067"/>
+        </w:tabs>
+      </w:pPr>
+      <w:r>
+        <w:t>7. KOPS vs Manual Kubernetes Installation</w:t>
+      </w:r>
+    </w:p>
+    <w:p>
+      <w:pPr>
+        <w:tabs>
+          <w:tab w:val="left" w:pos="6067"/>
+        </w:tabs>
+      </w:pPr>
+      <w:r>
+        <w:t>Without KOPS</w:t>
+      </w:r>
+    </w:p>
+    <w:p>
+      <w:pPr>
+        <w:tabs>
+          <w:tab w:val="left" w:pos="6067"/>
+        </w:tabs>
+      </w:pPr>
+      <w:r>
+        <w:t>You may have to manually configure:</w:t>
+      </w:r>
+    </w:p>
+    <w:p>
+      <w:pPr>
+        <w:tabs>
+          <w:tab w:val="left" w:pos="6067"/>
+        </w:tabs>
+        <w:ind w:left="2880"/>
+      </w:pPr>
+      <w:r>
+        <w:t>EC2</w:t>
+      </w:r>
+    </w:p>
+    <w:p>
+      <w:pPr>
+        <w:tabs>
+          <w:tab w:val="left" w:pos="6067"/>
+        </w:tabs>
+        <w:ind w:left="2880"/>
+      </w:pPr>
+      <w:r>
+        <w:t xml:space="preserve"> ↓</w:t>
+      </w:r>
+    </w:p>
+    <w:p>
+      <w:pPr>
+        <w:tabs>
+          <w:tab w:val="left" w:pos="6067"/>
+        </w:tabs>
+        <w:ind w:left="2880"/>
+      </w:pPr>
+      <w:r>
+        <w:t>Networking</w:t>
+      </w:r>
+    </w:p>
+    <w:p>
+      <w:pPr>
+        <w:tabs>
+          <w:tab w:val="left" w:pos="6067"/>
+        </w:tabs>
+        <w:ind w:left="2880"/>
+      </w:pPr>
+      <w:r>
+        <w:t xml:space="preserve"> ↓</w:t>
+      </w:r>
+    </w:p>
+    <w:p>
+      <w:pPr>
+        <w:tabs>
+          <w:tab w:val="left" w:pos="6067"/>
+        </w:tabs>
+        <w:ind w:left="2880"/>
+      </w:pPr>
+      <w:r>
+        <w:t>Control Plane</w:t>
+      </w:r>
+    </w:p>
+    <w:p>
+      <w:pPr>
+        <w:tabs>
+          <w:tab w:val="left" w:pos="6067"/>
+        </w:tabs>
+        <w:ind w:left="2880"/>
+      </w:pPr>
+      <w:r>
+        <w:t xml:space="preserve"> ↓</w:t>
+      </w:r>
+    </w:p>
+    <w:p>
+      <w:pPr>
+        <w:tabs>
+          <w:tab w:val="left" w:pos="6067"/>
+        </w:tabs>
+        <w:ind w:left="2880"/>
+      </w:pPr>
+      <w:proofErr w:type="spellStart"/>
+      <w:r>
+        <w:t>etcd</w:t>
+      </w:r>
+      <w:proofErr w:type="spellEnd"/>
+    </w:p>
+    <w:p>
+      <w:pPr>
+        <w:tabs>
+          <w:tab w:val="left" w:pos="6067"/>
+        </w:tabs>
+        <w:ind w:left="2880"/>
+      </w:pPr>
+      <w:r>
+        <w:t xml:space="preserve"> ↓</w:t>
+      </w:r>
+    </w:p>
+    <w:p>
+      <w:pPr>
+        <w:tabs>
+          <w:tab w:val="left" w:pos="6067"/>
+        </w:tabs>
+        <w:ind w:left="2880"/>
+      </w:pPr>
+      <w:r>
+        <w:lastRenderedPageBreak/>
+        <w:t>Worker Nodes</w:t>
+      </w:r>
+    </w:p>
+    <w:p>
+      <w:pPr>
+        <w:tabs>
+          <w:tab w:val="left" w:pos="6067"/>
+        </w:tabs>
+        <w:ind w:left="2880"/>
+      </w:pPr>
+      <w:r>
+        <w:t xml:space="preserve"> ↓</w:t>
+      </w:r>
+    </w:p>
+    <w:p>
+      <w:pPr>
+        <w:tabs>
+          <w:tab w:val="left" w:pos="6067"/>
+        </w:tabs>
+        <w:ind w:left="2880"/>
+      </w:pPr>
+      <w:r>
+        <w:t>Certificates</w:t>
+      </w:r>
+    </w:p>
+    <w:p>
+      <w:pPr>
+        <w:tabs>
+          <w:tab w:val="left" w:pos="6067"/>
+        </w:tabs>
+        <w:ind w:left="2880"/>
+      </w:pPr>
+      <w:r>
+        <w:t xml:space="preserve"> ↓</w:t>
+      </w:r>
+    </w:p>
+    <w:p>
+      <w:pPr>
+        <w:tabs>
+          <w:tab w:val="left" w:pos="6067"/>
+        </w:tabs>
+        <w:ind w:left="2880"/>
+      </w:pPr>
+      <w:r>
+        <w:t>Networking</w:t>
+      </w:r>
+    </w:p>
+    <w:p>
+      <w:pPr>
+        <w:tabs>
+          <w:tab w:val="left" w:pos="6067"/>
+        </w:tabs>
+        <w:ind w:left="2880"/>
+      </w:pPr>
+      <w:r>
+        <w:t xml:space="preserve"> ↓</w:t>
+      </w:r>
+    </w:p>
+    <w:p>
+      <w:pPr>
+        <w:tabs>
+          <w:tab w:val="left" w:pos="6067"/>
+        </w:tabs>
+        <w:ind w:left="2880"/>
+      </w:pPr>
+      <w:r>
+        <w:t>Storage</w:t>
+      </w:r>
+    </w:p>
+    <w:p>
+      <w:pPr>
+        <w:tabs>
+          <w:tab w:val="left" w:pos="6067"/>
+        </w:tabs>
+        <w:ind w:left="2880"/>
+      </w:pPr>
+      <w:r>
+        <w:t xml:space="preserve"> ↓</w:t>
+      </w:r>
+    </w:p>
+    <w:p>
+      <w:pPr>
+        <w:tabs>
+          <w:tab w:val="left" w:pos="6067"/>
+        </w:tabs>
+        <w:ind w:left="2880"/>
+      </w:pPr>
+      <w:r>
+        <w:t>Kubernetes</w:t>
+      </w:r>
+    </w:p>
+    <w:p>
+      <w:pPr>
+        <w:tabs>
+          <w:tab w:val="left" w:pos="6067"/>
+        </w:tabs>
+      </w:pPr>
+      <w:r>
+        <w:t>This becomes difficult when the number of clusters increases.</w:t>
+      </w:r>
+    </w:p>
+    <w:p>
+      <w:pPr>
+        <w:tabs>
+          <w:tab w:val="left" w:pos="6067"/>
+        </w:tabs>
+        <w:rPr>
+          <w:b/>
+          <w:bCs/>
+        </w:rPr>
+      </w:pPr>
+      <w:r>
+        <w:rPr>
+          <w:b/>
+          <w:bCs/>
+        </w:rPr>
+        <w:t>With KOPS</w:t>
+      </w:r>
+    </w:p>
+    <w:p>
+      <w:pPr>
+        <w:tabs>
+          <w:tab w:val="left" w:pos="6067"/>
+        </w:tabs>
+        <w:ind w:left="720"/>
+      </w:pPr>
+      <w:r>
+        <w:t>KOPS</w:t>
+      </w:r>
+    </w:p>
+    <w:p>
+      <w:pPr>
+        <w:tabs>
+          <w:tab w:val="left" w:pos="6067"/>
+        </w:tabs>
+        <w:ind w:left="720"/>
+      </w:pPr>
+      <w:r>
+        <w:t xml:space="preserve">  |</w:t>
+      </w:r>
+    </w:p>
+    <w:p>
+      <w:pPr>
+        <w:tabs>
+          <w:tab w:val="left" w:pos="6067"/>
+        </w:tabs>
+        <w:ind w:left="720"/>
+      </w:pPr>
+      <w:r>
+        <w:t xml:space="preserve">  +--&gt; Infrastructure</w:t>
+      </w:r>
+    </w:p>
+    <w:p>
+      <w:pPr>
+        <w:tabs>
+          <w:tab w:val="left" w:pos="6067"/>
+        </w:tabs>
+        <w:ind w:left="720"/>
+      </w:pPr>
+      <w:r>
+        <w:t xml:space="preserve">  +--&gt; Kubernetes</w:t>
+      </w:r>
+    </w:p>
+    <w:p>
+      <w:pPr>
+        <w:tabs>
+          <w:tab w:val="left" w:pos="6067"/>
+        </w:tabs>
+        <w:ind w:left="720"/>
+      </w:pPr>
+      <w:r>
+        <w:t xml:space="preserve">  +--&gt; Configuration</w:t>
+      </w:r>
+    </w:p>
+    <w:p>
+      <w:pPr>
+        <w:tabs>
+          <w:tab w:val="left" w:pos="6067"/>
+        </w:tabs>
+        <w:ind w:left="720"/>
+      </w:pPr>
+      <w:r>
+        <w:t xml:space="preserve">  +--&gt; Networking</w:t>
+      </w:r>
+    </w:p>
+    <w:p>
+      <w:pPr>
+        <w:tabs>
+          <w:tab w:val="left" w:pos="6067"/>
+        </w:tabs>
+        <w:ind w:left="720"/>
+      </w:pPr>
+      <w:r>
+        <w:t xml:space="preserve">  +--&gt; Cluster lifecycle</w:t>
+      </w:r>
+    </w:p>
+    <w:p>
+      <w:pPr>
+        <w:tabs>
+          <w:tab w:val="left" w:pos="6067"/>
+        </w:tabs>
+      </w:pPr>
+      <w:r>
+        <w:t>Automation reduces repetitive manual work.</w:t>
+      </w:r>
+    </w:p>
+    <w:p>
+      <w:pPr>
+        <w:tabs>
+          <w:tab w:val="left" w:pos="6067"/>
+        </w:tabs>
+      </w:pPr>
+    </w:p>
+    <w:p>
+      <w:pPr>
+        <w:tabs>
+          <w:tab w:val="left" w:pos="6067"/>
+        </w:tabs>
+        <w:rPr>
+          <w:b/>
+          <w:bCs/>
+        </w:rPr>
+      </w:pPr>
+      <w:r>
+        <w:rPr>
+          <w:b/>
+          <w:bCs/>
+        </w:rPr>
+        <w:t>8. Other Kubernetes Management Options</w:t>
+      </w:r>
+    </w:p>
+    <w:p>
+      <w:pPr>
+        <w:tabs>
+          <w:tab w:val="left" w:pos="6067"/>
+        </w:tabs>
+      </w:pPr>
+      <w:r>
+        <w:t>The video mentions several alternatives:</w:t>
+      </w:r>
+    </w:p>
+    <w:p>
+      <w:pPr>
+        <w:tabs>
+          <w:tab w:val="left" w:pos="6067"/>
+        </w:tabs>
+        <w:rPr>
+          <w:b/>
+          <w:bCs/>
+        </w:rPr>
+      </w:pPr>
+      <w:r>
+        <w:rPr>
+          <w:b/>
+          <w:bCs/>
+        </w:rPr>
+        <w:t>1. EKS</w:t>
+      </w:r>
+    </w:p>
+    <w:p>
+      <w:pPr>
+        <w:tabs>
+          <w:tab w:val="left" w:pos="6067"/>
+        </w:tabs>
+      </w:pPr>
+      <w:r>
+        <w:t>AWS managed Kubernetes.</w:t>
+      </w:r>
+    </w:p>
+    <w:p>
+      <w:pPr>
+        <w:tabs>
+          <w:tab w:val="left" w:pos="6067"/>
+        </w:tabs>
+        <w:rPr>
+          <w:b/>
+          <w:bCs/>
+        </w:rPr>
+      </w:pPr>
+      <w:r>
+        <w:rPr>
+          <w:b/>
+          <w:bCs/>
+        </w:rPr>
+        <w:t>2. GKE</w:t>
+      </w:r>
+    </w:p>
+    <w:p>
+      <w:pPr>
+        <w:tabs>
+          <w:tab w:val="left" w:pos="6067"/>
+        </w:tabs>
+      </w:pPr>
+      <w:r>
+        <w:t>Google Cloud managed Kubernetes.</w:t>
+      </w:r>
+    </w:p>
+    <w:p>
+      <w:pPr>
+        <w:tabs>
+          <w:tab w:val="left" w:pos="6067"/>
+        </w:tabs>
+        <w:rPr>
+          <w:b/>
+          <w:bCs/>
+        </w:rPr>
+      </w:pPr>
+      <w:r>
+        <w:rPr>
+          <w:b/>
+          <w:bCs/>
+        </w:rPr>
+        <w:t>3. AKS</w:t>
+      </w:r>
+    </w:p>
+    <w:p>
+      <w:pPr>
+        <w:tabs>
+          <w:tab w:val="left" w:pos="6067"/>
+        </w:tabs>
+      </w:pPr>
+      <w:r>
+        <w:t>Azure managed Kubernetes.</w:t>
+      </w:r>
+    </w:p>
+    <w:p>
+      <w:pPr>
+        <w:tabs>
+          <w:tab w:val="left" w:pos="6067"/>
+        </w:tabs>
+        <w:rPr>
+          <w:b/>
+          <w:bCs/>
+        </w:rPr>
+      </w:pPr>
+      <w:r>
+        <w:rPr>
+          <w:b/>
+          <w:bCs/>
+        </w:rPr>
+        <w:t>4. OpenShift</w:t>
+      </w:r>
+    </w:p>
+    <w:p>
+      <w:pPr>
+        <w:tabs>
+          <w:tab w:val="left" w:pos="6067"/>
+        </w:tabs>
+      </w:pPr>
+      <w:r>
+        <w:t>Red Hat's Kubernetes platform.</w:t>
+      </w:r>
+    </w:p>
+    <w:p>
+      <w:pPr>
+        <w:tabs>
+          <w:tab w:val="left" w:pos="6067"/>
+        </w:tabs>
+        <w:rPr>
+          <w:b/>
+          <w:bCs/>
+        </w:rPr>
+      </w:pPr>
+      <w:r>
+        <w:rPr>
+          <w:b/>
+          <w:bCs/>
+        </w:rPr>
+        <w:t>5. Rancher</w:t>
+      </w:r>
+    </w:p>
+    <w:p>
+      <w:pPr>
+        <w:tabs>
+          <w:tab w:val="left" w:pos="6067"/>
+        </w:tabs>
+      </w:pPr>
+      <w:r>
+        <w:lastRenderedPageBreak/>
+        <w:t>Kubernetes management platform.</w:t>
+      </w:r>
+    </w:p>
+    <w:p>
+      <w:pPr>
+        <w:tabs>
+          <w:tab w:val="left" w:pos="6067"/>
+        </w:tabs>
+        <w:rPr>
+          <w:b/>
+          <w:bCs/>
+        </w:rPr>
+      </w:pPr>
+      <w:r>
+        <w:rPr>
+          <w:b/>
+          <w:bCs/>
+        </w:rPr>
+        <w:t>6. Tanzu</w:t>
+      </w:r>
+    </w:p>
+    <w:p>
+      <w:pPr>
+        <w:tabs>
+          <w:tab w:val="left" w:pos="6067"/>
+        </w:tabs>
+      </w:pPr>
+      <w:r>
+        <w:t>VMware's Kubernetes platform.</w:t>
+      </w:r>
+    </w:p>
+    <w:p>
+      <w:pPr>
+        <w:tabs>
+          <w:tab w:val="left" w:pos="6067"/>
+        </w:tabs>
+        <w:rPr>
+          <w:b/>
+          <w:bCs/>
+        </w:rPr>
+      </w:pPr>
+      <w:r>
+        <w:rPr>
+          <w:b/>
+          <w:bCs/>
+        </w:rPr>
+        <w:t>7. KOPS</w:t>
+      </w:r>
+    </w:p>
+    <w:p>
+      <w:pPr>
+        <w:tabs>
+          <w:tab w:val="left" w:pos="6067"/>
+        </w:tabs>
+      </w:pPr>
+      <w:r>
+        <w:t>Kubernetes cluster lifecycle management tool, particularly associated with AWS.</w:t>
+      </w:r>
+    </w:p>
+    <w:p>
+      <w:pPr>
+        <w:tabs>
+          <w:tab w:val="left" w:pos="6067"/>
+        </w:tabs>
+      </w:pPr>
+    </w:p>
+    <w:p>
+      <w:pPr>
+        <w:tabs>
+          <w:tab w:val="left" w:pos="6067"/>
+        </w:tabs>
+        <w:rPr>
+          <w:b/>
+          <w:bCs/>
+        </w:rPr>
+      </w:pPr>
+      <w:r>
+        <w:rPr>
+          <w:b/>
+          <w:bCs/>
+        </w:rPr>
+        <w:t>9. KOPS Architecture — Simple View</w:t>
+      </w:r>
+    </w:p>
+    <w:p>
+      <w:pPr>
+        <w:tabs>
+          <w:tab w:val="left" w:pos="6067"/>
+        </w:tabs>
+      </w:pPr>
+      <w:r>
+        <w:t>A useful mental model:</w:t>
+      </w:r>
+    </w:p>
+    <w:p>
+      <w:pPr>
+        <w:tabs>
+          <w:tab w:val="left" w:pos="6067"/>
+        </w:tabs>
+      </w:pPr>
+      <w:r>
+        <w:drawing>
+          <wp:inline distT="0" distB="0" distL="0" distR="0" wp14:anchorId="4FC8355B" wp14:editId="4EB3C3BE">
+            <wp:extent cx="3330229" cy="5357324"/>
+            <wp:effectExtent l="0" t="0" r="3810" b="0"/>
+            <wp:docPr id="601758263" name="Picture 1"/>
+            <wp:cNvGraphicFramePr>
+              <a:graphicFrameLocks xmlns:a="http://schemas.openxmlformats.org/drawingml/2006/main" noChangeAspect="1"/>
+            </wp:cNvGraphicFramePr>
+            <a:graphic xmlns:a="http://schemas.openxmlformats.org/drawingml/2006/main">
+              <a:graphicData uri="http://schemas.openxmlformats.org/drawingml/2006/picture">
+                <pic:pic xmlns:pic="http://schemas.openxmlformats.org/drawingml/2006/picture">
+                  <pic:nvPicPr>
+                    <pic:cNvPr id="601758263" name=""/>
+                    <pic:cNvPicPr/>
+                  </pic:nvPicPr>
+                  <pic:blipFill>
+                    <a:blip r:embed="rId7"/>
+                    <a:stretch>
+                      <a:fillRect/>
+                    </a:stretch>
+                  </pic:blipFill>
+                  <pic:spPr>
+                    <a:xfrm>
+                      <a:off x="0" y="0"/>
+                      <a:ext cx="3330229" cy="5357324"/>
+                    </a:xfrm>
+                    <a:prstGeom prst="rect">
+                      <a:avLst/>
+                    </a:prstGeom>
+                  </pic:spPr>
+                </pic:pic>
+              </a:graphicData>
+            </a:graphic>
+          </wp:inline>
+        </w:drawing>
+      </w:r>
+    </w:p>
+    <w:p>
+      <w:pPr>
+        <w:tabs>
+          <w:tab w:val="left" w:pos="6067"/>
+        </w:tabs>
+        <w:rPr>
+          <w:b/>
+          <w:bCs/>
+        </w:rPr>
+      </w:pPr>
+      <w:r>
+        <w:rPr>
+          <w:b/>
+          <w:bCs/>
+        </w:rPr>
+        <w:t>Important AWS services involved</w:t>
+      </w:r>
+    </w:p>
+    <w:p>
+      <w:pPr>
+        <w:numPr>
+          <w:ilvl w:val="0"/>
+          <w:numId w:val="14"/>
+        </w:numPr>
+        <w:tabs>
+          <w:tab w:val="left" w:pos="6067"/>
+        </w:tabs>
+      </w:pPr>
+      <w:r>
+        <w:rPr>
+          <w:b/>
+          <w:bCs/>
+        </w:rPr>
+        <w:t>EC2</w:t>
+      </w:r>
+      <w:r>
+        <w:t xml:space="preserve"> → compute </w:t>
+      </w:r>
+    </w:p>
+    <w:p>
+      <w:pPr>
+        <w:numPr>
+          <w:ilvl w:val="0"/>
+          <w:numId w:val="14"/>
+        </w:numPr>
+        <w:tabs>
+          <w:tab w:val="left" w:pos="6067"/>
+        </w:tabs>
+      </w:pPr>
+      <w:r>
+        <w:rPr>
+          <w:b/>
+          <w:bCs/>
+        </w:rPr>
+        <w:t>EBS</w:t>
+      </w:r>
+      <w:r>
+        <w:t xml:space="preserve"> → persistent storage </w:t>
+      </w:r>
+    </w:p>
+    <w:p>
+      <w:pPr>
+        <w:numPr>
+          <w:ilvl w:val="0"/>
+          <w:numId w:val="14"/>
+        </w:numPr>
+        <w:tabs>
+          <w:tab w:val="left" w:pos="6067"/>
+        </w:tabs>
+      </w:pPr>
+      <w:r>
+        <w:rPr>
+          <w:b/>
+          <w:bCs/>
+        </w:rPr>
+        <w:t>S3</w:t>
+      </w:r>
+      <w:r>
+        <w:t xml:space="preserve"> → KOPS cluster configuration/state </w:t>
+      </w:r>
+    </w:p>
+    <w:p>
+      <w:pPr>
+        <w:numPr>
+          <w:ilvl w:val="0"/>
+          <w:numId w:val="14"/>
+        </w:numPr>
+        <w:tabs>
+          <w:tab w:val="left" w:pos="6067"/>
+        </w:tabs>
+      </w:pPr>
+      <w:r>
+        <w:rPr>
+          <w:b/>
+          <w:bCs/>
+        </w:rPr>
+        <w:lastRenderedPageBreak/>
+        <w:t>Route 53</w:t>
+      </w:r>
+      <w:r>
+        <w:t xml:space="preserve"> → DNS</w:t>
+      </w:r>
+    </w:p>
+    <w:p>
+      <w:pPr>
+        <w:tabs>
+          <w:tab w:val="left" w:pos="6067"/>
+        </w:tabs>
+      </w:pPr>
+    </w:p>
+    <w:p>
+      <w:pPr>
+        <w:tabs>
+          <w:tab w:val="left" w:pos="6067"/>
+        </w:tabs>
+        <w:rPr>
+          <w:b/>
+          <w:bCs/>
+        </w:rPr>
+      </w:pPr>
+      <w:r>
+        <w:rPr>
+          <w:b/>
+          <w:bCs/>
+        </w:rPr>
+        <w:t>10. Why S3 is Important in KOPS</w:t>
+      </w:r>
+    </w:p>
+    <w:p>
+      <w:pPr>
+        <w:tabs>
+          <w:tab w:val="left" w:pos="6067"/>
+        </w:tabs>
+      </w:pPr>
+      <w:r>
+        <w:t xml:space="preserve">KOPS uses an </w:t>
+      </w:r>
+      <w:r>
+        <w:rPr>
+          <w:b/>
+          <w:bCs/>
+        </w:rPr>
+        <w:t>S3 bucket to store cluster configuration/state</w:t>
+      </w:r>
+      <w:r>
+        <w:t>.</w:t>
+      </w:r>
+    </w:p>
+    <w:p>
+      <w:pPr>
+        <w:tabs>
+          <w:tab w:val="left" w:pos="6067"/>
+        </w:tabs>
+      </w:pPr>
+      <w:r>
+        <w:t>Conceptually:</w:t>
+      </w:r>
+    </w:p>
+    <w:p>
+      <w:pPr>
+        <w:tabs>
+          <w:tab w:val="left" w:pos="6067"/>
+        </w:tabs>
+        <w:ind w:left="720"/>
+      </w:pPr>
+      <w:r>
+        <w:t xml:space="preserve">            KOPS</w:t>
+      </w:r>
+    </w:p>
+    <w:p>
+      <w:pPr>
+        <w:tabs>
+          <w:tab w:val="left" w:pos="6067"/>
+        </w:tabs>
+        <w:ind w:left="720"/>
+      </w:pPr>
+      <w:r>
+        <w:t xml:space="preserve">                |</w:t>
+      </w:r>
+    </w:p>
+    <w:p>
+      <w:pPr>
+        <w:tabs>
+          <w:tab w:val="left" w:pos="6067"/>
+        </w:tabs>
+        <w:ind w:left="720"/>
+      </w:pPr>
+      <w:r>
+        <w:t xml:space="preserve">                v</w:t>
+      </w:r>
+    </w:p>
+    <w:p>
+      <w:pPr>
+        <w:tabs>
+          <w:tab w:val="left" w:pos="6067"/>
+        </w:tabs>
+        <w:ind w:left="720"/>
+      </w:pPr>
+      <w:r>
+        <w:t xml:space="preserve">              S3</w:t>
+      </w:r>
+    </w:p>
+    <w:p>
+      <w:pPr>
+        <w:tabs>
+          <w:tab w:val="left" w:pos="6067"/>
+        </w:tabs>
+        <w:ind w:left="720"/>
+      </w:pPr>
+      <w:r>
+        <w:t xml:space="preserve">                |</w:t>
+      </w:r>
+    </w:p>
+    <w:p>
+      <w:pPr>
+        <w:tabs>
+          <w:tab w:val="left" w:pos="6067"/>
+        </w:tabs>
+        <w:ind w:left="720"/>
+      </w:pPr>
+      <w:r>
+        <w:t xml:space="preserve">       Cluster configuration</w:t>
+      </w:r>
+    </w:p>
+    <w:p>
+      <w:pPr>
+        <w:tabs>
+          <w:tab w:val="left" w:pos="6067"/>
+        </w:tabs>
+        <w:ind w:left="720"/>
+      </w:pPr>
+      <w:r>
+        <w:t xml:space="preserve">       Cluster state</w:t>
+      </w:r>
+    </w:p>
+    <w:p>
+      <w:pPr>
+        <w:tabs>
+          <w:tab w:val="left" w:pos="6067"/>
+        </w:tabs>
+        <w:ind w:left="720"/>
+      </w:pPr>
+      <w:r>
+        <w:t xml:space="preserve">       Configuration data</w:t>
+      </w:r>
+    </w:p>
+    <w:p>
+      <w:pPr>
+        <w:tabs>
+          <w:tab w:val="left" w:pos="6067"/>
+        </w:tabs>
+      </w:pPr>
+      <w:r>
+        <w:t>Example:</w:t>
+      </w:r>
+      <w:r>
+        <w:t xml:space="preserve"> </w:t>
+      </w:r>
+      <w:r>
+        <w:t>s3://my-kops-bucket</w:t>
+      </w:r>
+    </w:p>
+    <w:p>
+      <w:pPr>
+        <w:tabs>
+          <w:tab w:val="left" w:pos="6067"/>
+        </w:tabs>
+      </w:pPr>
+      <w:r>
+        <w:t>The bucket name needs to be unique within AWS.</w:t>
+      </w:r>
+    </w:p>
+    <w:p>
+      <w:pPr>
+        <w:tabs>
+          <w:tab w:val="left" w:pos="6067"/>
+        </w:tabs>
+      </w:pPr>
+    </w:p>
+    <w:p>
+      <w:pPr>
+        <w:tabs>
+          <w:tab w:val="left" w:pos="6067"/>
+        </w:tabs>
+        <w:rPr>
+          <w:b/>
+          <w:bCs/>
+        </w:rPr>
+      </w:pPr>
+      <w:r>
+        <w:rPr>
+          <w:b/>
+          <w:bCs/>
+        </w:rPr>
+        <w:t>11. AWS CLI Prerequisites</w:t>
+      </w:r>
+    </w:p>
+    <w:p>
+      <w:pPr>
+        <w:tabs>
+          <w:tab w:val="left" w:pos="6067"/>
+        </w:tabs>
+      </w:pPr>
+      <w:r>
+        <w:t>Before using KOPS with AWS, you need AWS CLI configured.</w:t>
+      </w:r>
+    </w:p>
+    <w:p>
+      <w:pPr>
+        <w:tabs>
+          <w:tab w:val="left" w:pos="6067"/>
+        </w:tabs>
+      </w:pPr>
+      <w:r>
+        <w:t>Conceptually:</w:t>
+      </w:r>
+    </w:p>
+    <w:p>
+      <w:pPr>
+        <w:tabs>
+          <w:tab w:val="left" w:pos="6067"/>
+        </w:tabs>
+        <w:ind w:left="720"/>
+      </w:pPr>
+      <w:r>
+        <w:t>AWS CLI</w:t>
+      </w:r>
+    </w:p>
+    <w:p>
+      <w:pPr>
+        <w:tabs>
+          <w:tab w:val="left" w:pos="6067"/>
+        </w:tabs>
+        <w:ind w:left="720"/>
+      </w:pPr>
+      <w:r>
+        <w:t xml:space="preserve">   |</w:t>
+      </w:r>
+    </w:p>
+    <w:p>
+      <w:pPr>
+        <w:tabs>
+          <w:tab w:val="left" w:pos="6067"/>
+        </w:tabs>
+        <w:ind w:left="720"/>
+      </w:pPr>
+      <w:r>
+        <w:t xml:space="preserve">   +-- Access Key</w:t>
+      </w:r>
+    </w:p>
+    <w:p>
+      <w:pPr>
+        <w:tabs>
+          <w:tab w:val="left" w:pos="6067"/>
+        </w:tabs>
+        <w:ind w:left="720"/>
+      </w:pPr>
+      <w:r>
+        <w:t xml:space="preserve">   +-- Secret Access Key</w:t>
+      </w:r>
+    </w:p>
+    <w:p>
+      <w:pPr>
+        <w:tabs>
+          <w:tab w:val="left" w:pos="6067"/>
+        </w:tabs>
+        <w:ind w:left="720"/>
+      </w:pPr>
+      <w:r>
+        <w:t xml:space="preserve">   +-- Region</w:t>
+      </w:r>
+    </w:p>
+    <w:p>
+      <w:pPr>
+        <w:tabs>
+          <w:tab w:val="left" w:pos="6067"/>
+        </w:tabs>
+      </w:pPr>
+      <w:r>
+        <w:t>Configuration is commonly done using:</w:t>
+      </w:r>
+      <w:r>
+        <w:t xml:space="preserve"> </w:t>
+      </w:r>
+      <w:proofErr w:type="spellStart"/>
+      <w:r>
+        <w:t>aws</w:t>
+      </w:r>
+      <w:proofErr w:type="spellEnd"/>
+      <w:r>
+        <w:t xml:space="preserve"> configure</w:t>
+      </w:r>
+    </w:p>
+    <w:p>
+      <w:pPr>
+        <w:tabs>
+          <w:tab w:val="left" w:pos="6067"/>
+        </w:tabs>
+      </w:pPr>
+      <w:r>
+        <w:t>You provide:</w:t>
+      </w:r>
+    </w:p>
+    <w:p>
+      <w:pPr>
+        <w:tabs>
+          <w:tab w:val="left" w:pos="6067"/>
+        </w:tabs>
+        <w:ind w:left="720"/>
+      </w:pPr>
+      <w:r>
+        <w:t>AWS Access Key ID</w:t>
+      </w:r>
+    </w:p>
+    <w:p>
+      <w:pPr>
+        <w:tabs>
+          <w:tab w:val="left" w:pos="6067"/>
+        </w:tabs>
+        <w:ind w:left="720"/>
+      </w:pPr>
+      <w:r>
+        <w:t>AWS Secret Access Key</w:t>
+      </w:r>
+    </w:p>
+    <w:p>
+      <w:pPr>
+        <w:tabs>
+          <w:tab w:val="left" w:pos="6067"/>
+        </w:tabs>
+        <w:ind w:left="720"/>
+      </w:pPr>
+      <w:r>
+        <w:t>Default Region</w:t>
+      </w:r>
+    </w:p>
+    <w:p>
+      <w:pPr>
+        <w:tabs>
+          <w:tab w:val="left" w:pos="6067"/>
+        </w:tabs>
+        <w:ind w:left="720"/>
+      </w:pPr>
+      <w:r>
+        <w:t>Output Format</w:t>
+      </w:r>
+    </w:p>
+    <w:p>
+      <w:pPr>
+        <w:tabs>
+          <w:tab w:val="left" w:pos="6067"/>
+        </w:tabs>
+        <w:rPr>
+          <w:b/>
+          <w:bCs/>
+        </w:rPr>
+      </w:pPr>
+    </w:p>
+    <w:p>
+      <w:pPr>
+        <w:tabs>
+          <w:tab w:val="left" w:pos="6067"/>
+        </w:tabs>
+        <w:rPr>
+          <w:b/>
+          <w:bCs/>
+        </w:rPr>
+      </w:pPr>
+      <w:r>
+        <w:rPr>
+          <w:b/>
+          <w:bCs/>
+        </w:rPr>
+        <w:lastRenderedPageBreak/>
+        <w:t>Security note</w:t>
+      </w:r>
+    </w:p>
+    <w:p>
+      <w:pPr>
+        <w:tabs>
+          <w:tab w:val="left" w:pos="6067"/>
+        </w:tabs>
+      </w:pPr>
+      <w:r>
+        <w:t>For real production environments, avoid using an AWS root account or long-lived credentials unnecessarily. Prefer IAM roles and least-privilege permissions.</w:t>
+      </w:r>
+    </w:p>
+    <w:p>
+      <w:pPr>
+        <w:tabs>
+          <w:tab w:val="left" w:pos="6067"/>
+        </w:tabs>
+      </w:pPr>
+    </w:p>
+    <w:p>
+      <w:pPr>
+        <w:tabs>
+          <w:tab w:val="left" w:pos="6067"/>
+        </w:tabs>
+      </w:pPr>
+      <w:r>
+        <w:t>12. KOPS Prerequisites</w:t>
+      </w:r>
+    </w:p>
+    <w:p>
+      <w:pPr>
+        <w:tabs>
+          <w:tab w:val="left" w:pos="6067"/>
+        </w:tabs>
+        <w:ind w:left="720"/>
+      </w:pPr>
+      <w:r>
+        <w:t>Python 3</w:t>
+      </w:r>
+    </w:p>
+    <w:p>
+      <w:pPr>
+        <w:tabs>
+          <w:tab w:val="left" w:pos="6067"/>
+        </w:tabs>
+        <w:ind w:left="720"/>
+      </w:pPr>
+      <w:r>
+        <w:t>AWS CLI</w:t>
+      </w:r>
+    </w:p>
+    <w:p>
+      <w:pPr>
+        <w:tabs>
+          <w:tab w:val="left" w:pos="6067"/>
+        </w:tabs>
+        <w:ind w:left="720"/>
+      </w:pPr>
+      <w:proofErr w:type="spellStart"/>
+      <w:r>
+        <w:t>kubectl</w:t>
+      </w:r>
+      <w:proofErr w:type="spellEnd"/>
+    </w:p>
+    <w:p>
+      <w:pPr>
+        <w:tabs>
+          <w:tab w:val="left" w:pos="6067"/>
+        </w:tabs>
+        <w:ind w:left="720"/>
+      </w:pPr>
+      <w:r>
+        <w:t>KOPS</w:t>
+      </w:r>
+    </w:p>
+    <w:p>
+      <w:pPr>
+        <w:tabs>
+          <w:tab w:val="left" w:pos="6067"/>
+        </w:tabs>
+      </w:pPr>
+      <w:r>
+        <w:t>Conceptually:</w:t>
+      </w:r>
+    </w:p>
+    <w:p>
+      <w:pPr>
+        <w:tabs>
+          <w:tab w:val="left" w:pos="6067"/>
+        </w:tabs>
+        <w:ind w:left="720"/>
+      </w:pPr>
+      <w:r>
+        <w:t>Python</w:t>
+      </w:r>
+    </w:p>
+    <w:p>
+      <w:pPr>
+        <w:tabs>
+          <w:tab w:val="left" w:pos="6067"/>
+        </w:tabs>
+        <w:ind w:left="720"/>
+      </w:pPr>
+      <w:r>
+        <w:t xml:space="preserve">   ↓</w:t>
+      </w:r>
+    </w:p>
+    <w:p>
+      <w:pPr>
+        <w:tabs>
+          <w:tab w:val="left" w:pos="6067"/>
+        </w:tabs>
+        <w:ind w:left="720"/>
+      </w:pPr>
+      <w:r>
+        <w:t>AWS CLI</w:t>
+      </w:r>
+    </w:p>
+    <w:p>
+      <w:pPr>
+        <w:tabs>
+          <w:tab w:val="left" w:pos="6067"/>
+        </w:tabs>
+        <w:ind w:left="720"/>
+      </w:pPr>
+      <w:r>
+        <w:t xml:space="preserve">   ↓</w:t>
+      </w:r>
+    </w:p>
+    <w:p>
+      <w:pPr>
+        <w:tabs>
+          <w:tab w:val="left" w:pos="6067"/>
+        </w:tabs>
+        <w:ind w:left="720"/>
+      </w:pPr>
+      <w:r>
+        <w:t>AWS authentication</w:t>
+      </w:r>
+    </w:p>
+    <w:p>
+      <w:pPr>
+        <w:tabs>
+          <w:tab w:val="left" w:pos="6067"/>
+        </w:tabs>
+        <w:ind w:left="720"/>
+      </w:pPr>
+      <w:r>
+        <w:t xml:space="preserve">   ↓</w:t>
+      </w:r>
+    </w:p>
+    <w:p>
+      <w:pPr>
+        <w:tabs>
+          <w:tab w:val="left" w:pos="6067"/>
+        </w:tabs>
+        <w:ind w:left="720"/>
+      </w:pPr>
+      <w:r>
+        <w:t>KOPS</w:t>
+      </w:r>
+    </w:p>
+    <w:p>
+      <w:pPr>
+        <w:tabs>
+          <w:tab w:val="left" w:pos="6067"/>
+        </w:tabs>
+        <w:ind w:left="720"/>
+      </w:pPr>
+      <w:r>
+        <w:t xml:space="preserve">   ↓</w:t>
+      </w:r>
+    </w:p>
+    <w:p>
+      <w:pPr>
+        <w:tabs>
+          <w:tab w:val="left" w:pos="6067"/>
+        </w:tabs>
+        <w:ind w:left="720"/>
+      </w:pPr>
+      <w:r>
+        <w:t>Kubernetes cluster</w:t>
+      </w:r>
+    </w:p>
+    <w:p>
+      <w:pPr>
+        <w:tabs>
+          <w:tab w:val="left" w:pos="6067"/>
+        </w:tabs>
+        <w:ind w:left="720"/>
+      </w:pPr>
+      <w:r>
+        <w:t xml:space="preserve">   ↓</w:t>
+      </w:r>
+    </w:p>
+    <w:p>
+      <w:pPr>
+        <w:tabs>
+          <w:tab w:val="left" w:pos="6067"/>
+        </w:tabs>
+        <w:ind w:left="720"/>
+      </w:pPr>
+      <w:proofErr w:type="spellStart"/>
+      <w:r>
+        <w:t>K</w:t>
+      </w:r>
+      <w:r>
+        <w:t>ubectl</w:t>
+      </w:r>
+      <w:proofErr w:type="spellEnd"/>
+    </w:p>
+    <w:p>
+      <w:pPr>
+        <w:tabs>
+          <w:tab w:val="left" w:pos="6067"/>
+        </w:tabs>
+      </w:pPr>
+      <w:proofErr w:type="spellStart"/>
+      <w:r>
+        <w:t>kubectl</w:t>
+      </w:r>
+      <w:proofErr w:type="spellEnd"/>
+      <w:r>
+        <w:t xml:space="preserve"> is used to interact with the Kubernetes cluster after it is available.</w:t>
+      </w:r>
+    </w:p>
+    <w:p>
+      <w:pPr>
+        <w:tabs>
+          <w:tab w:val="left" w:pos="6067"/>
+        </w:tabs>
+      </w:pPr>
+    </w:p>
+    <w:p>
+      <w:pPr>
+        <w:tabs>
+          <w:tab w:val="left" w:pos="6067"/>
+        </w:tabs>
+      </w:pPr>
+      <w:hyperlink r:id="rId8" w:history="1">
+        <w:r>
+          <w:rPr>
+            <w:rStyle w:val="Hyperlink"/>
+          </w:rPr>
+          <w:t>https://github.com/iam-veeramalla/Kubernetes-Zero-to-Hero/tree/main</w:t>
+        </w:r>
+      </w:hyperlink>
+    </w:p>
+    <w:p>
+      <w:pPr>
+        <w:tabs>
+          <w:tab w:val="left" w:pos="6067"/>
+        </w:tabs>
+      </w:pPr>
+    </w:p>
+    <w:p>
+      <w:pPr>
+        <w:tabs>
+          <w:tab w:val="left" w:pos="6067"/>
+        </w:tabs>
+      </w:pPr>
+    </w:p>
+    <w:p>
+      <w:pPr>
+        <w:tabs>
+          <w:tab w:val="left" w:pos="6067"/>
+        </w:tabs>
+      </w:pPr>
+    </w:p>
+    <w:p>
+      <w:pPr>
+        <w:tabs>
+          <w:tab w:val="left" w:pos="6067"/>
+        </w:tabs>
+      </w:pPr>
+    </w:p>
+    <w:p>
+      <w:pPr>
+        <w:tabs>
+          <w:tab w:val="left" w:pos="6067"/>
+        </w:tabs>
+      </w:pPr>
+    </w:p>
+    <w:p>
+      <w:pPr>
+        <w:tabs>
+          <w:tab w:val="left" w:pos="6067"/>
+        </w:tabs>
+      </w:pPr>
+    </w:p>
+    <w:p>
+      <w:pPr>
+        <w:tabs>
+          <w:tab w:val="left" w:pos="6067"/>
+        </w:tabs>
+      </w:pPr>
+    </w:p>
+    <w:p>
+      <w:pPr>
+        <w:tabs>
+          <w:tab w:val="left" w:pos="6067"/>
+        </w:tabs>
+      </w:pPr>
+    </w:p>
     <w:sectPr>
-      <w:footerReference w:type="default" r:id="rId7"/>
+      <w:footerReference w:type="default" r:id="rId9"/>
       <w:pgSz w:w="11906" w:h="16838"/>
       <w:pgMar w:top="1440" w:right="1440" w:bottom="1440" w:left="1440" w:header="708" w:footer="708" w:gutter="0"/>
       <w:pgBorders w:offsetFrom="page">
@@ -6478,9 +9572,9 @@
 <file path=word/numbering.xml><?xml version="1.0" encoding="utf-8"?>
 <w:numbering xmlns:wpc="http://schemas.microsoft.com/office/word/2010/wordprocessingCanvas" xmlns:cx="http://schemas.microsoft.com/office/drawing/2014/chartex" xmlns:cx1="http://schemas.microsoft.com/office/drawing/2015/9/8/chartex" xmlns:cx2="http://schemas.microsoft.com/office/drawing/2015/10/21/chartex" xmlns:cx3="http://schemas.microsoft.com/office/drawing/2016/5/9/chartex" xmlns:cx4="http://schemas.microsoft.com/office/drawing/2016/5/10/chartex" xmlns:cx5="http://schemas.microsoft.com/office/drawing/2016/5/11/chartex" xmlns:cx6="http://schemas.microsoft.com/office/drawing/2016/5/12/chartex" xmlns:cx7="http://schemas.microsoft.com/office/drawing/2016/5/13/chartex" xmlns:cx8="http://schemas.microsoft.com/office/drawing/2016/5/14/chartex" xmlns:mc="http://schemas.openxmlformats.org/markup-compatibility/2006" xmlns:aink="http://schemas.microsoft.com/office/drawing/2016/ink" xmlns:am3d="http://schemas.microsoft.com/office/drawing/2017/model3d" xmlns:o="urn:schemas-microsoft-com:office:office" xmlns:oel="http://schemas.microsoft.com/office/2019/extlst" xmlns:r="http://schemas.openxmlformats.org/officeDocument/2006/relationships" xmlns:m="http://schemas.openxmlformats.org/officeDocument/2006/math" xmlns:v="urn:schemas-microsoft-com:vml" xmlns:wp14="http://schemas.microsoft.com/office/word/2010/wordprocessingDrawing" xmlns:wp="http://schemas.openxmlformats.org/drawingml/2006/wordprocessingDrawing" xmlns:w10="urn:schemas-microsoft-com:office:word" xmlns:w="http://schemas.openxmlformats.org/wordprocessingml/2006/main" xmlns:w14="http://schemas.microsoft.com/office/word/2010/wordml" xmlns:w15="http://schemas.microsoft.com/office/word/2012/wordml" xmlns:w16cex="http://schemas.microsoft.com/office/word/2018/wordml/cex" xmlns:w16cid="http://schemas.microsoft.com/office/word/2016/wordml/cid" xmlns:w16="http://schemas.microsoft.com/office/word/2018/wordml" xmlns:w16du="http://schemas.microsoft.com/office/word/2023/wordml/word16du" xmlns:w16sdtdh="http://schemas.microsoft.com/office/word/2020/wordml/sdtdatahash" xmlns:w16sdtfl="http://schemas.microsoft.com/office/word/2024/wordml/sdtformatlock" xmlns:w16se="http://schemas.microsoft.com/office/word/2015/wordml/symex" xmlns:wpg="http://schemas.microsoft.com/office/word/2010/wordprocessingGroup" xmlns:wpi="http://schemas.microsoft.com/office/word/2010/wordprocessingInk" xmlns:wne="http://schemas.microsoft.com/office/word/2006/wordml" xmlns:wps="http://schemas.microsoft.com/office/word/2010/wordprocessingShape" mc:Ignorable="w14 w15 w16se w16cid w16 w16cex w16sdtdh w16sdtfl w16du wp14">
   <w:abstractNum w:abstractNumId="0" w15:restartNumberingAfterBreak="0">
-    <w:nsid w:val="137359F8"/>
+    <w:nsid w:val="11AF0E31"/>
     <w:multiLevelType w:val="multilevel"/>
-    <w:tmpl w:val="B498BA04"/>
+    <w:tmpl w:val="612E9508"/>
     <w:lvl w:ilvl="0">
       <w:start w:val="1"/>
       <w:numFmt w:val="bullet"/>
@@ -6627,9 +9721,9 @@
     </w:lvl>
   </w:abstractNum>
   <w:abstractNum w:abstractNumId="1" w15:restartNumberingAfterBreak="0">
-    <w:nsid w:val="17DE5E84"/>
+    <w:nsid w:val="137359F8"/>
     <w:multiLevelType w:val="multilevel"/>
-    <w:tmpl w:val="69B839CA"/>
+    <w:tmpl w:val="B498BA04"/>
     <w:lvl w:ilvl="0">
       <w:start w:val="1"/>
       <w:numFmt w:val="bullet"/>
@@ -6776,9 +9870,9 @@
     </w:lvl>
   </w:abstractNum>
   <w:abstractNum w:abstractNumId="2" w15:restartNumberingAfterBreak="0">
-    <w:nsid w:val="191F7FBF"/>
+    <w:nsid w:val="13D34449"/>
     <w:multiLevelType w:val="multilevel"/>
-    <w:tmpl w:val="4F724436"/>
+    <w:tmpl w:val="D32AA580"/>
     <w:lvl w:ilvl="0">
       <w:start w:val="1"/>
       <w:numFmt w:val="bullet"/>
@@ -6925,122 +10019,9 @@
     </w:lvl>
   </w:abstractNum>
   <w:abstractNum w:abstractNumId="3" w15:restartNumberingAfterBreak="0">
-    <w:nsid w:val="28963747"/>
-    <w:multiLevelType w:val="hybridMultilevel"/>
-    <w:tmpl w:val="A4C824AA"/>
-    <w:lvl w:ilvl="0" w:tplc="40090001">
-      <w:start w:val="1"/>
-      <w:numFmt w:val="bullet"/>
-      <w:lvlText w:val=""/>
-      <w:lvlJc w:val="left"/>
-      <w:pPr>
-        <w:ind w:left="720" w:hanging="360"/>
-      </w:pPr>
-      <w:rPr>
-        <w:rFonts w:ascii="Symbol" w:hAnsi="Symbol" w:hint="default"/>
-      </w:rPr>
-    </w:lvl>
-    <w:lvl w:ilvl="1" w:tplc="40090003" w:tentative="1">
-      <w:start w:val="1"/>
-      <w:numFmt w:val="bullet"/>
-      <w:lvlText w:val="o"/>
-      <w:lvlJc w:val="left"/>
-      <w:pPr>
-        <w:ind w:left="1440" w:hanging="360"/>
-      </w:pPr>
-      <w:rPr>
-        <w:rFonts w:ascii="Courier New" w:hAnsi="Courier New" w:cs="Courier New" w:hint="default"/>
-      </w:rPr>
-    </w:lvl>
-    <w:lvl w:ilvl="2" w:tplc="40090005" w:tentative="1">
-      <w:start w:val="1"/>
-      <w:numFmt w:val="bullet"/>
-      <w:lvlText w:val=""/>
-      <w:lvlJc w:val="left"/>
-      <w:pPr>
-        <w:ind w:left="2160" w:hanging="360"/>
-      </w:pPr>
-      <w:rPr>
-        <w:rFonts w:ascii="Wingdings" w:hAnsi="Wingdings" w:hint="default"/>
-      </w:rPr>
-    </w:lvl>
-    <w:lvl w:ilvl="3" w:tplc="40090001" w:tentative="1">
-      <w:start w:val="1"/>
-      <w:numFmt w:val="bullet"/>
-      <w:lvlText w:val=""/>
-      <w:lvlJc w:val="left"/>
-      <w:pPr>
-        <w:ind w:left="2880" w:hanging="360"/>
-      </w:pPr>
-      <w:rPr>
-        <w:rFonts w:ascii="Symbol" w:hAnsi="Symbol" w:hint="default"/>
-      </w:rPr>
-    </w:lvl>
-    <w:lvl w:ilvl="4" w:tplc="40090003" w:tentative="1">
-      <w:start w:val="1"/>
-      <w:numFmt w:val="bullet"/>
-      <w:lvlText w:val="o"/>
-      <w:lvlJc w:val="left"/>
-      <w:pPr>
-        <w:ind w:left="3600" w:hanging="360"/>
-      </w:pPr>
-      <w:rPr>
-        <w:rFonts w:ascii="Courier New" w:hAnsi="Courier New" w:cs="Courier New" w:hint="default"/>
-      </w:rPr>
-    </w:lvl>
-    <w:lvl w:ilvl="5" w:tplc="40090005" w:tentative="1">
-      <w:start w:val="1"/>
-      <w:numFmt w:val="bullet"/>
-      <w:lvlText w:val=""/>
-      <w:lvlJc w:val="left"/>
-      <w:pPr>
-        <w:ind w:left="4320" w:hanging="360"/>
-      </w:pPr>
-      <w:rPr>
-        <w:rFonts w:ascii="Wingdings" w:hAnsi="Wingdings" w:hint="default"/>
-      </w:rPr>
-    </w:lvl>
-    <w:lvl w:ilvl="6" w:tplc="40090001" w:tentative="1">
-      <w:start w:val="1"/>
-      <w:numFmt w:val="bullet"/>
-      <w:lvlText w:val=""/>
-      <w:lvlJc w:val="left"/>
-      <w:pPr>
-        <w:ind w:left="5040" w:hanging="360"/>
-      </w:pPr>
-      <w:rPr>
-        <w:rFonts w:ascii="Symbol" w:hAnsi="Symbol" w:hint="default"/>
-      </w:rPr>
-    </w:lvl>
-    <w:lvl w:ilvl="7" w:tplc="40090003" w:tentative="1">
-      <w:start w:val="1"/>
-      <w:numFmt w:val="bullet"/>
-      <w:lvlText w:val="o"/>
-      <w:lvlJc w:val="left"/>
-      <w:pPr>
-        <w:ind w:left="5760" w:hanging="360"/>
-      </w:pPr>
-      <w:rPr>
-        <w:rFonts w:ascii="Courier New" w:hAnsi="Courier New" w:cs="Courier New" w:hint="default"/>
-      </w:rPr>
-    </w:lvl>
-    <w:lvl w:ilvl="8" w:tplc="40090005" w:tentative="1">
-      <w:start w:val="1"/>
-      <w:numFmt w:val="bullet"/>
-      <w:lvlText w:val=""/>
-      <w:lvlJc w:val="left"/>
-      <w:pPr>
-        <w:ind w:left="6480" w:hanging="360"/>
-      </w:pPr>
-      <w:rPr>
-        <w:rFonts w:ascii="Wingdings" w:hAnsi="Wingdings" w:hint="default"/>
-      </w:rPr>
-    </w:lvl>
-  </w:abstractNum>
-  <w:abstractNum w:abstractNumId="4" w15:restartNumberingAfterBreak="0">
-    <w:nsid w:val="2CCA78D2"/>
+    <w:nsid w:val="17DE5E84"/>
     <w:multiLevelType w:val="multilevel"/>
-    <w:tmpl w:val="D9E25A9E"/>
+    <w:tmpl w:val="69B839CA"/>
     <w:lvl w:ilvl="0">
       <w:start w:val="1"/>
       <w:numFmt w:val="bullet"/>
@@ -7186,10 +10167,10 @@
       </w:rPr>
     </w:lvl>
   </w:abstractNum>
-  <w:abstractNum w:abstractNumId="5" w15:restartNumberingAfterBreak="0">
-    <w:nsid w:val="34CC2BFC"/>
+  <w:abstractNum w:abstractNumId="4" w15:restartNumberingAfterBreak="0">
+    <w:nsid w:val="191F7FBF"/>
     <w:multiLevelType w:val="multilevel"/>
-    <w:tmpl w:val="4364BF6C"/>
+    <w:tmpl w:val="4F724436"/>
     <w:lvl w:ilvl="0">
       <w:start w:val="1"/>
       <w:numFmt w:val="bullet"/>
@@ -7335,10 +10316,10 @@
       </w:rPr>
     </w:lvl>
   </w:abstractNum>
-  <w:abstractNum w:abstractNumId="6" w15:restartNumberingAfterBreak="0">
-    <w:nsid w:val="39FF1CB1"/>
+  <w:abstractNum w:abstractNumId="5" w15:restartNumberingAfterBreak="0">
+    <w:nsid w:val="27023ECF"/>
     <w:multiLevelType w:val="multilevel"/>
-    <w:tmpl w:val="B9D21D68"/>
+    <w:tmpl w:val="A8FC3A46"/>
     <w:lvl w:ilvl="0">
       <w:start w:val="1"/>
       <w:numFmt w:val="bullet"/>
@@ -7484,10 +10465,10 @@
       </w:rPr>
     </w:lvl>
   </w:abstractNum>
-  <w:abstractNum w:abstractNumId="7" w15:restartNumberingAfterBreak="0">
-    <w:nsid w:val="43462127"/>
+  <w:abstractNum w:abstractNumId="6" w15:restartNumberingAfterBreak="0">
+    <w:nsid w:val="282F4177"/>
     <w:multiLevelType w:val="multilevel"/>
-    <w:tmpl w:val="2A44C164"/>
+    <w:tmpl w:val="657A9136"/>
     <w:lvl w:ilvl="0">
       <w:start w:val="1"/>
       <w:numFmt w:val="bullet"/>
@@ -7633,10 +10614,123 @@
       </w:rPr>
     </w:lvl>
   </w:abstractNum>
+  <w:abstractNum w:abstractNumId="7" w15:restartNumberingAfterBreak="0">
+    <w:nsid w:val="28963747"/>
+    <w:multiLevelType w:val="hybridMultilevel"/>
+    <w:tmpl w:val="A4C824AA"/>
+    <w:lvl w:ilvl="0" w:tplc="40090001">
+      <w:start w:val="1"/>
+      <w:numFmt w:val="bullet"/>
+      <w:lvlText w:val=""/>
+      <w:lvlJc w:val="left"/>
+      <w:pPr>
+        <w:ind w:left="720" w:hanging="360"/>
+      </w:pPr>
+      <w:rPr>
+        <w:rFonts w:ascii="Symbol" w:hAnsi="Symbol" w:hint="default"/>
+      </w:rPr>
+    </w:lvl>
+    <w:lvl w:ilvl="1" w:tplc="40090003" w:tentative="1">
+      <w:start w:val="1"/>
+      <w:numFmt w:val="bullet"/>
+      <w:lvlText w:val="o"/>
+      <w:lvlJc w:val="left"/>
+      <w:pPr>
+        <w:ind w:left="1440" w:hanging="360"/>
+      </w:pPr>
+      <w:rPr>
+        <w:rFonts w:ascii="Courier New" w:hAnsi="Courier New" w:cs="Courier New" w:hint="default"/>
+      </w:rPr>
+    </w:lvl>
+    <w:lvl w:ilvl="2" w:tplc="40090005" w:tentative="1">
+      <w:start w:val="1"/>
+      <w:numFmt w:val="bullet"/>
+      <w:lvlText w:val=""/>
+      <w:lvlJc w:val="left"/>
+      <w:pPr>
+        <w:ind w:left="2160" w:hanging="360"/>
+      </w:pPr>
+      <w:rPr>
+        <w:rFonts w:ascii="Wingdings" w:hAnsi="Wingdings" w:hint="default"/>
+      </w:rPr>
+    </w:lvl>
+    <w:lvl w:ilvl="3" w:tplc="40090001" w:tentative="1">
+      <w:start w:val="1"/>
+      <w:numFmt w:val="bullet"/>
+      <w:lvlText w:val=""/>
+      <w:lvlJc w:val="left"/>
+      <w:pPr>
+        <w:ind w:left="2880" w:hanging="360"/>
+      </w:pPr>
+      <w:rPr>
+        <w:rFonts w:ascii="Symbol" w:hAnsi="Symbol" w:hint="default"/>
+      </w:rPr>
+    </w:lvl>
+    <w:lvl w:ilvl="4" w:tplc="40090003" w:tentative="1">
+      <w:start w:val="1"/>
+      <w:numFmt w:val="bullet"/>
+      <w:lvlText w:val="o"/>
+      <w:lvlJc w:val="left"/>
+      <w:pPr>
+        <w:ind w:left="3600" w:hanging="360"/>
+      </w:pPr>
+      <w:rPr>
+        <w:rFonts w:ascii="Courier New" w:hAnsi="Courier New" w:cs="Courier New" w:hint="default"/>
+      </w:rPr>
+    </w:lvl>
+    <w:lvl w:ilvl="5" w:tplc="40090005" w:tentative="1">
+      <w:start w:val="1"/>
+      <w:numFmt w:val="bullet"/>
+      <w:lvlText w:val=""/>
+      <w:lvlJc w:val="left"/>
+      <w:pPr>
+        <w:ind w:left="4320" w:hanging="360"/>
+      </w:pPr>
+      <w:rPr>
+        <w:rFonts w:ascii="Wingdings" w:hAnsi="Wingdings" w:hint="default"/>
+      </w:rPr>
+    </w:lvl>
+    <w:lvl w:ilvl="6" w:tplc="40090001" w:tentative="1">
+      <w:start w:val="1"/>
+      <w:numFmt w:val="bullet"/>
+      <w:lvlText w:val=""/>
+      <w:lvlJc w:val="left"/>
+      <w:pPr>
+        <w:ind w:left="5040" w:hanging="360"/>
+      </w:pPr>
+      <w:rPr>
+        <w:rFonts w:ascii="Symbol" w:hAnsi="Symbol" w:hint="default"/>
+      </w:rPr>
+    </w:lvl>
+    <w:lvl w:ilvl="7" w:tplc="40090003" w:tentative="1">
+      <w:start w:val="1"/>
+      <w:numFmt w:val="bullet"/>
+      <w:lvlText w:val="o"/>
+      <w:lvlJc w:val="left"/>
+      <w:pPr>
+        <w:ind w:left="5760" w:hanging="360"/>
+      </w:pPr>
+      <w:rPr>
+        <w:rFonts w:ascii="Courier New" w:hAnsi="Courier New" w:cs="Courier New" w:hint="default"/>
+      </w:rPr>
+    </w:lvl>
+    <w:lvl w:ilvl="8" w:tplc="40090005" w:tentative="1">
+      <w:start w:val="1"/>
+      <w:numFmt w:val="bullet"/>
+      <w:lvlText w:val=""/>
+      <w:lvlJc w:val="left"/>
+      <w:pPr>
+        <w:ind w:left="6480" w:hanging="360"/>
+      </w:pPr>
+      <w:rPr>
+        <w:rFonts w:ascii="Wingdings" w:hAnsi="Wingdings" w:hint="default"/>
+      </w:rPr>
+    </w:lvl>
+  </w:abstractNum>
   <w:abstractNum w:abstractNumId="8" w15:restartNumberingAfterBreak="0">
-    <w:nsid w:val="61802EC5"/>
+    <w:nsid w:val="2CCA78D2"/>
     <w:multiLevelType w:val="multilevel"/>
-    <w:tmpl w:val="E59AE44C"/>
+    <w:tmpl w:val="D9E25A9E"/>
     <w:lvl w:ilvl="0">
       <w:start w:val="1"/>
       <w:numFmt w:val="bullet"/>
@@ -7782,31 +10876,791 @@
       </w:rPr>
     </w:lvl>
   </w:abstractNum>
+  <w:abstractNum w:abstractNumId="9" w15:restartNumberingAfterBreak="0">
+    <w:nsid w:val="34CC2BFC"/>
+    <w:multiLevelType w:val="multilevel"/>
+    <w:tmpl w:val="4364BF6C"/>
+    <w:lvl w:ilvl="0">
+      <w:start w:val="1"/>
+      <w:numFmt w:val="bullet"/>
+      <w:lvlText w:val=""/>
+      <w:lvlJc w:val="left"/>
+      <w:pPr>
+        <w:tabs>
+          <w:tab w:val="num" w:pos="720"/>
+        </w:tabs>
+        <w:ind w:left="720" w:hanging="360"/>
+      </w:pPr>
+      <w:rPr>
+        <w:rFonts w:ascii="Symbol" w:hAnsi="Symbol" w:hint="default"/>
+        <w:sz w:val="20"/>
+      </w:rPr>
+    </w:lvl>
+    <w:lvl w:ilvl="1" w:tentative="1">
+      <w:start w:val="1"/>
+      <w:numFmt w:val="bullet"/>
+      <w:lvlText w:val="o"/>
+      <w:lvlJc w:val="left"/>
+      <w:pPr>
+        <w:tabs>
+          <w:tab w:val="num" w:pos="1440"/>
+        </w:tabs>
+        <w:ind w:left="1440" w:hanging="360"/>
+      </w:pPr>
+      <w:rPr>
+        <w:rFonts w:ascii="Courier New" w:hAnsi="Courier New" w:hint="default"/>
+        <w:sz w:val="20"/>
+      </w:rPr>
+    </w:lvl>
+    <w:lvl w:ilvl="2" w:tentative="1">
+      <w:start w:val="1"/>
+      <w:numFmt w:val="bullet"/>
+      <w:lvlText w:val=""/>
+      <w:lvlJc w:val="left"/>
+      <w:pPr>
+        <w:tabs>
+          <w:tab w:val="num" w:pos="2160"/>
+        </w:tabs>
+        <w:ind w:left="2160" w:hanging="360"/>
+      </w:pPr>
+      <w:rPr>
+        <w:rFonts w:ascii="Wingdings" w:hAnsi="Wingdings" w:hint="default"/>
+        <w:sz w:val="20"/>
+      </w:rPr>
+    </w:lvl>
+    <w:lvl w:ilvl="3" w:tentative="1">
+      <w:start w:val="1"/>
+      <w:numFmt w:val="bullet"/>
+      <w:lvlText w:val=""/>
+      <w:lvlJc w:val="left"/>
+      <w:pPr>
+        <w:tabs>
+          <w:tab w:val="num" w:pos="2880"/>
+        </w:tabs>
+        <w:ind w:left="2880" w:hanging="360"/>
+      </w:pPr>
+      <w:rPr>
+        <w:rFonts w:ascii="Wingdings" w:hAnsi="Wingdings" w:hint="default"/>
+        <w:sz w:val="20"/>
+      </w:rPr>
+    </w:lvl>
+    <w:lvl w:ilvl="4" w:tentative="1">
+      <w:start w:val="1"/>
+      <w:numFmt w:val="bullet"/>
+      <w:lvlText w:val=""/>
+      <w:lvlJc w:val="left"/>
+      <w:pPr>
+        <w:tabs>
+          <w:tab w:val="num" w:pos="3600"/>
+        </w:tabs>
+        <w:ind w:left="3600" w:hanging="360"/>
+      </w:pPr>
+      <w:rPr>
+        <w:rFonts w:ascii="Wingdings" w:hAnsi="Wingdings" w:hint="default"/>
+        <w:sz w:val="20"/>
+      </w:rPr>
+    </w:lvl>
+    <w:lvl w:ilvl="5" w:tentative="1">
+      <w:start w:val="1"/>
+      <w:numFmt w:val="bullet"/>
+      <w:lvlText w:val=""/>
+      <w:lvlJc w:val="left"/>
+      <w:pPr>
+        <w:tabs>
+          <w:tab w:val="num" w:pos="4320"/>
+        </w:tabs>
+        <w:ind w:left="4320" w:hanging="360"/>
+      </w:pPr>
+      <w:rPr>
+        <w:rFonts w:ascii="Wingdings" w:hAnsi="Wingdings" w:hint="default"/>
+        <w:sz w:val="20"/>
+      </w:rPr>
+    </w:lvl>
+    <w:lvl w:ilvl="6" w:tentative="1">
+      <w:start w:val="1"/>
+      <w:numFmt w:val="bullet"/>
+      <w:lvlText w:val=""/>
+      <w:lvlJc w:val="left"/>
+      <w:pPr>
+        <w:tabs>
+          <w:tab w:val="num" w:pos="5040"/>
+        </w:tabs>
+        <w:ind w:left="5040" w:hanging="360"/>
+      </w:pPr>
+      <w:rPr>
+        <w:rFonts w:ascii="Wingdings" w:hAnsi="Wingdings" w:hint="default"/>
+        <w:sz w:val="20"/>
+      </w:rPr>
+    </w:lvl>
+    <w:lvl w:ilvl="7" w:tentative="1">
+      <w:start w:val="1"/>
+      <w:numFmt w:val="bullet"/>
+      <w:lvlText w:val=""/>
+      <w:lvlJc w:val="left"/>
+      <w:pPr>
+        <w:tabs>
+          <w:tab w:val="num" w:pos="5760"/>
+        </w:tabs>
+        <w:ind w:left="5760" w:hanging="360"/>
+      </w:pPr>
+      <w:rPr>
+        <w:rFonts w:ascii="Wingdings" w:hAnsi="Wingdings" w:hint="default"/>
+        <w:sz w:val="20"/>
+      </w:rPr>
+    </w:lvl>
+    <w:lvl w:ilvl="8" w:tentative="1">
+      <w:start w:val="1"/>
+      <w:numFmt w:val="bullet"/>
+      <w:lvlText w:val=""/>
+      <w:lvlJc w:val="left"/>
+      <w:pPr>
+        <w:tabs>
+          <w:tab w:val="num" w:pos="6480"/>
+        </w:tabs>
+        <w:ind w:left="6480" w:hanging="360"/>
+      </w:pPr>
+      <w:rPr>
+        <w:rFonts w:ascii="Wingdings" w:hAnsi="Wingdings" w:hint="default"/>
+        <w:sz w:val="20"/>
+      </w:rPr>
+    </w:lvl>
+  </w:abstractNum>
+  <w:abstractNum w:abstractNumId="10" w15:restartNumberingAfterBreak="0">
+    <w:nsid w:val="39FF1CB1"/>
+    <w:multiLevelType w:val="multilevel"/>
+    <w:tmpl w:val="B9D21D68"/>
+    <w:lvl w:ilvl="0">
+      <w:start w:val="1"/>
+      <w:numFmt w:val="bullet"/>
+      <w:lvlText w:val=""/>
+      <w:lvlJc w:val="left"/>
+      <w:pPr>
+        <w:tabs>
+          <w:tab w:val="num" w:pos="720"/>
+        </w:tabs>
+        <w:ind w:left="720" w:hanging="360"/>
+      </w:pPr>
+      <w:rPr>
+        <w:rFonts w:ascii="Symbol" w:hAnsi="Symbol" w:hint="default"/>
+        <w:sz w:val="20"/>
+      </w:rPr>
+    </w:lvl>
+    <w:lvl w:ilvl="1" w:tentative="1">
+      <w:start w:val="1"/>
+      <w:numFmt w:val="bullet"/>
+      <w:lvlText w:val="o"/>
+      <w:lvlJc w:val="left"/>
+      <w:pPr>
+        <w:tabs>
+          <w:tab w:val="num" w:pos="1440"/>
+        </w:tabs>
+        <w:ind w:left="1440" w:hanging="360"/>
+      </w:pPr>
+      <w:rPr>
+        <w:rFonts w:ascii="Courier New" w:hAnsi="Courier New" w:hint="default"/>
+        <w:sz w:val="20"/>
+      </w:rPr>
+    </w:lvl>
+    <w:lvl w:ilvl="2" w:tentative="1">
+      <w:start w:val="1"/>
+      <w:numFmt w:val="bullet"/>
+      <w:lvlText w:val=""/>
+      <w:lvlJc w:val="left"/>
+      <w:pPr>
+        <w:tabs>
+          <w:tab w:val="num" w:pos="2160"/>
+        </w:tabs>
+        <w:ind w:left="2160" w:hanging="360"/>
+      </w:pPr>
+      <w:rPr>
+        <w:rFonts w:ascii="Wingdings" w:hAnsi="Wingdings" w:hint="default"/>
+        <w:sz w:val="20"/>
+      </w:rPr>
+    </w:lvl>
+    <w:lvl w:ilvl="3" w:tentative="1">
+      <w:start w:val="1"/>
+      <w:numFmt w:val="bullet"/>
+      <w:lvlText w:val=""/>
+      <w:lvlJc w:val="left"/>
+      <w:pPr>
+        <w:tabs>
+          <w:tab w:val="num" w:pos="2880"/>
+        </w:tabs>
+        <w:ind w:left="2880" w:hanging="360"/>
+      </w:pPr>
+      <w:rPr>
+        <w:rFonts w:ascii="Wingdings" w:hAnsi="Wingdings" w:hint="default"/>
+        <w:sz w:val="20"/>
+      </w:rPr>
+    </w:lvl>
+    <w:lvl w:ilvl="4" w:tentative="1">
+      <w:start w:val="1"/>
+      <w:numFmt w:val="bullet"/>
+      <w:lvlText w:val=""/>
+      <w:lvlJc w:val="left"/>
+      <w:pPr>
+        <w:tabs>
+          <w:tab w:val="num" w:pos="3600"/>
+        </w:tabs>
+        <w:ind w:left="3600" w:hanging="360"/>
+      </w:pPr>
+      <w:rPr>
+        <w:rFonts w:ascii="Wingdings" w:hAnsi="Wingdings" w:hint="default"/>
+        <w:sz w:val="20"/>
+      </w:rPr>
+    </w:lvl>
+    <w:lvl w:ilvl="5" w:tentative="1">
+      <w:start w:val="1"/>
+      <w:numFmt w:val="bullet"/>
+      <w:lvlText w:val=""/>
+      <w:lvlJc w:val="left"/>
+      <w:pPr>
+        <w:tabs>
+          <w:tab w:val="num" w:pos="4320"/>
+        </w:tabs>
+        <w:ind w:left="4320" w:hanging="360"/>
+      </w:pPr>
+      <w:rPr>
+        <w:rFonts w:ascii="Wingdings" w:hAnsi="Wingdings" w:hint="default"/>
+        <w:sz w:val="20"/>
+      </w:rPr>
+    </w:lvl>
+    <w:lvl w:ilvl="6" w:tentative="1">
+      <w:start w:val="1"/>
+      <w:numFmt w:val="bullet"/>
+      <w:lvlText w:val=""/>
+      <w:lvlJc w:val="left"/>
+      <w:pPr>
+        <w:tabs>
+          <w:tab w:val="num" w:pos="5040"/>
+        </w:tabs>
+        <w:ind w:left="5040" w:hanging="360"/>
+      </w:pPr>
+      <w:rPr>
+        <w:rFonts w:ascii="Wingdings" w:hAnsi="Wingdings" w:hint="default"/>
+        <w:sz w:val="20"/>
+      </w:rPr>
+    </w:lvl>
+    <w:lvl w:ilvl="7" w:tentative="1">
+      <w:start w:val="1"/>
+      <w:numFmt w:val="bullet"/>
+      <w:lvlText w:val=""/>
+      <w:lvlJc w:val="left"/>
+      <w:pPr>
+        <w:tabs>
+          <w:tab w:val="num" w:pos="5760"/>
+        </w:tabs>
+        <w:ind w:left="5760" w:hanging="360"/>
+      </w:pPr>
+      <w:rPr>
+        <w:rFonts w:ascii="Wingdings" w:hAnsi="Wingdings" w:hint="default"/>
+        <w:sz w:val="20"/>
+      </w:rPr>
+    </w:lvl>
+    <w:lvl w:ilvl="8" w:tentative="1">
+      <w:start w:val="1"/>
+      <w:numFmt w:val="bullet"/>
+      <w:lvlText w:val=""/>
+      <w:lvlJc w:val="left"/>
+      <w:pPr>
+        <w:tabs>
+          <w:tab w:val="num" w:pos="6480"/>
+        </w:tabs>
+        <w:ind w:left="6480" w:hanging="360"/>
+      </w:pPr>
+      <w:rPr>
+        <w:rFonts w:ascii="Wingdings" w:hAnsi="Wingdings" w:hint="default"/>
+        <w:sz w:val="20"/>
+      </w:rPr>
+    </w:lvl>
+  </w:abstractNum>
+  <w:abstractNum w:abstractNumId="11" w15:restartNumberingAfterBreak="0">
+    <w:nsid w:val="43462127"/>
+    <w:multiLevelType w:val="multilevel"/>
+    <w:tmpl w:val="2A44C164"/>
+    <w:lvl w:ilvl="0">
+      <w:start w:val="1"/>
+      <w:numFmt w:val="bullet"/>
+      <w:lvlText w:val=""/>
+      <w:lvlJc w:val="left"/>
+      <w:pPr>
+        <w:tabs>
+          <w:tab w:val="num" w:pos="720"/>
+        </w:tabs>
+        <w:ind w:left="720" w:hanging="360"/>
+      </w:pPr>
+      <w:rPr>
+        <w:rFonts w:ascii="Symbol" w:hAnsi="Symbol" w:hint="default"/>
+        <w:sz w:val="20"/>
+      </w:rPr>
+    </w:lvl>
+    <w:lvl w:ilvl="1" w:tentative="1">
+      <w:start w:val="1"/>
+      <w:numFmt w:val="bullet"/>
+      <w:lvlText w:val="o"/>
+      <w:lvlJc w:val="left"/>
+      <w:pPr>
+        <w:tabs>
+          <w:tab w:val="num" w:pos="1440"/>
+        </w:tabs>
+        <w:ind w:left="1440" w:hanging="360"/>
+      </w:pPr>
+      <w:rPr>
+        <w:rFonts w:ascii="Courier New" w:hAnsi="Courier New" w:hint="default"/>
+        <w:sz w:val="20"/>
+      </w:rPr>
+    </w:lvl>
+    <w:lvl w:ilvl="2" w:tentative="1">
+      <w:start w:val="1"/>
+      <w:numFmt w:val="bullet"/>
+      <w:lvlText w:val=""/>
+      <w:lvlJc w:val="left"/>
+      <w:pPr>
+        <w:tabs>
+          <w:tab w:val="num" w:pos="2160"/>
+        </w:tabs>
+        <w:ind w:left="2160" w:hanging="360"/>
+      </w:pPr>
+      <w:rPr>
+        <w:rFonts w:ascii="Wingdings" w:hAnsi="Wingdings" w:hint="default"/>
+        <w:sz w:val="20"/>
+      </w:rPr>
+    </w:lvl>
+    <w:lvl w:ilvl="3" w:tentative="1">
+      <w:start w:val="1"/>
+      <w:numFmt w:val="bullet"/>
+      <w:lvlText w:val=""/>
+      <w:lvlJc w:val="left"/>
+      <w:pPr>
+        <w:tabs>
+          <w:tab w:val="num" w:pos="2880"/>
+        </w:tabs>
+        <w:ind w:left="2880" w:hanging="360"/>
+      </w:pPr>
+      <w:rPr>
+        <w:rFonts w:ascii="Wingdings" w:hAnsi="Wingdings" w:hint="default"/>
+        <w:sz w:val="20"/>
+      </w:rPr>
+    </w:lvl>
+    <w:lvl w:ilvl="4" w:tentative="1">
+      <w:start w:val="1"/>
+      <w:numFmt w:val="bullet"/>
+      <w:lvlText w:val=""/>
+      <w:lvlJc w:val="left"/>
+      <w:pPr>
+        <w:tabs>
+          <w:tab w:val="num" w:pos="3600"/>
+        </w:tabs>
+        <w:ind w:left="3600" w:hanging="360"/>
+      </w:pPr>
+      <w:rPr>
+        <w:rFonts w:ascii="Wingdings" w:hAnsi="Wingdings" w:hint="default"/>
+        <w:sz w:val="20"/>
+      </w:rPr>
+    </w:lvl>
+    <w:lvl w:ilvl="5" w:tentative="1">
+      <w:start w:val="1"/>
+      <w:numFmt w:val="bullet"/>
+      <w:lvlText w:val=""/>
+      <w:lvlJc w:val="left"/>
+      <w:pPr>
+        <w:tabs>
+          <w:tab w:val="num" w:pos="4320"/>
+        </w:tabs>
+        <w:ind w:left="4320" w:hanging="360"/>
+      </w:pPr>
+      <w:rPr>
+        <w:rFonts w:ascii="Wingdings" w:hAnsi="Wingdings" w:hint="default"/>
+        <w:sz w:val="20"/>
+      </w:rPr>
+    </w:lvl>
+    <w:lvl w:ilvl="6" w:tentative="1">
+      <w:start w:val="1"/>
+      <w:numFmt w:val="bullet"/>
+      <w:lvlText w:val=""/>
+      <w:lvlJc w:val="left"/>
+      <w:pPr>
+        <w:tabs>
+          <w:tab w:val="num" w:pos="5040"/>
+        </w:tabs>
+        <w:ind w:left="5040" w:hanging="360"/>
+      </w:pPr>
+      <w:rPr>
+        <w:rFonts w:ascii="Wingdings" w:hAnsi="Wingdings" w:hint="default"/>
+        <w:sz w:val="20"/>
+      </w:rPr>
+    </w:lvl>
+    <w:lvl w:ilvl="7" w:tentative="1">
+      <w:start w:val="1"/>
+      <w:numFmt w:val="bullet"/>
+      <w:lvlText w:val=""/>
+      <w:lvlJc w:val="left"/>
+      <w:pPr>
+        <w:tabs>
+          <w:tab w:val="num" w:pos="5760"/>
+        </w:tabs>
+        <w:ind w:left="5760" w:hanging="360"/>
+      </w:pPr>
+      <w:rPr>
+        <w:rFonts w:ascii="Wingdings" w:hAnsi="Wingdings" w:hint="default"/>
+        <w:sz w:val="20"/>
+      </w:rPr>
+    </w:lvl>
+    <w:lvl w:ilvl="8" w:tentative="1">
+      <w:start w:val="1"/>
+      <w:numFmt w:val="bullet"/>
+      <w:lvlText w:val=""/>
+      <w:lvlJc w:val="left"/>
+      <w:pPr>
+        <w:tabs>
+          <w:tab w:val="num" w:pos="6480"/>
+        </w:tabs>
+        <w:ind w:left="6480" w:hanging="360"/>
+      </w:pPr>
+      <w:rPr>
+        <w:rFonts w:ascii="Wingdings" w:hAnsi="Wingdings" w:hint="default"/>
+        <w:sz w:val="20"/>
+      </w:rPr>
+    </w:lvl>
+  </w:abstractNum>
+  <w:abstractNum w:abstractNumId="12" w15:restartNumberingAfterBreak="0">
+    <w:nsid w:val="61802EC5"/>
+    <w:multiLevelType w:val="multilevel"/>
+    <w:tmpl w:val="E59AE44C"/>
+    <w:lvl w:ilvl="0">
+      <w:start w:val="1"/>
+      <w:numFmt w:val="bullet"/>
+      <w:lvlText w:val=""/>
+      <w:lvlJc w:val="left"/>
+      <w:pPr>
+        <w:tabs>
+          <w:tab w:val="num" w:pos="720"/>
+        </w:tabs>
+        <w:ind w:left="720" w:hanging="360"/>
+      </w:pPr>
+      <w:rPr>
+        <w:rFonts w:ascii="Symbol" w:hAnsi="Symbol" w:hint="default"/>
+        <w:sz w:val="20"/>
+      </w:rPr>
+    </w:lvl>
+    <w:lvl w:ilvl="1" w:tentative="1">
+      <w:start w:val="1"/>
+      <w:numFmt w:val="bullet"/>
+      <w:lvlText w:val="o"/>
+      <w:lvlJc w:val="left"/>
+      <w:pPr>
+        <w:tabs>
+          <w:tab w:val="num" w:pos="1440"/>
+        </w:tabs>
+        <w:ind w:left="1440" w:hanging="360"/>
+      </w:pPr>
+      <w:rPr>
+        <w:rFonts w:ascii="Courier New" w:hAnsi="Courier New" w:hint="default"/>
+        <w:sz w:val="20"/>
+      </w:rPr>
+    </w:lvl>
+    <w:lvl w:ilvl="2" w:tentative="1">
+      <w:start w:val="1"/>
+      <w:numFmt w:val="bullet"/>
+      <w:lvlText w:val=""/>
+      <w:lvlJc w:val="left"/>
+      <w:pPr>
+        <w:tabs>
+          <w:tab w:val="num" w:pos="2160"/>
+        </w:tabs>
+        <w:ind w:left="2160" w:hanging="360"/>
+      </w:pPr>
+      <w:rPr>
+        <w:rFonts w:ascii="Wingdings" w:hAnsi="Wingdings" w:hint="default"/>
+        <w:sz w:val="20"/>
+      </w:rPr>
+    </w:lvl>
+    <w:lvl w:ilvl="3" w:tentative="1">
+      <w:start w:val="1"/>
+      <w:numFmt w:val="bullet"/>
+      <w:lvlText w:val=""/>
+      <w:lvlJc w:val="left"/>
+      <w:pPr>
+        <w:tabs>
+          <w:tab w:val="num" w:pos="2880"/>
+        </w:tabs>
+        <w:ind w:left="2880" w:hanging="360"/>
+      </w:pPr>
+      <w:rPr>
+        <w:rFonts w:ascii="Wingdings" w:hAnsi="Wingdings" w:hint="default"/>
+        <w:sz w:val="20"/>
+      </w:rPr>
+    </w:lvl>
+    <w:lvl w:ilvl="4" w:tentative="1">
+      <w:start w:val="1"/>
+      <w:numFmt w:val="bullet"/>
+      <w:lvlText w:val=""/>
+      <w:lvlJc w:val="left"/>
+      <w:pPr>
+        <w:tabs>
+          <w:tab w:val="num" w:pos="3600"/>
+        </w:tabs>
+        <w:ind w:left="3600" w:hanging="360"/>
+      </w:pPr>
+      <w:rPr>
+        <w:rFonts w:ascii="Wingdings" w:hAnsi="Wingdings" w:hint="default"/>
+        <w:sz w:val="20"/>
+      </w:rPr>
+    </w:lvl>
+    <w:lvl w:ilvl="5" w:tentative="1">
+      <w:start w:val="1"/>
+      <w:numFmt w:val="bullet"/>
+      <w:lvlText w:val=""/>
+      <w:lvlJc w:val="left"/>
+      <w:pPr>
+        <w:tabs>
+          <w:tab w:val="num" w:pos="4320"/>
+        </w:tabs>
+        <w:ind w:left="4320" w:hanging="360"/>
+      </w:pPr>
+      <w:rPr>
+        <w:rFonts w:ascii="Wingdings" w:hAnsi="Wingdings" w:hint="default"/>
+        <w:sz w:val="20"/>
+      </w:rPr>
+    </w:lvl>
+    <w:lvl w:ilvl="6" w:tentative="1">
+      <w:start w:val="1"/>
+      <w:numFmt w:val="bullet"/>
+      <w:lvlText w:val=""/>
+      <w:lvlJc w:val="left"/>
+      <w:pPr>
+        <w:tabs>
+          <w:tab w:val="num" w:pos="5040"/>
+        </w:tabs>
+        <w:ind w:left="5040" w:hanging="360"/>
+      </w:pPr>
+      <w:rPr>
+        <w:rFonts w:ascii="Wingdings" w:hAnsi="Wingdings" w:hint="default"/>
+        <w:sz w:val="20"/>
+      </w:rPr>
+    </w:lvl>
+    <w:lvl w:ilvl="7" w:tentative="1">
+      <w:start w:val="1"/>
+      <w:numFmt w:val="bullet"/>
+      <w:lvlText w:val=""/>
+      <w:lvlJc w:val="left"/>
+      <w:pPr>
+        <w:tabs>
+          <w:tab w:val="num" w:pos="5760"/>
+        </w:tabs>
+        <w:ind w:left="5760" w:hanging="360"/>
+      </w:pPr>
+      <w:rPr>
+        <w:rFonts w:ascii="Wingdings" w:hAnsi="Wingdings" w:hint="default"/>
+        <w:sz w:val="20"/>
+      </w:rPr>
+    </w:lvl>
+    <w:lvl w:ilvl="8" w:tentative="1">
+      <w:start w:val="1"/>
+      <w:numFmt w:val="bullet"/>
+      <w:lvlText w:val=""/>
+      <w:lvlJc w:val="left"/>
+      <w:pPr>
+        <w:tabs>
+          <w:tab w:val="num" w:pos="6480"/>
+        </w:tabs>
+        <w:ind w:left="6480" w:hanging="360"/>
+      </w:pPr>
+      <w:rPr>
+        <w:rFonts w:ascii="Wingdings" w:hAnsi="Wingdings" w:hint="default"/>
+        <w:sz w:val="20"/>
+      </w:rPr>
+    </w:lvl>
+  </w:abstractNum>
+  <w:abstractNum w:abstractNumId="13" w15:restartNumberingAfterBreak="0">
+    <w:nsid w:val="77931688"/>
+    <w:multiLevelType w:val="multilevel"/>
+    <w:tmpl w:val="2C066EF4"/>
+    <w:lvl w:ilvl="0">
+      <w:start w:val="1"/>
+      <w:numFmt w:val="bullet"/>
+      <w:lvlText w:val=""/>
+      <w:lvlJc w:val="left"/>
+      <w:pPr>
+        <w:tabs>
+          <w:tab w:val="num" w:pos="720"/>
+        </w:tabs>
+        <w:ind w:left="720" w:hanging="360"/>
+      </w:pPr>
+      <w:rPr>
+        <w:rFonts w:ascii="Symbol" w:hAnsi="Symbol" w:hint="default"/>
+        <w:sz w:val="20"/>
+      </w:rPr>
+    </w:lvl>
+    <w:lvl w:ilvl="1" w:tentative="1">
+      <w:start w:val="1"/>
+      <w:numFmt w:val="bullet"/>
+      <w:lvlText w:val="o"/>
+      <w:lvlJc w:val="left"/>
+      <w:pPr>
+        <w:tabs>
+          <w:tab w:val="num" w:pos="1440"/>
+        </w:tabs>
+        <w:ind w:left="1440" w:hanging="360"/>
+      </w:pPr>
+      <w:rPr>
+        <w:rFonts w:ascii="Courier New" w:hAnsi="Courier New" w:hint="default"/>
+        <w:sz w:val="20"/>
+      </w:rPr>
+    </w:lvl>
+    <w:lvl w:ilvl="2" w:tentative="1">
+      <w:start w:val="1"/>
+      <w:numFmt w:val="bullet"/>
+      <w:lvlText w:val=""/>
+      <w:lvlJc w:val="left"/>
+      <w:pPr>
+        <w:tabs>
+          <w:tab w:val="num" w:pos="2160"/>
+        </w:tabs>
+        <w:ind w:left="2160" w:hanging="360"/>
+      </w:pPr>
+      <w:rPr>
+        <w:rFonts w:ascii="Wingdings" w:hAnsi="Wingdings" w:hint="default"/>
+        <w:sz w:val="20"/>
+      </w:rPr>
+    </w:lvl>
+    <w:lvl w:ilvl="3" w:tentative="1">
+      <w:start w:val="1"/>
+      <w:numFmt w:val="bullet"/>
+      <w:lvlText w:val=""/>
+      <w:lvlJc w:val="left"/>
+      <w:pPr>
+        <w:tabs>
+          <w:tab w:val="num" w:pos="2880"/>
+        </w:tabs>
+        <w:ind w:left="2880" w:hanging="360"/>
+      </w:pPr>
+      <w:rPr>
+        <w:rFonts w:ascii="Wingdings" w:hAnsi="Wingdings" w:hint="default"/>
+        <w:sz w:val="20"/>
+      </w:rPr>
+    </w:lvl>
+    <w:lvl w:ilvl="4" w:tentative="1">
+      <w:start w:val="1"/>
+      <w:numFmt w:val="bullet"/>
+      <w:lvlText w:val=""/>
+      <w:lvlJc w:val="left"/>
+      <w:pPr>
+        <w:tabs>
+          <w:tab w:val="num" w:pos="3600"/>
+        </w:tabs>
+        <w:ind w:left="3600" w:hanging="360"/>
+      </w:pPr>
+      <w:rPr>
+        <w:rFonts w:ascii="Wingdings" w:hAnsi="Wingdings" w:hint="default"/>
+        <w:sz w:val="20"/>
+      </w:rPr>
+    </w:lvl>
+    <w:lvl w:ilvl="5" w:tentative="1">
+      <w:start w:val="1"/>
+      <w:numFmt w:val="bullet"/>
+      <w:lvlText w:val=""/>
+      <w:lvlJc w:val="left"/>
+      <w:pPr>
+        <w:tabs>
+          <w:tab w:val="num" w:pos="4320"/>
+        </w:tabs>
+        <w:ind w:left="4320" w:hanging="360"/>
+      </w:pPr>
+      <w:rPr>
+        <w:rFonts w:ascii="Wingdings" w:hAnsi="Wingdings" w:hint="default"/>
+        <w:sz w:val="20"/>
+      </w:rPr>
+    </w:lvl>
+    <w:lvl w:ilvl="6" w:tentative="1">
+      <w:start w:val="1"/>
+      <w:numFmt w:val="bullet"/>
+      <w:lvlText w:val=""/>
+      <w:lvlJc w:val="left"/>
+      <w:pPr>
+        <w:tabs>
+          <w:tab w:val="num" w:pos="5040"/>
+        </w:tabs>
+        <w:ind w:left="5040" w:hanging="360"/>
+      </w:pPr>
+      <w:rPr>
+        <w:rFonts w:ascii="Wingdings" w:hAnsi="Wingdings" w:hint="default"/>
+        <w:sz w:val="20"/>
+      </w:rPr>
+    </w:lvl>
+    <w:lvl w:ilvl="7" w:tentative="1">
+      <w:start w:val="1"/>
+      <w:numFmt w:val="bullet"/>
+      <w:lvlText w:val=""/>
+      <w:lvlJc w:val="left"/>
+      <w:pPr>
+        <w:tabs>
+          <w:tab w:val="num" w:pos="5760"/>
+        </w:tabs>
+        <w:ind w:left="5760" w:hanging="360"/>
+      </w:pPr>
+      <w:rPr>
+        <w:rFonts w:ascii="Wingdings" w:hAnsi="Wingdings" w:hint="default"/>
+        <w:sz w:val="20"/>
+      </w:rPr>
+    </w:lvl>
+    <w:lvl w:ilvl="8" w:tentative="1">
+      <w:start w:val="1"/>
+      <w:numFmt w:val="bullet"/>
+      <w:lvlText w:val=""/>
+      <w:lvlJc w:val="left"/>
+      <w:pPr>
+        <w:tabs>
+          <w:tab w:val="num" w:pos="6480"/>
+        </w:tabs>
+        <w:ind w:left="6480" w:hanging="360"/>
+      </w:pPr>
+      <w:rPr>
+        <w:rFonts w:ascii="Wingdings" w:hAnsi="Wingdings" w:hint="default"/>
+        <w:sz w:val="20"/>
+      </w:rPr>
+    </w:lvl>
+  </w:abstractNum>
   <w:num w:numId="1" w16cid:durableId="1541429971">
+    <w:abstractNumId w:val="8"/>
+  </w:num>
+  <w:num w:numId="2" w16cid:durableId="1933469506">
+    <w:abstractNumId w:val="7"/>
+  </w:num>
+  <w:num w:numId="3" w16cid:durableId="1685402643">
+    <w:abstractNumId w:val="12"/>
+  </w:num>
+  <w:num w:numId="4" w16cid:durableId="1926112215">
+    <w:abstractNumId w:val="1"/>
+  </w:num>
+  <w:num w:numId="5" w16cid:durableId="643437083">
+    <w:abstractNumId w:val="9"/>
+  </w:num>
+  <w:num w:numId="6" w16cid:durableId="820392158">
+    <w:abstractNumId w:val="10"/>
+  </w:num>
+  <w:num w:numId="7" w16cid:durableId="910119482">
+    <w:abstractNumId w:val="3"/>
+  </w:num>
+  <w:num w:numId="8" w16cid:durableId="1730684956">
+    <w:abstractNumId w:val="11"/>
+  </w:num>
+  <w:num w:numId="9" w16cid:durableId="685211640">
     <w:abstractNumId w:val="4"/>
   </w:num>
-  <w:num w:numId="2" w16cid:durableId="1933469506">
-    <w:abstractNumId w:val="3"/>
+  <w:num w:numId="10" w16cid:durableId="74253472">
+    <w:abstractNumId w:val="13"/>
   </w:num>
-  <w:num w:numId="3" w16cid:durableId="1685402643">
-    <w:abstractNumId w:val="8"/>
+  <w:num w:numId="11" w16cid:durableId="2143768663">
+    <w:abstractNumId w:val="5"/>
   </w:num>
-  <w:num w:numId="4" w16cid:durableId="1926112215">
+  <w:num w:numId="12" w16cid:durableId="1679118520">
     <w:abstractNumId w:val="0"/>
   </w:num>
-  <w:num w:numId="5" w16cid:durableId="643437083">
-    <w:abstractNumId w:val="5"/>
-  </w:num>
-  <w:num w:numId="6" w16cid:durableId="820392158">
+  <w:num w:numId="13" w16cid:durableId="740100974">
     <w:abstractNumId w:val="6"/>
   </w:num>
-  <w:num w:numId="7" w16cid:durableId="910119482">
-    <w:abstractNumId w:val="1"/>
-  </w:num>
-  <w:num w:numId="8" w16cid:durableId="1730684956">
-    <w:abstractNumId w:val="7"/>
-  </w:num>
-  <w:num w:numId="9" w16cid:durableId="685211640">
+  <w:num w:numId="14" w16cid:durableId="1582370005">
     <w:abstractNumId w:val="2"/>
   </w:num>
 </w:numbering>
@@ -8772,6 +12626,29 @@
     <w:uiPriority w:val="99"/>
     <w:rsid w:val="00565C88"/>
   </w:style>
+  <w:style w:type="character" w:styleId="Hyperlink">
+    <w:name w:val="Hyperlink"/>
+    <w:basedOn w:val="DefaultParagraphFont"/>
+    <w:uiPriority w:val="99"/>
+    <w:unhideWhenUsed/>
+    <w:rsid w:val="005C35DF"/>
+    <w:rPr>
+      <w:color w:val="0563C1" w:themeColor="hyperlink"/>
+      <w:u w:val="single"/>
+    </w:rPr>
+  </w:style>
+  <w:style w:type="character" w:styleId="UnresolvedMention">
+    <w:name w:val="Unresolved Mention"/>
+    <w:basedOn w:val="DefaultParagraphFont"/>
+    <w:uiPriority w:val="99"/>
+    <w:semiHidden/>
+    <w:unhideWhenUsed/>
+    <w:rsid w:val="005C35DF"/>
+    <w:rPr>
+      <w:color w:val="605E5C"/>
+      <w:shd w:val="clear" w:color="auto" w:fill="E1DFDD"/>
+    </w:rPr>
+  </w:style>
 </w:styles>
 </file>
 

</xml_diff>

<commit_message>
KUBERNETES PODS | DEPLOY YOUR FIRST APP
</commit_message>
<xml_diff>
--- a/Kubernetes/Kubernetes.docx
+++ b/Kubernetes/Kubernetes.docx
@@ -1064,21 +1064,8 @@
     </w:p>
     <w:p>
       <w:r>
-        <w:t xml:space="preserve">     Containers                                 </w:t>
-      </w:r>
-      <w:proofErr w:type="spellStart"/>
-      <w:r>
-        <w:t>Containers</w:t>
-      </w:r>
-      <w:proofErr w:type="spellEnd"/>
-      <w:r>
-        <w:t xml:space="preserve">                                          </w:t>
-      </w:r>
-      <w:proofErr w:type="spellStart"/>
-      <w:r>
-        <w:t>Containers</w:t>
-      </w:r>
-      <w:proofErr w:type="spellEnd"/>
+        <w:t xml:space="preserve">     Containers                                 Containers                                          Containers</w:t>
+      </w:r>
     </w:p>
     <w:p/>
     <w:p>
@@ -1122,15 +1109,7 @@
         <w:sym w:font="Wingdings" w:char="F0E0"/>
       </w:r>
       <w:r>
-        <w:t xml:space="preserve"> In Kubernetes, containers and Pods are considered ephemeral because they can be </w:t>
-      </w:r>
-      <w:proofErr w:type="gramStart"/>
-      <w:r>
-        <w:t>created,  destroyed</w:t>
-      </w:r>
-      <w:proofErr w:type="gramEnd"/>
-      <w:r>
-        <w:t>, and replaced at any time.</w:t>
+        <w:t xml:space="preserve"> In Kubernetes, containers and Pods are considered ephemeral because they can be created,  destroyed, and replaced at any time.</w:t>
       </w:r>
     </w:p>
     <w:p>
@@ -1782,21 +1761,8 @@
     </w:p>
     <w:p>
       <w:r>
-        <w:t xml:space="preserve">                                                                                                 Pod                  </w:t>
-      </w:r>
-      <w:proofErr w:type="spellStart"/>
-      <w:r>
-        <w:t>Pod</w:t>
-      </w:r>
-      <w:proofErr w:type="spellEnd"/>
-      <w:r>
-        <w:t xml:space="preserve">                </w:t>
-      </w:r>
-      <w:proofErr w:type="spellStart"/>
-      <w:r>
-        <w:t>Pod</w:t>
-      </w:r>
-      <w:proofErr w:type="spellEnd"/>
+        <w:t xml:space="preserve">                                                                                                 Pod                  Pod                Pod</w:t>
+      </w:r>
     </w:p>
     <w:p>
       <w:pPr>
@@ -1894,7 +1860,6 @@
           <w:numId w:val="4"/>
         </w:numPr>
       </w:pPr>
-      <w:proofErr w:type="spellStart"/>
       <w:r>
         <w:rPr>
           <w:b/>
@@ -1902,7 +1867,6 @@
         </w:rPr>
         <w:t>etcd</w:t>
       </w:r>
-      <w:proofErr w:type="spellEnd"/>
       <w:r>
         <w:t xml:space="preserve"> → stores cluster state and configuration </w:t>
       </w:r>
@@ -1950,7 +1914,6 @@
           <w:numId w:val="5"/>
         </w:numPr>
       </w:pPr>
-      <w:proofErr w:type="spellStart"/>
       <w:r>
         <w:rPr>
           <w:b/>
@@ -1958,7 +1921,6 @@
         </w:rPr>
         <w:t>kubelet</w:t>
       </w:r>
-      <w:proofErr w:type="spellEnd"/>
       <w:r>
         <w:t xml:space="preserve"> → communicates with Control Plane </w:t>
       </w:r>
@@ -1988,21 +1950,12 @@
           <w:numId w:val="5"/>
         </w:numPr>
       </w:pPr>
-      <w:proofErr w:type="spellStart"/>
-      <w:r>
-        <w:rPr>
-          <w:b/>
-          <w:bCs/>
-        </w:rPr>
-        <w:t>kube</w:t>
-      </w:r>
-      <w:proofErr w:type="spellEnd"/>
-      <w:r>
-        <w:rPr>
-          <w:b/>
-          <w:bCs/>
-        </w:rPr>
-        <w:t>-proxy</w:t>
+      <w:r>
+        <w:rPr>
+          <w:b/>
+          <w:bCs/>
+        </w:rPr>
+        <w:t>kube-proxy</w:t>
       </w:r>
       <w:r>
         <w:t xml:space="preserve"> → handles networking</w:t>
@@ -2712,23 +2665,7 @@
         </w:tabs>
       </w:pPr>
       <w:r>
-        <w:t xml:space="preserve">         (</w:t>
-      </w:r>
-      <w:proofErr w:type="gramStart"/>
-      <w:r>
-        <w:t xml:space="preserve">Master)   </w:t>
-      </w:r>
-      <w:proofErr w:type="gramEnd"/>
-      <w:r>
-        <w:t xml:space="preserve">                                                                                                            </w:t>
-      </w:r>
-      <w:proofErr w:type="gramStart"/>
-      <w:r>
-        <w:t xml:space="preserve">   (</w:t>
-      </w:r>
-      <w:proofErr w:type="gramEnd"/>
-      <w:r>
-        <w:t>Workers)</w:t>
+        <w:t xml:space="preserve">         (Master)                                                                                                                  (Workers)</w:t>
       </w:r>
     </w:p>
     <w:p>
@@ -2943,66 +2880,222 @@
         <w:t>──</w:t>
       </w:r>
       <w:r>
+        <w:t xml:space="preserve"> etcd</w:t>
+      </w:r>
+    </w:p>
+    <w:p>
+      <w:pPr>
+        <w:tabs>
+          <w:tab w:val="left" w:pos="6067"/>
+        </w:tabs>
+      </w:pPr>
+      <w:r>
+        <w:rPr>
+          <w:rFonts w:ascii="MS Gothic" w:eastAsia="MS Gothic" w:hAnsi="MS Gothic" w:cs="MS Gothic" w:hint="eastAsia"/>
+        </w:rPr>
+        <w:t>├</w:t>
+      </w:r>
+      <w:r>
+        <w:rPr>
+          <w:rFonts w:ascii="Calibri" w:hAnsi="Calibri" w:cs="Calibri"/>
+        </w:rPr>
+        <w:t>──</w:t>
+      </w:r>
+      <w:r>
+        <w:t xml:space="preserve"> Scheduler</w:t>
+      </w:r>
+    </w:p>
+    <w:p>
+      <w:pPr>
+        <w:tabs>
+          <w:tab w:val="left" w:pos="6067"/>
+        </w:tabs>
+      </w:pPr>
+      <w:r>
+        <w:rPr>
+          <w:rFonts w:ascii="MS Gothic" w:eastAsia="MS Gothic" w:hAnsi="MS Gothic" w:cs="MS Gothic" w:hint="eastAsia"/>
+        </w:rPr>
+        <w:t>├</w:t>
+      </w:r>
+      <w:r>
+        <w:rPr>
+          <w:rFonts w:ascii="Calibri" w:hAnsi="Calibri" w:cs="Calibri"/>
+        </w:rPr>
+        <w:t>──</w:t>
+      </w:r>
+      <w:r>
+        <w:t xml:space="preserve"> Controller Manager</w:t>
+      </w:r>
+    </w:p>
+    <w:p>
+      <w:pPr>
+        <w:tabs>
+          <w:tab w:val="left" w:pos="6067"/>
+        </w:tabs>
+      </w:pPr>
+      <w:r>
+        <w:t>└── Cloud Controller Manager</w:t>
+      </w:r>
+    </w:p>
+    <w:p>
+      <w:pPr>
+        <w:tabs>
+          <w:tab w:val="left" w:pos="6067"/>
+        </w:tabs>
+        <w:rPr>
+          <w:b/>
+          <w:bCs/>
+        </w:rPr>
+      </w:pPr>
+      <w:r>
+        <w:rPr>
+          <w:rFonts w:ascii="Segoe UI Emoji" w:hAnsi="Segoe UI Emoji" w:cs="Segoe UI Emoji"/>
+          <w:b/>
+          <w:bCs/>
+        </w:rPr>
+        <w:t>🔹</w:t>
+      </w:r>
+      <w:r>
+        <w:rPr>
+          <w:b/>
+          <w:bCs/>
+        </w:rPr>
+        <w:t xml:space="preserve"> API Server</w:t>
+      </w:r>
+    </w:p>
+    <w:p>
+      <w:pPr>
+        <w:tabs>
+          <w:tab w:val="left" w:pos="6067"/>
+        </w:tabs>
+      </w:pPr>
+      <w:r>
+        <w:t xml:space="preserve">The </w:t>
+      </w:r>
+      <w:r>
+        <w:rPr>
+          <w:b/>
+          <w:bCs/>
+        </w:rPr>
+        <w:t>API Server is the main entry point</w:t>
+      </w:r>
+      <w:r>
+        <w:t xml:space="preserve"> to Kubernetes.</w:t>
+      </w:r>
+    </w:p>
+    <w:p>
+      <w:pPr>
+        <w:tabs>
+          <w:tab w:val="left" w:pos="6067"/>
+        </w:tabs>
+      </w:pPr>
+      <w:r>
+        <w:t>For example:</w:t>
+      </w:r>
+      <w:r>
         <w:t xml:space="preserve"> </w:t>
       </w:r>
-      <w:proofErr w:type="spellStart"/>
-      <w:r>
-        <w:t>etcd</w:t>
-      </w:r>
-      <w:proofErr w:type="spellEnd"/>
-    </w:p>
-    <w:p>
-      <w:pPr>
-        <w:tabs>
-          <w:tab w:val="left" w:pos="6067"/>
-        </w:tabs>
-      </w:pPr>
-      <w:r>
-        <w:rPr>
-          <w:rFonts w:ascii="MS Gothic" w:eastAsia="MS Gothic" w:hAnsi="MS Gothic" w:cs="MS Gothic" w:hint="eastAsia"/>
-        </w:rPr>
-        <w:t>├</w:t>
-      </w:r>
-      <w:r>
-        <w:rPr>
-          <w:rFonts w:ascii="Calibri" w:hAnsi="Calibri" w:cs="Calibri"/>
-        </w:rPr>
-        <w:t>──</w:t>
-      </w:r>
-      <w:r>
-        <w:t xml:space="preserve"> Scheduler</w:t>
-      </w:r>
-    </w:p>
-    <w:p>
-      <w:pPr>
-        <w:tabs>
-          <w:tab w:val="left" w:pos="6067"/>
-        </w:tabs>
-      </w:pPr>
-      <w:r>
-        <w:rPr>
-          <w:rFonts w:ascii="MS Gothic" w:eastAsia="MS Gothic" w:hAnsi="MS Gothic" w:cs="MS Gothic" w:hint="eastAsia"/>
-        </w:rPr>
-        <w:t>├</w:t>
-      </w:r>
-      <w:r>
-        <w:rPr>
-          <w:rFonts w:ascii="Calibri" w:hAnsi="Calibri" w:cs="Calibri"/>
-        </w:rPr>
-        <w:t>──</w:t>
-      </w:r>
-      <w:r>
-        <w:t xml:space="preserve"> Controller Manager</w:t>
-      </w:r>
-    </w:p>
-    <w:p>
-      <w:pPr>
-        <w:tabs>
-          <w:tab w:val="left" w:pos="6067"/>
-        </w:tabs>
-      </w:pPr>
-      <w:r>
-        <w:t>└── Cloud Controller Manager</w:t>
+    </w:p>
+    <w:p>
+      <w:pPr>
+        <w:tabs>
+          <w:tab w:val="left" w:pos="6067"/>
+        </w:tabs>
+      </w:pPr>
+      <w:r>
+        <w:t xml:space="preserve">           </w:t>
+      </w:r>
+      <w:r>
+        <w:t>kubectl create deployment nginx --image=nginx</w:t>
+      </w:r>
+    </w:p>
+    <w:p>
+      <w:pPr>
+        <w:tabs>
+          <w:tab w:val="left" w:pos="6067"/>
+        </w:tabs>
+      </w:pPr>
+      <w:r>
+        <w:t xml:space="preserve">Flow: </w:t>
+      </w:r>
+    </w:p>
+    <w:p>
+      <w:pPr>
+        <w:tabs>
+          <w:tab w:val="left" w:pos="6067"/>
+        </w:tabs>
+        <w:ind w:left="720"/>
+      </w:pPr>
+      <w:r>
+        <w:t>kubectl</w:t>
+      </w:r>
+    </w:p>
+    <w:p>
+      <w:pPr>
+        <w:tabs>
+          <w:tab w:val="left" w:pos="6067"/>
+        </w:tabs>
+        <w:ind w:left="720"/>
+      </w:pPr>
+      <w:r>
+        <w:t xml:space="preserve">   ↓</w:t>
+      </w:r>
+    </w:p>
+    <w:p>
+      <w:pPr>
+        <w:tabs>
+          <w:tab w:val="left" w:pos="6067"/>
+        </w:tabs>
+        <w:ind w:left="720"/>
+      </w:pPr>
+      <w:r>
+        <w:t>API Server</w:t>
+      </w:r>
+    </w:p>
+    <w:p>
+      <w:pPr>
+        <w:tabs>
+          <w:tab w:val="left" w:pos="6067"/>
+        </w:tabs>
+        <w:ind w:left="720"/>
+      </w:pPr>
+      <w:r>
+        <w:t xml:space="preserve">   ↓</w:t>
+      </w:r>
+    </w:p>
+    <w:p>
+      <w:pPr>
+        <w:tabs>
+          <w:tab w:val="left" w:pos="6067"/>
+        </w:tabs>
+        <w:ind w:left="720"/>
+      </w:pPr>
+      <w:r>
+        <w:t>Kubernetes</w:t>
+      </w:r>
+    </w:p>
+    <w:p>
+      <w:pPr>
+        <w:tabs>
+          <w:tab w:val="left" w:pos="6067"/>
+        </w:tabs>
+      </w:pPr>
+      <w:r>
+        <w:t>Almost all communication with the cluster goes through the API Server.</w:t>
+      </w:r>
+    </w:p>
+    <w:p>
+      <w:pPr>
+        <w:tabs>
+          <w:tab w:val="left" w:pos="6067"/>
+        </w:tabs>
+      </w:pPr>
+      <w:r>
+        <w:rPr>
+          <w:b/>
+          <w:bCs/>
+        </w:rPr>
+        <w:t>API Server = Gateway/Entry point</w:t>
       </w:r>
     </w:p>
     <w:p>
@@ -3028,199 +3121,17 @@
           <w:b/>
           <w:bCs/>
         </w:rPr>
-        <w:t xml:space="preserve"> API Server</w:t>
-      </w:r>
-    </w:p>
-    <w:p>
-      <w:pPr>
-        <w:tabs>
-          <w:tab w:val="left" w:pos="6067"/>
-        </w:tabs>
-      </w:pPr>
-      <w:r>
-        <w:t xml:space="preserve">The </w:t>
-      </w:r>
-      <w:r>
-        <w:rPr>
-          <w:b/>
-          <w:bCs/>
-        </w:rPr>
-        <w:t>API Server is the main entry point</w:t>
-      </w:r>
-      <w:r>
-        <w:t xml:space="preserve"> to Kubernetes.</w:t>
-      </w:r>
-    </w:p>
-    <w:p>
-      <w:pPr>
-        <w:tabs>
-          <w:tab w:val="left" w:pos="6067"/>
-        </w:tabs>
-      </w:pPr>
-      <w:r>
-        <w:t>For example:</w:t>
-      </w:r>
-      <w:r>
-        <w:t xml:space="preserve"> </w:t>
-      </w:r>
-    </w:p>
-    <w:p>
-      <w:pPr>
-        <w:tabs>
-          <w:tab w:val="left" w:pos="6067"/>
-        </w:tabs>
-      </w:pPr>
-      <w:r>
-        <w:t xml:space="preserve">           </w:t>
-      </w:r>
-      <w:proofErr w:type="spellStart"/>
-      <w:r>
-        <w:t>kubectl</w:t>
-      </w:r>
-      <w:proofErr w:type="spellEnd"/>
-      <w:r>
-        <w:t xml:space="preserve"> create deployment nginx --image=nginx</w:t>
-      </w:r>
-    </w:p>
-    <w:p>
-      <w:pPr>
-        <w:tabs>
-          <w:tab w:val="left" w:pos="6067"/>
-        </w:tabs>
-      </w:pPr>
-      <w:r>
-        <w:t xml:space="preserve">Flow: </w:t>
-      </w:r>
-    </w:p>
-    <w:p>
-      <w:pPr>
-        <w:tabs>
-          <w:tab w:val="left" w:pos="6067"/>
-        </w:tabs>
-        <w:ind w:left="720"/>
-      </w:pPr>
-      <w:proofErr w:type="spellStart"/>
-      <w:r>
-        <w:t>kubectl</w:t>
-      </w:r>
-      <w:proofErr w:type="spellEnd"/>
-    </w:p>
-    <w:p>
-      <w:pPr>
-        <w:tabs>
-          <w:tab w:val="left" w:pos="6067"/>
-        </w:tabs>
-        <w:ind w:left="720"/>
-      </w:pPr>
-      <w:r>
-        <w:t xml:space="preserve">   ↓</w:t>
-      </w:r>
-    </w:p>
-    <w:p>
-      <w:pPr>
-        <w:tabs>
-          <w:tab w:val="left" w:pos="6067"/>
-        </w:tabs>
-        <w:ind w:left="720"/>
-      </w:pPr>
-      <w:r>
-        <w:t>API Server</w:t>
-      </w:r>
-    </w:p>
-    <w:p>
-      <w:pPr>
-        <w:tabs>
-          <w:tab w:val="left" w:pos="6067"/>
-        </w:tabs>
-        <w:ind w:left="720"/>
-      </w:pPr>
-      <w:r>
-        <w:t xml:space="preserve">   ↓</w:t>
-      </w:r>
-    </w:p>
-    <w:p>
-      <w:pPr>
-        <w:tabs>
-          <w:tab w:val="left" w:pos="6067"/>
-        </w:tabs>
-        <w:ind w:left="720"/>
-      </w:pPr>
-      <w:r>
-        <w:t>Kubernetes</w:t>
-      </w:r>
-    </w:p>
-    <w:p>
-      <w:pPr>
-        <w:tabs>
-          <w:tab w:val="left" w:pos="6067"/>
-        </w:tabs>
-      </w:pPr>
-      <w:r>
-        <w:t>Almost all communication with the cluster goes through the API Server.</w:t>
-      </w:r>
-    </w:p>
-    <w:p>
-      <w:pPr>
-        <w:tabs>
-          <w:tab w:val="left" w:pos="6067"/>
-        </w:tabs>
-      </w:pPr>
-      <w:r>
-        <w:rPr>
-          <w:b/>
-          <w:bCs/>
-        </w:rPr>
-        <w:t>API Server = Gateway/Entry point</w:t>
-      </w:r>
-    </w:p>
-    <w:p>
-      <w:pPr>
-        <w:tabs>
-          <w:tab w:val="left" w:pos="6067"/>
-        </w:tabs>
-        <w:rPr>
-          <w:b/>
-          <w:bCs/>
-        </w:rPr>
-      </w:pPr>
-      <w:r>
-        <w:rPr>
-          <w:rFonts w:ascii="Segoe UI Emoji" w:hAnsi="Segoe UI Emoji" w:cs="Segoe UI Emoji"/>
-          <w:b/>
-          <w:bCs/>
-        </w:rPr>
-        <w:t>🔹</w:t>
-      </w:r>
-      <w:r>
-        <w:rPr>
-          <w:b/>
-          <w:bCs/>
-        </w:rPr>
-        <w:t xml:space="preserve"> </w:t>
-      </w:r>
-      <w:proofErr w:type="spellStart"/>
-      <w:r>
-        <w:rPr>
-          <w:b/>
-          <w:bCs/>
-        </w:rPr>
-        <w:t>etcd</w:t>
-      </w:r>
-      <w:proofErr w:type="spellEnd"/>
-    </w:p>
-    <w:p>
-      <w:pPr>
-        <w:tabs>
-          <w:tab w:val="left" w:pos="6067"/>
-        </w:tabs>
-      </w:pPr>
-      <w:proofErr w:type="spellStart"/>
-      <w:r>
-        <w:t>etcd</w:t>
-      </w:r>
-      <w:proofErr w:type="spellEnd"/>
-      <w:r>
-        <w:t xml:space="preserve"> is Kubernetes' </w:t>
+        <w:t xml:space="preserve"> etcd</w:t>
+      </w:r>
+    </w:p>
+    <w:p>
+      <w:pPr>
+        <w:tabs>
+          <w:tab w:val="left" w:pos="6067"/>
+        </w:tabs>
+      </w:pPr>
+      <w:r>
+        <w:t xml:space="preserve">etcd is Kubernetes' </w:t>
       </w:r>
       <w:r>
         <w:rPr>
@@ -3343,13 +3254,8 @@
         <w:ind w:left="360"/>
       </w:pPr>
       <w:r>
-        <w:t xml:space="preserve">    </w:t>
-      </w:r>
-      <w:proofErr w:type="spellStart"/>
-      <w:r>
-        <w:t>etcd</w:t>
-      </w:r>
-      <w:proofErr w:type="spellEnd"/>
+        <w:t xml:space="preserve">    etcd</w:t>
+      </w:r>
     </w:p>
     <w:p>
       <w:pPr>
@@ -3380,13 +3286,8 @@
           <w:tab w:val="left" w:pos="6067"/>
         </w:tabs>
       </w:pPr>
-      <w:proofErr w:type="spellStart"/>
-      <w:r>
-        <w:t>etcd</w:t>
-      </w:r>
-      <w:proofErr w:type="spellEnd"/>
-      <w:r>
-        <w:t xml:space="preserve"> = Database/Storage of cluster state</w:t>
+      <w:r>
+        <w:t>etcd = Database/Storage of cluster state</w:t>
       </w:r>
     </w:p>
     <w:p>
@@ -3643,13 +3544,8 @@
         </w:tabs>
         <w:ind w:left="720"/>
       </w:pPr>
-      <w:proofErr w:type="gramStart"/>
-      <w:r>
-        <w:t>Actual  =</w:t>
-      </w:r>
-      <w:proofErr w:type="gramEnd"/>
-      <w:r>
-        <w:t xml:space="preserve"> 2 Pods</w:t>
+      <w:r>
+        <w:t>Actual  = 2 Pods</w:t>
       </w:r>
     </w:p>
     <w:p>
@@ -3741,17 +3637,8 @@
           <w:b/>
           <w:bCs/>
         </w:rPr>
-        <w:t xml:space="preserve">self-healing/reconciliation </w:t>
-      </w:r>
-      <w:proofErr w:type="spellStart"/>
-      <w:r>
-        <w:rPr>
-          <w:b/>
-          <w:bCs/>
-        </w:rPr>
-        <w:t>behavior</w:t>
-      </w:r>
-      <w:proofErr w:type="spellEnd"/>
+        <w:t>self-healing/reconciliation behavior</w:t>
+      </w:r>
       <w:r>
         <w:t>.</w:t>
       </w:r>
@@ -3991,13 +3878,8 @@
         <w:t>──</w:t>
       </w:r>
       <w:r>
-        <w:t xml:space="preserve"> </w:t>
-      </w:r>
-      <w:proofErr w:type="spellStart"/>
-      <w:r>
-        <w:t>kubelet</w:t>
-      </w:r>
-      <w:proofErr w:type="spellEnd"/>
+        <w:t xml:space="preserve"> kubelet</w:t>
+      </w:r>
     </w:p>
     <w:p>
       <w:pPr>
@@ -4019,15 +3901,7 @@
         <w:t>──</w:t>
       </w:r>
       <w:r>
-        <w:t xml:space="preserve"> </w:t>
-      </w:r>
-      <w:proofErr w:type="spellStart"/>
-      <w:r>
-        <w:t>kube</w:t>
-      </w:r>
-      <w:proofErr w:type="spellEnd"/>
-      <w:r>
-        <w:t>-proxy</w:t>
+        <w:t xml:space="preserve"> kube-proxy</w:t>
       </w:r>
     </w:p>
     <w:p>
@@ -4086,31 +3960,17 @@
           <w:b/>
           <w:bCs/>
         </w:rPr>
-        <w:t xml:space="preserve"> </w:t>
-      </w:r>
-      <w:proofErr w:type="spellStart"/>
-      <w:r>
-        <w:rPr>
-          <w:b/>
-          <w:bCs/>
-        </w:rPr>
-        <w:t>kubelet</w:t>
-      </w:r>
-      <w:proofErr w:type="spellEnd"/>
-    </w:p>
-    <w:p>
-      <w:pPr>
-        <w:tabs>
-          <w:tab w:val="left" w:pos="6067"/>
-        </w:tabs>
-      </w:pPr>
-      <w:proofErr w:type="spellStart"/>
-      <w:r>
-        <w:t>kubelet</w:t>
-      </w:r>
-      <w:proofErr w:type="spellEnd"/>
-      <w:r>
-        <w:t xml:space="preserve"> is an </w:t>
+        <w:t xml:space="preserve"> kubelet</w:t>
+      </w:r>
+    </w:p>
+    <w:p>
+      <w:pPr>
+        <w:tabs>
+          <w:tab w:val="left" w:pos="6067"/>
+        </w:tabs>
+      </w:pPr>
+      <w:r>
+        <w:t xml:space="preserve">kubelet is an </w:t>
       </w:r>
       <w:r>
         <w:rPr>
@@ -4163,13 +4023,8 @@
         <w:ind w:left="720"/>
       </w:pPr>
       <w:r>
-        <w:t xml:space="preserve">   </w:t>
-      </w:r>
-      <w:proofErr w:type="spellStart"/>
-      <w:r>
-        <w:t>kubelet</w:t>
-      </w:r>
-      <w:proofErr w:type="spellEnd"/>
+        <w:t xml:space="preserve">   kubelet</w:t>
+      </w:r>
     </w:p>
     <w:p>
       <w:pPr>
@@ -4221,13 +4076,8 @@
           <w:tab w:val="left" w:pos="6067"/>
         </w:tabs>
       </w:pPr>
-      <w:proofErr w:type="spellStart"/>
-      <w:r>
-        <w:t>kubelet</w:t>
-      </w:r>
-      <w:proofErr w:type="spellEnd"/>
-      <w:r>
-        <w:t xml:space="preserve"> = Worker Node agent</w:t>
+      <w:r>
+        <w:t>kubelet = Worker Node agent</w:t>
       </w:r>
     </w:p>
     <w:p>
@@ -4304,13 +4154,8 @@
           <w:tab w:val="left" w:pos="6067"/>
         </w:tabs>
       </w:pPr>
-      <w:proofErr w:type="spellStart"/>
-      <w:r>
-        <w:t>containerd</w:t>
-      </w:r>
-      <w:proofErr w:type="spellEnd"/>
-      <w:r>
-        <w:t xml:space="preserve"> </w:t>
+      <w:r>
+        <w:t xml:space="preserve">containerd </w:t>
       </w:r>
     </w:p>
     <w:p>
@@ -4437,61 +4282,31 @@
           <w:b/>
           <w:bCs/>
         </w:rPr>
-        <w:t xml:space="preserve"> </w:t>
-      </w:r>
-      <w:proofErr w:type="spellStart"/>
-      <w:r>
-        <w:rPr>
-          <w:b/>
-          <w:bCs/>
-        </w:rPr>
-        <w:t>kube</w:t>
-      </w:r>
-      <w:proofErr w:type="spellEnd"/>
-      <w:r>
-        <w:rPr>
-          <w:b/>
-          <w:bCs/>
-        </w:rPr>
-        <w:t>-proxy</w:t>
-      </w:r>
-    </w:p>
-    <w:p>
-      <w:pPr>
-        <w:tabs>
-          <w:tab w:val="left" w:pos="6067"/>
-        </w:tabs>
-      </w:pPr>
-      <w:proofErr w:type="spellStart"/>
-      <w:r>
-        <w:t>kube</w:t>
-      </w:r>
-      <w:proofErr w:type="spellEnd"/>
-      <w:r>
-        <w:t>-proxy provides networking functionality on Worker Nodes and helps direct traffic to the appropriate Pods.</w:t>
-      </w:r>
-    </w:p>
-    <w:p>
-      <w:pPr>
-        <w:tabs>
-          <w:tab w:val="left" w:pos="6067"/>
-        </w:tabs>
-      </w:pPr>
-      <w:proofErr w:type="spellStart"/>
-      <w:r>
-        <w:rPr>
-          <w:b/>
-          <w:bCs/>
-        </w:rPr>
-        <w:t>kube</w:t>
-      </w:r>
-      <w:proofErr w:type="spellEnd"/>
-      <w:r>
-        <w:rPr>
-          <w:b/>
-          <w:bCs/>
-        </w:rPr>
-        <w:t>-proxy = Networking</w:t>
+        <w:t xml:space="preserve"> kube-proxy</w:t>
+      </w:r>
+    </w:p>
+    <w:p>
+      <w:pPr>
+        <w:tabs>
+          <w:tab w:val="left" w:pos="6067"/>
+        </w:tabs>
+      </w:pPr>
+      <w:r>
+        <w:t>kube-proxy provides networking functionality on Worker Nodes and helps direct traffic to the appropriate Pods.</w:t>
+      </w:r>
+    </w:p>
+    <w:p>
+      <w:pPr>
+        <w:tabs>
+          <w:tab w:val="left" w:pos="6067"/>
+        </w:tabs>
+      </w:pPr>
+      <w:r>
+        <w:rPr>
+          <w:b/>
+          <w:bCs/>
+        </w:rPr>
+        <w:t>kube-proxy = Networking</w:t>
       </w:r>
     </w:p>
     <w:p>
@@ -4728,34 +4543,17 @@
           <w:b/>
           <w:bCs/>
         </w:rPr>
-        <w:t xml:space="preserve">6. Example: Deploying an </w:t>
-      </w:r>
-      <w:proofErr w:type="gramStart"/>
-      <w:r>
-        <w:rPr>
-          <w:b/>
-          <w:bCs/>
-        </w:rPr>
-        <w:t>Application</w:t>
-      </w:r>
-      <w:proofErr w:type="gramEnd"/>
-    </w:p>
-    <w:p>
-      <w:pPr>
-        <w:tabs>
-          <w:tab w:val="left" w:pos="6067"/>
-        </w:tabs>
-      </w:pPr>
-      <w:r>
-        <w:t xml:space="preserve">Suppose you want to deploy </w:t>
-      </w:r>
-      <w:proofErr w:type="gramStart"/>
-      <w:r>
-        <w:t>an</w:t>
-      </w:r>
-      <w:proofErr w:type="gramEnd"/>
-      <w:r>
-        <w:t xml:space="preserve"> Nginx application.</w:t>
+        <w:t>6. Example: Deploying an Application</w:t>
+      </w:r>
+    </w:p>
+    <w:p>
+      <w:pPr>
+        <w:tabs>
+          <w:tab w:val="left" w:pos="6067"/>
+        </w:tabs>
+      </w:pPr>
+      <w:r>
+        <w:t>Suppose you want to deploy an Nginx application.</w:t>
       </w:r>
     </w:p>
     <w:p>
@@ -4787,11 +4585,9 @@
         </w:tabs>
         <w:ind w:left="720"/>
       </w:pPr>
-      <w:proofErr w:type="spellStart"/>
       <w:r>
         <w:t>kubectl</w:t>
       </w:r>
-      <w:proofErr w:type="spellEnd"/>
     </w:p>
     <w:p>
       <w:pPr>
@@ -4877,11 +4673,9 @@
         </w:tabs>
         <w:ind w:left="720"/>
       </w:pPr>
-      <w:proofErr w:type="spellStart"/>
       <w:r>
         <w:t>kubelet</w:t>
       </w:r>
-      <w:proofErr w:type="spellEnd"/>
     </w:p>
     <w:p>
       <w:pPr>
@@ -4966,11 +4760,9 @@
         </w:tabs>
         <w:ind w:left="720"/>
       </w:pPr>
-      <w:proofErr w:type="spellStart"/>
       <w:r>
         <w:t>etcd</w:t>
       </w:r>
-      <w:proofErr w:type="spellEnd"/>
     </w:p>
     <w:p>
       <w:pPr>
@@ -5050,337 +4842,307 @@
         </w:tabs>
         <w:ind w:left="720"/>
       </w:pPr>
-      <w:proofErr w:type="spellStart"/>
+      <w:r>
+        <w:t>kube-proxy</w:t>
+      </w:r>
+    </w:p>
+    <w:p>
+      <w:pPr>
+        <w:tabs>
+          <w:tab w:val="left" w:pos="6067"/>
+        </w:tabs>
+        <w:ind w:left="720"/>
+      </w:pPr>
+      <w:r>
+        <w:t xml:space="preserve"> ↓</w:t>
+      </w:r>
+    </w:p>
+    <w:p>
+      <w:pPr>
+        <w:tabs>
+          <w:tab w:val="left" w:pos="6067"/>
+        </w:tabs>
+        <w:ind w:left="720"/>
+      </w:pPr>
+      <w:r>
+        <w:t>Handles networking</w:t>
+      </w:r>
+    </w:p>
+    <w:p>
+      <w:pPr>
+        <w:tabs>
+          <w:tab w:val="left" w:pos="6067"/>
+        </w:tabs>
+      </w:pPr>
+    </w:p>
+    <w:p>
+      <w:pPr>
+        <w:tabs>
+          <w:tab w:val="left" w:pos="6067"/>
+        </w:tabs>
+      </w:pPr>
+      <w:r>
+        <w:t>7. Complete Architecture</w:t>
+      </w:r>
+    </w:p>
+    <w:p>
+      <w:pPr>
+        <w:tabs>
+          <w:tab w:val="left" w:pos="6067"/>
+        </w:tabs>
+      </w:pPr>
+      <w:r>
+        <w:t xml:space="preserve">                                                                             Kubernetes Cluster</w:t>
+      </w:r>
+    </w:p>
+    <w:p>
+      <w:pPr>
+        <w:tabs>
+          <w:tab w:val="left" w:pos="6067"/>
+        </w:tabs>
+      </w:pPr>
+      <w:r>
+        <w:t xml:space="preserve">                                                                                          │</w:t>
+      </w:r>
+    </w:p>
+    <w:p>
+      <w:pPr>
+        <w:tabs>
+          <w:tab w:val="left" w:pos="6067"/>
+        </w:tabs>
+      </w:pPr>
+      <w:r>
+        <w:t xml:space="preserve">          ┌───────────---------------------------------───</w:t>
+      </w:r>
+      <w:r>
+        <w:rPr>
+          <w:rFonts w:ascii="MS Gothic" w:eastAsia="MS Gothic" w:hAnsi="MS Gothic" w:cs="MS Gothic" w:hint="eastAsia"/>
+        </w:rPr>
+        <w:t>┴</w:t>
+      </w:r>
+      <w:r>
+        <w:rPr>
+          <w:rFonts w:ascii="Calibri" w:hAnsi="Calibri" w:cs="Calibri"/>
+        </w:rPr>
+        <w:t>─-----------------------─────────────┐</w:t>
+      </w:r>
+    </w:p>
+    <w:p>
+      <w:pPr>
+        <w:tabs>
+          <w:tab w:val="left" w:pos="6067"/>
+        </w:tabs>
+      </w:pPr>
+      <w:r>
+        <w:t xml:space="preserve">          │                                                                                                                                             │</w:t>
+      </w:r>
+    </w:p>
+    <w:p>
+      <w:pPr>
+        <w:tabs>
+          <w:tab w:val="left" w:pos="6067"/>
+        </w:tabs>
+      </w:pPr>
+      <w:r>
+        <w:t xml:space="preserve">     CONTROL PLANE                                                                                                         DATA PLANE</w:t>
+      </w:r>
+    </w:p>
+    <w:p>
+      <w:pPr>
+        <w:tabs>
+          <w:tab w:val="left" w:pos="6067"/>
+        </w:tabs>
+      </w:pPr>
+      <w:r>
+        <w:t xml:space="preserve">      (Master)                                                                                                                  (Worker Nodes)</w:t>
+      </w:r>
+    </w:p>
+    <w:p>
+      <w:pPr>
+        <w:tabs>
+          <w:tab w:val="left" w:pos="6067"/>
+        </w:tabs>
+      </w:pPr>
+      <w:r>
+        <w:t xml:space="preserve">          │                                                                                                                                          │</w:t>
+      </w:r>
+    </w:p>
+    <w:p>
+      <w:pPr>
+        <w:tabs>
+          <w:tab w:val="left" w:pos="6067"/>
+        </w:tabs>
+      </w:pPr>
+      <w:r>
+        <w:t xml:space="preserve">   ┌────</w:t>
+      </w:r>
+      <w:r>
+        <w:t>-------</w:t>
+      </w:r>
+      <w:r>
+        <w:t>──</w:t>
+      </w:r>
+      <w:r>
+        <w:rPr>
+          <w:rFonts w:ascii="MS Gothic" w:eastAsia="MS Gothic" w:hAnsi="MS Gothic" w:cs="MS Gothic" w:hint="eastAsia"/>
+        </w:rPr>
+        <w:t>┼</w:t>
+      </w:r>
+      <w:r>
+        <w:rPr>
+          <w:rFonts w:ascii="Calibri" w:hAnsi="Calibri" w:cs="Calibri"/>
+        </w:rPr>
+        <w:t>─────</w:t>
+      </w:r>
+      <w:r>
+        <w:rPr>
+          <w:rFonts w:ascii="Calibri" w:hAnsi="Calibri" w:cs="Calibri"/>
+        </w:rPr>
+        <w:t>--------</w:t>
+      </w:r>
+      <w:r>
+        <w:rPr>
+          <w:rFonts w:ascii="Calibri" w:hAnsi="Calibri" w:cs="Calibri"/>
+        </w:rPr>
+        <w:t>─┐</w:t>
+      </w:r>
+      <w:r>
+        <w:t xml:space="preserve">               </w:t>
+      </w:r>
+      <w:r>
+        <w:t xml:space="preserve">                                                  </w:t>
+      </w:r>
+      <w:r>
+        <w:rPr>
+          <w:rFonts w:ascii="Calibri" w:hAnsi="Calibri" w:cs="Calibri"/>
+        </w:rPr>
+        <w:t>┌─</w:t>
+      </w:r>
+      <w:r>
+        <w:rPr>
+          <w:rFonts w:ascii="Calibri" w:hAnsi="Calibri" w:cs="Calibri"/>
+        </w:rPr>
+        <w:t>-----</w:t>
+      </w:r>
+      <w:r>
+        <w:rPr>
+          <w:rFonts w:ascii="Calibri" w:hAnsi="Calibri" w:cs="Calibri"/>
+        </w:rPr>
+        <w:t>───</w:t>
+      </w:r>
+      <w:r>
+        <w:rPr>
+          <w:rFonts w:ascii="Calibri" w:hAnsi="Calibri" w:cs="Calibri"/>
+        </w:rPr>
+        <w:t>--</w:t>
+      </w:r>
+      <w:r>
+        <w:rPr>
+          <w:rFonts w:ascii="Calibri" w:hAnsi="Calibri" w:cs="Calibri"/>
+        </w:rPr>
+        <w:t>──</w:t>
+      </w:r>
+      <w:r>
+        <w:rPr>
+          <w:rFonts w:ascii="MS Gothic" w:eastAsia="MS Gothic" w:hAnsi="MS Gothic" w:cs="MS Gothic" w:hint="eastAsia"/>
+        </w:rPr>
+        <w:t>┼</w:t>
+      </w:r>
+      <w:r>
+        <w:rPr>
+          <w:rFonts w:ascii="Calibri" w:hAnsi="Calibri" w:cs="Calibri"/>
+        </w:rPr>
+        <w:t>──</w:t>
+      </w:r>
+      <w:r>
+        <w:rPr>
+          <w:rFonts w:ascii="Calibri" w:hAnsi="Calibri" w:cs="Calibri"/>
+        </w:rPr>
+        <w:t>------</w:t>
+      </w:r>
+      <w:r>
+        <w:rPr>
+          <w:rFonts w:ascii="Calibri" w:hAnsi="Calibri" w:cs="Calibri"/>
+        </w:rPr>
+        <w:t>────┐</w:t>
+      </w:r>
+    </w:p>
+    <w:p>
+      <w:pPr>
+        <w:tabs>
+          <w:tab w:val="left" w:pos="6067"/>
+        </w:tabs>
+      </w:pPr>
+      <w:r>
+        <w:t xml:space="preserve">   │      </w:t>
+      </w:r>
+      <w:r>
+        <w:t xml:space="preserve">                  </w:t>
+      </w:r>
+      <w:r>
+        <w:t xml:space="preserve">│      </w:t>
+      </w:r>
+      <w:r>
+        <w:t xml:space="preserve">                   </w:t>
+      </w:r>
+      <w:r>
+        <w:t xml:space="preserve">│               </w:t>
+      </w:r>
+      <w:r>
+        <w:t xml:space="preserve">                                                  </w:t>
+      </w:r>
+      <w:r>
+        <w:t>│</w:t>
+      </w:r>
+      <w:r>
+        <w:t xml:space="preserve">                  </w:t>
+      </w:r>
+      <w:r>
+        <w:t xml:space="preserve">      │  </w:t>
+      </w:r>
+      <w:r>
+        <w:t xml:space="preserve">                 </w:t>
+      </w:r>
+      <w:r>
+        <w:t xml:space="preserve">    │</w:t>
+      </w:r>
+    </w:p>
+    <w:p>
+      <w:pPr>
+        <w:tabs>
+          <w:tab w:val="left" w:pos="6067"/>
+        </w:tabs>
+      </w:pPr>
+      <w:r>
+        <w:t xml:space="preserve"> API  </w:t>
+      </w:r>
+      <w:r>
+        <w:t xml:space="preserve">             </w:t>
+      </w:r>
+      <w:r>
+        <w:t xml:space="preserve"> Scheduler </w:t>
+      </w:r>
+      <w:r>
+        <w:t xml:space="preserve">             </w:t>
+      </w:r>
+      <w:r>
+        <w:t xml:space="preserve">etcd          </w:t>
+      </w:r>
+      <w:r>
+        <w:t xml:space="preserve">                                              </w:t>
+      </w:r>
+      <w:r>
+        <w:t>kubelet</w:t>
+      </w:r>
+      <w:r>
+        <w:t xml:space="preserve">         </w:t>
+      </w:r>
       <w:r>
         <w:t>kube</w:t>
       </w:r>
-      <w:proofErr w:type="spellEnd"/>
-      <w:r>
-        <w:t>-proxy</w:t>
-      </w:r>
-    </w:p>
-    <w:p>
-      <w:pPr>
-        <w:tabs>
-          <w:tab w:val="left" w:pos="6067"/>
-        </w:tabs>
-        <w:ind w:left="720"/>
-      </w:pPr>
-      <w:r>
-        <w:t xml:space="preserve"> ↓</w:t>
-      </w:r>
-    </w:p>
-    <w:p>
-      <w:pPr>
-        <w:tabs>
-          <w:tab w:val="left" w:pos="6067"/>
-        </w:tabs>
-        <w:ind w:left="720"/>
-      </w:pPr>
-      <w:r>
-        <w:t>Handles networking</w:t>
-      </w:r>
-    </w:p>
-    <w:p>
-      <w:pPr>
-        <w:tabs>
-          <w:tab w:val="left" w:pos="6067"/>
-        </w:tabs>
-      </w:pPr>
-    </w:p>
-    <w:p>
-      <w:pPr>
-        <w:tabs>
-          <w:tab w:val="left" w:pos="6067"/>
-        </w:tabs>
-      </w:pPr>
-      <w:r>
-        <w:t>7. Complete Architecture</w:t>
-      </w:r>
-    </w:p>
-    <w:p>
-      <w:pPr>
-        <w:tabs>
-          <w:tab w:val="left" w:pos="6067"/>
-        </w:tabs>
-      </w:pPr>
-      <w:r>
-        <w:t xml:space="preserve">                                                                             Kubernetes Cluster</w:t>
-      </w:r>
-    </w:p>
-    <w:p>
-      <w:pPr>
-        <w:tabs>
-          <w:tab w:val="left" w:pos="6067"/>
-        </w:tabs>
-      </w:pPr>
-      <w:r>
-        <w:t xml:space="preserve">                                                                                          │</w:t>
-      </w:r>
-    </w:p>
-    <w:p>
-      <w:pPr>
-        <w:tabs>
-          <w:tab w:val="left" w:pos="6067"/>
-        </w:tabs>
-      </w:pPr>
-      <w:r>
-        <w:t xml:space="preserve">          ┌───────────---------------------------------───</w:t>
-      </w:r>
-      <w:r>
-        <w:rPr>
-          <w:rFonts w:ascii="MS Gothic" w:eastAsia="MS Gothic" w:hAnsi="MS Gothic" w:cs="MS Gothic" w:hint="eastAsia"/>
-        </w:rPr>
-        <w:t>┴</w:t>
-      </w:r>
-      <w:r>
-        <w:rPr>
-          <w:rFonts w:ascii="Calibri" w:hAnsi="Calibri" w:cs="Calibri"/>
-        </w:rPr>
-        <w:t>─-----------------------─────────────┐</w:t>
-      </w:r>
-    </w:p>
-    <w:p>
-      <w:pPr>
-        <w:tabs>
-          <w:tab w:val="left" w:pos="6067"/>
-        </w:tabs>
-      </w:pPr>
-      <w:r>
-        <w:t xml:space="preserve">          │                                                                                                                                             │</w:t>
-      </w:r>
-    </w:p>
-    <w:p>
-      <w:pPr>
-        <w:tabs>
-          <w:tab w:val="left" w:pos="6067"/>
-        </w:tabs>
-      </w:pPr>
-      <w:r>
-        <w:t xml:space="preserve">     CONTROL PLANE                                                                                                         DATA PLANE</w:t>
-      </w:r>
-    </w:p>
-    <w:p>
-      <w:pPr>
-        <w:tabs>
-          <w:tab w:val="left" w:pos="6067"/>
-        </w:tabs>
-      </w:pPr>
-      <w:r>
-        <w:t xml:space="preserve">      (</w:t>
-      </w:r>
-      <w:proofErr w:type="gramStart"/>
-      <w:r>
-        <w:t xml:space="preserve">Master)   </w:t>
-      </w:r>
-      <w:proofErr w:type="gramEnd"/>
-      <w:r>
-        <w:t xml:space="preserve">                                                                                                            </w:t>
-      </w:r>
-      <w:proofErr w:type="gramStart"/>
-      <w:r>
-        <w:t xml:space="preserve">   (</w:t>
-      </w:r>
-      <w:proofErr w:type="gramEnd"/>
-      <w:r>
-        <w:t>Worker Nodes)</w:t>
-      </w:r>
-    </w:p>
-    <w:p>
-      <w:pPr>
-        <w:tabs>
-          <w:tab w:val="left" w:pos="6067"/>
-        </w:tabs>
-      </w:pPr>
-      <w:r>
-        <w:t xml:space="preserve">          │                                                                                                                                          │</w:t>
-      </w:r>
-    </w:p>
-    <w:p>
-      <w:pPr>
-        <w:tabs>
-          <w:tab w:val="left" w:pos="6067"/>
-        </w:tabs>
-      </w:pPr>
-      <w:r>
-        <w:t xml:space="preserve">   ┌────</w:t>
-      </w:r>
-      <w:r>
-        <w:t>-------</w:t>
-      </w:r>
-      <w:r>
-        <w:t>──</w:t>
-      </w:r>
-      <w:r>
-        <w:rPr>
-          <w:rFonts w:ascii="MS Gothic" w:eastAsia="MS Gothic" w:hAnsi="MS Gothic" w:cs="MS Gothic" w:hint="eastAsia"/>
-        </w:rPr>
-        <w:t>┼</w:t>
-      </w:r>
-      <w:r>
-        <w:rPr>
-          <w:rFonts w:ascii="Calibri" w:hAnsi="Calibri" w:cs="Calibri"/>
-        </w:rPr>
-        <w:t>─────</w:t>
-      </w:r>
-      <w:r>
-        <w:rPr>
-          <w:rFonts w:ascii="Calibri" w:hAnsi="Calibri" w:cs="Calibri"/>
-        </w:rPr>
-        <w:t>--------</w:t>
-      </w:r>
-      <w:r>
-        <w:rPr>
-          <w:rFonts w:ascii="Calibri" w:hAnsi="Calibri" w:cs="Calibri"/>
-        </w:rPr>
-        <w:t>─┐</w:t>
-      </w:r>
-      <w:r>
-        <w:t xml:space="preserve">               </w:t>
-      </w:r>
-      <w:r>
-        <w:t xml:space="preserve">                                                  </w:t>
-      </w:r>
-      <w:r>
-        <w:rPr>
-          <w:rFonts w:ascii="Calibri" w:hAnsi="Calibri" w:cs="Calibri"/>
-        </w:rPr>
-        <w:t>┌─</w:t>
-      </w:r>
-      <w:r>
-        <w:rPr>
-          <w:rFonts w:ascii="Calibri" w:hAnsi="Calibri" w:cs="Calibri"/>
-        </w:rPr>
-        <w:t>-----</w:t>
-      </w:r>
-      <w:r>
-        <w:rPr>
-          <w:rFonts w:ascii="Calibri" w:hAnsi="Calibri" w:cs="Calibri"/>
-        </w:rPr>
-        <w:t>───</w:t>
-      </w:r>
-      <w:r>
-        <w:rPr>
-          <w:rFonts w:ascii="Calibri" w:hAnsi="Calibri" w:cs="Calibri"/>
-        </w:rPr>
-        <w:t>--</w:t>
-      </w:r>
-      <w:r>
-        <w:rPr>
-          <w:rFonts w:ascii="Calibri" w:hAnsi="Calibri" w:cs="Calibri"/>
-        </w:rPr>
-        <w:t>──</w:t>
-      </w:r>
-      <w:r>
-        <w:rPr>
-          <w:rFonts w:ascii="MS Gothic" w:eastAsia="MS Gothic" w:hAnsi="MS Gothic" w:cs="MS Gothic" w:hint="eastAsia"/>
-        </w:rPr>
-        <w:t>┼</w:t>
-      </w:r>
-      <w:r>
-        <w:rPr>
-          <w:rFonts w:ascii="Calibri" w:hAnsi="Calibri" w:cs="Calibri"/>
-        </w:rPr>
-        <w:t>──</w:t>
-      </w:r>
-      <w:r>
-        <w:rPr>
-          <w:rFonts w:ascii="Calibri" w:hAnsi="Calibri" w:cs="Calibri"/>
-        </w:rPr>
-        <w:t>------</w:t>
-      </w:r>
-      <w:r>
-        <w:rPr>
-          <w:rFonts w:ascii="Calibri" w:hAnsi="Calibri" w:cs="Calibri"/>
-        </w:rPr>
-        <w:t>────┐</w:t>
-      </w:r>
-    </w:p>
-    <w:p>
-      <w:pPr>
-        <w:tabs>
-          <w:tab w:val="left" w:pos="6067"/>
-        </w:tabs>
-      </w:pPr>
-      <w:r>
-        <w:t xml:space="preserve">   │      </w:t>
-      </w:r>
-      <w:r>
-        <w:t xml:space="preserve">                  </w:t>
-      </w:r>
-      <w:r>
-        <w:t xml:space="preserve">│      </w:t>
-      </w:r>
-      <w:r>
-        <w:t xml:space="preserve">                   </w:t>
-      </w:r>
-      <w:r>
-        <w:t xml:space="preserve">│               </w:t>
-      </w:r>
-      <w:r>
-        <w:t xml:space="preserve">                                                  </w:t>
-      </w:r>
-      <w:r>
-        <w:t>│</w:t>
-      </w:r>
-      <w:r>
-        <w:t xml:space="preserve">                  </w:t>
-      </w:r>
-      <w:r>
-        <w:t xml:space="preserve">      │  </w:t>
-      </w:r>
-      <w:r>
-        <w:t xml:space="preserve">                 </w:t>
-      </w:r>
-      <w:r>
-        <w:t xml:space="preserve">    │</w:t>
-      </w:r>
-    </w:p>
-    <w:p>
-      <w:pPr>
-        <w:tabs>
-          <w:tab w:val="left" w:pos="6067"/>
-        </w:tabs>
-      </w:pPr>
-      <w:r>
-        <w:t xml:space="preserve"> API  </w:t>
-      </w:r>
-      <w:r>
-        <w:t xml:space="preserve">             </w:t>
-      </w:r>
-      <w:r>
-        <w:t xml:space="preserve"> Scheduler </w:t>
-      </w:r>
-      <w:r>
-        <w:t xml:space="preserve">             </w:t>
-      </w:r>
-      <w:proofErr w:type="spellStart"/>
-      <w:r>
-        <w:t>etcd</w:t>
-      </w:r>
-      <w:proofErr w:type="spellEnd"/>
-      <w:r>
-        <w:t xml:space="preserve">          </w:t>
-      </w:r>
-      <w:r>
-        <w:t xml:space="preserve">                                              </w:t>
-      </w:r>
-      <w:proofErr w:type="spellStart"/>
-      <w:r>
-        <w:t>kubelet</w:t>
-      </w:r>
-      <w:proofErr w:type="spellEnd"/>
-      <w:r>
-        <w:t xml:space="preserve">         </w:t>
-      </w:r>
-      <w:proofErr w:type="spellStart"/>
-      <w:r>
-        <w:t>kube</w:t>
-      </w:r>
       <w:r>
         <w:t>proxy</w:t>
       </w:r>
-      <w:proofErr w:type="spellEnd"/>
       <w:r>
         <w:t xml:space="preserve">  </w:t>
       </w:r>
@@ -5600,15 +5362,7 @@
               <w:t>🚪</w:t>
             </w:r>
             <w:r>
-              <w:t xml:space="preserve"> Entry point; receives requests from </w:t>
-            </w:r>
-            <w:proofErr w:type="spellStart"/>
-            <w:r>
-              <w:t>kubectl</w:t>
-            </w:r>
-            <w:proofErr w:type="spellEnd"/>
-            <w:r>
-              <w:t xml:space="preserve"> and other components.</w:t>
+              <w:t xml:space="preserve"> Entry point; receives requests from kubectl and other components.</w:t>
             </w:r>
           </w:p>
         </w:tc>
@@ -5629,7 +5383,6 @@
                 <w:tab w:val="left" w:pos="6067"/>
               </w:tabs>
             </w:pPr>
-            <w:proofErr w:type="spellStart"/>
             <w:r>
               <w:rPr>
                 <w:b/>
@@ -5637,7 +5390,6 @@
               </w:rPr>
               <w:t>etcd</w:t>
             </w:r>
-            <w:proofErr w:type="spellEnd"/>
           </w:p>
         </w:tc>
         <w:tc>
@@ -5868,7 +5620,6 @@
                 <w:tab w:val="left" w:pos="6067"/>
               </w:tabs>
             </w:pPr>
-            <w:proofErr w:type="spellStart"/>
             <w:r>
               <w:rPr>
                 <w:b/>
@@ -5876,7 +5627,6 @@
               </w:rPr>
               <w:t>kubelet</w:t>
             </w:r>
-            <w:proofErr w:type="spellEnd"/>
           </w:p>
         </w:tc>
         <w:tc>
@@ -5929,21 +5679,12 @@
                 <w:tab w:val="left" w:pos="6067"/>
               </w:tabs>
             </w:pPr>
-            <w:proofErr w:type="spellStart"/>
             <w:r>
               <w:rPr>
                 <w:b/>
                 <w:bCs/>
               </w:rPr>
-              <w:t>kube</w:t>
-            </w:r>
-            <w:proofErr w:type="spellEnd"/>
-            <w:r>
-              <w:rPr>
-                <w:b/>
-                <w:bCs/>
-              </w:rPr>
-              <w:t>-proxy</w:t>
+              <w:t>kube-proxy</w:t>
             </w:r>
           </w:p>
         </w:tc>
@@ -6035,15 +5776,7 @@
               <w:t>runs containers</w:t>
             </w:r>
             <w:r>
-              <w:t xml:space="preserve"> (</w:t>
-            </w:r>
-            <w:proofErr w:type="spellStart"/>
-            <w:r>
-              <w:t>containerd</w:t>
-            </w:r>
-            <w:proofErr w:type="spellEnd"/>
-            <w:r>
-              <w:t>, CRI-O).</w:t>
+              <w:t xml:space="preserve"> (containerd, CRI-O).</w:t>
             </w:r>
           </w:p>
         </w:tc>
@@ -6159,14 +5892,7 @@
       </w:r>
       <w:r>
         <w:br/>
-      </w:r>
-      <w:proofErr w:type="spellStart"/>
-      <w:r>
-        <w:t>etcd</w:t>
-      </w:r>
-      <w:proofErr w:type="spellEnd"/>
-      <w:r>
-        <w:t xml:space="preserve"> → Store</w:t>
+        <w:t>etcd → Store</w:t>
       </w:r>
       <w:r>
         <w:br/>
@@ -6178,25 +5904,11 @@
       </w:r>
       <w:r>
         <w:br/>
-      </w:r>
-      <w:proofErr w:type="spellStart"/>
-      <w:r>
-        <w:t>kubelet</w:t>
-      </w:r>
-      <w:proofErr w:type="spellEnd"/>
-      <w:r>
-        <w:t xml:space="preserve"> → Manage Pods</w:t>
+        <w:t>kubelet → Manage Pods</w:t>
       </w:r>
       <w:r>
         <w:br/>
-      </w:r>
-      <w:proofErr w:type="spellStart"/>
-      <w:r>
-        <w:t>kube</w:t>
-      </w:r>
-      <w:proofErr w:type="spellEnd"/>
-      <w:r>
-        <w:t>-proxy → Network</w:t>
+        <w:t>kube-proxy → Network</w:t>
       </w:r>
       <w:r>
         <w:br/>
@@ -6324,27 +6036,7 @@
           <w:szCs w:val="32"/>
         </w:rPr>
         <w:lastRenderedPageBreak/>
-        <w:t xml:space="preserve">3.) How to Manage Hundreds of Kubernetes </w:t>
-      </w:r>
-      <w:proofErr w:type="gramStart"/>
-      <w:r>
-        <w:rPr>
-          <w:b/>
-          <w:bCs/>
-          <w:sz w:val="32"/>
-          <w:szCs w:val="32"/>
-        </w:rPr>
-        <w:t>clusters ???</w:t>
-      </w:r>
-      <w:proofErr w:type="gramEnd"/>
-      <w:r>
-        <w:rPr>
-          <w:b/>
-          <w:bCs/>
-          <w:sz w:val="32"/>
-          <w:szCs w:val="32"/>
-        </w:rPr>
-        <w:t xml:space="preserve"> | KOPS</w:t>
+        <w:t>3.) How to Manage Hundreds of Kubernetes clusters ??? | KOPS</w:t>
       </w:r>
     </w:p>
     <w:p>
@@ -6385,13 +6077,8 @@
           <w:tab w:val="left" w:pos="6067"/>
         </w:tabs>
       </w:pPr>
-      <w:proofErr w:type="spellStart"/>
-      <w:r>
-        <w:t>Minikube</w:t>
-      </w:r>
-      <w:proofErr w:type="spellEnd"/>
-      <w:r>
-        <w:t xml:space="preserve"> </w:t>
+      <w:r>
+        <w:t xml:space="preserve">Minikube </w:t>
       </w:r>
     </w:p>
     <w:p>
@@ -6598,13 +6285,8 @@
           <w:tab w:val="left" w:pos="6067"/>
         </w:tabs>
       </w:pPr>
-      <w:proofErr w:type="gramStart"/>
-      <w:r>
-        <w:t>So</w:t>
-      </w:r>
-      <w:proofErr w:type="gramEnd"/>
-      <w:r>
-        <w:t xml:space="preserve"> a DevOps engineer needs tools that can manage the </w:t>
+      <w:r>
+        <w:t xml:space="preserve">So a DevOps engineer needs tools that can manage the </w:t>
       </w:r>
       <w:r>
         <w:rPr>
@@ -6724,11 +6406,9 @@
                 <w:tab w:val="left" w:pos="6067"/>
               </w:tabs>
             </w:pPr>
-            <w:proofErr w:type="spellStart"/>
             <w:r>
               <w:t>Minikube</w:t>
             </w:r>
-            <w:proofErr w:type="spellEnd"/>
           </w:p>
         </w:tc>
         <w:tc>
@@ -6766,13 +6446,8 @@
                 <w:tab w:val="left" w:pos="6067"/>
               </w:tabs>
             </w:pPr>
-            <w:proofErr w:type="gramStart"/>
             <w:r>
-              <w:t>Usually</w:t>
-            </w:r>
-            <w:proofErr w:type="gramEnd"/>
-            <w:r>
-              <w:t xml:space="preserve"> single node</w:t>
+              <w:t>Usually single node</w:t>
             </w:r>
           </w:p>
         </w:tc>
@@ -6989,13 +6664,8 @@
               </w:tabs>
             </w:pPr>
             <w:r>
-              <w:t xml:space="preserve">Cloud / Data </w:t>
+              <w:t>Cloud / Data Center</w:t>
             </w:r>
-            <w:proofErr w:type="spellStart"/>
-            <w:r>
-              <w:t>Center</w:t>
-            </w:r>
-            <w:proofErr w:type="spellEnd"/>
           </w:p>
         </w:tc>
       </w:tr>
@@ -7025,28 +6695,18 @@
         </w:rPr>
         <w:t xml:space="preserve">: </w:t>
       </w:r>
-      <w:proofErr w:type="spellStart"/>
-      <w:r>
-        <w:t>Minikube</w:t>
-      </w:r>
-      <w:proofErr w:type="spellEnd"/>
-      <w:r>
-        <w:t xml:space="preserve"> is NOT a replacement for a production Kubernetes cluster.</w:t>
-      </w:r>
-    </w:p>
-    <w:p>
-      <w:pPr>
-        <w:tabs>
-          <w:tab w:val="left" w:pos="6067"/>
-        </w:tabs>
-      </w:pPr>
-      <w:proofErr w:type="spellStart"/>
-      <w:r>
-        <w:t>Minikube</w:t>
-      </w:r>
-      <w:proofErr w:type="spellEnd"/>
-      <w:r>
-        <w:t xml:space="preserve"> is excellent for learning Kubernetes concepts, but production environments require much more infrastructure.</w:t>
+      <w:r>
+        <w:t>Minikube is NOT a replacement for a production Kubernetes cluster.</w:t>
+      </w:r>
+    </w:p>
+    <w:p>
+      <w:pPr>
+        <w:tabs>
+          <w:tab w:val="left" w:pos="6067"/>
+        </w:tabs>
+      </w:pPr>
+      <w:r>
+        <w:t>Minikube is excellent for learning Kubernetes concepts, but production environments require much more infrastructure.</w:t>
       </w:r>
     </w:p>
     <w:p>
@@ -7737,144 +7397,68 @@
       </w:pPr>
       <w:r>
         <w:lastRenderedPageBreak/>
-        <w:t xml:space="preserve">                                                                                  </w:t>
-      </w:r>
-      <w:r>
-        <w:t>KOPS</w:t>
-      </w:r>
-    </w:p>
-    <w:p>
-      <w:pPr>
-        <w:tabs>
-          <w:tab w:val="left" w:pos="6067"/>
-        </w:tabs>
-      </w:pPr>
-      <w:r>
-        <w:t xml:space="preserve">                </w:t>
-      </w:r>
-      <w:r>
-        <w:t xml:space="preserve">                                                                      </w:t>
-      </w:r>
-      <w:r>
-        <w:t>|</w:t>
-      </w:r>
-    </w:p>
-    <w:p>
-      <w:pPr>
-        <w:tabs>
-          <w:tab w:val="left" w:pos="6067"/>
-        </w:tabs>
-      </w:pPr>
-      <w:r>
-        <w:t xml:space="preserve">       +-----</w:t>
-      </w:r>
-      <w:r>
-        <w:t>-------------------------------------------------</w:t>
-      </w:r>
-      <w:r>
-        <w:t>---+----</w:t>
-      </w:r>
-      <w:r>
-        <w:t>------------------------------------------------</w:t>
-      </w:r>
-      <w:r>
-        <w:t>----+</w:t>
-      </w:r>
-    </w:p>
-    <w:p>
-      <w:pPr>
-        <w:tabs>
-          <w:tab w:val="left" w:pos="6067"/>
-        </w:tabs>
-      </w:pPr>
-      <w:r>
-        <w:t xml:space="preserve">       |        </w:t>
-      </w:r>
-      <w:r>
-        <w:t xml:space="preserve">                                                                      </w:t>
-      </w:r>
-      <w:r>
-        <w:t>|</w:t>
-      </w:r>
-      <w:r>
-        <w:t xml:space="preserve">                                                                    </w:t>
-      </w:r>
-      <w:r>
-        <w:t xml:space="preserve">        |</w:t>
-      </w:r>
-    </w:p>
-    <w:p>
-      <w:pPr>
-        <w:tabs>
-          <w:tab w:val="left" w:pos="6067"/>
-        </w:tabs>
-      </w:pPr>
-      <w:r>
-        <w:t xml:space="preserve">    Cluster1 </w:t>
-      </w:r>
-      <w:r>
-        <w:t xml:space="preserve">                                                            </w:t>
-      </w:r>
-      <w:r>
-        <w:t xml:space="preserve">Cluster2 </w:t>
-      </w:r>
-      <w:r>
-        <w:t xml:space="preserve">                                                              </w:t>
-      </w:r>
-      <w:r>
-        <w:t>Cluster3</w:t>
-      </w:r>
-    </w:p>
-    <w:p>
-      <w:pPr>
-        <w:tabs>
-          <w:tab w:val="left" w:pos="6067"/>
-        </w:tabs>
-      </w:pPr>
-      <w:r>
-        <w:t xml:space="preserve">       |       </w:t>
-      </w:r>
-      <w:r>
-        <w:t xml:space="preserve">                                                                      </w:t>
-      </w:r>
-      <w:r>
-        <w:t xml:space="preserve"> |        </w:t>
-      </w:r>
-      <w:r>
-        <w:t xml:space="preserve">                                                                     </w:t>
-      </w:r>
-      <w:r>
-        <w:t>|</w:t>
-      </w:r>
-    </w:p>
-    <w:p>
-      <w:pPr>
-        <w:tabs>
-          <w:tab w:val="left" w:pos="6067"/>
-        </w:tabs>
-      </w:pPr>
-      <w:r>
-        <w:t xml:space="preserve">    Workers  </w:t>
-      </w:r>
-      <w:r>
-        <w:t xml:space="preserve">                                                            </w:t>
-      </w:r>
-      <w:proofErr w:type="spellStart"/>
-      <w:r>
-        <w:t>Workers</w:t>
-      </w:r>
-      <w:proofErr w:type="spellEnd"/>
-      <w:r>
-        <w:t xml:space="preserve">  </w:t>
-      </w:r>
-      <w:r>
-        <w:t xml:space="preserve">                                                              </w:t>
-      </w:r>
-      <w:proofErr w:type="spellStart"/>
-      <w:r>
-        <w:t>Workers</w:t>
-      </w:r>
-      <w:proofErr w:type="spellEnd"/>
+        <w:t xml:space="preserve">                                                                                  KOPS</w:t>
+      </w:r>
+    </w:p>
+    <w:p>
+      <w:pPr>
+        <w:tabs>
+          <w:tab w:val="left" w:pos="6067"/>
+        </w:tabs>
+      </w:pPr>
+      <w:r>
+        <w:t xml:space="preserve">                                                                                      |</w:t>
+      </w:r>
+    </w:p>
+    <w:p>
+      <w:pPr>
+        <w:tabs>
+          <w:tab w:val="left" w:pos="6067"/>
+        </w:tabs>
+      </w:pPr>
+      <w:r>
+        <w:t xml:space="preserve">       +---------------------------------------------------------+--------------------------------------------------------+</w:t>
+      </w:r>
+    </w:p>
+    <w:p>
+      <w:pPr>
+        <w:tabs>
+          <w:tab w:val="left" w:pos="6067"/>
+        </w:tabs>
+      </w:pPr>
+      <w:r>
+        <w:t xml:space="preserve">       |                                                                              |                                                                            |</w:t>
+      </w:r>
+    </w:p>
+    <w:p>
+      <w:pPr>
+        <w:tabs>
+          <w:tab w:val="left" w:pos="6067"/>
+        </w:tabs>
+      </w:pPr>
+      <w:r>
+        <w:t xml:space="preserve">    Cluster1                                                             Cluster2                                                               Cluster3</w:t>
+      </w:r>
+    </w:p>
+    <w:p>
+      <w:pPr>
+        <w:tabs>
+          <w:tab w:val="left" w:pos="6067"/>
+        </w:tabs>
+      </w:pPr>
+      <w:r>
+        <w:t xml:space="preserve">       |                                                                              |                                                                             |</w:t>
+      </w:r>
+    </w:p>
+    <w:p>
+      <w:pPr>
+        <w:tabs>
+          <w:tab w:val="left" w:pos="6067"/>
+        </w:tabs>
+      </w:pPr>
+      <w:r>
+        <w:t xml:space="preserve">    Workers                                                              Workers                                                                Workers</w:t>
+      </w:r>
     </w:p>
     <w:p>
       <w:pPr>
@@ -8127,11 +7711,9 @@
         </w:tabs>
         <w:ind w:left="2880"/>
       </w:pPr>
-      <w:proofErr w:type="spellStart"/>
       <w:r>
         <w:t>etcd</w:t>
       </w:r>
-      <w:proofErr w:type="spellEnd"/>
     </w:p>
     <w:p>
       <w:pPr>
@@ -8633,6 +8215,9 @@
         </w:tabs>
       </w:pPr>
       <w:r>
+        <w:rPr>
+          <w:noProof/>
+        </w:rPr>
         <w:drawing>
           <wp:inline distT="0" distB="0" distL="0" distR="0" wp14:anchorId="4FC8355B" wp14:editId="4EB3C3BE">
             <wp:extent cx="3330229" cy="5357324"/>
@@ -9054,13 +8639,8 @@
       <w:r>
         <w:t xml:space="preserve"> </w:t>
       </w:r>
-      <w:proofErr w:type="spellStart"/>
-      <w:r>
-        <w:t>aws</w:t>
-      </w:r>
-      <w:proofErr w:type="spellEnd"/>
-      <w:r>
-        <w:t xml:space="preserve"> configure</w:t>
+      <w:r>
+        <w:t>aws configure</w:t>
       </w:r>
     </w:p>
     <w:p>
@@ -9203,11 +8783,9 @@
         </w:tabs>
         <w:ind w:left="720"/>
       </w:pPr>
-      <w:proofErr w:type="spellStart"/>
       <w:r>
         <w:t>kubectl</w:t>
       </w:r>
-      <w:proofErr w:type="spellEnd"/>
     </w:p>
     <w:p>
       <w:pPr>
@@ -9347,28 +8925,18 @@
         </w:tabs>
         <w:ind w:left="720"/>
       </w:pPr>
-      <w:proofErr w:type="spellStart"/>
-      <w:r>
-        <w:t>K</w:t>
-      </w:r>
-      <w:r>
-        <w:t>ubectl</w:t>
-      </w:r>
-      <w:proofErr w:type="spellEnd"/>
-    </w:p>
-    <w:p>
-      <w:pPr>
-        <w:tabs>
-          <w:tab w:val="left" w:pos="6067"/>
-        </w:tabs>
-      </w:pPr>
-      <w:proofErr w:type="spellStart"/>
-      <w:r>
-        <w:t>kubectl</w:t>
-      </w:r>
-      <w:proofErr w:type="spellEnd"/>
-      <w:r>
-        <w:t xml:space="preserve"> is used to interact with the Kubernetes cluster after it is available.</w:t>
+      <w:r>
+        <w:t>Kubectl</w:t>
+      </w:r>
+    </w:p>
+    <w:p>
+      <w:pPr>
+        <w:tabs>
+          <w:tab w:val="left" w:pos="6067"/>
+        </w:tabs>
+      </w:pPr>
+      <w:r>
+        <w:t>kubectl is used to interact with the Kubernetes cluster after it is available.</w:t>
       </w:r>
     </w:p>
     <w:p>
@@ -9447,10 +9015,2015 @@
         <w:tabs>
           <w:tab w:val="left" w:pos="6067"/>
         </w:tabs>
+        <w:rPr>
+          <w:b/>
+          <w:bCs/>
+          <w:sz w:val="32"/>
+          <w:szCs w:val="32"/>
+        </w:rPr>
+      </w:pPr>
+      <w:r>
+        <w:rPr>
+          <w:b/>
+          <w:bCs/>
+          <w:sz w:val="32"/>
+          <w:szCs w:val="32"/>
+        </w:rPr>
+        <w:lastRenderedPageBreak/>
+        <w:t xml:space="preserve">4.) </w:t>
+      </w:r>
+      <w:r>
+        <w:rPr>
+          <w:b/>
+          <w:bCs/>
+          <w:sz w:val="32"/>
+          <w:szCs w:val="32"/>
+        </w:rPr>
+        <w:t>KUBERNETES PODS | DEPLOY YOUR FIRST APP</w:t>
+      </w:r>
+    </w:p>
+    <w:p>
+      <w:pPr>
+        <w:tabs>
+          <w:tab w:val="left" w:pos="6067"/>
+        </w:tabs>
+      </w:pPr>
+      <w:r>
+        <w:t>1. What is a Pod?</w:t>
+      </w:r>
+    </w:p>
+    <w:p>
+      <w:pPr>
+        <w:tabs>
+          <w:tab w:val="left" w:pos="6067"/>
+        </w:tabs>
+      </w:pPr>
+      <w:r>
+        <w:t>A Pod is the smallest deployable unit in Kubernetes.</w:t>
+      </w:r>
+    </w:p>
+    <w:p>
+      <w:pPr>
+        <w:tabs>
+          <w:tab w:val="left" w:pos="6067"/>
+        </w:tabs>
+      </w:pPr>
+      <w:r>
+        <w:t xml:space="preserve">Kubernetes does </w:t>
+      </w:r>
+      <w:r>
+        <w:rPr>
+          <w:b/>
+          <w:bCs/>
+        </w:rPr>
+        <w:t>not directly manage containers</w:t>
+      </w:r>
+      <w:r>
+        <w:t>. Instead:</w:t>
+      </w:r>
+    </w:p>
+    <w:p>
+      <w:pPr>
+        <w:tabs>
+          <w:tab w:val="left" w:pos="6067"/>
+        </w:tabs>
+        <w:ind w:left="720"/>
+      </w:pPr>
+      <w:r>
+        <w:t>Kubernetes</w:t>
+      </w:r>
+    </w:p>
+    <w:p>
+      <w:pPr>
+        <w:tabs>
+          <w:tab w:val="left" w:pos="6067"/>
+        </w:tabs>
+        <w:ind w:left="720"/>
+      </w:pPr>
+      <w:r>
+        <w:t xml:space="preserve">    ↓</w:t>
+      </w:r>
+    </w:p>
+    <w:p>
+      <w:pPr>
+        <w:tabs>
+          <w:tab w:val="left" w:pos="6067"/>
+        </w:tabs>
+        <w:ind w:left="720"/>
+      </w:pPr>
+      <w:r>
+        <w:t xml:space="preserve">   Pod</w:t>
+      </w:r>
+    </w:p>
+    <w:p>
+      <w:pPr>
+        <w:tabs>
+          <w:tab w:val="left" w:pos="6067"/>
+        </w:tabs>
+        <w:ind w:left="720"/>
+      </w:pPr>
+      <w:r>
+        <w:t xml:space="preserve">    ↓</w:t>
+      </w:r>
+    </w:p>
+    <w:p>
+      <w:pPr>
+        <w:tabs>
+          <w:tab w:val="left" w:pos="6067"/>
+        </w:tabs>
+        <w:ind w:left="720"/>
+      </w:pPr>
+      <w:r>
+        <w:t>Container</w:t>
+      </w:r>
+    </w:p>
+    <w:p>
+      <w:pPr>
+        <w:tabs>
+          <w:tab w:val="left" w:pos="6067"/>
+        </w:tabs>
+      </w:pPr>
+      <w:r>
+        <w:t>A Pod provides the environment in which one or more containers run.</w:t>
+      </w:r>
+    </w:p>
+    <w:p>
+      <w:pPr>
+        <w:tabs>
+          <w:tab w:val="left" w:pos="6067"/>
+        </w:tabs>
+      </w:pPr>
+      <w:r>
+        <w:t xml:space="preserve">Most Pods contain </w:t>
+      </w:r>
+      <w:r>
+        <w:rPr>
+          <w:b/>
+          <w:bCs/>
+        </w:rPr>
+        <w:t>one container</w:t>
+      </w:r>
+      <w:r>
+        <w:t>, but a Pod can contain multiple tightly coupled containers.</w:t>
+      </w:r>
+    </w:p>
+    <w:p>
+      <w:pPr>
+        <w:pStyle w:val="ListParagraph"/>
+        <w:numPr>
+          <w:ilvl w:val="0"/>
+          <w:numId w:val="15"/>
+        </w:numPr>
+        <w:tabs>
+          <w:tab w:val="left" w:pos="6067"/>
+        </w:tabs>
+      </w:pPr>
+      <w:r>
+        <w:t>Simple definition</w:t>
+      </w:r>
+      <w:r>
+        <w:t xml:space="preserve">: </w:t>
+      </w:r>
+      <w:r>
+        <w:t>Pod = A wrapper around one or more containers that share networking and certain resources.</w:t>
+      </w:r>
+    </w:p>
+    <w:p>
+      <w:pPr>
+        <w:tabs>
+          <w:tab w:val="left" w:pos="6067"/>
+        </w:tabs>
+      </w:pPr>
+    </w:p>
+    <w:p>
+      <w:pPr>
+        <w:tabs>
+          <w:tab w:val="left" w:pos="6067"/>
+        </w:tabs>
+        <w:rPr>
+          <w:b/>
+          <w:bCs/>
+        </w:rPr>
+      </w:pPr>
+      <w:r>
+        <w:rPr>
+          <w:b/>
+          <w:bCs/>
+        </w:rPr>
+        <w:t>2. Container vs Pod</w:t>
+      </w:r>
+    </w:p>
+    <w:p>
+      <w:pPr>
+        <w:tabs>
+          <w:tab w:val="left" w:pos="6067"/>
+        </w:tabs>
+        <w:rPr>
+          <w:b/>
+          <w:bCs/>
+        </w:rPr>
+      </w:pPr>
+      <w:r>
+        <w:rPr>
+          <w:b/>
+          <w:bCs/>
+        </w:rPr>
+        <w:t>Docker</w:t>
+      </w:r>
+    </w:p>
+    <w:p>
+      <w:pPr>
+        <w:tabs>
+          <w:tab w:val="left" w:pos="6067"/>
+        </w:tabs>
+      </w:pPr>
+      <w:r>
+        <w:t>With Docker, you generally run:</w:t>
+      </w:r>
+    </w:p>
+    <w:p>
+      <w:pPr>
+        <w:tabs>
+          <w:tab w:val="left" w:pos="6067"/>
+        </w:tabs>
+        <w:ind w:left="720"/>
+      </w:pPr>
+      <w:r>
+        <w:t>Docker</w:t>
+      </w:r>
+    </w:p>
+    <w:p>
+      <w:pPr>
+        <w:tabs>
+          <w:tab w:val="left" w:pos="6067"/>
+        </w:tabs>
+        <w:ind w:left="720"/>
+      </w:pPr>
+      <w:r>
+        <w:t xml:space="preserve">   ↓</w:t>
+      </w:r>
+    </w:p>
+    <w:p>
+      <w:pPr>
+        <w:tabs>
+          <w:tab w:val="left" w:pos="6067"/>
+        </w:tabs>
+        <w:ind w:left="720"/>
+      </w:pPr>
+      <w:r>
+        <w:t>Container</w:t>
+      </w:r>
+    </w:p>
+    <w:p>
+      <w:pPr>
+        <w:tabs>
+          <w:tab w:val="left" w:pos="6067"/>
+        </w:tabs>
+        <w:ind w:left="720"/>
+      </w:pPr>
+      <w:r>
+        <w:t xml:space="preserve">   ↓</w:t>
+      </w:r>
+    </w:p>
+    <w:p>
+      <w:pPr>
+        <w:tabs>
+          <w:tab w:val="left" w:pos="6067"/>
+        </w:tabs>
+        <w:ind w:left="720"/>
+      </w:pPr>
+      <w:r>
+        <w:t>Application</w:t>
+      </w:r>
+    </w:p>
+    <w:p>
+      <w:pPr>
+        <w:tabs>
+          <w:tab w:val="left" w:pos="6067"/>
+        </w:tabs>
+      </w:pPr>
+      <w:r>
+        <w:t>Example:</w:t>
+      </w:r>
+      <w:r>
+        <w:t xml:space="preserve"> </w:t>
+      </w:r>
+      <w:r>
+        <w:t>docker run nginx</w:t>
+      </w:r>
+    </w:p>
+    <w:p>
+      <w:pPr>
+        <w:tabs>
+          <w:tab w:val="left" w:pos="6067"/>
+        </w:tabs>
+        <w:rPr>
+          <w:b/>
+          <w:bCs/>
+        </w:rPr>
+      </w:pPr>
+      <w:r>
+        <w:rPr>
+          <w:b/>
+          <w:bCs/>
+        </w:rPr>
+        <w:t>Kubernetes</w:t>
+      </w:r>
+    </w:p>
+    <w:p>
+      <w:pPr>
+        <w:tabs>
+          <w:tab w:val="left" w:pos="6067"/>
+        </w:tabs>
+      </w:pPr>
+      <w:r>
+        <w:t>With Kubernetes:</w:t>
+      </w:r>
+    </w:p>
+    <w:p>
+      <w:pPr>
+        <w:tabs>
+          <w:tab w:val="left" w:pos="6067"/>
+        </w:tabs>
+        <w:ind w:left="720"/>
+      </w:pPr>
+      <w:r>
+        <w:t>Kubernetes</w:t>
+      </w:r>
+    </w:p>
+    <w:p>
+      <w:pPr>
+        <w:tabs>
+          <w:tab w:val="left" w:pos="6067"/>
+        </w:tabs>
+        <w:ind w:left="720"/>
+      </w:pPr>
+      <w:r>
+        <w:t xml:space="preserve">     ↓</w:t>
+      </w:r>
+    </w:p>
+    <w:p>
+      <w:pPr>
+        <w:tabs>
+          <w:tab w:val="left" w:pos="6067"/>
+        </w:tabs>
+        <w:ind w:left="720"/>
+      </w:pPr>
+      <w:r>
+        <w:t xml:space="preserve">    Pod</w:t>
+      </w:r>
+    </w:p>
+    <w:p>
+      <w:pPr>
+        <w:tabs>
+          <w:tab w:val="left" w:pos="6067"/>
+        </w:tabs>
+        <w:ind w:left="720"/>
+      </w:pPr>
+      <w:r>
+        <w:t xml:space="preserve">     ↓</w:t>
+      </w:r>
+    </w:p>
+    <w:p>
+      <w:pPr>
+        <w:tabs>
+          <w:tab w:val="left" w:pos="6067"/>
+        </w:tabs>
+        <w:ind w:left="720"/>
+      </w:pPr>
+      <w:r>
+        <w:t xml:space="preserve"> Container</w:t>
+      </w:r>
+    </w:p>
+    <w:p>
+      <w:pPr>
+        <w:tabs>
+          <w:tab w:val="left" w:pos="6067"/>
+        </w:tabs>
+        <w:ind w:left="720"/>
+      </w:pPr>
+      <w:r>
+        <w:t xml:space="preserve">     ↓</w:t>
+      </w:r>
+    </w:p>
+    <w:p>
+      <w:pPr>
+        <w:tabs>
+          <w:tab w:val="left" w:pos="6067"/>
+        </w:tabs>
+        <w:ind w:left="720"/>
+      </w:pPr>
+      <w:r>
+        <w:lastRenderedPageBreak/>
+        <w:t xml:space="preserve"> Application</w:t>
+      </w:r>
+    </w:p>
+    <w:p>
+      <w:pPr>
+        <w:tabs>
+          <w:tab w:val="left" w:pos="6067"/>
+        </w:tabs>
+      </w:pPr>
+      <w:r>
+        <w:t>You don't normally tell Kubernetes:</w:t>
+      </w:r>
+    </w:p>
+    <w:p>
+      <w:pPr>
+        <w:tabs>
+          <w:tab w:val="left" w:pos="6067"/>
+        </w:tabs>
+      </w:pPr>
+      <w:r>
+        <w:t xml:space="preserve">          </w:t>
+      </w:r>
+      <w:r>
+        <w:t>"Run this container."</w:t>
+      </w:r>
+    </w:p>
+    <w:p>
+      <w:pPr>
+        <w:tabs>
+          <w:tab w:val="left" w:pos="6067"/>
+        </w:tabs>
+      </w:pPr>
+      <w:r>
+        <w:t xml:space="preserve">Instead, you define a </w:t>
+      </w:r>
+      <w:r>
+        <w:rPr>
+          <w:b/>
+          <w:bCs/>
+        </w:rPr>
+        <w:t>Pod</w:t>
+      </w:r>
+      <w:r>
+        <w:t xml:space="preserve"> that describes how the container should run.</w:t>
+      </w:r>
+    </w:p>
+    <w:p>
+      <w:pPr>
+        <w:tabs>
+          <w:tab w:val="left" w:pos="6067"/>
+        </w:tabs>
+      </w:pPr>
+    </w:p>
+    <w:p>
+      <w:pPr>
+        <w:tabs>
+          <w:tab w:val="left" w:pos="6067"/>
+        </w:tabs>
+        <w:rPr>
+          <w:b/>
+          <w:bCs/>
+        </w:rPr>
+      </w:pPr>
+      <w:r>
+        <w:rPr>
+          <w:b/>
+          <w:bCs/>
+        </w:rPr>
+        <w:t>3. Why does Kubernetes use Pods?</w:t>
+      </w:r>
+    </w:p>
+    <w:p>
+      <w:pPr>
+        <w:tabs>
+          <w:tab w:val="left" w:pos="6067"/>
+        </w:tabs>
+      </w:pPr>
+      <w:r>
+        <w:t>Pods provide a higher-level abstraction around containers.</w:t>
+      </w:r>
+    </w:p>
+    <w:p>
+      <w:pPr>
+        <w:tabs>
+          <w:tab w:val="left" w:pos="6067"/>
+        </w:tabs>
+      </w:pPr>
+      <w:r>
+        <w:t>A Pod can provide:</w:t>
+      </w:r>
+    </w:p>
+    <w:p>
+      <w:pPr>
+        <w:numPr>
+          <w:ilvl w:val="0"/>
+          <w:numId w:val="16"/>
+        </w:numPr>
+        <w:tabs>
+          <w:tab w:val="left" w:pos="6067"/>
+        </w:tabs>
+      </w:pPr>
+      <w:r>
+        <w:t xml:space="preserve">Shared network </w:t>
+      </w:r>
+    </w:p>
+    <w:p>
+      <w:pPr>
+        <w:numPr>
+          <w:ilvl w:val="0"/>
+          <w:numId w:val="16"/>
+        </w:numPr>
+        <w:tabs>
+          <w:tab w:val="left" w:pos="6067"/>
+        </w:tabs>
+      </w:pPr>
+      <w:r>
+        <w:t xml:space="preserve">Shared IP address </w:t>
+      </w:r>
+    </w:p>
+    <w:p>
+      <w:pPr>
+        <w:numPr>
+          <w:ilvl w:val="0"/>
+          <w:numId w:val="16"/>
+        </w:numPr>
+        <w:tabs>
+          <w:tab w:val="left" w:pos="6067"/>
+        </w:tabs>
+      </w:pPr>
+      <w:r>
+        <w:t xml:space="preserve">Shared storage volumes </w:t>
+      </w:r>
+    </w:p>
+    <w:p>
+      <w:pPr>
+        <w:numPr>
+          <w:ilvl w:val="0"/>
+          <w:numId w:val="16"/>
+        </w:numPr>
+        <w:tabs>
+          <w:tab w:val="left" w:pos="6067"/>
+        </w:tabs>
+      </w:pPr>
+      <w:r>
+        <w:t xml:space="preserve">Shared lifecycle </w:t>
+      </w:r>
+    </w:p>
+    <w:p>
+      <w:pPr>
+        <w:numPr>
+          <w:ilvl w:val="0"/>
+          <w:numId w:val="16"/>
+        </w:numPr>
+        <w:tabs>
+          <w:tab w:val="left" w:pos="6067"/>
+        </w:tabs>
+      </w:pPr>
+      <w:r>
+        <w:t xml:space="preserve">Resource configuration </w:t>
+      </w:r>
+    </w:p>
+    <w:p>
+      <w:pPr>
+        <w:numPr>
+          <w:ilvl w:val="0"/>
+          <w:numId w:val="16"/>
+        </w:numPr>
+        <w:tabs>
+          <w:tab w:val="left" w:pos="6067"/>
+        </w:tabs>
+      </w:pPr>
+      <w:r>
+        <w:t>Container coordination</w:t>
+      </w:r>
+    </w:p>
+    <w:p>
+      <w:pPr>
+        <w:tabs>
+          <w:tab w:val="left" w:pos="6067"/>
+        </w:tabs>
+      </w:pPr>
+      <w:r>
+        <w:drawing>
+          <wp:inline distT="0" distB="0" distL="0" distR="0" wp14:anchorId="11BE1A76" wp14:editId="4509E281">
+            <wp:extent cx="2110923" cy="2491956"/>
+            <wp:effectExtent l="0" t="0" r="3810" b="3810"/>
+            <wp:docPr id="453089223" name="Picture 1"/>
+            <wp:cNvGraphicFramePr>
+              <a:graphicFrameLocks xmlns:a="http://schemas.openxmlformats.org/drawingml/2006/main" noChangeAspect="1"/>
+            </wp:cNvGraphicFramePr>
+            <a:graphic xmlns:a="http://schemas.openxmlformats.org/drawingml/2006/main">
+              <a:graphicData uri="http://schemas.openxmlformats.org/drawingml/2006/picture">
+                <pic:pic xmlns:pic="http://schemas.openxmlformats.org/drawingml/2006/picture">
+                  <pic:nvPicPr>
+                    <pic:cNvPr id="453089223" name=""/>
+                    <pic:cNvPicPr/>
+                  </pic:nvPicPr>
+                  <pic:blipFill>
+                    <a:blip r:embed="rId9"/>
+                    <a:stretch>
+                      <a:fillRect/>
+                    </a:stretch>
+                  </pic:blipFill>
+                  <pic:spPr>
+                    <a:xfrm>
+                      <a:off x="0" y="0"/>
+                      <a:ext cx="2110923" cy="2491956"/>
+                    </a:xfrm>
+                    <a:prstGeom prst="rect">
+                      <a:avLst/>
+                    </a:prstGeom>
+                  </pic:spPr>
+                </pic:pic>
+              </a:graphicData>
+            </a:graphic>
+          </wp:inline>
+        </w:drawing>
+      </w:r>
+    </w:p>
+    <w:p>
+      <w:pPr>
+        <w:tabs>
+          <w:tab w:val="left" w:pos="6067"/>
+        </w:tabs>
+      </w:pPr>
+      <w:r>
+        <w:t xml:space="preserve">NOTE: </w:t>
+      </w:r>
+      <w:r>
+        <w:t>Containers inside the same Pod can communicate with each other using localhost.</w:t>
+      </w:r>
+    </w:p>
+    <w:p>
+      <w:pPr>
+        <w:tabs>
+          <w:tab w:val="left" w:pos="6067"/>
+        </w:tabs>
+      </w:pPr>
+    </w:p>
+    <w:p>
+      <w:pPr>
+        <w:tabs>
+          <w:tab w:val="left" w:pos="6067"/>
+        </w:tabs>
+        <w:rPr>
+          <w:b/>
+          <w:bCs/>
+        </w:rPr>
+      </w:pPr>
+      <w:r>
+        <w:rPr>
+          <w:b/>
+          <w:bCs/>
+        </w:rPr>
+        <w:t>4. Single-container Pod</w:t>
+      </w:r>
+    </w:p>
+    <w:p>
+      <w:pPr>
+        <w:tabs>
+          <w:tab w:val="left" w:pos="6067"/>
+        </w:tabs>
+      </w:pPr>
+      <w:r>
+        <w:t>The most common case:</w:t>
+      </w:r>
+    </w:p>
+    <w:p>
+      <w:pPr>
+        <w:tabs>
+          <w:tab w:val="left" w:pos="6067"/>
+        </w:tabs>
+        <w:ind w:left="720"/>
+      </w:pPr>
+      <w:r>
+        <w:t>Pod</w:t>
+      </w:r>
+    </w:p>
+    <w:p>
+      <w:pPr>
+        <w:tabs>
+          <w:tab w:val="left" w:pos="6067"/>
+        </w:tabs>
+        <w:ind w:left="720"/>
+      </w:pPr>
+      <w:r>
+        <w:t xml:space="preserve"> |</w:t>
+      </w:r>
+    </w:p>
+    <w:p>
+      <w:pPr>
+        <w:tabs>
+          <w:tab w:val="left" w:pos="6067"/>
+        </w:tabs>
+        <w:ind w:left="720"/>
+      </w:pPr>
+      <w:r>
+        <w:t xml:space="preserve"> └── NGINX Container</w:t>
+      </w:r>
+    </w:p>
+    <w:p>
+      <w:pPr>
+        <w:tabs>
+          <w:tab w:val="left" w:pos="6067"/>
+        </w:tabs>
+        <w:ind w:left="720"/>
+      </w:pPr>
+    </w:p>
+    <w:p>
+      <w:pPr>
+        <w:tabs>
+          <w:tab w:val="left" w:pos="6067"/>
+        </w:tabs>
+      </w:pPr>
+      <w:r>
+        <w:lastRenderedPageBreak/>
+        <w:t>Example:</w:t>
+      </w:r>
+    </w:p>
+    <w:p>
+      <w:pPr>
+        <w:tabs>
+          <w:tab w:val="left" w:pos="6067"/>
+        </w:tabs>
+      </w:pPr>
+      <w:r>
+        <w:drawing>
+          <wp:inline distT="0" distB="0" distL="0" distR="0" wp14:anchorId="2F40BB60" wp14:editId="616127F7">
+            <wp:extent cx="2103302" cy="2438611"/>
+            <wp:effectExtent l="0" t="0" r="0" b="0"/>
+            <wp:docPr id="1164294137" name="Picture 1"/>
+            <wp:cNvGraphicFramePr>
+              <a:graphicFrameLocks xmlns:a="http://schemas.openxmlformats.org/drawingml/2006/main" noChangeAspect="1"/>
+            </wp:cNvGraphicFramePr>
+            <a:graphic xmlns:a="http://schemas.openxmlformats.org/drawingml/2006/main">
+              <a:graphicData uri="http://schemas.openxmlformats.org/drawingml/2006/picture">
+                <pic:pic xmlns:pic="http://schemas.openxmlformats.org/drawingml/2006/picture">
+                  <pic:nvPicPr>
+                    <pic:cNvPr id="1164294137" name=""/>
+                    <pic:cNvPicPr/>
+                  </pic:nvPicPr>
+                  <pic:blipFill>
+                    <a:blip r:embed="rId10"/>
+                    <a:stretch>
+                      <a:fillRect/>
+                    </a:stretch>
+                  </pic:blipFill>
+                  <pic:spPr>
+                    <a:xfrm>
+                      <a:off x="0" y="0"/>
+                      <a:ext cx="2103302" cy="2438611"/>
+                    </a:xfrm>
+                    <a:prstGeom prst="rect">
+                      <a:avLst/>
+                    </a:prstGeom>
+                  </pic:spPr>
+                </pic:pic>
+              </a:graphicData>
+            </a:graphic>
+          </wp:inline>
+        </w:drawing>
+      </w:r>
+      <w:r>
+        <w:t xml:space="preserve"> </w:t>
+      </w:r>
+    </w:p>
+    <w:p>
+      <w:pPr>
+        <w:tabs>
+          <w:tab w:val="left" w:pos="6067"/>
+        </w:tabs>
+      </w:pPr>
+      <w:r>
+        <w:t>This creates:</w:t>
+      </w:r>
+    </w:p>
+    <w:p>
+      <w:pPr>
+        <w:tabs>
+          <w:tab w:val="left" w:pos="6067"/>
+        </w:tabs>
+        <w:ind w:left="720"/>
+      </w:pPr>
+      <w:r>
+        <w:t>nginx-pod</w:t>
+      </w:r>
+    </w:p>
+    <w:p>
+      <w:pPr>
+        <w:tabs>
+          <w:tab w:val="left" w:pos="6067"/>
+        </w:tabs>
+        <w:ind w:left="720"/>
+      </w:pPr>
+      <w:r>
+        <w:t xml:space="preserve">     |</w:t>
+      </w:r>
+    </w:p>
+    <w:p>
+      <w:pPr>
+        <w:tabs>
+          <w:tab w:val="left" w:pos="6067"/>
+        </w:tabs>
+        <w:ind w:left="720"/>
+      </w:pPr>
+      <w:r>
+        <w:t xml:space="preserve">     └── nginx container</w:t>
+      </w:r>
+    </w:p>
+    <w:p>
+      <w:pPr>
+        <w:tabs>
+          <w:tab w:val="left" w:pos="6067"/>
+        </w:tabs>
+      </w:pPr>
+    </w:p>
+    <w:p>
+      <w:pPr>
+        <w:tabs>
+          <w:tab w:val="left" w:pos="6067"/>
+        </w:tabs>
+        <w:rPr>
+          <w:b/>
+          <w:bCs/>
+        </w:rPr>
+      </w:pPr>
+      <w:r>
+        <w:rPr>
+          <w:b/>
+          <w:bCs/>
+        </w:rPr>
+        <w:t>5. Multi-container Pod</w:t>
+      </w:r>
+    </w:p>
+    <w:p>
+      <w:pPr>
+        <w:tabs>
+          <w:tab w:val="left" w:pos="6067"/>
+        </w:tabs>
+      </w:pPr>
+      <w:r>
+        <w:t>A Pod can also contain multiple containers.</w:t>
+      </w:r>
+    </w:p>
+    <w:p>
+      <w:pPr>
+        <w:tabs>
+          <w:tab w:val="left" w:pos="6067"/>
+        </w:tabs>
+      </w:pPr>
+      <w:r>
+        <w:t xml:space="preserve">       </w:t>
+      </w:r>
+      <w:r>
+        <w:drawing>
+          <wp:inline distT="0" distB="0" distL="0" distR="0" wp14:anchorId="58D5CBE9" wp14:editId="1CFC928C">
+            <wp:extent cx="1684166" cy="1882303"/>
+            <wp:effectExtent l="0" t="0" r="0" b="3810"/>
+            <wp:docPr id="2077793986" name="Picture 1"/>
+            <wp:cNvGraphicFramePr>
+              <a:graphicFrameLocks xmlns:a="http://schemas.openxmlformats.org/drawingml/2006/main" noChangeAspect="1"/>
+            </wp:cNvGraphicFramePr>
+            <a:graphic xmlns:a="http://schemas.openxmlformats.org/drawingml/2006/main">
+              <a:graphicData uri="http://schemas.openxmlformats.org/drawingml/2006/picture">
+                <pic:pic xmlns:pic="http://schemas.openxmlformats.org/drawingml/2006/picture">
+                  <pic:nvPicPr>
+                    <pic:cNvPr id="2077793986" name=""/>
+                    <pic:cNvPicPr/>
+                  </pic:nvPicPr>
+                  <pic:blipFill>
+                    <a:blip r:embed="rId11"/>
+                    <a:stretch>
+                      <a:fillRect/>
+                    </a:stretch>
+                  </pic:blipFill>
+                  <pic:spPr>
+                    <a:xfrm>
+                      <a:off x="0" y="0"/>
+                      <a:ext cx="1684166" cy="1882303"/>
+                    </a:xfrm>
+                    <a:prstGeom prst="rect">
+                      <a:avLst/>
+                    </a:prstGeom>
+                  </pic:spPr>
+                </pic:pic>
+              </a:graphicData>
+            </a:graphic>
+          </wp:inline>
+        </w:drawing>
+      </w:r>
+    </w:p>
+    <w:p>
+      <w:pPr>
+        <w:tabs>
+          <w:tab w:val="left" w:pos="6067"/>
+        </w:tabs>
+      </w:pPr>
+      <w:r>
+        <w:t>These containers:</w:t>
+      </w:r>
+    </w:p>
+    <w:p>
+      <w:pPr>
+        <w:numPr>
+          <w:ilvl w:val="0"/>
+          <w:numId w:val="17"/>
+        </w:numPr>
+        <w:tabs>
+          <w:tab w:val="left" w:pos="6067"/>
+        </w:tabs>
+      </w:pPr>
+      <w:r>
+        <w:t xml:space="preserve">Share the same network namespace </w:t>
+      </w:r>
+    </w:p>
+    <w:p>
+      <w:pPr>
+        <w:numPr>
+          <w:ilvl w:val="0"/>
+          <w:numId w:val="17"/>
+        </w:numPr>
+        <w:tabs>
+          <w:tab w:val="left" w:pos="6067"/>
+        </w:tabs>
+      </w:pPr>
+      <w:r>
+        <w:t xml:space="preserve">Can communicate through localhost </w:t>
+      </w:r>
+    </w:p>
+    <w:p>
+      <w:pPr>
+        <w:numPr>
+          <w:ilvl w:val="0"/>
+          <w:numId w:val="17"/>
+        </w:numPr>
+        <w:tabs>
+          <w:tab w:val="left" w:pos="6067"/>
+        </w:tabs>
+      </w:pPr>
+      <w:r>
+        <w:t xml:space="preserve">Can share volumes </w:t>
+      </w:r>
+    </w:p>
+    <w:p>
+      <w:pPr>
+        <w:numPr>
+          <w:ilvl w:val="0"/>
+          <w:numId w:val="17"/>
+        </w:numPr>
+        <w:tabs>
+          <w:tab w:val="left" w:pos="6067"/>
+        </w:tabs>
+      </w:pPr>
+      <w:r>
+        <w:t>Have the same Pod lifecycle</w:t>
+      </w:r>
+    </w:p>
+    <w:p>
+      <w:pPr>
+        <w:tabs>
+          <w:tab w:val="left" w:pos="6067"/>
+        </w:tabs>
+      </w:pPr>
+    </w:p>
+    <w:p>
+      <w:pPr>
+        <w:tabs>
+          <w:tab w:val="left" w:pos="6067"/>
+        </w:tabs>
+      </w:pPr>
+    </w:p>
+    <w:p>
+      <w:pPr>
+        <w:tabs>
+          <w:tab w:val="left" w:pos="6067"/>
+        </w:tabs>
+      </w:pPr>
+      <w:r>
+        <w:lastRenderedPageBreak/>
+        <w:t>Example use case</w:t>
+      </w:r>
+    </w:p>
+    <w:p>
+      <w:pPr>
+        <w:tabs>
+          <w:tab w:val="left" w:pos="6067"/>
+        </w:tabs>
+        <w:ind w:left="720"/>
+      </w:pPr>
+      <w:r>
+        <w:t>Pod</w:t>
+      </w:r>
+    </w:p>
+    <w:p>
+      <w:pPr>
+        <w:tabs>
+          <w:tab w:val="left" w:pos="6067"/>
+        </w:tabs>
+        <w:ind w:left="720"/>
+      </w:pPr>
+      <w:r>
+        <w:rPr>
+          <w:rFonts w:ascii="MS Gothic" w:eastAsia="MS Gothic" w:hAnsi="MS Gothic" w:cs="MS Gothic" w:hint="eastAsia"/>
+        </w:rPr>
+        <w:t>├</w:t>
+      </w:r>
+      <w:r>
+        <w:rPr>
+          <w:rFonts w:ascii="Calibri" w:hAnsi="Calibri" w:cs="Calibri"/>
+        </w:rPr>
+        <w:t>──</w:t>
+      </w:r>
+      <w:r>
+        <w:t xml:space="preserve"> Application</w:t>
+      </w:r>
+    </w:p>
+    <w:p>
+      <w:pPr>
+        <w:tabs>
+          <w:tab w:val="left" w:pos="6067"/>
+        </w:tabs>
+        <w:ind w:left="720"/>
+      </w:pPr>
+      <w:r>
+        <w:t>└── Logging Sidecar</w:t>
+      </w:r>
+    </w:p>
+    <w:p>
+      <w:pPr>
+        <w:tabs>
+          <w:tab w:val="left" w:pos="6067"/>
+        </w:tabs>
+      </w:pPr>
+      <w:r>
+        <w:t>The application generates logs and the sidecar processes/ships them.</w:t>
+      </w:r>
+    </w:p>
+    <w:p>
+      <w:pPr>
+        <w:tabs>
+          <w:tab w:val="left" w:pos="6067"/>
+        </w:tabs>
+      </w:pPr>
+    </w:p>
+    <w:p>
+      <w:pPr>
+        <w:tabs>
+          <w:tab w:val="left" w:pos="6067"/>
+        </w:tabs>
+        <w:rPr>
+          <w:b/>
+          <w:bCs/>
+        </w:rPr>
+      </w:pPr>
+      <w:r>
+        <w:rPr>
+          <w:b/>
+          <w:bCs/>
+        </w:rPr>
+        <w:t>6. Important Kubernetes Hierarchy</w:t>
+      </w:r>
+    </w:p>
+    <w:p>
+      <w:pPr>
+        <w:tabs>
+          <w:tab w:val="left" w:pos="6067"/>
+        </w:tabs>
+      </w:pPr>
+      <w:r>
+        <w:t>Remember this:</w:t>
+      </w:r>
+    </w:p>
+    <w:p>
+      <w:pPr>
+        <w:tabs>
+          <w:tab w:val="left" w:pos="6067"/>
+        </w:tabs>
+        <w:ind w:left="720"/>
+      </w:pPr>
+      <w:r>
+        <w:t>Cluster</w:t>
+      </w:r>
+    </w:p>
+    <w:p>
+      <w:pPr>
+        <w:tabs>
+          <w:tab w:val="left" w:pos="6067"/>
+        </w:tabs>
+        <w:ind w:left="720"/>
+      </w:pPr>
+      <w:r>
+        <w:t xml:space="preserve">   ↓</w:t>
+      </w:r>
+    </w:p>
+    <w:p>
+      <w:pPr>
+        <w:tabs>
+          <w:tab w:val="left" w:pos="6067"/>
+        </w:tabs>
+        <w:ind w:left="720"/>
+      </w:pPr>
+      <w:r>
+        <w:t>Node</w:t>
+      </w:r>
+    </w:p>
+    <w:p>
+      <w:pPr>
+        <w:tabs>
+          <w:tab w:val="left" w:pos="6067"/>
+        </w:tabs>
+        <w:ind w:left="720"/>
+      </w:pPr>
+      <w:r>
+        <w:t xml:space="preserve">   ↓</w:t>
+      </w:r>
+    </w:p>
+    <w:p>
+      <w:pPr>
+        <w:tabs>
+          <w:tab w:val="left" w:pos="6067"/>
+        </w:tabs>
+        <w:ind w:left="720"/>
+      </w:pPr>
+      <w:r>
+        <w:t>Pod</w:t>
+      </w:r>
+    </w:p>
+    <w:p>
+      <w:pPr>
+        <w:tabs>
+          <w:tab w:val="left" w:pos="6067"/>
+        </w:tabs>
+        <w:ind w:left="720"/>
+      </w:pPr>
+      <w:r>
+        <w:t xml:space="preserve">   ↓</w:t>
+      </w:r>
+    </w:p>
+    <w:p>
+      <w:pPr>
+        <w:tabs>
+          <w:tab w:val="left" w:pos="6067"/>
+        </w:tabs>
+        <w:ind w:left="720"/>
+      </w:pPr>
+      <w:r>
+        <w:t>Container</w:t>
+      </w:r>
+    </w:p>
+    <w:p>
+      <w:pPr>
+        <w:tabs>
+          <w:tab w:val="left" w:pos="6067"/>
+        </w:tabs>
+        <w:ind w:left="720"/>
+      </w:pPr>
+      <w:r>
+        <w:t xml:space="preserve">   ↓</w:t>
+      </w:r>
+    </w:p>
+    <w:p>
+      <w:pPr>
+        <w:tabs>
+          <w:tab w:val="left" w:pos="6067"/>
+        </w:tabs>
+        <w:ind w:left="720"/>
+      </w:pPr>
+      <w:r>
+        <w:t>Application</w:t>
+      </w:r>
+    </w:p>
+    <w:p>
+      <w:pPr>
+        <w:tabs>
+          <w:tab w:val="left" w:pos="6067"/>
+        </w:tabs>
+      </w:pPr>
+      <w:r>
+        <w:t>Example:</w:t>
+      </w:r>
+    </w:p>
+    <w:p>
+      <w:pPr>
+        <w:tabs>
+          <w:tab w:val="left" w:pos="6067"/>
+        </w:tabs>
+      </w:pPr>
+      <w:r>
+        <w:drawing>
+          <wp:inline distT="0" distB="0" distL="0" distR="0" wp14:anchorId="5D0F09F0" wp14:editId="24FD2DA2">
+            <wp:extent cx="2263336" cy="2362405"/>
+            <wp:effectExtent l="0" t="0" r="3810" b="0"/>
+            <wp:docPr id="709209014" name="Picture 1"/>
+            <wp:cNvGraphicFramePr>
+              <a:graphicFrameLocks xmlns:a="http://schemas.openxmlformats.org/drawingml/2006/main" noChangeAspect="1"/>
+            </wp:cNvGraphicFramePr>
+            <a:graphic xmlns:a="http://schemas.openxmlformats.org/drawingml/2006/main">
+              <a:graphicData uri="http://schemas.openxmlformats.org/drawingml/2006/picture">
+                <pic:pic xmlns:pic="http://schemas.openxmlformats.org/drawingml/2006/picture">
+                  <pic:nvPicPr>
+                    <pic:cNvPr id="709209014" name=""/>
+                    <pic:cNvPicPr/>
+                  </pic:nvPicPr>
+                  <pic:blipFill>
+                    <a:blip r:embed="rId12"/>
+                    <a:stretch>
+                      <a:fillRect/>
+                    </a:stretch>
+                  </pic:blipFill>
+                  <pic:spPr>
+                    <a:xfrm>
+                      <a:off x="0" y="0"/>
+                      <a:ext cx="2263336" cy="2362405"/>
+                    </a:xfrm>
+                    <a:prstGeom prst="rect">
+                      <a:avLst/>
+                    </a:prstGeom>
+                  </pic:spPr>
+                </pic:pic>
+              </a:graphicData>
+            </a:graphic>
+          </wp:inline>
+        </w:drawing>
+      </w:r>
+    </w:p>
+    <w:p>
+      <w:pPr>
+        <w:tabs>
+          <w:tab w:val="left" w:pos="6067"/>
+        </w:tabs>
+      </w:pPr>
+      <w:r>
+        <w:t>This hierarchy is extremely important for Kubernetes interviews.</w:t>
+      </w:r>
+    </w:p>
+    <w:p>
+      <w:pPr>
+        <w:tabs>
+          <w:tab w:val="left" w:pos="6067"/>
+        </w:tabs>
+      </w:pPr>
+    </w:p>
+    <w:p>
+      <w:pPr>
+        <w:tabs>
+          <w:tab w:val="left" w:pos="6067"/>
+        </w:tabs>
+        <w:rPr>
+          <w:b/>
+          <w:bCs/>
+        </w:rPr>
+      </w:pPr>
+    </w:p>
+    <w:p>
+      <w:pPr>
+        <w:tabs>
+          <w:tab w:val="left" w:pos="6067"/>
+        </w:tabs>
+        <w:rPr>
+          <w:b/>
+          <w:bCs/>
+        </w:rPr>
+      </w:pPr>
+    </w:p>
+    <w:p>
+      <w:pPr>
+        <w:tabs>
+          <w:tab w:val="left" w:pos="6067"/>
+        </w:tabs>
+        <w:rPr>
+          <w:b/>
+          <w:bCs/>
+        </w:rPr>
+      </w:pPr>
+      <w:r>
+        <w:rPr>
+          <w:b/>
+          <w:bCs/>
+        </w:rPr>
+        <w:lastRenderedPageBreak/>
+        <w:t>7. What is kubectl?</w:t>
+      </w:r>
+    </w:p>
+    <w:p>
+      <w:pPr>
+        <w:tabs>
+          <w:tab w:val="left" w:pos="6067"/>
+        </w:tabs>
+      </w:pPr>
+      <w:r>
+        <w:t xml:space="preserve">kubectl is the </w:t>
+      </w:r>
+      <w:r>
+        <w:rPr>
+          <w:b/>
+          <w:bCs/>
+        </w:rPr>
+        <w:t>command-line tool used to communicate with and manage a Kubernetes cluster</w:t>
+      </w:r>
+      <w:r>
+        <w:t>.</w:t>
+      </w:r>
+    </w:p>
+    <w:p>
+      <w:pPr>
+        <w:tabs>
+          <w:tab w:val="left" w:pos="6067"/>
+        </w:tabs>
+      </w:pPr>
+      <w:r>
+        <w:t>Think of it as:</w:t>
+      </w:r>
+    </w:p>
+    <w:p>
+      <w:pPr>
+        <w:tabs>
+          <w:tab w:val="left" w:pos="6067"/>
+        </w:tabs>
+        <w:ind w:left="720"/>
+      </w:pPr>
+      <w:r>
+        <w:t>You</w:t>
+      </w:r>
+    </w:p>
+    <w:p>
+      <w:pPr>
+        <w:tabs>
+          <w:tab w:val="left" w:pos="6067"/>
+        </w:tabs>
+        <w:ind w:left="720"/>
+      </w:pPr>
+      <w:r>
+        <w:t xml:space="preserve"> |</w:t>
+      </w:r>
+    </w:p>
+    <w:p>
+      <w:pPr>
+        <w:tabs>
+          <w:tab w:val="left" w:pos="6067"/>
+        </w:tabs>
+        <w:ind w:left="720"/>
+      </w:pPr>
+      <w:r>
+        <w:t>kubectl</w:t>
+      </w:r>
+    </w:p>
+    <w:p>
+      <w:pPr>
+        <w:tabs>
+          <w:tab w:val="left" w:pos="6067"/>
+        </w:tabs>
+        <w:ind w:left="720"/>
+      </w:pPr>
+      <w:r>
+        <w:t xml:space="preserve"> |</w:t>
+      </w:r>
+    </w:p>
+    <w:p>
+      <w:pPr>
+        <w:tabs>
+          <w:tab w:val="left" w:pos="6067"/>
+        </w:tabs>
+        <w:ind w:left="720"/>
+      </w:pPr>
+      <w:r>
+        <w:t>Kubernetes API Server</w:t>
+      </w:r>
+    </w:p>
+    <w:p>
+      <w:pPr>
+        <w:tabs>
+          <w:tab w:val="left" w:pos="6067"/>
+        </w:tabs>
+        <w:ind w:left="720"/>
+      </w:pPr>
+      <w:r>
+        <w:t xml:space="preserve"> |</w:t>
+      </w:r>
+    </w:p>
+    <w:p>
+      <w:pPr>
+        <w:tabs>
+          <w:tab w:val="left" w:pos="6067"/>
+        </w:tabs>
+        <w:ind w:left="720"/>
+      </w:pPr>
+      <w:r>
+        <w:t>Kubernetes Cluster</w:t>
+      </w:r>
+    </w:p>
+    <w:p>
+      <w:pPr>
+        <w:tabs>
+          <w:tab w:val="left" w:pos="6067"/>
+        </w:tabs>
+      </w:pPr>
+      <w:r>
+        <w:t>Examples:</w:t>
+      </w:r>
+    </w:p>
+    <w:p>
+      <w:pPr>
+        <w:pStyle w:val="ListParagraph"/>
+        <w:numPr>
+          <w:ilvl w:val="0"/>
+          <w:numId w:val="18"/>
+        </w:numPr>
+        <w:tabs>
+          <w:tab w:val="left" w:pos="6067"/>
+        </w:tabs>
+      </w:pPr>
+      <w:r>
+        <w:t>kubectl get pods</w:t>
+      </w:r>
+    </w:p>
+    <w:p>
+      <w:pPr>
+        <w:pStyle w:val="ListParagraph"/>
+        <w:numPr>
+          <w:ilvl w:val="0"/>
+          <w:numId w:val="18"/>
+        </w:numPr>
+        <w:tabs>
+          <w:tab w:val="left" w:pos="6067"/>
+        </w:tabs>
+      </w:pPr>
+      <w:r>
+        <w:t>kubectl create pod</w:t>
+      </w:r>
+    </w:p>
+    <w:p>
+      <w:pPr>
+        <w:pStyle w:val="ListParagraph"/>
+        <w:numPr>
+          <w:ilvl w:val="0"/>
+          <w:numId w:val="18"/>
+        </w:numPr>
+        <w:tabs>
+          <w:tab w:val="left" w:pos="6067"/>
+        </w:tabs>
+      </w:pPr>
+      <w:r>
+        <w:t>kubectl describe pod</w:t>
+      </w:r>
+    </w:p>
+    <w:p>
+      <w:pPr>
+        <w:pStyle w:val="ListParagraph"/>
+        <w:numPr>
+          <w:ilvl w:val="0"/>
+          <w:numId w:val="18"/>
+        </w:numPr>
+        <w:tabs>
+          <w:tab w:val="left" w:pos="6067"/>
+        </w:tabs>
+      </w:pPr>
+      <w:r>
+        <w:t>kubectl logs</w:t>
+      </w:r>
+    </w:p>
+    <w:p>
+      <w:pPr>
+        <w:pStyle w:val="ListParagraph"/>
+        <w:numPr>
+          <w:ilvl w:val="0"/>
+          <w:numId w:val="18"/>
+        </w:numPr>
+        <w:tabs>
+          <w:tab w:val="left" w:pos="6067"/>
+        </w:tabs>
+      </w:pPr>
+      <w:r>
+        <w:t>kubectl delete pod</w:t>
+      </w:r>
+    </w:p>
+    <w:p>
+      <w:pPr>
+        <w:tabs>
+          <w:tab w:val="left" w:pos="6067"/>
+        </w:tabs>
+      </w:pPr>
+    </w:p>
+    <w:p>
+      <w:pPr>
+        <w:tabs>
+          <w:tab w:val="left" w:pos="6067"/>
+        </w:tabs>
+        <w:rPr>
+          <w:b/>
+          <w:bCs/>
+        </w:rPr>
+      </w:pPr>
+      <w:r>
+        <w:rPr>
+          <w:b/>
+          <w:bCs/>
+        </w:rPr>
+        <w:t>8. kubectl get pods</w:t>
+      </w:r>
+    </w:p>
+    <w:p>
+      <w:pPr>
+        <w:tabs>
+          <w:tab w:val="left" w:pos="6067"/>
+        </w:tabs>
+      </w:pPr>
+      <w:r>
+        <w:t>To see Pods:</w:t>
+      </w:r>
+      <w:r>
+        <w:t xml:space="preserve"> </w:t>
+      </w:r>
+    </w:p>
+    <w:p>
+      <w:pPr>
+        <w:tabs>
+          <w:tab w:val="left" w:pos="6067"/>
+        </w:tabs>
+        <w:ind w:left="720"/>
+      </w:pPr>
+      <w:r>
+        <w:t>kubectl get pods</w:t>
+      </w:r>
+    </w:p>
+    <w:p>
+      <w:pPr>
+        <w:tabs>
+          <w:tab w:val="left" w:pos="6067"/>
+        </w:tabs>
+        <w:ind w:left="720"/>
+      </w:pPr>
+      <w:r>
+        <w:t>OR</w:t>
+      </w:r>
+    </w:p>
+    <w:p>
+      <w:pPr>
+        <w:tabs>
+          <w:tab w:val="left" w:pos="6067"/>
+        </w:tabs>
+        <w:ind w:left="720"/>
+      </w:pPr>
+      <w:r>
+        <w:t>Kubectl get pod</w:t>
+      </w:r>
+    </w:p>
+    <w:p>
+      <w:pPr>
+        <w:tabs>
+          <w:tab w:val="left" w:pos="6067"/>
+        </w:tabs>
+      </w:pPr>
+      <w:r>
+        <w:t>Example output:</w:t>
+      </w:r>
+    </w:p>
+    <w:p>
+      <w:pPr>
+        <w:tabs>
+          <w:tab w:val="left" w:pos="6067"/>
+        </w:tabs>
+      </w:pPr>
+      <w:r>
+        <w:t xml:space="preserve">NAME        </w:t>
+      </w:r>
+      <w:r>
+        <w:t xml:space="preserve">        </w:t>
+      </w:r>
+      <w:r>
+        <w:t xml:space="preserve">READY   </w:t>
+      </w:r>
+      <w:r>
+        <w:t xml:space="preserve">      </w:t>
+      </w:r>
+      <w:r>
+        <w:t xml:space="preserve">STATUS    </w:t>
+      </w:r>
+      <w:r>
+        <w:t xml:space="preserve">      </w:t>
+      </w:r>
+      <w:r>
+        <w:t xml:space="preserve">RESTARTS   </w:t>
+      </w:r>
+      <w:r>
+        <w:t xml:space="preserve">       </w:t>
+      </w:r>
+      <w:r>
+        <w:t>AGE</w:t>
+      </w:r>
+    </w:p>
+    <w:p>
+      <w:pPr>
+        <w:tabs>
+          <w:tab w:val="left" w:pos="6067"/>
+        </w:tabs>
+      </w:pPr>
+      <w:r>
+        <w:t xml:space="preserve">nginx-pod   </w:t>
+      </w:r>
+      <w:r>
+        <w:t xml:space="preserve">          </w:t>
+      </w:r>
+      <w:r>
+        <w:t xml:space="preserve">1/1    </w:t>
+      </w:r>
+      <w:r>
+        <w:t xml:space="preserve">      </w:t>
+      </w:r>
+      <w:r>
+        <w:t xml:space="preserve">Running   </w:t>
+      </w:r>
+      <w:r>
+        <w:t xml:space="preserve">               </w:t>
+      </w:r>
+      <w:r>
+        <w:t xml:space="preserve">0          </w:t>
+      </w:r>
+      <w:r>
+        <w:t xml:space="preserve">        </w:t>
+      </w:r>
+      <w:r>
+        <w:t>2m</w:t>
+      </w:r>
+    </w:p>
+    <w:p>
+      <w:pPr>
+        <w:tabs>
+          <w:tab w:val="left" w:pos="6067"/>
+        </w:tabs>
+      </w:pPr>
+    </w:p>
+    <w:p>
+      <w:pPr>
+        <w:tabs>
+          <w:tab w:val="left" w:pos="6067"/>
+        </w:tabs>
+      </w:pPr>
+    </w:p>
+    <w:p>
+      <w:pPr>
+        <w:tabs>
+          <w:tab w:val="left" w:pos="6067"/>
+        </w:tabs>
+      </w:pPr>
+    </w:p>
+    <w:p>
+      <w:pPr>
+        <w:tabs>
+          <w:tab w:val="left" w:pos="6067"/>
+        </w:tabs>
+      </w:pPr>
+    </w:p>
+    <w:p>
+      <w:pPr>
+        <w:tabs>
+          <w:tab w:val="left" w:pos="6067"/>
+        </w:tabs>
+      </w:pPr>
+    </w:p>
+    <w:p>
+      <w:pPr>
+        <w:tabs>
+          <w:tab w:val="left" w:pos="6067"/>
+        </w:tabs>
+      </w:pPr>
+    </w:p>
+    <w:p>
+      <w:pPr>
+        <w:tabs>
+          <w:tab w:val="left" w:pos="6067"/>
+        </w:tabs>
+      </w:pPr>
+    </w:p>
+    <w:p>
+      <w:pPr>
+        <w:tabs>
+          <w:tab w:val="left" w:pos="6067"/>
+        </w:tabs>
+      </w:pPr>
+      <w:r>
+        <w:lastRenderedPageBreak/>
+        <w:t>Meaning</w:t>
+      </w:r>
+    </w:p>
+    <w:tbl>
+      <w:tblPr>
+        <w:tblW w:w="9061" w:type="dxa"/>
+        <w:tblCellSpacing w:w="15" w:type="dxa"/>
+        <w:tblCellMar>
+          <w:top w:w="15" w:type="dxa"/>
+          <w:left w:w="15" w:type="dxa"/>
+          <w:bottom w:w="15" w:type="dxa"/>
+          <w:right w:w="15" w:type="dxa"/>
+        </w:tblCellMar>
+        <w:tblLook w:val="04A0" w:firstRow="1" w:lastRow="0" w:firstColumn="1" w:lastColumn="0" w:noHBand="0" w:noVBand="1"/>
+      </w:tblPr>
+      <w:tblGrid>
+        <w:gridCol w:w="2039"/>
+        <w:gridCol w:w="7022"/>
+      </w:tblGrid>
+      <w:tr>
+        <w:trPr>
+          <w:trHeight w:val="457"/>
+          <w:tblHeader/>
+          <w:tblCellSpacing w:w="15" w:type="dxa"/>
+        </w:trPr>
+        <w:tc>
+          <w:tcPr>
+            <w:tcW w:w="0" w:type="auto"/>
+            <w:vAlign w:val="center"/>
+            <w:hideMark/>
+          </w:tcPr>
+          <w:p>
+            <w:pPr>
+              <w:tabs>
+                <w:tab w:val="left" w:pos="6067"/>
+              </w:tabs>
+              <w:rPr>
+                <w:b/>
+                <w:bCs/>
+              </w:rPr>
+            </w:pPr>
+            <w:r>
+              <w:rPr>
+                <w:b/>
+                <w:bCs/>
+              </w:rPr>
+              <w:t>Column</w:t>
+            </w:r>
+          </w:p>
+        </w:tc>
+        <w:tc>
+          <w:tcPr>
+            <w:tcW w:w="0" w:type="auto"/>
+            <w:vAlign w:val="center"/>
+            <w:hideMark/>
+          </w:tcPr>
+          <w:p>
+            <w:pPr>
+              <w:tabs>
+                <w:tab w:val="left" w:pos="6067"/>
+              </w:tabs>
+              <w:rPr>
+                <w:b/>
+                <w:bCs/>
+              </w:rPr>
+            </w:pPr>
+            <w:r>
+              <w:rPr>
+                <w:b/>
+                <w:bCs/>
+              </w:rPr>
+              <w:t>Meaning</w:t>
+            </w:r>
+          </w:p>
+        </w:tc>
+      </w:tr>
+      <w:tr>
+        <w:trPr>
+          <w:trHeight w:val="472"/>
+          <w:tblCellSpacing w:w="15" w:type="dxa"/>
+        </w:trPr>
+        <w:tc>
+          <w:tcPr>
+            <w:tcW w:w="0" w:type="auto"/>
+            <w:vAlign w:val="center"/>
+            <w:hideMark/>
+          </w:tcPr>
+          <w:p>
+            <w:pPr>
+              <w:tabs>
+                <w:tab w:val="left" w:pos="6067"/>
+              </w:tabs>
+            </w:pPr>
+            <w:r>
+              <w:t>NAME</w:t>
+            </w:r>
+          </w:p>
+        </w:tc>
+        <w:tc>
+          <w:tcPr>
+            <w:tcW w:w="0" w:type="auto"/>
+            <w:vAlign w:val="center"/>
+            <w:hideMark/>
+          </w:tcPr>
+          <w:p>
+            <w:pPr>
+              <w:tabs>
+                <w:tab w:val="left" w:pos="6067"/>
+              </w:tabs>
+            </w:pPr>
+            <w:r>
+              <w:t>Pod name</w:t>
+            </w:r>
+          </w:p>
+        </w:tc>
+      </w:tr>
+      <w:tr>
+        <w:trPr>
+          <w:trHeight w:val="457"/>
+          <w:tblCellSpacing w:w="15" w:type="dxa"/>
+        </w:trPr>
+        <w:tc>
+          <w:tcPr>
+            <w:tcW w:w="0" w:type="auto"/>
+            <w:vAlign w:val="center"/>
+            <w:hideMark/>
+          </w:tcPr>
+          <w:p>
+            <w:pPr>
+              <w:tabs>
+                <w:tab w:val="left" w:pos="6067"/>
+              </w:tabs>
+            </w:pPr>
+            <w:r>
+              <w:t>READY</w:t>
+            </w:r>
+          </w:p>
+        </w:tc>
+        <w:tc>
+          <w:tcPr>
+            <w:tcW w:w="0" w:type="auto"/>
+            <w:vAlign w:val="center"/>
+            <w:hideMark/>
+          </w:tcPr>
+          <w:p>
+            <w:pPr>
+              <w:tabs>
+                <w:tab w:val="left" w:pos="6067"/>
+              </w:tabs>
+            </w:pPr>
+            <w:r>
+              <w:t>Ready containers / total containers</w:t>
+            </w:r>
+          </w:p>
+        </w:tc>
+      </w:tr>
+      <w:tr>
+        <w:trPr>
+          <w:trHeight w:val="457"/>
+          <w:tblCellSpacing w:w="15" w:type="dxa"/>
+        </w:trPr>
+        <w:tc>
+          <w:tcPr>
+            <w:tcW w:w="0" w:type="auto"/>
+            <w:vAlign w:val="center"/>
+            <w:hideMark/>
+          </w:tcPr>
+          <w:p>
+            <w:pPr>
+              <w:tabs>
+                <w:tab w:val="left" w:pos="6067"/>
+              </w:tabs>
+            </w:pPr>
+            <w:r>
+              <w:t>STATUS</w:t>
+            </w:r>
+          </w:p>
+        </w:tc>
+        <w:tc>
+          <w:tcPr>
+            <w:tcW w:w="0" w:type="auto"/>
+            <w:vAlign w:val="center"/>
+            <w:hideMark/>
+          </w:tcPr>
+          <w:p>
+            <w:pPr>
+              <w:tabs>
+                <w:tab w:val="left" w:pos="6067"/>
+              </w:tabs>
+            </w:pPr>
+            <w:r>
+              <w:t>Current Pod state</w:t>
+            </w:r>
+          </w:p>
+        </w:tc>
+      </w:tr>
+      <w:tr>
+        <w:trPr>
+          <w:trHeight w:val="457"/>
+          <w:tblCellSpacing w:w="15" w:type="dxa"/>
+        </w:trPr>
+        <w:tc>
+          <w:tcPr>
+            <w:tcW w:w="0" w:type="auto"/>
+            <w:vAlign w:val="center"/>
+            <w:hideMark/>
+          </w:tcPr>
+          <w:p>
+            <w:pPr>
+              <w:tabs>
+                <w:tab w:val="left" w:pos="6067"/>
+              </w:tabs>
+            </w:pPr>
+            <w:r>
+              <w:t>RESTARTS</w:t>
+            </w:r>
+          </w:p>
+        </w:tc>
+        <w:tc>
+          <w:tcPr>
+            <w:tcW w:w="0" w:type="auto"/>
+            <w:vAlign w:val="center"/>
+            <w:hideMark/>
+          </w:tcPr>
+          <w:p>
+            <w:pPr>
+              <w:tabs>
+                <w:tab w:val="left" w:pos="6067"/>
+              </w:tabs>
+            </w:pPr>
+            <w:r>
+              <w:t>Container restart count</w:t>
+            </w:r>
+          </w:p>
+        </w:tc>
+      </w:tr>
+      <w:tr>
+        <w:trPr>
+          <w:trHeight w:val="457"/>
+          <w:tblCellSpacing w:w="15" w:type="dxa"/>
+        </w:trPr>
+        <w:tc>
+          <w:tcPr>
+            <w:tcW w:w="0" w:type="auto"/>
+            <w:vAlign w:val="center"/>
+            <w:hideMark/>
+          </w:tcPr>
+          <w:p>
+            <w:pPr>
+              <w:tabs>
+                <w:tab w:val="left" w:pos="6067"/>
+              </w:tabs>
+            </w:pPr>
+            <w:r>
+              <w:t>AGE</w:t>
+            </w:r>
+          </w:p>
+        </w:tc>
+        <w:tc>
+          <w:tcPr>
+            <w:tcW w:w="0" w:type="auto"/>
+            <w:vAlign w:val="center"/>
+            <w:hideMark/>
+          </w:tcPr>
+          <w:p>
+            <w:pPr>
+              <w:tabs>
+                <w:tab w:val="left" w:pos="6067"/>
+              </w:tabs>
+            </w:pPr>
+            <w:r>
+              <w:t>Pod age</w:t>
+            </w:r>
+          </w:p>
+        </w:tc>
+      </w:tr>
+    </w:tbl>
+    <w:p>
+      <w:pPr>
+        <w:tabs>
+          <w:tab w:val="left" w:pos="6067"/>
+        </w:tabs>
+      </w:pPr>
+    </w:p>
+    <w:p>
+      <w:pPr>
+        <w:tabs>
+          <w:tab w:val="left" w:pos="6067"/>
+        </w:tabs>
+      </w:pPr>
+      <w:r>
+        <w:t>For:</w:t>
+      </w:r>
+      <w:r>
+        <w:t xml:space="preserve"> </w:t>
+      </w:r>
+      <w:r>
+        <w:t>1/1</w:t>
+      </w:r>
+    </w:p>
+    <w:p>
+      <w:pPr>
+        <w:tabs>
+          <w:tab w:val="left" w:pos="6067"/>
+        </w:tabs>
+      </w:pPr>
+      <w:r>
+        <w:sym w:font="Wingdings" w:char="F0E0"/>
+      </w:r>
+      <w:r>
+        <w:t>it means:</w:t>
+      </w:r>
+      <w:r>
+        <w:t xml:space="preserve"> </w:t>
+      </w:r>
+      <w:r>
+        <w:t>1 container is ready out of 1 container.</w:t>
+      </w:r>
+    </w:p>
+    <w:p>
+      <w:pPr>
+        <w:tabs>
+          <w:tab w:val="left" w:pos="6067"/>
+        </w:tabs>
       </w:pPr>
     </w:p>
     <w:sectPr>
-      <w:footerReference w:type="default" r:id="rId9"/>
+      <w:footerReference w:type="default" r:id="rId13"/>
       <w:pgSz w:w="11906" w:h="16838"/>
       <w:pgMar w:top="1440" w:right="1440" w:bottom="1440" w:left="1440" w:header="708" w:footer="708" w:gutter="0"/>
       <w:pgBorders w:offsetFrom="page">
@@ -9582,9 +11155,9 @@
       <w:lvlJc w:val="left"/>
       <w:pPr>
         <w:tabs>
-          <w:tab w:val="num" w:pos="720"/>
-        </w:tabs>
-        <w:ind w:left="720" w:hanging="360"/>
+          <w:tab w:val="num" w:pos="360"/>
+        </w:tabs>
+        <w:ind w:left="360" w:hanging="360"/>
       </w:pPr>
       <w:rPr>
         <w:rFonts w:ascii="Symbol" w:hAnsi="Symbol" w:hint="default"/>
@@ -9598,9 +11171,9 @@
       <w:lvlJc w:val="left"/>
       <w:pPr>
         <w:tabs>
-          <w:tab w:val="num" w:pos="1440"/>
-        </w:tabs>
-        <w:ind w:left="1440" w:hanging="360"/>
+          <w:tab w:val="num" w:pos="1080"/>
+        </w:tabs>
+        <w:ind w:left="1080" w:hanging="360"/>
       </w:pPr>
       <w:rPr>
         <w:rFonts w:ascii="Courier New" w:hAnsi="Courier New" w:hint="default"/>
@@ -9614,9 +11187,9 @@
       <w:lvlJc w:val="left"/>
       <w:pPr>
         <w:tabs>
-          <w:tab w:val="num" w:pos="2160"/>
-        </w:tabs>
-        <w:ind w:left="2160" w:hanging="360"/>
+          <w:tab w:val="num" w:pos="1800"/>
+        </w:tabs>
+        <w:ind w:left="1800" w:hanging="360"/>
       </w:pPr>
       <w:rPr>
         <w:rFonts w:ascii="Wingdings" w:hAnsi="Wingdings" w:hint="default"/>
@@ -9630,9 +11203,9 @@
       <w:lvlJc w:val="left"/>
       <w:pPr>
         <w:tabs>
-          <w:tab w:val="num" w:pos="2880"/>
-        </w:tabs>
-        <w:ind w:left="2880" w:hanging="360"/>
+          <w:tab w:val="num" w:pos="2520"/>
+        </w:tabs>
+        <w:ind w:left="2520" w:hanging="360"/>
       </w:pPr>
       <w:rPr>
         <w:rFonts w:ascii="Wingdings" w:hAnsi="Wingdings" w:hint="default"/>
@@ -9646,9 +11219,9 @@
       <w:lvlJc w:val="left"/>
       <w:pPr>
         <w:tabs>
-          <w:tab w:val="num" w:pos="3600"/>
-        </w:tabs>
-        <w:ind w:left="3600" w:hanging="360"/>
+          <w:tab w:val="num" w:pos="3240"/>
+        </w:tabs>
+        <w:ind w:left="3240" w:hanging="360"/>
       </w:pPr>
       <w:rPr>
         <w:rFonts w:ascii="Wingdings" w:hAnsi="Wingdings" w:hint="default"/>
@@ -9662,9 +11235,9 @@
       <w:lvlJc w:val="left"/>
       <w:pPr>
         <w:tabs>
-          <w:tab w:val="num" w:pos="4320"/>
-        </w:tabs>
-        <w:ind w:left="4320" w:hanging="360"/>
+          <w:tab w:val="num" w:pos="3960"/>
+        </w:tabs>
+        <w:ind w:left="3960" w:hanging="360"/>
       </w:pPr>
       <w:rPr>
         <w:rFonts w:ascii="Wingdings" w:hAnsi="Wingdings" w:hint="default"/>
@@ -9678,9 +11251,9 @@
       <w:lvlJc w:val="left"/>
       <w:pPr>
         <w:tabs>
-          <w:tab w:val="num" w:pos="5040"/>
-        </w:tabs>
-        <w:ind w:left="5040" w:hanging="360"/>
+          <w:tab w:val="num" w:pos="4680"/>
+        </w:tabs>
+        <w:ind w:left="4680" w:hanging="360"/>
       </w:pPr>
       <w:rPr>
         <w:rFonts w:ascii="Wingdings" w:hAnsi="Wingdings" w:hint="default"/>
@@ -9694,9 +11267,9 @@
       <w:lvlJc w:val="left"/>
       <w:pPr>
         <w:tabs>
-          <w:tab w:val="num" w:pos="5760"/>
-        </w:tabs>
-        <w:ind w:left="5760" w:hanging="360"/>
+          <w:tab w:val="num" w:pos="5400"/>
+        </w:tabs>
+        <w:ind w:left="5400" w:hanging="360"/>
       </w:pPr>
       <w:rPr>
         <w:rFonts w:ascii="Wingdings" w:hAnsi="Wingdings" w:hint="default"/>
@@ -9710,9 +11283,9 @@
       <w:lvlJc w:val="left"/>
       <w:pPr>
         <w:tabs>
-          <w:tab w:val="num" w:pos="6480"/>
-        </w:tabs>
-        <w:ind w:left="6480" w:hanging="360"/>
+          <w:tab w:val="num" w:pos="6120"/>
+        </w:tabs>
+        <w:ind w:left="6120" w:hanging="360"/>
       </w:pPr>
       <w:rPr>
         <w:rFonts w:ascii="Wingdings" w:hAnsi="Wingdings" w:hint="default"/>
@@ -10877,6 +12450,119 @@
     </w:lvl>
   </w:abstractNum>
   <w:abstractNum w:abstractNumId="9" w15:restartNumberingAfterBreak="0">
+    <w:nsid w:val="31F54A73"/>
+    <w:multiLevelType w:val="hybridMultilevel"/>
+    <w:tmpl w:val="D03E85DA"/>
+    <w:lvl w:ilvl="0" w:tplc="4009000B">
+      <w:start w:val="1"/>
+      <w:numFmt w:val="bullet"/>
+      <w:lvlText w:val=""/>
+      <w:lvlJc w:val="left"/>
+      <w:pPr>
+        <w:ind w:left="720" w:hanging="360"/>
+      </w:pPr>
+      <w:rPr>
+        <w:rFonts w:ascii="Wingdings" w:hAnsi="Wingdings" w:hint="default"/>
+      </w:rPr>
+    </w:lvl>
+    <w:lvl w:ilvl="1" w:tplc="40090003" w:tentative="1">
+      <w:start w:val="1"/>
+      <w:numFmt w:val="bullet"/>
+      <w:lvlText w:val="o"/>
+      <w:lvlJc w:val="left"/>
+      <w:pPr>
+        <w:ind w:left="1440" w:hanging="360"/>
+      </w:pPr>
+      <w:rPr>
+        <w:rFonts w:ascii="Courier New" w:hAnsi="Courier New" w:cs="Courier New" w:hint="default"/>
+      </w:rPr>
+    </w:lvl>
+    <w:lvl w:ilvl="2" w:tplc="40090005" w:tentative="1">
+      <w:start w:val="1"/>
+      <w:numFmt w:val="bullet"/>
+      <w:lvlText w:val=""/>
+      <w:lvlJc w:val="left"/>
+      <w:pPr>
+        <w:ind w:left="2160" w:hanging="360"/>
+      </w:pPr>
+      <w:rPr>
+        <w:rFonts w:ascii="Wingdings" w:hAnsi="Wingdings" w:hint="default"/>
+      </w:rPr>
+    </w:lvl>
+    <w:lvl w:ilvl="3" w:tplc="40090001" w:tentative="1">
+      <w:start w:val="1"/>
+      <w:numFmt w:val="bullet"/>
+      <w:lvlText w:val=""/>
+      <w:lvlJc w:val="left"/>
+      <w:pPr>
+        <w:ind w:left="2880" w:hanging="360"/>
+      </w:pPr>
+      <w:rPr>
+        <w:rFonts w:ascii="Symbol" w:hAnsi="Symbol" w:hint="default"/>
+      </w:rPr>
+    </w:lvl>
+    <w:lvl w:ilvl="4" w:tplc="40090003" w:tentative="1">
+      <w:start w:val="1"/>
+      <w:numFmt w:val="bullet"/>
+      <w:lvlText w:val="o"/>
+      <w:lvlJc w:val="left"/>
+      <w:pPr>
+        <w:ind w:left="3600" w:hanging="360"/>
+      </w:pPr>
+      <w:rPr>
+        <w:rFonts w:ascii="Courier New" w:hAnsi="Courier New" w:cs="Courier New" w:hint="default"/>
+      </w:rPr>
+    </w:lvl>
+    <w:lvl w:ilvl="5" w:tplc="40090005" w:tentative="1">
+      <w:start w:val="1"/>
+      <w:numFmt w:val="bullet"/>
+      <w:lvlText w:val=""/>
+      <w:lvlJc w:val="left"/>
+      <w:pPr>
+        <w:ind w:left="4320" w:hanging="360"/>
+      </w:pPr>
+      <w:rPr>
+        <w:rFonts w:ascii="Wingdings" w:hAnsi="Wingdings" w:hint="default"/>
+      </w:rPr>
+    </w:lvl>
+    <w:lvl w:ilvl="6" w:tplc="40090001" w:tentative="1">
+      <w:start w:val="1"/>
+      <w:numFmt w:val="bullet"/>
+      <w:lvlText w:val=""/>
+      <w:lvlJc w:val="left"/>
+      <w:pPr>
+        <w:ind w:left="5040" w:hanging="360"/>
+      </w:pPr>
+      <w:rPr>
+        <w:rFonts w:ascii="Symbol" w:hAnsi="Symbol" w:hint="default"/>
+      </w:rPr>
+    </w:lvl>
+    <w:lvl w:ilvl="7" w:tplc="40090003" w:tentative="1">
+      <w:start w:val="1"/>
+      <w:numFmt w:val="bullet"/>
+      <w:lvlText w:val="o"/>
+      <w:lvlJc w:val="left"/>
+      <w:pPr>
+        <w:ind w:left="5760" w:hanging="360"/>
+      </w:pPr>
+      <w:rPr>
+        <w:rFonts w:ascii="Courier New" w:hAnsi="Courier New" w:cs="Courier New" w:hint="default"/>
+      </w:rPr>
+    </w:lvl>
+    <w:lvl w:ilvl="8" w:tplc="40090005" w:tentative="1">
+      <w:start w:val="1"/>
+      <w:numFmt w:val="bullet"/>
+      <w:lvlText w:val=""/>
+      <w:lvlJc w:val="left"/>
+      <w:pPr>
+        <w:ind w:left="6480" w:hanging="360"/>
+      </w:pPr>
+      <w:rPr>
+        <w:rFonts w:ascii="Wingdings" w:hAnsi="Wingdings" w:hint="default"/>
+      </w:rPr>
+    </w:lvl>
+  </w:abstractNum>
+  <w:abstractNum w:abstractNumId="10" w15:restartNumberingAfterBreak="0">
     <w:nsid w:val="34CC2BFC"/>
     <w:multiLevelType w:val="multilevel"/>
     <w:tmpl w:val="4364BF6C"/>
@@ -11025,7 +12711,7 @@
       </w:rPr>
     </w:lvl>
   </w:abstractNum>
-  <w:abstractNum w:abstractNumId="10" w15:restartNumberingAfterBreak="0">
+  <w:abstractNum w:abstractNumId="11" w15:restartNumberingAfterBreak="0">
     <w:nsid w:val="39FF1CB1"/>
     <w:multiLevelType w:val="multilevel"/>
     <w:tmpl w:val="B9D21D68"/>
@@ -11174,7 +12860,7 @@
       </w:rPr>
     </w:lvl>
   </w:abstractNum>
-  <w:abstractNum w:abstractNumId="11" w15:restartNumberingAfterBreak="0">
+  <w:abstractNum w:abstractNumId="12" w15:restartNumberingAfterBreak="0">
     <w:nsid w:val="43462127"/>
     <w:multiLevelType w:val="multilevel"/>
     <w:tmpl w:val="2A44C164"/>
@@ -11323,7 +13009,269 @@
       </w:rPr>
     </w:lvl>
   </w:abstractNum>
-  <w:abstractNum w:abstractNumId="12" w15:restartNumberingAfterBreak="0">
+  <w:abstractNum w:abstractNumId="13" w15:restartNumberingAfterBreak="0">
+    <w:nsid w:val="4AFA0E28"/>
+    <w:multiLevelType w:val="hybridMultilevel"/>
+    <w:tmpl w:val="83DAB420"/>
+    <w:lvl w:ilvl="0" w:tplc="40090001">
+      <w:start w:val="1"/>
+      <w:numFmt w:val="bullet"/>
+      <w:lvlText w:val=""/>
+      <w:lvlJc w:val="left"/>
+      <w:pPr>
+        <w:ind w:left="720" w:hanging="360"/>
+      </w:pPr>
+      <w:rPr>
+        <w:rFonts w:ascii="Symbol" w:hAnsi="Symbol" w:hint="default"/>
+      </w:rPr>
+    </w:lvl>
+    <w:lvl w:ilvl="1" w:tplc="40090003" w:tentative="1">
+      <w:start w:val="1"/>
+      <w:numFmt w:val="bullet"/>
+      <w:lvlText w:val="o"/>
+      <w:lvlJc w:val="left"/>
+      <w:pPr>
+        <w:ind w:left="1440" w:hanging="360"/>
+      </w:pPr>
+      <w:rPr>
+        <w:rFonts w:ascii="Courier New" w:hAnsi="Courier New" w:cs="Courier New" w:hint="default"/>
+      </w:rPr>
+    </w:lvl>
+    <w:lvl w:ilvl="2" w:tplc="40090005" w:tentative="1">
+      <w:start w:val="1"/>
+      <w:numFmt w:val="bullet"/>
+      <w:lvlText w:val=""/>
+      <w:lvlJc w:val="left"/>
+      <w:pPr>
+        <w:ind w:left="2160" w:hanging="360"/>
+      </w:pPr>
+      <w:rPr>
+        <w:rFonts w:ascii="Wingdings" w:hAnsi="Wingdings" w:hint="default"/>
+      </w:rPr>
+    </w:lvl>
+    <w:lvl w:ilvl="3" w:tplc="40090001" w:tentative="1">
+      <w:start w:val="1"/>
+      <w:numFmt w:val="bullet"/>
+      <w:lvlText w:val=""/>
+      <w:lvlJc w:val="left"/>
+      <w:pPr>
+        <w:ind w:left="2880" w:hanging="360"/>
+      </w:pPr>
+      <w:rPr>
+        <w:rFonts w:ascii="Symbol" w:hAnsi="Symbol" w:hint="default"/>
+      </w:rPr>
+    </w:lvl>
+    <w:lvl w:ilvl="4" w:tplc="40090003" w:tentative="1">
+      <w:start w:val="1"/>
+      <w:numFmt w:val="bullet"/>
+      <w:lvlText w:val="o"/>
+      <w:lvlJc w:val="left"/>
+      <w:pPr>
+        <w:ind w:left="3600" w:hanging="360"/>
+      </w:pPr>
+      <w:rPr>
+        <w:rFonts w:ascii="Courier New" w:hAnsi="Courier New" w:cs="Courier New" w:hint="default"/>
+      </w:rPr>
+    </w:lvl>
+    <w:lvl w:ilvl="5" w:tplc="40090005" w:tentative="1">
+      <w:start w:val="1"/>
+      <w:numFmt w:val="bullet"/>
+      <w:lvlText w:val=""/>
+      <w:lvlJc w:val="left"/>
+      <w:pPr>
+        <w:ind w:left="4320" w:hanging="360"/>
+      </w:pPr>
+      <w:rPr>
+        <w:rFonts w:ascii="Wingdings" w:hAnsi="Wingdings" w:hint="default"/>
+      </w:rPr>
+    </w:lvl>
+    <w:lvl w:ilvl="6" w:tplc="40090001" w:tentative="1">
+      <w:start w:val="1"/>
+      <w:numFmt w:val="bullet"/>
+      <w:lvlText w:val=""/>
+      <w:lvlJc w:val="left"/>
+      <w:pPr>
+        <w:ind w:left="5040" w:hanging="360"/>
+      </w:pPr>
+      <w:rPr>
+        <w:rFonts w:ascii="Symbol" w:hAnsi="Symbol" w:hint="default"/>
+      </w:rPr>
+    </w:lvl>
+    <w:lvl w:ilvl="7" w:tplc="40090003" w:tentative="1">
+      <w:start w:val="1"/>
+      <w:numFmt w:val="bullet"/>
+      <w:lvlText w:val="o"/>
+      <w:lvlJc w:val="left"/>
+      <w:pPr>
+        <w:ind w:left="5760" w:hanging="360"/>
+      </w:pPr>
+      <w:rPr>
+        <w:rFonts w:ascii="Courier New" w:hAnsi="Courier New" w:cs="Courier New" w:hint="default"/>
+      </w:rPr>
+    </w:lvl>
+    <w:lvl w:ilvl="8" w:tplc="40090005" w:tentative="1">
+      <w:start w:val="1"/>
+      <w:numFmt w:val="bullet"/>
+      <w:lvlText w:val=""/>
+      <w:lvlJc w:val="left"/>
+      <w:pPr>
+        <w:ind w:left="6480" w:hanging="360"/>
+      </w:pPr>
+      <w:rPr>
+        <w:rFonts w:ascii="Wingdings" w:hAnsi="Wingdings" w:hint="default"/>
+      </w:rPr>
+    </w:lvl>
+  </w:abstractNum>
+  <w:abstractNum w:abstractNumId="14" w15:restartNumberingAfterBreak="0">
+    <w:nsid w:val="529A2B17"/>
+    <w:multiLevelType w:val="multilevel"/>
+    <w:tmpl w:val="94448010"/>
+    <w:lvl w:ilvl="0">
+      <w:start w:val="1"/>
+      <w:numFmt w:val="bullet"/>
+      <w:lvlText w:val=""/>
+      <w:lvlJc w:val="left"/>
+      <w:pPr>
+        <w:tabs>
+          <w:tab w:val="num" w:pos="720"/>
+        </w:tabs>
+        <w:ind w:left="720" w:hanging="360"/>
+      </w:pPr>
+      <w:rPr>
+        <w:rFonts w:ascii="Symbol" w:hAnsi="Symbol" w:hint="default"/>
+        <w:sz w:val="20"/>
+      </w:rPr>
+    </w:lvl>
+    <w:lvl w:ilvl="1" w:tentative="1">
+      <w:start w:val="1"/>
+      <w:numFmt w:val="bullet"/>
+      <w:lvlText w:val="o"/>
+      <w:lvlJc w:val="left"/>
+      <w:pPr>
+        <w:tabs>
+          <w:tab w:val="num" w:pos="1440"/>
+        </w:tabs>
+        <w:ind w:left="1440" w:hanging="360"/>
+      </w:pPr>
+      <w:rPr>
+        <w:rFonts w:ascii="Courier New" w:hAnsi="Courier New" w:hint="default"/>
+        <w:sz w:val="20"/>
+      </w:rPr>
+    </w:lvl>
+    <w:lvl w:ilvl="2" w:tentative="1">
+      <w:start w:val="1"/>
+      <w:numFmt w:val="bullet"/>
+      <w:lvlText w:val=""/>
+      <w:lvlJc w:val="left"/>
+      <w:pPr>
+        <w:tabs>
+          <w:tab w:val="num" w:pos="2160"/>
+        </w:tabs>
+        <w:ind w:left="2160" w:hanging="360"/>
+      </w:pPr>
+      <w:rPr>
+        <w:rFonts w:ascii="Wingdings" w:hAnsi="Wingdings" w:hint="default"/>
+        <w:sz w:val="20"/>
+      </w:rPr>
+    </w:lvl>
+    <w:lvl w:ilvl="3" w:tentative="1">
+      <w:start w:val="1"/>
+      <w:numFmt w:val="bullet"/>
+      <w:lvlText w:val=""/>
+      <w:lvlJc w:val="left"/>
+      <w:pPr>
+        <w:tabs>
+          <w:tab w:val="num" w:pos="2880"/>
+        </w:tabs>
+        <w:ind w:left="2880" w:hanging="360"/>
+      </w:pPr>
+      <w:rPr>
+        <w:rFonts w:ascii="Wingdings" w:hAnsi="Wingdings" w:hint="default"/>
+        <w:sz w:val="20"/>
+      </w:rPr>
+    </w:lvl>
+    <w:lvl w:ilvl="4" w:tentative="1">
+      <w:start w:val="1"/>
+      <w:numFmt w:val="bullet"/>
+      <w:lvlText w:val=""/>
+      <w:lvlJc w:val="left"/>
+      <w:pPr>
+        <w:tabs>
+          <w:tab w:val="num" w:pos="3600"/>
+        </w:tabs>
+        <w:ind w:left="3600" w:hanging="360"/>
+      </w:pPr>
+      <w:rPr>
+        <w:rFonts w:ascii="Wingdings" w:hAnsi="Wingdings" w:hint="default"/>
+        <w:sz w:val="20"/>
+      </w:rPr>
+    </w:lvl>
+    <w:lvl w:ilvl="5" w:tentative="1">
+      <w:start w:val="1"/>
+      <w:numFmt w:val="bullet"/>
+      <w:lvlText w:val=""/>
+      <w:lvlJc w:val="left"/>
+      <w:pPr>
+        <w:tabs>
+          <w:tab w:val="num" w:pos="4320"/>
+        </w:tabs>
+        <w:ind w:left="4320" w:hanging="360"/>
+      </w:pPr>
+      <w:rPr>
+        <w:rFonts w:ascii="Wingdings" w:hAnsi="Wingdings" w:hint="default"/>
+        <w:sz w:val="20"/>
+      </w:rPr>
+    </w:lvl>
+    <w:lvl w:ilvl="6" w:tentative="1">
+      <w:start w:val="1"/>
+      <w:numFmt w:val="bullet"/>
+      <w:lvlText w:val=""/>
+      <w:lvlJc w:val="left"/>
+      <w:pPr>
+        <w:tabs>
+          <w:tab w:val="num" w:pos="5040"/>
+        </w:tabs>
+        <w:ind w:left="5040" w:hanging="360"/>
+      </w:pPr>
+      <w:rPr>
+        <w:rFonts w:ascii="Wingdings" w:hAnsi="Wingdings" w:hint="default"/>
+        <w:sz w:val="20"/>
+      </w:rPr>
+    </w:lvl>
+    <w:lvl w:ilvl="7" w:tentative="1">
+      <w:start w:val="1"/>
+      <w:numFmt w:val="bullet"/>
+      <w:lvlText w:val=""/>
+      <w:lvlJc w:val="left"/>
+      <w:pPr>
+        <w:tabs>
+          <w:tab w:val="num" w:pos="5760"/>
+        </w:tabs>
+        <w:ind w:left="5760" w:hanging="360"/>
+      </w:pPr>
+      <w:rPr>
+        <w:rFonts w:ascii="Wingdings" w:hAnsi="Wingdings" w:hint="default"/>
+        <w:sz w:val="20"/>
+      </w:rPr>
+    </w:lvl>
+    <w:lvl w:ilvl="8" w:tentative="1">
+      <w:start w:val="1"/>
+      <w:numFmt w:val="bullet"/>
+      <w:lvlText w:val=""/>
+      <w:lvlJc w:val="left"/>
+      <w:pPr>
+        <w:tabs>
+          <w:tab w:val="num" w:pos="6480"/>
+        </w:tabs>
+        <w:ind w:left="6480" w:hanging="360"/>
+      </w:pPr>
+      <w:rPr>
+        <w:rFonts w:ascii="Wingdings" w:hAnsi="Wingdings" w:hint="default"/>
+        <w:sz w:val="20"/>
+      </w:rPr>
+    </w:lvl>
+  </w:abstractNum>
+  <w:abstractNum w:abstractNumId="15" w15:restartNumberingAfterBreak="0">
     <w:nsid w:val="61802EC5"/>
     <w:multiLevelType w:val="multilevel"/>
     <w:tmpl w:val="E59AE44C"/>
@@ -11472,10 +13420,159 @@
       </w:rPr>
     </w:lvl>
   </w:abstractNum>
-  <w:abstractNum w:abstractNumId="13" w15:restartNumberingAfterBreak="0">
+  <w:abstractNum w:abstractNumId="16" w15:restartNumberingAfterBreak="0">
     <w:nsid w:val="77931688"/>
     <w:multiLevelType w:val="multilevel"/>
     <w:tmpl w:val="2C066EF4"/>
+    <w:lvl w:ilvl="0">
+      <w:start w:val="1"/>
+      <w:numFmt w:val="bullet"/>
+      <w:lvlText w:val=""/>
+      <w:lvlJc w:val="left"/>
+      <w:pPr>
+        <w:tabs>
+          <w:tab w:val="num" w:pos="720"/>
+        </w:tabs>
+        <w:ind w:left="720" w:hanging="360"/>
+      </w:pPr>
+      <w:rPr>
+        <w:rFonts w:ascii="Symbol" w:hAnsi="Symbol" w:hint="default"/>
+        <w:sz w:val="20"/>
+      </w:rPr>
+    </w:lvl>
+    <w:lvl w:ilvl="1" w:tentative="1">
+      <w:start w:val="1"/>
+      <w:numFmt w:val="bullet"/>
+      <w:lvlText w:val="o"/>
+      <w:lvlJc w:val="left"/>
+      <w:pPr>
+        <w:tabs>
+          <w:tab w:val="num" w:pos="1440"/>
+        </w:tabs>
+        <w:ind w:left="1440" w:hanging="360"/>
+      </w:pPr>
+      <w:rPr>
+        <w:rFonts w:ascii="Courier New" w:hAnsi="Courier New" w:hint="default"/>
+        <w:sz w:val="20"/>
+      </w:rPr>
+    </w:lvl>
+    <w:lvl w:ilvl="2" w:tentative="1">
+      <w:start w:val="1"/>
+      <w:numFmt w:val="bullet"/>
+      <w:lvlText w:val=""/>
+      <w:lvlJc w:val="left"/>
+      <w:pPr>
+        <w:tabs>
+          <w:tab w:val="num" w:pos="2160"/>
+        </w:tabs>
+        <w:ind w:left="2160" w:hanging="360"/>
+      </w:pPr>
+      <w:rPr>
+        <w:rFonts w:ascii="Wingdings" w:hAnsi="Wingdings" w:hint="default"/>
+        <w:sz w:val="20"/>
+      </w:rPr>
+    </w:lvl>
+    <w:lvl w:ilvl="3" w:tentative="1">
+      <w:start w:val="1"/>
+      <w:numFmt w:val="bullet"/>
+      <w:lvlText w:val=""/>
+      <w:lvlJc w:val="left"/>
+      <w:pPr>
+        <w:tabs>
+          <w:tab w:val="num" w:pos="2880"/>
+        </w:tabs>
+        <w:ind w:left="2880" w:hanging="360"/>
+      </w:pPr>
+      <w:rPr>
+        <w:rFonts w:ascii="Wingdings" w:hAnsi="Wingdings" w:hint="default"/>
+        <w:sz w:val="20"/>
+      </w:rPr>
+    </w:lvl>
+    <w:lvl w:ilvl="4" w:tentative="1">
+      <w:start w:val="1"/>
+      <w:numFmt w:val="bullet"/>
+      <w:lvlText w:val=""/>
+      <w:lvlJc w:val="left"/>
+      <w:pPr>
+        <w:tabs>
+          <w:tab w:val="num" w:pos="3600"/>
+        </w:tabs>
+        <w:ind w:left="3600" w:hanging="360"/>
+      </w:pPr>
+      <w:rPr>
+        <w:rFonts w:ascii="Wingdings" w:hAnsi="Wingdings" w:hint="default"/>
+        <w:sz w:val="20"/>
+      </w:rPr>
+    </w:lvl>
+    <w:lvl w:ilvl="5" w:tentative="1">
+      <w:start w:val="1"/>
+      <w:numFmt w:val="bullet"/>
+      <w:lvlText w:val=""/>
+      <w:lvlJc w:val="left"/>
+      <w:pPr>
+        <w:tabs>
+          <w:tab w:val="num" w:pos="4320"/>
+        </w:tabs>
+        <w:ind w:left="4320" w:hanging="360"/>
+      </w:pPr>
+      <w:rPr>
+        <w:rFonts w:ascii="Wingdings" w:hAnsi="Wingdings" w:hint="default"/>
+        <w:sz w:val="20"/>
+      </w:rPr>
+    </w:lvl>
+    <w:lvl w:ilvl="6" w:tentative="1">
+      <w:start w:val="1"/>
+      <w:numFmt w:val="bullet"/>
+      <w:lvlText w:val=""/>
+      <w:lvlJc w:val="left"/>
+      <w:pPr>
+        <w:tabs>
+          <w:tab w:val="num" w:pos="5040"/>
+        </w:tabs>
+        <w:ind w:left="5040" w:hanging="360"/>
+      </w:pPr>
+      <w:rPr>
+        <w:rFonts w:ascii="Wingdings" w:hAnsi="Wingdings" w:hint="default"/>
+        <w:sz w:val="20"/>
+      </w:rPr>
+    </w:lvl>
+    <w:lvl w:ilvl="7" w:tentative="1">
+      <w:start w:val="1"/>
+      <w:numFmt w:val="bullet"/>
+      <w:lvlText w:val=""/>
+      <w:lvlJc w:val="left"/>
+      <w:pPr>
+        <w:tabs>
+          <w:tab w:val="num" w:pos="5760"/>
+        </w:tabs>
+        <w:ind w:left="5760" w:hanging="360"/>
+      </w:pPr>
+      <w:rPr>
+        <w:rFonts w:ascii="Wingdings" w:hAnsi="Wingdings" w:hint="default"/>
+        <w:sz w:val="20"/>
+      </w:rPr>
+    </w:lvl>
+    <w:lvl w:ilvl="8" w:tentative="1">
+      <w:start w:val="1"/>
+      <w:numFmt w:val="bullet"/>
+      <w:lvlText w:val=""/>
+      <w:lvlJc w:val="left"/>
+      <w:pPr>
+        <w:tabs>
+          <w:tab w:val="num" w:pos="6480"/>
+        </w:tabs>
+        <w:ind w:left="6480" w:hanging="360"/>
+      </w:pPr>
+      <w:rPr>
+        <w:rFonts w:ascii="Wingdings" w:hAnsi="Wingdings" w:hint="default"/>
+        <w:sz w:val="20"/>
+      </w:rPr>
+    </w:lvl>
+  </w:abstractNum>
+  <w:abstractNum w:abstractNumId="17" w15:restartNumberingAfterBreak="0">
+    <w:nsid w:val="7C5A4B44"/>
+    <w:multiLevelType w:val="multilevel"/>
+    <w:tmpl w:val="87CE6E58"/>
     <w:lvl w:ilvl="0">
       <w:start w:val="1"/>
       <w:numFmt w:val="bullet"/>
@@ -11628,28 +13725,28 @@
     <w:abstractNumId w:val="7"/>
   </w:num>
   <w:num w:numId="3" w16cid:durableId="1685402643">
-    <w:abstractNumId w:val="12"/>
+    <w:abstractNumId w:val="15"/>
   </w:num>
   <w:num w:numId="4" w16cid:durableId="1926112215">
     <w:abstractNumId w:val="1"/>
   </w:num>
   <w:num w:numId="5" w16cid:durableId="643437083">
-    <w:abstractNumId w:val="9"/>
+    <w:abstractNumId w:val="10"/>
   </w:num>
   <w:num w:numId="6" w16cid:durableId="820392158">
-    <w:abstractNumId w:val="10"/>
+    <w:abstractNumId w:val="11"/>
   </w:num>
   <w:num w:numId="7" w16cid:durableId="910119482">
     <w:abstractNumId w:val="3"/>
   </w:num>
   <w:num w:numId="8" w16cid:durableId="1730684956">
-    <w:abstractNumId w:val="11"/>
+    <w:abstractNumId w:val="12"/>
   </w:num>
   <w:num w:numId="9" w16cid:durableId="685211640">
     <w:abstractNumId w:val="4"/>
   </w:num>
   <w:num w:numId="10" w16cid:durableId="74253472">
-    <w:abstractNumId w:val="13"/>
+    <w:abstractNumId w:val="16"/>
   </w:num>
   <w:num w:numId="11" w16cid:durableId="2143768663">
     <w:abstractNumId w:val="5"/>
@@ -11662,6 +13759,18 @@
   </w:num>
   <w:num w:numId="14" w16cid:durableId="1582370005">
     <w:abstractNumId w:val="2"/>
+  </w:num>
+  <w:num w:numId="15" w16cid:durableId="2070497849">
+    <w:abstractNumId w:val="9"/>
+  </w:num>
+  <w:num w:numId="16" w16cid:durableId="1196578306">
+    <w:abstractNumId w:val="14"/>
+  </w:num>
+  <w:num w:numId="17" w16cid:durableId="1118259855">
+    <w:abstractNumId w:val="17"/>
+  </w:num>
+  <w:num w:numId="18" w16cid:durableId="1522664256">
+    <w:abstractNumId w:val="13"/>
   </w:num>
 </w:numbering>
 </file>

</xml_diff>

<commit_message>
KUBERNETES DEPLOYMENT | REPLICASETS
</commit_message>
<xml_diff>
--- a/Kubernetes/Kubernetes.docx
+++ b/Kubernetes/Kubernetes.docx
@@ -12293,6 +12293,9 @@
         </w:tabs>
       </w:pPr>
       <w:r>
+        <w:rPr>
+          <w:noProof/>
+        </w:rPr>
         <w:lastRenderedPageBreak/>
         <w:drawing>
           <wp:inline distT="0" distB="0" distL="0" distR="0" wp14:anchorId="55386501" wp14:editId="22747A1C">
@@ -12362,6 +12365,9 @@
         </w:tabs>
       </w:pPr>
       <w:r>
+        <w:rPr>
+          <w:noProof/>
+        </w:rPr>
         <w:drawing>
           <wp:inline distT="0" distB="0" distL="0" distR="0" wp14:anchorId="1B5540B2" wp14:editId="309F9B0C">
             <wp:extent cx="2225233" cy="457240"/>
@@ -12454,6 +12460,9 @@
         </w:tabs>
       </w:pPr>
       <w:r>
+        <w:rPr>
+          <w:noProof/>
+        </w:rPr>
         <w:drawing>
           <wp:inline distT="0" distB="0" distL="0" distR="0" wp14:anchorId="684E5132" wp14:editId="1F8DE3E0">
             <wp:extent cx="5014395" cy="1051651"/>
@@ -12599,6 +12608,9 @@
         </w:tabs>
       </w:pPr>
       <w:r>
+        <w:rPr>
+          <w:noProof/>
+        </w:rPr>
         <w:drawing>
           <wp:inline distT="0" distB="0" distL="0" distR="0" wp14:anchorId="0AA486A9" wp14:editId="64CEB35F">
             <wp:extent cx="4473328" cy="381033"/>
@@ -12805,15 +12817,24 @@
           <w:tab w:val="left" w:pos="6067"/>
         </w:tabs>
       </w:pPr>
-    </w:p>
-    <w:p>
-      <w:pPr>
-        <w:tabs>
-          <w:tab w:val="left" w:pos="6067"/>
-        </w:tabs>
-      </w:pPr>
-      <w:r>
-        <w:lastRenderedPageBreak/>
+      <w:r>
+        <w:t>NOTE: Pod is running specification on Docker Container</w:t>
+      </w:r>
+    </w:p>
+    <w:p>
+      <w:pPr>
+        <w:tabs>
+          <w:tab w:val="left" w:pos="6067"/>
+        </w:tabs>
+      </w:pPr>
+    </w:p>
+    <w:p>
+      <w:pPr>
+        <w:tabs>
+          <w:tab w:val="left" w:pos="6067"/>
+        </w:tabs>
+      </w:pPr>
+      <w:r>
         <w:t>Q.) How do we debug pods/application in Kubernetes</w:t>
       </w:r>
     </w:p>
@@ -12848,15 +12869,7 @@
       </w:r>
       <w:proofErr w:type="spellEnd"/>
       <w:r>
-        <w:t xml:space="preserve"> logs &lt;</w:t>
-      </w:r>
-      <w:proofErr w:type="spellStart"/>
-      <w:r>
-        <w:t>pod_name</w:t>
-      </w:r>
-      <w:proofErr w:type="spellEnd"/>
-      <w:r>
-        <w:t>&gt;</w:t>
+        <w:t xml:space="preserve"> logs &lt;pod_name&gt;</w:t>
       </w:r>
     </w:p>
     <w:p>
@@ -13082,7 +13095,6 @@
           <w:sz w:val="32"/>
           <w:szCs w:val="32"/>
         </w:rPr>
-        <w:lastRenderedPageBreak/>
         <w:t>5.) Kubernetes Deployment</w:t>
       </w:r>
     </w:p>
@@ -13113,24 +13125,1781 @@
         <w:tabs>
           <w:tab w:val="left" w:pos="6067"/>
         </w:tabs>
-        <w:rPr>
-          <w:b/>
-          <w:bCs/>
-          <w:sz w:val="26"/>
-          <w:szCs w:val="26"/>
-        </w:rPr>
-      </w:pPr>
-    </w:p>
-    <w:p>
-      <w:pPr>
-        <w:tabs>
-          <w:tab w:val="left" w:pos="6067"/>
-        </w:tabs>
-        <w:rPr>
-          <w:sz w:val="24"/>
-          <w:szCs w:val="24"/>
-        </w:rPr>
-      </w:pPr>
+      </w:pPr>
+      <w:r>
+        <w:t>Solution:</w:t>
+      </w:r>
+      <w:r>
+        <w:t xml:space="preserve"> We use Deployment for this</w:t>
+      </w:r>
+    </w:p>
+    <w:p>
+      <w:pPr>
+        <w:tabs>
+          <w:tab w:val="left" w:pos="6067"/>
+        </w:tabs>
+        <w:ind w:left="720"/>
+      </w:pPr>
+      <w:r>
+        <w:t xml:space="preserve">             Deployment</w:t>
+      </w:r>
+    </w:p>
+    <w:p>
+      <w:pPr>
+        <w:tabs>
+          <w:tab w:val="left" w:pos="6067"/>
+        </w:tabs>
+        <w:ind w:left="720"/>
+      </w:pPr>
+      <w:r>
+        <w:t xml:space="preserve">                 |</w:t>
+      </w:r>
+    </w:p>
+    <w:p>
+      <w:pPr>
+        <w:tabs>
+          <w:tab w:val="left" w:pos="6067"/>
+        </w:tabs>
+        <w:ind w:left="720"/>
+      </w:pPr>
+      <w:r>
+        <w:t xml:space="preserve">                 ↓</w:t>
+      </w:r>
+    </w:p>
+    <w:p>
+      <w:pPr>
+        <w:tabs>
+          <w:tab w:val="left" w:pos="6067"/>
+        </w:tabs>
+        <w:ind w:left="720"/>
+      </w:pPr>
+      <w:r>
+        <w:t xml:space="preserve">            </w:t>
+      </w:r>
+      <w:proofErr w:type="spellStart"/>
+      <w:r>
+        <w:t>ReplicaSet</w:t>
+      </w:r>
+      <w:proofErr w:type="spellEnd"/>
+    </w:p>
+    <w:p>
+      <w:pPr>
+        <w:tabs>
+          <w:tab w:val="left" w:pos="6067"/>
+        </w:tabs>
+        <w:ind w:left="720"/>
+      </w:pPr>
+      <w:r>
+        <w:t xml:space="preserve">            (Controller)</w:t>
+      </w:r>
+    </w:p>
+    <w:p>
+      <w:pPr>
+        <w:tabs>
+          <w:tab w:val="left" w:pos="6067"/>
+        </w:tabs>
+        <w:ind w:left="720"/>
+      </w:pPr>
+      <w:r>
+        <w:t xml:space="preserve">                 |</w:t>
+      </w:r>
+    </w:p>
+    <w:p>
+      <w:pPr>
+        <w:tabs>
+          <w:tab w:val="left" w:pos="6067"/>
+        </w:tabs>
+        <w:ind w:left="720"/>
+      </w:pPr>
+      <w:r>
+        <w:t xml:space="preserve">                 ↓</w:t>
+      </w:r>
+    </w:p>
+    <w:p>
+      <w:pPr>
+        <w:tabs>
+          <w:tab w:val="left" w:pos="6067"/>
+        </w:tabs>
+        <w:ind w:left="720"/>
+      </w:pPr>
+      <w:r>
+        <w:t xml:space="preserve">               Pods</w:t>
+      </w:r>
+    </w:p>
+    <w:p>
+      <w:pPr>
+        <w:tabs>
+          <w:tab w:val="left" w:pos="6067"/>
+        </w:tabs>
+        <w:ind w:left="720"/>
+      </w:pPr>
+      <w:r>
+        <w:t xml:space="preserve">                 |</w:t>
+      </w:r>
+    </w:p>
+    <w:p>
+      <w:pPr>
+        <w:tabs>
+          <w:tab w:val="left" w:pos="6067"/>
+        </w:tabs>
+        <w:ind w:left="720"/>
+      </w:pPr>
+      <w:r>
+        <w:t xml:space="preserve">                 ↓</w:t>
+      </w:r>
+    </w:p>
+    <w:p>
+      <w:pPr>
+        <w:tabs>
+          <w:tab w:val="left" w:pos="6067"/>
+        </w:tabs>
+        <w:ind w:left="720"/>
+      </w:pPr>
+      <w:r>
+        <w:t xml:space="preserve">            Containers</w:t>
+      </w:r>
+    </w:p>
+    <w:p>
+      <w:pPr>
+        <w:tabs>
+          <w:tab w:val="left" w:pos="6067"/>
+        </w:tabs>
+      </w:pPr>
+    </w:p>
+    <w:p>
+      <w:pPr>
+        <w:tabs>
+          <w:tab w:val="left" w:pos="6067"/>
+        </w:tabs>
+      </w:pPr>
+      <w:r>
+        <w:t xml:space="preserve">In Kubernetes, </w:t>
+      </w:r>
+      <w:r>
+        <w:rPr>
+          <w:b/>
+          <w:bCs/>
+        </w:rPr>
+        <w:t>Container → Pod → Deployment</w:t>
+      </w:r>
+      <w:r>
+        <w:t xml:space="preserve"> is a useful way to understand the hierarchy:</w:t>
+      </w:r>
+    </w:p>
+    <w:p>
+      <w:pPr>
+        <w:tabs>
+          <w:tab w:val="left" w:pos="6067"/>
+        </w:tabs>
+        <w:rPr>
+          <w:b/>
+          <w:bCs/>
+        </w:rPr>
+      </w:pPr>
+      <w:r>
+        <w:rPr>
+          <w:b/>
+          <w:bCs/>
+        </w:rPr>
+        <w:t>1. Container</w:t>
+      </w:r>
+    </w:p>
+    <w:p>
+      <w:pPr>
+        <w:tabs>
+          <w:tab w:val="left" w:pos="6067"/>
+        </w:tabs>
+      </w:pPr>
+      <w:r>
+        <w:t xml:space="preserve">A </w:t>
+      </w:r>
+      <w:r>
+        <w:rPr>
+          <w:b/>
+          <w:bCs/>
+        </w:rPr>
+        <w:t>container</w:t>
+      </w:r>
+      <w:r>
+        <w:t xml:space="preserve"> is where your application actually runs.</w:t>
+      </w:r>
+    </w:p>
+    <w:p>
+      <w:pPr>
+        <w:numPr>
+          <w:ilvl w:val="0"/>
+          <w:numId w:val="23"/>
+        </w:numPr>
+        <w:tabs>
+          <w:tab w:val="left" w:pos="6067"/>
+        </w:tabs>
+      </w:pPr>
+      <w:r>
+        <w:t xml:space="preserve">Contains your application + dependencies. </w:t>
+      </w:r>
+    </w:p>
+    <w:p>
+      <w:pPr>
+        <w:numPr>
+          <w:ilvl w:val="0"/>
+          <w:numId w:val="23"/>
+        </w:numPr>
+        <w:tabs>
+          <w:tab w:val="left" w:pos="6067"/>
+        </w:tabs>
+      </w:pPr>
+      <w:r>
+        <w:t>Usually created using Docker/</w:t>
+      </w:r>
+      <w:proofErr w:type="spellStart"/>
+      <w:r>
+        <w:t>Containerd</w:t>
+      </w:r>
+      <w:proofErr w:type="spellEnd"/>
+      <w:r>
+        <w:t xml:space="preserve">. </w:t>
+      </w:r>
+    </w:p>
+    <w:p>
+      <w:pPr>
+        <w:numPr>
+          <w:ilvl w:val="0"/>
+          <w:numId w:val="23"/>
+        </w:numPr>
+        <w:tabs>
+          <w:tab w:val="left" w:pos="6067"/>
+        </w:tabs>
+      </w:pPr>
+      <w:r>
+        <w:t xml:space="preserve">Kubernetes does </w:t>
+      </w:r>
+      <w:r>
+        <w:rPr>
+          <w:b/>
+          <w:bCs/>
+        </w:rPr>
+        <w:t>not</w:t>
+      </w:r>
+      <w:r>
+        <w:t xml:space="preserve"> directly manage containers; it manages Pods. </w:t>
+      </w:r>
+    </w:p>
+    <w:p>
+      <w:pPr>
+        <w:tabs>
+          <w:tab w:val="left" w:pos="6067"/>
+        </w:tabs>
+      </w:pPr>
+      <w:r>
+        <w:rPr>
+          <w:b/>
+          <w:bCs/>
+        </w:rPr>
+        <w:t>Example:</w:t>
+      </w:r>
+    </w:p>
+    <w:p>
+      <w:pPr>
+        <w:tabs>
+          <w:tab w:val="left" w:pos="6067"/>
+        </w:tabs>
+        <w:ind w:left="720"/>
+      </w:pPr>
+      <w:r>
+        <w:t>Container</w:t>
+      </w:r>
+    </w:p>
+    <w:p>
+      <w:pPr>
+        <w:tabs>
+          <w:tab w:val="left" w:pos="6067"/>
+        </w:tabs>
+        <w:ind w:left="720"/>
+      </w:pPr>
+      <w:r>
+        <w:t>└── Django Application</w:t>
+      </w:r>
+    </w:p>
+    <w:p>
+      <w:pPr>
+        <w:tabs>
+          <w:tab w:val="left" w:pos="6067"/>
+        </w:tabs>
+        <w:ind w:left="720"/>
+      </w:pPr>
+      <w:r>
+        <w:t xml:space="preserve">    </w:t>
+      </w:r>
+      <w:r>
+        <w:rPr>
+          <w:rFonts w:ascii="MS Gothic" w:eastAsia="MS Gothic" w:hAnsi="MS Gothic" w:cs="MS Gothic" w:hint="eastAsia"/>
+        </w:rPr>
+        <w:t>├</w:t>
+      </w:r>
+      <w:r>
+        <w:rPr>
+          <w:rFonts w:ascii="Calibri" w:hAnsi="Calibri" w:cs="Calibri"/>
+        </w:rPr>
+        <w:t>──</w:t>
+      </w:r>
+      <w:r>
+        <w:t xml:space="preserve"> Python</w:t>
+      </w:r>
+    </w:p>
+    <w:p>
+      <w:pPr>
+        <w:tabs>
+          <w:tab w:val="left" w:pos="6067"/>
+        </w:tabs>
+        <w:ind w:left="720"/>
+      </w:pPr>
+      <w:r>
+        <w:t xml:space="preserve">    </w:t>
+      </w:r>
+      <w:r>
+        <w:rPr>
+          <w:rFonts w:ascii="MS Gothic" w:eastAsia="MS Gothic" w:hAnsi="MS Gothic" w:cs="MS Gothic" w:hint="eastAsia"/>
+        </w:rPr>
+        <w:t>├</w:t>
+      </w:r>
+      <w:r>
+        <w:rPr>
+          <w:rFonts w:ascii="Calibri" w:hAnsi="Calibri" w:cs="Calibri"/>
+        </w:rPr>
+        <w:t>──</w:t>
+      </w:r>
+      <w:r>
+        <w:t xml:space="preserve"> Django</w:t>
+      </w:r>
+    </w:p>
+    <w:p>
+      <w:pPr>
+        <w:tabs>
+          <w:tab w:val="left" w:pos="6067"/>
+        </w:tabs>
+        <w:ind w:left="720"/>
+      </w:pPr>
+      <w:r>
+        <w:t xml:space="preserve">    └── Dependencies</w:t>
+      </w:r>
+    </w:p>
+    <w:p>
+      <w:pPr>
+        <w:tabs>
+          <w:tab w:val="left" w:pos="6067"/>
+        </w:tabs>
+        <w:rPr>
+          <w:b/>
+          <w:bCs/>
+        </w:rPr>
+      </w:pPr>
+      <w:r>
+        <w:rPr>
+          <w:b/>
+          <w:bCs/>
+        </w:rPr>
+        <w:t>2. Pod</w:t>
+      </w:r>
+    </w:p>
+    <w:p>
+      <w:pPr>
+        <w:tabs>
+          <w:tab w:val="left" w:pos="6067"/>
+        </w:tabs>
+      </w:pPr>
+      <w:r>
+        <w:t xml:space="preserve">A </w:t>
+      </w:r>
+      <w:r>
+        <w:rPr>
+          <w:b/>
+          <w:bCs/>
+        </w:rPr>
+        <w:t>Pod</w:t>
+      </w:r>
+      <w:r>
+        <w:t xml:space="preserve"> is the </w:t>
+      </w:r>
+      <w:r>
+        <w:rPr>
+          <w:b/>
+          <w:bCs/>
+        </w:rPr>
+        <w:t>smallest deployable unit in Kubernetes</w:t>
+      </w:r>
+      <w:r>
+        <w:t>.</w:t>
+      </w:r>
+    </w:p>
+    <w:p>
+      <w:pPr>
+        <w:numPr>
+          <w:ilvl w:val="0"/>
+          <w:numId w:val="24"/>
+        </w:numPr>
+        <w:tabs>
+          <w:tab w:val="left" w:pos="6067"/>
+        </w:tabs>
+      </w:pPr>
+      <w:r>
+        <w:lastRenderedPageBreak/>
+        <w:t xml:space="preserve">A Pod contains </w:t>
+      </w:r>
+      <w:r>
+        <w:rPr>
+          <w:b/>
+          <w:bCs/>
+        </w:rPr>
+        <w:t>one or more containers</w:t>
+      </w:r>
+      <w:r>
+        <w:t xml:space="preserve">. </w:t>
+      </w:r>
+    </w:p>
+    <w:p>
+      <w:pPr>
+        <w:numPr>
+          <w:ilvl w:val="0"/>
+          <w:numId w:val="24"/>
+        </w:numPr>
+        <w:tabs>
+          <w:tab w:val="left" w:pos="6067"/>
+        </w:tabs>
+      </w:pPr>
+      <w:r>
+        <w:t xml:space="preserve">Containers inside the same Pod share: </w:t>
+      </w:r>
+    </w:p>
+    <w:p>
+      <w:pPr>
+        <w:numPr>
+          <w:ilvl w:val="1"/>
+          <w:numId w:val="24"/>
+        </w:numPr>
+        <w:tabs>
+          <w:tab w:val="left" w:pos="6067"/>
+        </w:tabs>
+      </w:pPr>
+      <w:r>
+        <w:t xml:space="preserve">Network </w:t>
+      </w:r>
+    </w:p>
+    <w:p>
+      <w:pPr>
+        <w:numPr>
+          <w:ilvl w:val="1"/>
+          <w:numId w:val="24"/>
+        </w:numPr>
+        <w:tabs>
+          <w:tab w:val="left" w:pos="6067"/>
+        </w:tabs>
+      </w:pPr>
+      <w:r>
+        <w:t xml:space="preserve">IP address </w:t>
+      </w:r>
+    </w:p>
+    <w:p>
+      <w:pPr>
+        <w:numPr>
+          <w:ilvl w:val="1"/>
+          <w:numId w:val="24"/>
+        </w:numPr>
+        <w:tabs>
+          <w:tab w:val="left" w:pos="6067"/>
+        </w:tabs>
+      </w:pPr>
+      <w:r>
+        <w:t xml:space="preserve">Storage volumes </w:t>
+      </w:r>
+    </w:p>
+    <w:p>
+      <w:pPr>
+        <w:numPr>
+          <w:ilvl w:val="0"/>
+          <w:numId w:val="24"/>
+        </w:numPr>
+        <w:tabs>
+          <w:tab w:val="left" w:pos="6067"/>
+        </w:tabs>
+      </w:pPr>
+      <w:r>
+        <w:t xml:space="preserve">Usually, </w:t>
+      </w:r>
+      <w:r>
+        <w:rPr>
+          <w:b/>
+          <w:bCs/>
+        </w:rPr>
+        <w:t>1 Pod = 1 main application container</w:t>
+      </w:r>
+      <w:r>
+        <w:t>.</w:t>
+      </w:r>
+    </w:p>
+    <w:p>
+      <w:pPr>
+        <w:tabs>
+          <w:tab w:val="left" w:pos="6067"/>
+        </w:tabs>
+      </w:pPr>
+      <w:r>
+        <w:t xml:space="preserve">Example: </w:t>
+      </w:r>
+    </w:p>
+    <w:p>
+      <w:pPr>
+        <w:tabs>
+          <w:tab w:val="left" w:pos="6067"/>
+        </w:tabs>
+        <w:ind w:left="720"/>
+      </w:pPr>
+      <w:r>
+        <w:t>Pod</w:t>
+      </w:r>
+    </w:p>
+    <w:p>
+      <w:pPr>
+        <w:tabs>
+          <w:tab w:val="left" w:pos="6067"/>
+        </w:tabs>
+        <w:ind w:left="720"/>
+      </w:pPr>
+      <w:r>
+        <w:t>└── Container</w:t>
+      </w:r>
+    </w:p>
+    <w:p>
+      <w:pPr>
+        <w:tabs>
+          <w:tab w:val="left" w:pos="6067"/>
+        </w:tabs>
+        <w:ind w:left="720"/>
+      </w:pPr>
+      <w:r>
+        <w:t xml:space="preserve">    └── Django App</w:t>
+      </w:r>
+    </w:p>
+    <w:p>
+      <w:pPr>
+        <w:tabs>
+          <w:tab w:val="left" w:pos="6067"/>
+        </w:tabs>
+      </w:pPr>
+      <w:r>
+        <w:t>A Pod can also have multiple containers:</w:t>
+      </w:r>
+    </w:p>
+    <w:p>
+      <w:pPr>
+        <w:tabs>
+          <w:tab w:val="left" w:pos="6067"/>
+        </w:tabs>
+      </w:pPr>
+    </w:p>
+    <w:p>
+      <w:pPr>
+        <w:tabs>
+          <w:tab w:val="left" w:pos="6067"/>
+        </w:tabs>
+        <w:ind w:left="720"/>
+      </w:pPr>
+      <w:r>
+        <w:t>Pod</w:t>
+      </w:r>
+    </w:p>
+    <w:p>
+      <w:pPr>
+        <w:tabs>
+          <w:tab w:val="left" w:pos="6067"/>
+        </w:tabs>
+        <w:ind w:left="720"/>
+      </w:pPr>
+      <w:r>
+        <w:rPr>
+          <w:rFonts w:ascii="MS Gothic" w:eastAsia="MS Gothic" w:hAnsi="MS Gothic" w:cs="MS Gothic" w:hint="eastAsia"/>
+        </w:rPr>
+        <w:t>├</w:t>
+      </w:r>
+      <w:r>
+        <w:rPr>
+          <w:rFonts w:ascii="Calibri" w:hAnsi="Calibri" w:cs="Calibri"/>
+        </w:rPr>
+        <w:t>──</w:t>
+      </w:r>
+      <w:r>
+        <w:t xml:space="preserve"> Django Container</w:t>
+      </w:r>
+    </w:p>
+    <w:p>
+      <w:pPr>
+        <w:tabs>
+          <w:tab w:val="left" w:pos="6067"/>
+        </w:tabs>
+        <w:ind w:left="720"/>
+      </w:pPr>
+      <w:r>
+        <w:t>└── Sidecar Container</w:t>
+      </w:r>
+    </w:p>
+    <w:p>
+      <w:pPr>
+        <w:tabs>
+          <w:tab w:val="left" w:pos="6067"/>
+        </w:tabs>
+        <w:rPr>
+          <w:b/>
+          <w:bCs/>
+        </w:rPr>
+      </w:pPr>
+      <w:r>
+        <w:rPr>
+          <w:b/>
+          <w:bCs/>
+        </w:rPr>
+        <w:t>3. Deployment</w:t>
+      </w:r>
+    </w:p>
+    <w:p>
+      <w:pPr>
+        <w:tabs>
+          <w:tab w:val="left" w:pos="6067"/>
+        </w:tabs>
+      </w:pPr>
+      <w:r>
+        <w:t xml:space="preserve">A </w:t>
+      </w:r>
+      <w:r>
+        <w:rPr>
+          <w:b/>
+          <w:bCs/>
+        </w:rPr>
+        <w:t>Deployment</w:t>
+      </w:r>
+      <w:r>
+        <w:t xml:space="preserve"> manages Pods.</w:t>
+      </w:r>
+    </w:p>
+    <w:p>
+      <w:pPr>
+        <w:tabs>
+          <w:tab w:val="left" w:pos="6067"/>
+        </w:tabs>
+      </w:pPr>
+      <w:r>
+        <w:t>Deployment is used for auto-scaling and auto-healing</w:t>
+      </w:r>
+    </w:p>
+    <w:p>
+      <w:pPr>
+        <w:tabs>
+          <w:tab w:val="left" w:pos="6067"/>
+        </w:tabs>
+      </w:pPr>
+      <w:r>
+        <w:t>It is used when you want Kubernetes to:</w:t>
+      </w:r>
+    </w:p>
+    <w:p>
+      <w:pPr>
+        <w:numPr>
+          <w:ilvl w:val="0"/>
+          <w:numId w:val="25"/>
+        </w:numPr>
+        <w:tabs>
+          <w:tab w:val="left" w:pos="6067"/>
+        </w:tabs>
+      </w:pPr>
+      <w:r>
+        <w:t xml:space="preserve">Create Pods </w:t>
+      </w:r>
+    </w:p>
+    <w:p>
+      <w:pPr>
+        <w:numPr>
+          <w:ilvl w:val="0"/>
+          <w:numId w:val="25"/>
+        </w:numPr>
+        <w:tabs>
+          <w:tab w:val="left" w:pos="6067"/>
+        </w:tabs>
+      </w:pPr>
+      <w:r>
+        <w:t xml:space="preserve">Maintain a desired number of replicas </w:t>
+      </w:r>
+    </w:p>
+    <w:p>
+      <w:pPr>
+        <w:numPr>
+          <w:ilvl w:val="0"/>
+          <w:numId w:val="25"/>
+        </w:numPr>
+        <w:tabs>
+          <w:tab w:val="left" w:pos="6067"/>
+        </w:tabs>
+      </w:pPr>
+      <w:r>
+        <w:t xml:space="preserve">Restart/replace failed Pods </w:t>
+      </w:r>
+    </w:p>
+    <w:p>
+      <w:pPr>
+        <w:numPr>
+          <w:ilvl w:val="0"/>
+          <w:numId w:val="25"/>
+        </w:numPr>
+        <w:tabs>
+          <w:tab w:val="left" w:pos="6067"/>
+        </w:tabs>
+      </w:pPr>
+      <w:r>
+        <w:t xml:space="preserve">Perform rolling updates </w:t>
+      </w:r>
+    </w:p>
+    <w:p>
+      <w:pPr>
+        <w:numPr>
+          <w:ilvl w:val="0"/>
+          <w:numId w:val="25"/>
+        </w:numPr>
+        <w:tabs>
+          <w:tab w:val="left" w:pos="6067"/>
+        </w:tabs>
+      </w:pPr>
+      <w:r>
+        <w:t>Roll back versions</w:t>
+      </w:r>
+    </w:p>
+    <w:p>
+      <w:pPr>
+        <w:tabs>
+          <w:tab w:val="left" w:pos="6067"/>
+        </w:tabs>
+      </w:pPr>
+      <w:r>
+        <w:t xml:space="preserve">Example: </w:t>
+      </w:r>
+    </w:p>
+    <w:p>
+      <w:pPr>
+        <w:tabs>
+          <w:tab w:val="left" w:pos="6067"/>
+        </w:tabs>
+        <w:ind w:left="720"/>
+      </w:pPr>
+      <w:r>
+        <w:t>Deployment</w:t>
+      </w:r>
+    </w:p>
+    <w:p>
+      <w:pPr>
+        <w:tabs>
+          <w:tab w:val="left" w:pos="6067"/>
+        </w:tabs>
+        <w:ind w:left="720"/>
+      </w:pPr>
+      <w:r>
+        <w:t>│</w:t>
+      </w:r>
+    </w:p>
+    <w:p>
+      <w:pPr>
+        <w:tabs>
+          <w:tab w:val="left" w:pos="6067"/>
+        </w:tabs>
+        <w:ind w:left="720"/>
+      </w:pPr>
+      <w:r>
+        <w:rPr>
+          <w:rFonts w:ascii="MS Gothic" w:eastAsia="MS Gothic" w:hAnsi="MS Gothic" w:cs="MS Gothic" w:hint="eastAsia"/>
+        </w:rPr>
+        <w:t>├</w:t>
+      </w:r>
+      <w:r>
+        <w:rPr>
+          <w:rFonts w:ascii="Calibri" w:hAnsi="Calibri" w:cs="Calibri"/>
+        </w:rPr>
+        <w:t>──</w:t>
+      </w:r>
+      <w:r>
+        <w:t xml:space="preserve"> Pod 1</w:t>
+      </w:r>
+    </w:p>
+    <w:p>
+      <w:pPr>
+        <w:tabs>
+          <w:tab w:val="left" w:pos="6067"/>
+        </w:tabs>
+        <w:ind w:left="720"/>
+      </w:pPr>
+      <w:r>
+        <w:t>│   └── Django Container</w:t>
+      </w:r>
+    </w:p>
+    <w:p>
+      <w:pPr>
+        <w:tabs>
+          <w:tab w:val="left" w:pos="6067"/>
+        </w:tabs>
+        <w:ind w:left="720"/>
+      </w:pPr>
+      <w:r>
+        <w:t>│</w:t>
+      </w:r>
+    </w:p>
+    <w:p>
+      <w:pPr>
+        <w:tabs>
+          <w:tab w:val="left" w:pos="6067"/>
+        </w:tabs>
+        <w:ind w:left="720"/>
+      </w:pPr>
+      <w:r>
+        <w:rPr>
+          <w:rFonts w:ascii="MS Gothic" w:eastAsia="MS Gothic" w:hAnsi="MS Gothic" w:cs="MS Gothic" w:hint="eastAsia"/>
+        </w:rPr>
+        <w:t>├</w:t>
+      </w:r>
+      <w:r>
+        <w:rPr>
+          <w:rFonts w:ascii="Calibri" w:hAnsi="Calibri" w:cs="Calibri"/>
+        </w:rPr>
+        <w:t>──</w:t>
+      </w:r>
+      <w:r>
+        <w:t xml:space="preserve"> Pod 2</w:t>
+      </w:r>
+    </w:p>
+    <w:p>
+      <w:pPr>
+        <w:tabs>
+          <w:tab w:val="left" w:pos="6067"/>
+        </w:tabs>
+        <w:ind w:left="720"/>
+      </w:pPr>
+      <w:r>
+        <w:lastRenderedPageBreak/>
+        <w:t>│   └── Django Container</w:t>
+      </w:r>
+    </w:p>
+    <w:p>
+      <w:pPr>
+        <w:tabs>
+          <w:tab w:val="left" w:pos="6067"/>
+        </w:tabs>
+        <w:ind w:left="720"/>
+      </w:pPr>
+      <w:r>
+        <w:t>│</w:t>
+      </w:r>
+    </w:p>
+    <w:p>
+      <w:pPr>
+        <w:tabs>
+          <w:tab w:val="left" w:pos="6067"/>
+        </w:tabs>
+        <w:ind w:left="720"/>
+      </w:pPr>
+      <w:r>
+        <w:t>└── Pod 3</w:t>
+      </w:r>
+    </w:p>
+    <w:p>
+      <w:pPr>
+        <w:tabs>
+          <w:tab w:val="left" w:pos="6067"/>
+        </w:tabs>
+        <w:ind w:left="720"/>
+      </w:pPr>
+      <w:r>
+        <w:t xml:space="preserve">    └── Django Container</w:t>
+      </w:r>
+    </w:p>
+    <w:p>
+      <w:pPr>
+        <w:tabs>
+          <w:tab w:val="left" w:pos="6067"/>
+        </w:tabs>
+      </w:pPr>
+    </w:p>
+    <w:p>
+      <w:pPr>
+        <w:tabs>
+          <w:tab w:val="left" w:pos="6067"/>
+        </w:tabs>
+        <w:ind w:left="720"/>
+      </w:pPr>
+    </w:p>
+    <w:tbl>
+      <w:tblPr>
+        <w:tblW w:w="9199" w:type="dxa"/>
+        <w:tblCellSpacing w:w="15" w:type="dxa"/>
+        <w:tblCellMar>
+          <w:top w:w="15" w:type="dxa"/>
+          <w:left w:w="15" w:type="dxa"/>
+          <w:bottom w:w="15" w:type="dxa"/>
+          <w:right w:w="15" w:type="dxa"/>
+        </w:tblCellMar>
+        <w:tblLook w:val="04A0" w:firstRow="1" w:lastRow="0" w:firstColumn="1" w:lastColumn="0" w:noHBand="0" w:noVBand="1"/>
+      </w:tblPr>
+      <w:tblGrid>
+        <w:gridCol w:w="1801"/>
+        <w:gridCol w:w="2495"/>
+        <w:gridCol w:w="2224"/>
+        <w:gridCol w:w="2679"/>
+      </w:tblGrid>
+      <w:tr>
+        <w:trPr>
+          <w:trHeight w:val="464"/>
+          <w:tblHeader/>
+          <w:tblCellSpacing w:w="15" w:type="dxa"/>
+        </w:trPr>
+        <w:tc>
+          <w:tcPr>
+            <w:tcW w:w="0" w:type="auto"/>
+            <w:vAlign w:val="center"/>
+            <w:hideMark/>
+          </w:tcPr>
+          <w:p>
+            <w:pPr>
+              <w:tabs>
+                <w:tab w:val="left" w:pos="6067"/>
+              </w:tabs>
+              <w:rPr>
+                <w:b/>
+                <w:bCs/>
+              </w:rPr>
+            </w:pPr>
+            <w:r>
+              <w:rPr>
+                <w:b/>
+                <w:bCs/>
+              </w:rPr>
+              <w:t>Feature</w:t>
+            </w:r>
+          </w:p>
+        </w:tc>
+        <w:tc>
+          <w:tcPr>
+            <w:tcW w:w="0" w:type="auto"/>
+            <w:vAlign w:val="center"/>
+            <w:hideMark/>
+          </w:tcPr>
+          <w:p>
+            <w:pPr>
+              <w:tabs>
+                <w:tab w:val="left" w:pos="6067"/>
+              </w:tabs>
+              <w:rPr>
+                <w:b/>
+                <w:bCs/>
+              </w:rPr>
+            </w:pPr>
+            <w:r>
+              <w:rPr>
+                <w:b/>
+                <w:bCs/>
+              </w:rPr>
+              <w:t>Container</w:t>
+            </w:r>
+          </w:p>
+        </w:tc>
+        <w:tc>
+          <w:tcPr>
+            <w:tcW w:w="0" w:type="auto"/>
+            <w:vAlign w:val="center"/>
+            <w:hideMark/>
+          </w:tcPr>
+          <w:p>
+            <w:pPr>
+              <w:tabs>
+                <w:tab w:val="left" w:pos="6067"/>
+              </w:tabs>
+              <w:rPr>
+                <w:b/>
+                <w:bCs/>
+              </w:rPr>
+            </w:pPr>
+            <w:r>
+              <w:rPr>
+                <w:b/>
+                <w:bCs/>
+              </w:rPr>
+              <w:t>Pod</w:t>
+            </w:r>
+          </w:p>
+        </w:tc>
+        <w:tc>
+          <w:tcPr>
+            <w:tcW w:w="0" w:type="auto"/>
+            <w:vAlign w:val="center"/>
+            <w:hideMark/>
+          </w:tcPr>
+          <w:p>
+            <w:pPr>
+              <w:tabs>
+                <w:tab w:val="left" w:pos="6067"/>
+              </w:tabs>
+              <w:rPr>
+                <w:b/>
+                <w:bCs/>
+              </w:rPr>
+            </w:pPr>
+            <w:r>
+              <w:rPr>
+                <w:b/>
+                <w:bCs/>
+              </w:rPr>
+              <w:t>Deployment</w:t>
+            </w:r>
+          </w:p>
+        </w:tc>
+      </w:tr>
+      <w:tr>
+        <w:trPr>
+          <w:trHeight w:val="478"/>
+          <w:tblCellSpacing w:w="15" w:type="dxa"/>
+        </w:trPr>
+        <w:tc>
+          <w:tcPr>
+            <w:tcW w:w="0" w:type="auto"/>
+            <w:vAlign w:val="center"/>
+            <w:hideMark/>
+          </w:tcPr>
+          <w:p>
+            <w:pPr>
+              <w:tabs>
+                <w:tab w:val="left" w:pos="6067"/>
+              </w:tabs>
+            </w:pPr>
+            <w:r>
+              <w:t>What is it?</w:t>
+            </w:r>
+          </w:p>
+        </w:tc>
+        <w:tc>
+          <w:tcPr>
+            <w:tcW w:w="0" w:type="auto"/>
+            <w:vAlign w:val="center"/>
+            <w:hideMark/>
+          </w:tcPr>
+          <w:p>
+            <w:pPr>
+              <w:tabs>
+                <w:tab w:val="left" w:pos="6067"/>
+              </w:tabs>
+            </w:pPr>
+            <w:r>
+              <w:t>Runs application</w:t>
+            </w:r>
+          </w:p>
+        </w:tc>
+        <w:tc>
+          <w:tcPr>
+            <w:tcW w:w="0" w:type="auto"/>
+            <w:vAlign w:val="center"/>
+            <w:hideMark/>
+          </w:tcPr>
+          <w:p>
+            <w:pPr>
+              <w:tabs>
+                <w:tab w:val="left" w:pos="6067"/>
+              </w:tabs>
+            </w:pPr>
+            <w:r>
+              <w:t>Runs container(s)</w:t>
+            </w:r>
+          </w:p>
+        </w:tc>
+        <w:tc>
+          <w:tcPr>
+            <w:tcW w:w="0" w:type="auto"/>
+            <w:vAlign w:val="center"/>
+            <w:hideMark/>
+          </w:tcPr>
+          <w:p>
+            <w:pPr>
+              <w:tabs>
+                <w:tab w:val="left" w:pos="6067"/>
+              </w:tabs>
+            </w:pPr>
+            <w:r>
+              <w:t>Manages Pods</w:t>
+            </w:r>
+          </w:p>
+        </w:tc>
+      </w:tr>
+      <w:tr>
+        <w:trPr>
+          <w:trHeight w:val="464"/>
+          <w:tblCellSpacing w:w="15" w:type="dxa"/>
+        </w:trPr>
+        <w:tc>
+          <w:tcPr>
+            <w:tcW w:w="0" w:type="auto"/>
+            <w:vAlign w:val="center"/>
+            <w:hideMark/>
+          </w:tcPr>
+          <w:p>
+            <w:pPr>
+              <w:tabs>
+                <w:tab w:val="left" w:pos="6067"/>
+              </w:tabs>
+            </w:pPr>
+            <w:r>
+              <w:t>Level</w:t>
+            </w:r>
+          </w:p>
+        </w:tc>
+        <w:tc>
+          <w:tcPr>
+            <w:tcW w:w="0" w:type="auto"/>
+            <w:vAlign w:val="center"/>
+            <w:hideMark/>
+          </w:tcPr>
+          <w:p>
+            <w:pPr>
+              <w:tabs>
+                <w:tab w:val="left" w:pos="6067"/>
+              </w:tabs>
+            </w:pPr>
+            <w:r>
+              <w:t>Application runtime</w:t>
+            </w:r>
+          </w:p>
+        </w:tc>
+        <w:tc>
+          <w:tcPr>
+            <w:tcW w:w="0" w:type="auto"/>
+            <w:vAlign w:val="center"/>
+            <w:hideMark/>
+          </w:tcPr>
+          <w:p>
+            <w:pPr>
+              <w:tabs>
+                <w:tab w:val="left" w:pos="6067"/>
+              </w:tabs>
+            </w:pPr>
+            <w:r>
+              <w:t>Kubernetes unit</w:t>
+            </w:r>
+          </w:p>
+        </w:tc>
+        <w:tc>
+          <w:tcPr>
+            <w:tcW w:w="0" w:type="auto"/>
+            <w:vAlign w:val="center"/>
+            <w:hideMark/>
+          </w:tcPr>
+          <w:p>
+            <w:pPr>
+              <w:tabs>
+                <w:tab w:val="left" w:pos="6067"/>
+              </w:tabs>
+            </w:pPr>
+            <w:r>
+              <w:t>Kubernetes controller</w:t>
+            </w:r>
+          </w:p>
+        </w:tc>
+      </w:tr>
+      <w:tr>
+        <w:trPr>
+          <w:trHeight w:val="464"/>
+          <w:tblCellSpacing w:w="15" w:type="dxa"/>
+        </w:trPr>
+        <w:tc>
+          <w:tcPr>
+            <w:tcW w:w="0" w:type="auto"/>
+            <w:vAlign w:val="center"/>
+            <w:hideMark/>
+          </w:tcPr>
+          <w:p>
+            <w:pPr>
+              <w:tabs>
+                <w:tab w:val="left" w:pos="6067"/>
+              </w:tabs>
+            </w:pPr>
+            <w:r>
+              <w:t>Contains</w:t>
+            </w:r>
+          </w:p>
+        </w:tc>
+        <w:tc>
+          <w:tcPr>
+            <w:tcW w:w="0" w:type="auto"/>
+            <w:vAlign w:val="center"/>
+            <w:hideMark/>
+          </w:tcPr>
+          <w:p>
+            <w:pPr>
+              <w:tabs>
+                <w:tab w:val="left" w:pos="6067"/>
+              </w:tabs>
+            </w:pPr>
+            <w:r>
+              <w:t>App + dependencies</w:t>
+            </w:r>
+          </w:p>
+        </w:tc>
+        <w:tc>
+          <w:tcPr>
+            <w:tcW w:w="0" w:type="auto"/>
+            <w:vAlign w:val="center"/>
+            <w:hideMark/>
+          </w:tcPr>
+          <w:p>
+            <w:pPr>
+              <w:tabs>
+                <w:tab w:val="left" w:pos="6067"/>
+              </w:tabs>
+            </w:pPr>
+            <w:r>
+              <w:t>1+ containers</w:t>
+            </w:r>
+          </w:p>
+        </w:tc>
+        <w:tc>
+          <w:tcPr>
+            <w:tcW w:w="0" w:type="auto"/>
+            <w:vAlign w:val="center"/>
+            <w:hideMark/>
+          </w:tcPr>
+          <w:p>
+            <w:pPr>
+              <w:tabs>
+                <w:tab w:val="left" w:pos="6067"/>
+              </w:tabs>
+            </w:pPr>
+            <w:r>
+              <w:t>Multiple Pods</w:t>
+            </w:r>
+          </w:p>
+        </w:tc>
+      </w:tr>
+      <w:tr>
+        <w:trPr>
+          <w:trHeight w:val="492"/>
+          <w:tblCellSpacing w:w="15" w:type="dxa"/>
+        </w:trPr>
+        <w:tc>
+          <w:tcPr>
+            <w:tcW w:w="0" w:type="auto"/>
+            <w:vAlign w:val="center"/>
+            <w:hideMark/>
+          </w:tcPr>
+          <w:p>
+            <w:pPr>
+              <w:tabs>
+                <w:tab w:val="left" w:pos="6067"/>
+              </w:tabs>
+            </w:pPr>
+            <w:r>
+              <w:t>Scaling</w:t>
+            </w:r>
+          </w:p>
+        </w:tc>
+        <w:tc>
+          <w:tcPr>
+            <w:tcW w:w="0" w:type="auto"/>
+            <w:vAlign w:val="center"/>
+            <w:hideMark/>
+          </w:tcPr>
+          <w:p>
+            <w:pPr>
+              <w:tabs>
+                <w:tab w:val="left" w:pos="6067"/>
+              </w:tabs>
+            </w:pPr>
+            <w:r>
+              <w:rPr>
+                <w:rFonts w:ascii="Segoe UI Emoji" w:hAnsi="Segoe UI Emoji" w:cs="Segoe UI Emoji"/>
+              </w:rPr>
+              <w:t>❌</w:t>
+            </w:r>
+          </w:p>
+        </w:tc>
+        <w:tc>
+          <w:tcPr>
+            <w:tcW w:w="0" w:type="auto"/>
+            <w:vAlign w:val="center"/>
+            <w:hideMark/>
+          </w:tcPr>
+          <w:p>
+            <w:pPr>
+              <w:tabs>
+                <w:tab w:val="left" w:pos="6067"/>
+              </w:tabs>
+            </w:pPr>
+            <w:r>
+              <w:t>Manually possible</w:t>
+            </w:r>
+          </w:p>
+        </w:tc>
+        <w:tc>
+          <w:tcPr>
+            <w:tcW w:w="0" w:type="auto"/>
+            <w:vAlign w:val="center"/>
+            <w:hideMark/>
+          </w:tcPr>
+          <w:p>
+            <w:pPr>
+              <w:tabs>
+                <w:tab w:val="left" w:pos="6067"/>
+              </w:tabs>
+            </w:pPr>
+            <w:r>
+              <w:rPr>
+                <w:rFonts w:ascii="Segoe UI Emoji" w:hAnsi="Segoe UI Emoji" w:cs="Segoe UI Emoji"/>
+              </w:rPr>
+              <w:t>✅</w:t>
+            </w:r>
+          </w:p>
+        </w:tc>
+      </w:tr>
+      <w:tr>
+        <w:trPr>
+          <w:trHeight w:val="492"/>
+          <w:tblCellSpacing w:w="15" w:type="dxa"/>
+        </w:trPr>
+        <w:tc>
+          <w:tcPr>
+            <w:tcW w:w="0" w:type="auto"/>
+            <w:vAlign w:val="center"/>
+            <w:hideMark/>
+          </w:tcPr>
+          <w:p>
+            <w:pPr>
+              <w:tabs>
+                <w:tab w:val="left" w:pos="6067"/>
+              </w:tabs>
+            </w:pPr>
+            <w:r>
+              <w:t>Self-healing</w:t>
+            </w:r>
+          </w:p>
+        </w:tc>
+        <w:tc>
+          <w:tcPr>
+            <w:tcW w:w="0" w:type="auto"/>
+            <w:vAlign w:val="center"/>
+            <w:hideMark/>
+          </w:tcPr>
+          <w:p>
+            <w:pPr>
+              <w:tabs>
+                <w:tab w:val="left" w:pos="6067"/>
+              </w:tabs>
+            </w:pPr>
+            <w:r>
+              <w:rPr>
+                <w:rFonts w:ascii="Segoe UI Emoji" w:hAnsi="Segoe UI Emoji" w:cs="Segoe UI Emoji"/>
+              </w:rPr>
+              <w:t>❌</w:t>
+            </w:r>
+          </w:p>
+        </w:tc>
+        <w:tc>
+          <w:tcPr>
+            <w:tcW w:w="0" w:type="auto"/>
+            <w:vAlign w:val="center"/>
+            <w:hideMark/>
+          </w:tcPr>
+          <w:p>
+            <w:pPr>
+              <w:tabs>
+                <w:tab w:val="left" w:pos="6067"/>
+              </w:tabs>
+            </w:pPr>
+            <w:r>
+              <w:rPr>
+                <w:rFonts w:ascii="Segoe UI Emoji" w:hAnsi="Segoe UI Emoji" w:cs="Segoe UI Emoji"/>
+              </w:rPr>
+              <w:t>❌</w:t>
+            </w:r>
+          </w:p>
+        </w:tc>
+        <w:tc>
+          <w:tcPr>
+            <w:tcW w:w="0" w:type="auto"/>
+            <w:vAlign w:val="center"/>
+            <w:hideMark/>
+          </w:tcPr>
+          <w:p>
+            <w:pPr>
+              <w:tabs>
+                <w:tab w:val="left" w:pos="6067"/>
+              </w:tabs>
+            </w:pPr>
+            <w:r>
+              <w:rPr>
+                <w:rFonts w:ascii="Segoe UI Emoji" w:hAnsi="Segoe UI Emoji" w:cs="Segoe UI Emoji"/>
+              </w:rPr>
+              <w:t>✅</w:t>
+            </w:r>
+          </w:p>
+        </w:tc>
+      </w:tr>
+      <w:tr>
+        <w:trPr>
+          <w:trHeight w:val="505"/>
+          <w:tblCellSpacing w:w="15" w:type="dxa"/>
+        </w:trPr>
+        <w:tc>
+          <w:tcPr>
+            <w:tcW w:w="0" w:type="auto"/>
+            <w:vAlign w:val="center"/>
+            <w:hideMark/>
+          </w:tcPr>
+          <w:p>
+            <w:pPr>
+              <w:tabs>
+                <w:tab w:val="left" w:pos="6067"/>
+              </w:tabs>
+            </w:pPr>
+            <w:r>
+              <w:t>Rolling update</w:t>
+            </w:r>
+          </w:p>
+        </w:tc>
+        <w:tc>
+          <w:tcPr>
+            <w:tcW w:w="0" w:type="auto"/>
+            <w:vAlign w:val="center"/>
+            <w:hideMark/>
+          </w:tcPr>
+          <w:p>
+            <w:pPr>
+              <w:tabs>
+                <w:tab w:val="left" w:pos="6067"/>
+              </w:tabs>
+            </w:pPr>
+            <w:r>
+              <w:rPr>
+                <w:rFonts w:ascii="Segoe UI Emoji" w:hAnsi="Segoe UI Emoji" w:cs="Segoe UI Emoji"/>
+              </w:rPr>
+              <w:t>❌</w:t>
+            </w:r>
+          </w:p>
+        </w:tc>
+        <w:tc>
+          <w:tcPr>
+            <w:tcW w:w="0" w:type="auto"/>
+            <w:vAlign w:val="center"/>
+            <w:hideMark/>
+          </w:tcPr>
+          <w:p>
+            <w:pPr>
+              <w:tabs>
+                <w:tab w:val="left" w:pos="6067"/>
+              </w:tabs>
+            </w:pPr>
+            <w:r>
+              <w:rPr>
+                <w:rFonts w:ascii="Segoe UI Emoji" w:hAnsi="Segoe UI Emoji" w:cs="Segoe UI Emoji"/>
+              </w:rPr>
+              <w:t>❌</w:t>
+            </w:r>
+          </w:p>
+        </w:tc>
+        <w:tc>
+          <w:tcPr>
+            <w:tcW w:w="0" w:type="auto"/>
+            <w:vAlign w:val="center"/>
+            <w:hideMark/>
+          </w:tcPr>
+          <w:p>
+            <w:pPr>
+              <w:tabs>
+                <w:tab w:val="left" w:pos="6067"/>
+              </w:tabs>
+            </w:pPr>
+            <w:r>
+              <w:rPr>
+                <w:rFonts w:ascii="Segoe UI Emoji" w:hAnsi="Segoe UI Emoji" w:cs="Segoe UI Emoji"/>
+              </w:rPr>
+              <w:t>✅</w:t>
+            </w:r>
+          </w:p>
+        </w:tc>
+      </w:tr>
+      <w:tr>
+        <w:trPr>
+          <w:trHeight w:val="464"/>
+          <w:tblCellSpacing w:w="15" w:type="dxa"/>
+        </w:trPr>
+        <w:tc>
+          <w:tcPr>
+            <w:tcW w:w="0" w:type="auto"/>
+            <w:vAlign w:val="center"/>
+            <w:hideMark/>
+          </w:tcPr>
+          <w:p>
+            <w:pPr>
+              <w:tabs>
+                <w:tab w:val="left" w:pos="6067"/>
+              </w:tabs>
+            </w:pPr>
+            <w:r>
+              <w:t>Example</w:t>
+            </w:r>
+          </w:p>
+        </w:tc>
+        <w:tc>
+          <w:tcPr>
+            <w:tcW w:w="0" w:type="auto"/>
+            <w:vAlign w:val="center"/>
+            <w:hideMark/>
+          </w:tcPr>
+          <w:p>
+            <w:pPr>
+              <w:tabs>
+                <w:tab w:val="left" w:pos="6067"/>
+              </w:tabs>
+            </w:pPr>
+            <w:r>
+              <w:t>Django container</w:t>
+            </w:r>
+          </w:p>
+        </w:tc>
+        <w:tc>
+          <w:tcPr>
+            <w:tcW w:w="0" w:type="auto"/>
+            <w:vAlign w:val="center"/>
+            <w:hideMark/>
+          </w:tcPr>
+          <w:p>
+            <w:pPr>
+              <w:tabs>
+                <w:tab w:val="left" w:pos="6067"/>
+              </w:tabs>
+            </w:pPr>
+            <w:r>
+              <w:t>Django Pod</w:t>
+            </w:r>
+          </w:p>
+        </w:tc>
+        <w:tc>
+          <w:tcPr>
+            <w:tcW w:w="0" w:type="auto"/>
+            <w:vAlign w:val="center"/>
+            <w:hideMark/>
+          </w:tcPr>
+          <w:p>
+            <w:pPr>
+              <w:tabs>
+                <w:tab w:val="left" w:pos="6067"/>
+              </w:tabs>
+            </w:pPr>
+            <w:r>
+              <w:t>3 Django Pods</w:t>
+            </w:r>
+          </w:p>
+        </w:tc>
+      </w:tr>
+    </w:tbl>
+    <w:p>
+      <w:pPr>
+        <w:tabs>
+          <w:tab w:val="left" w:pos="6067"/>
+        </w:tabs>
+      </w:pPr>
+      <w:r>
+        <w:t>Easy to remember:</w:t>
+      </w:r>
+    </w:p>
+    <w:p>
+      <w:pPr>
+        <w:tabs>
+          <w:tab w:val="left" w:pos="6067"/>
+        </w:tabs>
+        <w:ind w:left="720"/>
+      </w:pPr>
+      <w:r>
+        <w:t>Deployment</w:t>
+      </w:r>
+    </w:p>
+    <w:p>
+      <w:pPr>
+        <w:tabs>
+          <w:tab w:val="left" w:pos="6067"/>
+        </w:tabs>
+        <w:ind w:left="720"/>
+      </w:pPr>
+      <w:r>
+        <w:t xml:space="preserve">    ↓ manages</w:t>
+      </w:r>
+    </w:p>
+    <w:p>
+      <w:pPr>
+        <w:tabs>
+          <w:tab w:val="left" w:pos="6067"/>
+        </w:tabs>
+        <w:ind w:left="720"/>
+      </w:pPr>
+      <w:r>
+        <w:t xml:space="preserve">   Pods</w:t>
+      </w:r>
+    </w:p>
+    <w:p>
+      <w:pPr>
+        <w:tabs>
+          <w:tab w:val="left" w:pos="6067"/>
+        </w:tabs>
+        <w:ind w:left="720"/>
+      </w:pPr>
+      <w:r>
+        <w:t xml:space="preserve">    ↓ contains</w:t>
+      </w:r>
+    </w:p>
+    <w:p>
+      <w:pPr>
+        <w:tabs>
+          <w:tab w:val="left" w:pos="6067"/>
+        </w:tabs>
+        <w:ind w:left="720"/>
+      </w:pPr>
+      <w:r>
+        <w:t xml:space="preserve"> Containers</w:t>
+      </w:r>
+    </w:p>
+    <w:p>
+      <w:pPr>
+        <w:tabs>
+          <w:tab w:val="left" w:pos="6067"/>
+        </w:tabs>
+        <w:ind w:left="720"/>
+      </w:pPr>
+      <w:r>
+        <w:t xml:space="preserve">    ↓ runs</w:t>
+      </w:r>
+    </w:p>
+    <w:p>
+      <w:pPr>
+        <w:tabs>
+          <w:tab w:val="left" w:pos="6067"/>
+        </w:tabs>
+        <w:ind w:left="720"/>
+      </w:pPr>
+      <w:r>
+        <w:t>Application</w:t>
+      </w:r>
+    </w:p>
+    <w:p>
+      <w:pPr>
+        <w:tabs>
+          <w:tab w:val="left" w:pos="6067"/>
+        </w:tabs>
+      </w:pPr>
+      <w:r>
+        <w:t>In one line:</w:t>
+      </w:r>
+    </w:p>
+    <w:p>
+      <w:pPr>
+        <w:tabs>
+          <w:tab w:val="left" w:pos="6067"/>
+        </w:tabs>
+      </w:pPr>
+      <w:r>
+        <w:t>Container runs your application, Pod provides the environment for containers, and Deployment manages and scales Pods.</w:t>
+      </w:r>
+    </w:p>
+    <w:p>
+      <w:pPr>
+        <w:tabs>
+          <w:tab w:val="left" w:pos="6067"/>
+        </w:tabs>
+      </w:pPr>
+    </w:p>
+    <w:p>
+      <w:pPr>
+        <w:pStyle w:val="ListParagraph"/>
+        <w:numPr>
+          <w:ilvl w:val="0"/>
+          <w:numId w:val="20"/>
+        </w:numPr>
+        <w:tabs>
+          <w:tab w:val="left" w:pos="6067"/>
+        </w:tabs>
+      </w:pPr>
+      <w:proofErr w:type="spellStart"/>
+      <w:r>
+        <w:t>kubectl</w:t>
+      </w:r>
+      <w:proofErr w:type="spellEnd"/>
+      <w:r>
+        <w:t xml:space="preserve"> get all</w:t>
+      </w:r>
+    </w:p>
+    <w:p>
+      <w:pPr>
+        <w:pStyle w:val="ListParagraph"/>
+        <w:numPr>
+          <w:ilvl w:val="0"/>
+          <w:numId w:val="20"/>
+        </w:numPr>
+        <w:tabs>
+          <w:tab w:val="left" w:pos="6067"/>
+        </w:tabs>
+      </w:pPr>
+      <w:proofErr w:type="spellStart"/>
+      <w:r>
+        <w:t>kubectl</w:t>
+      </w:r>
+      <w:proofErr w:type="spellEnd"/>
+      <w:r>
+        <w:t xml:space="preserve"> get all -A</w:t>
+      </w:r>
+    </w:p>
+    <w:p>
+      <w:pPr>
+        <w:tabs>
+          <w:tab w:val="left" w:pos="6067"/>
+        </w:tabs>
+      </w:pPr>
+    </w:p>
+    <w:p>
+      <w:pPr>
+        <w:tabs>
+          <w:tab w:val="left" w:pos="6067"/>
+        </w:tabs>
+      </w:pPr>
+    </w:p>
+    <w:p>
+      <w:pPr>
+        <w:tabs>
+          <w:tab w:val="left" w:pos="6067"/>
+        </w:tabs>
+      </w:pPr>
+      <w:r>
+        <w:lastRenderedPageBreak/>
+        <w:t>Q.) Commands to Deploy pods</w:t>
+      </w:r>
+    </w:p>
+    <w:p>
+      <w:pPr>
+        <w:tabs>
+          <w:tab w:val="left" w:pos="6067"/>
+        </w:tabs>
+      </w:pPr>
+      <w:r>
+        <w:t>Sol:</w:t>
+      </w:r>
+    </w:p>
+    <w:p>
+      <w:pPr>
+        <w:pStyle w:val="ListParagraph"/>
+        <w:numPr>
+          <w:ilvl w:val="0"/>
+          <w:numId w:val="26"/>
+        </w:numPr>
+        <w:tabs>
+          <w:tab w:val="left" w:pos="6067"/>
+        </w:tabs>
+      </w:pPr>
+      <w:r>
+        <w:t>Delete existing nginx pod</w:t>
+      </w:r>
     </w:p>
     <w:p>
       <w:pPr>
@@ -13139,9 +14908,1336 @@
         </w:tabs>
         <w:ind w:left="360"/>
       </w:pPr>
+      <w:r>
+        <w:drawing>
+          <wp:inline distT="0" distB="0" distL="0" distR="0" wp14:anchorId="7F7FFC1D" wp14:editId="6BF7CF28">
+            <wp:extent cx="4320914" cy="502964"/>
+            <wp:effectExtent l="0" t="0" r="3810" b="0"/>
+            <wp:docPr id="694094305" name="Picture 1"/>
+            <wp:cNvGraphicFramePr>
+              <a:graphicFrameLocks xmlns:a="http://schemas.openxmlformats.org/drawingml/2006/main" noChangeAspect="1"/>
+            </wp:cNvGraphicFramePr>
+            <a:graphic xmlns:a="http://schemas.openxmlformats.org/drawingml/2006/main">
+              <a:graphicData uri="http://schemas.openxmlformats.org/drawingml/2006/picture">
+                <pic:pic xmlns:pic="http://schemas.openxmlformats.org/drawingml/2006/picture">
+                  <pic:nvPicPr>
+                    <pic:cNvPr id="694094305" name=""/>
+                    <pic:cNvPicPr/>
+                  </pic:nvPicPr>
+                  <pic:blipFill>
+                    <a:blip r:embed="rId25"/>
+                    <a:stretch>
+                      <a:fillRect/>
+                    </a:stretch>
+                  </pic:blipFill>
+                  <pic:spPr>
+                    <a:xfrm>
+                      <a:off x="0" y="0"/>
+                      <a:ext cx="4320914" cy="502964"/>
+                    </a:xfrm>
+                    <a:prstGeom prst="rect">
+                      <a:avLst/>
+                    </a:prstGeom>
+                  </pic:spPr>
+                </pic:pic>
+              </a:graphicData>
+            </a:graphic>
+          </wp:inline>
+        </w:drawing>
+      </w:r>
+    </w:p>
+    <w:p>
+      <w:pPr>
+        <w:pStyle w:val="ListParagraph"/>
+        <w:numPr>
+          <w:ilvl w:val="0"/>
+          <w:numId w:val="26"/>
+        </w:numPr>
+        <w:tabs>
+          <w:tab w:val="left" w:pos="6067"/>
+        </w:tabs>
+      </w:pPr>
+      <w:r>
+        <w:t>Create nginx pod again</w:t>
+      </w:r>
+    </w:p>
+    <w:p>
+      <w:pPr>
+        <w:tabs>
+          <w:tab w:val="left" w:pos="6067"/>
+        </w:tabs>
+        <w:ind w:left="360"/>
+      </w:pPr>
+      <w:r>
+        <w:drawing>
+          <wp:inline distT="0" distB="0" distL="0" distR="0" wp14:anchorId="034219CA" wp14:editId="08E817C4">
+            <wp:extent cx="5731510" cy="1188085"/>
+            <wp:effectExtent l="0" t="0" r="2540" b="0"/>
+            <wp:docPr id="1981078466" name="Picture 1"/>
+            <wp:cNvGraphicFramePr>
+              <a:graphicFrameLocks xmlns:a="http://schemas.openxmlformats.org/drawingml/2006/main" noChangeAspect="1"/>
+            </wp:cNvGraphicFramePr>
+            <a:graphic xmlns:a="http://schemas.openxmlformats.org/drawingml/2006/main">
+              <a:graphicData uri="http://schemas.openxmlformats.org/drawingml/2006/picture">
+                <pic:pic xmlns:pic="http://schemas.openxmlformats.org/drawingml/2006/picture">
+                  <pic:nvPicPr>
+                    <pic:cNvPr id="1981078466" name=""/>
+                    <pic:cNvPicPr/>
+                  </pic:nvPicPr>
+                  <pic:blipFill>
+                    <a:blip r:embed="rId26"/>
+                    <a:stretch>
+                      <a:fillRect/>
+                    </a:stretch>
+                  </pic:blipFill>
+                  <pic:spPr>
+                    <a:xfrm>
+                      <a:off x="0" y="0"/>
+                      <a:ext cx="5731510" cy="1188085"/>
+                    </a:xfrm>
+                    <a:prstGeom prst="rect">
+                      <a:avLst/>
+                    </a:prstGeom>
+                  </pic:spPr>
+                </pic:pic>
+              </a:graphicData>
+            </a:graphic>
+          </wp:inline>
+        </w:drawing>
+      </w:r>
+    </w:p>
+    <w:p>
+      <w:pPr>
+        <w:pStyle w:val="ListParagraph"/>
+        <w:numPr>
+          <w:ilvl w:val="0"/>
+          <w:numId w:val="26"/>
+        </w:numPr>
+        <w:tabs>
+          <w:tab w:val="left" w:pos="6067"/>
+        </w:tabs>
+      </w:pPr>
+      <w:r>
+        <w:t>Login to Kubernetes cluster</w:t>
+      </w:r>
+    </w:p>
+    <w:p>
+      <w:pPr>
+        <w:tabs>
+          <w:tab w:val="left" w:pos="6067"/>
+        </w:tabs>
+        <w:ind w:left="360"/>
+      </w:pPr>
+      <w:r>
+        <w:drawing>
+          <wp:inline distT="0" distB="0" distL="0" distR="0" wp14:anchorId="51340E35" wp14:editId="4B51DC31">
+            <wp:extent cx="5731510" cy="1136015"/>
+            <wp:effectExtent l="0" t="0" r="2540" b="6985"/>
+            <wp:docPr id="1086209807" name="Picture 1"/>
+            <wp:cNvGraphicFramePr>
+              <a:graphicFrameLocks xmlns:a="http://schemas.openxmlformats.org/drawingml/2006/main" noChangeAspect="1"/>
+            </wp:cNvGraphicFramePr>
+            <a:graphic xmlns:a="http://schemas.openxmlformats.org/drawingml/2006/main">
+              <a:graphicData uri="http://schemas.openxmlformats.org/drawingml/2006/picture">
+                <pic:pic xmlns:pic="http://schemas.openxmlformats.org/drawingml/2006/picture">
+                  <pic:nvPicPr>
+                    <pic:cNvPr id="1086209807" name=""/>
+                    <pic:cNvPicPr/>
+                  </pic:nvPicPr>
+                  <pic:blipFill>
+                    <a:blip r:embed="rId27"/>
+                    <a:stretch>
+                      <a:fillRect/>
+                    </a:stretch>
+                  </pic:blipFill>
+                  <pic:spPr>
+                    <a:xfrm>
+                      <a:off x="0" y="0"/>
+                      <a:ext cx="5731510" cy="1136015"/>
+                    </a:xfrm>
+                    <a:prstGeom prst="rect">
+                      <a:avLst/>
+                    </a:prstGeom>
+                  </pic:spPr>
+                </pic:pic>
+              </a:graphicData>
+            </a:graphic>
+          </wp:inline>
+        </w:drawing>
+      </w:r>
+    </w:p>
+    <w:p>
+      <w:pPr>
+        <w:pStyle w:val="ListParagraph"/>
+        <w:numPr>
+          <w:ilvl w:val="0"/>
+          <w:numId w:val="26"/>
+        </w:numPr>
+        <w:tabs>
+          <w:tab w:val="left" w:pos="6067"/>
+        </w:tabs>
+      </w:pPr>
+      <w:r>
+        <w:t>Create “</w:t>
+      </w:r>
+      <w:proofErr w:type="spellStart"/>
+      <w:proofErr w:type="gramStart"/>
+      <w:r>
+        <w:t>deployment.yaml</w:t>
+      </w:r>
+      <w:proofErr w:type="spellEnd"/>
+      <w:proofErr w:type="gramEnd"/>
+      <w:r>
+        <w:t>” file using (“</w:t>
+      </w:r>
+      <w:r>
+        <w:t>notepad "</w:t>
+      </w:r>
+      <w:proofErr w:type="spellStart"/>
+      <w:proofErr w:type="gramStart"/>
+      <w:r>
+        <w:t>deployment.yaml</w:t>
+      </w:r>
+      <w:proofErr w:type="spellEnd"/>
+      <w:proofErr w:type="gramEnd"/>
+      <w:r>
+        <w:t>"</w:t>
+      </w:r>
+      <w:r>
+        <w:t xml:space="preserve">) </w:t>
+      </w:r>
+      <w:r>
+        <w:sym w:font="Wingdings" w:char="F0E0"/>
+      </w:r>
+      <w:r>
+        <w:t xml:space="preserve"> Search Kubernetes deployments </w:t>
+      </w:r>
+      <w:r>
+        <w:sym w:font="Wingdings" w:char="F0E0"/>
+      </w:r>
+      <w:r>
+        <w:t xml:space="preserve"> Go to </w:t>
+      </w:r>
+      <w:hyperlink r:id="rId28" w:history="1">
+        <w:r>
+          <w:rPr>
+            <w:rStyle w:val="Hyperlink"/>
+          </w:rPr>
+          <w:t>https://kubernetes.io/docs/concepts/workloads/controllers/deployment/</w:t>
+        </w:r>
+      </w:hyperlink>
+      <w:r>
+        <w:t xml:space="preserve"> </w:t>
+      </w:r>
+      <w:r>
+        <w:sym w:font="Wingdings" w:char="F0E0"/>
+      </w:r>
+      <w:r>
+        <w:t xml:space="preserve"> </w:t>
+      </w:r>
+      <w:r>
+        <w:t>Copy the content of controllers/nginx-</w:t>
+      </w:r>
+      <w:proofErr w:type="spellStart"/>
+      <w:r>
+        <w:t>deployment.yaml</w:t>
+      </w:r>
+      <w:proofErr w:type="spellEnd"/>
+      <w:r>
+        <w:t xml:space="preserve"> and paste in </w:t>
+      </w:r>
+      <w:proofErr w:type="spellStart"/>
+      <w:proofErr w:type="gramStart"/>
+      <w:r>
+        <w:t>deployment.yaml</w:t>
+      </w:r>
+      <w:proofErr w:type="spellEnd"/>
+      <w:proofErr w:type="gramEnd"/>
+      <w:r>
+        <w:t xml:space="preserve"> </w:t>
+      </w:r>
+      <w:r>
+        <w:sym w:font="Wingdings" w:char="F0E0"/>
+      </w:r>
+      <w:r>
+        <w:t xml:space="preserve"> </w:t>
+      </w:r>
+    </w:p>
+    <w:p>
+      <w:pPr>
+        <w:pStyle w:val="ListParagraph"/>
+        <w:tabs>
+          <w:tab w:val="left" w:pos="6067"/>
+        </w:tabs>
+        <w:ind w:left="1080"/>
+      </w:pPr>
+      <w:proofErr w:type="spellStart"/>
+      <w:r>
+        <w:t>crtl</w:t>
+      </w:r>
+      <w:proofErr w:type="spellEnd"/>
+      <w:r>
+        <w:t xml:space="preserve"> + S </w:t>
+      </w:r>
+      <w:r>
+        <w:sym w:font="Wingdings" w:char="F0E0"/>
+      </w:r>
+      <w:r>
+        <w:t xml:space="preserve"> In CMD run “</w:t>
+      </w:r>
+      <w:proofErr w:type="spellStart"/>
+      <w:r>
+        <w:t>kubectl</w:t>
+      </w:r>
+      <w:proofErr w:type="spellEnd"/>
+      <w:r>
+        <w:t xml:space="preserve"> apply -f </w:t>
+      </w:r>
+      <w:proofErr w:type="spellStart"/>
+      <w:proofErr w:type="gramStart"/>
+      <w:r>
+        <w:t>deployment.yaml</w:t>
+      </w:r>
+      <w:proofErr w:type="spellEnd"/>
+      <w:proofErr w:type="gramEnd"/>
+      <w:r>
+        <w:t xml:space="preserve">” </w:t>
+      </w:r>
+      <w:r>
+        <w:sym w:font="Wingdings" w:char="F0E0"/>
+      </w:r>
+      <w:r>
+        <w:t xml:space="preserve"> In the we will see the pod is created automatically</w:t>
+      </w:r>
+    </w:p>
+    <w:p>
+      <w:pPr>
+        <w:pStyle w:val="ListParagraph"/>
+        <w:tabs>
+          <w:tab w:val="left" w:pos="6067"/>
+        </w:tabs>
+      </w:pPr>
+      <w:r>
+        <w:drawing>
+          <wp:inline distT="0" distB="0" distL="0" distR="0" wp14:anchorId="6F431C68" wp14:editId="162BA1F1">
+            <wp:extent cx="5731510" cy="2385695"/>
+            <wp:effectExtent l="0" t="0" r="2540" b="0"/>
+            <wp:docPr id="1778136978" name="Picture 1"/>
+            <wp:cNvGraphicFramePr>
+              <a:graphicFrameLocks xmlns:a="http://schemas.openxmlformats.org/drawingml/2006/main" noChangeAspect="1"/>
+            </wp:cNvGraphicFramePr>
+            <a:graphic xmlns:a="http://schemas.openxmlformats.org/drawingml/2006/main">
+              <a:graphicData uri="http://schemas.openxmlformats.org/drawingml/2006/picture">
+                <pic:pic xmlns:pic="http://schemas.openxmlformats.org/drawingml/2006/picture">
+                  <pic:nvPicPr>
+                    <pic:cNvPr id="1778136978" name=""/>
+                    <pic:cNvPicPr/>
+                  </pic:nvPicPr>
+                  <pic:blipFill>
+                    <a:blip r:embed="rId29"/>
+                    <a:stretch>
+                      <a:fillRect/>
+                    </a:stretch>
+                  </pic:blipFill>
+                  <pic:spPr>
+                    <a:xfrm>
+                      <a:off x="0" y="0"/>
+                      <a:ext cx="5731510" cy="2385695"/>
+                    </a:xfrm>
+                    <a:prstGeom prst="rect">
+                      <a:avLst/>
+                    </a:prstGeom>
+                  </pic:spPr>
+                </pic:pic>
+              </a:graphicData>
+            </a:graphic>
+          </wp:inline>
+        </w:drawing>
+      </w:r>
+    </w:p>
+    <w:p>
+      <w:pPr>
+        <w:pStyle w:val="ListParagraph"/>
+        <w:tabs>
+          <w:tab w:val="left" w:pos="6067"/>
+        </w:tabs>
+      </w:pPr>
+      <w:r>
+        <w:t xml:space="preserve">In this Deployment creates </w:t>
+      </w:r>
+      <w:r>
+        <w:sym w:font="Wingdings" w:char="F0E0"/>
+      </w:r>
+      <w:r>
+        <w:t xml:space="preserve"> Replica-set </w:t>
+      </w:r>
+      <w:r>
+        <w:sym w:font="Wingdings" w:char="F0E0"/>
+      </w:r>
+      <w:r>
+        <w:t xml:space="preserve"> This Replica-set creates pod</w:t>
+      </w:r>
+    </w:p>
+    <w:p>
+      <w:pPr>
+        <w:pStyle w:val="ListParagraph"/>
+        <w:numPr>
+          <w:ilvl w:val="0"/>
+          <w:numId w:val="26"/>
+        </w:numPr>
+        <w:tabs>
+          <w:tab w:val="left" w:pos="6067"/>
+        </w:tabs>
+      </w:pPr>
+      <w:proofErr w:type="spellStart"/>
+      <w:r>
+        <w:t>kubectl</w:t>
+      </w:r>
+      <w:proofErr w:type="spellEnd"/>
+      <w:r>
+        <w:t xml:space="preserve"> get </w:t>
+      </w:r>
+      <w:proofErr w:type="spellStart"/>
+      <w:r>
+        <w:t>rs</w:t>
+      </w:r>
+      <w:proofErr w:type="spellEnd"/>
+    </w:p>
+    <w:p>
+      <w:pPr>
+        <w:tabs>
+          <w:tab w:val="left" w:pos="6067"/>
+        </w:tabs>
+        <w:ind w:left="360"/>
+      </w:pPr>
+      <w:r>
+        <w:lastRenderedPageBreak/>
+        <w:drawing>
+          <wp:inline distT="0" distB="0" distL="0" distR="0" wp14:anchorId="1F29DB4A" wp14:editId="2F5A329E">
+            <wp:extent cx="5731510" cy="662940"/>
+            <wp:effectExtent l="0" t="0" r="2540" b="3810"/>
+            <wp:docPr id="1935321442" name="Picture 1"/>
+            <wp:cNvGraphicFramePr>
+              <a:graphicFrameLocks xmlns:a="http://schemas.openxmlformats.org/drawingml/2006/main" noChangeAspect="1"/>
+            </wp:cNvGraphicFramePr>
+            <a:graphic xmlns:a="http://schemas.openxmlformats.org/drawingml/2006/main">
+              <a:graphicData uri="http://schemas.openxmlformats.org/drawingml/2006/picture">
+                <pic:pic xmlns:pic="http://schemas.openxmlformats.org/drawingml/2006/picture">
+                  <pic:nvPicPr>
+                    <pic:cNvPr id="1935321442" name=""/>
+                    <pic:cNvPicPr/>
+                  </pic:nvPicPr>
+                  <pic:blipFill>
+                    <a:blip r:embed="rId30"/>
+                    <a:stretch>
+                      <a:fillRect/>
+                    </a:stretch>
+                  </pic:blipFill>
+                  <pic:spPr>
+                    <a:xfrm>
+                      <a:off x="0" y="0"/>
+                      <a:ext cx="5731510" cy="662940"/>
+                    </a:xfrm>
+                    <a:prstGeom prst="rect">
+                      <a:avLst/>
+                    </a:prstGeom>
+                  </pic:spPr>
+                </pic:pic>
+              </a:graphicData>
+            </a:graphic>
+          </wp:inline>
+        </w:drawing>
+      </w:r>
+    </w:p>
+    <w:p>
+      <w:pPr>
+        <w:tabs>
+          <w:tab w:val="left" w:pos="6067"/>
+        </w:tabs>
+      </w:pPr>
+      <w:r>
+        <w:t>Q.) Use of Replica set in deployment</w:t>
+      </w:r>
+    </w:p>
+    <w:p>
+      <w:pPr>
+        <w:tabs>
+          <w:tab w:val="left" w:pos="6067"/>
+        </w:tabs>
+      </w:pPr>
+      <w:r>
+        <w:t xml:space="preserve">Answer: </w:t>
+      </w:r>
+      <w:r>
+        <w:t xml:space="preserve">A </w:t>
+      </w:r>
+      <w:proofErr w:type="spellStart"/>
+      <w:r>
+        <w:rPr>
+          <w:b/>
+          <w:bCs/>
+        </w:rPr>
+        <w:t>ReplicaSet's</w:t>
+      </w:r>
+      <w:proofErr w:type="spellEnd"/>
+      <w:r>
+        <w:rPr>
+          <w:b/>
+          <w:bCs/>
+        </w:rPr>
+        <w:t xml:space="preserve"> main purpose is to maintain the desired number of Pods</w:t>
+      </w:r>
+      <w:r>
+        <w:t xml:space="preserve"> created by a Deployment.</w:t>
+      </w:r>
+    </w:p>
+    <w:p>
+      <w:pPr>
+        <w:tabs>
+          <w:tab w:val="left" w:pos="6067"/>
+        </w:tabs>
+        <w:rPr>
+          <w:b/>
+          <w:bCs/>
+        </w:rPr>
+      </w:pPr>
+      <w:r>
+        <w:rPr>
+          <w:b/>
+          <w:bCs/>
+        </w:rPr>
+        <w:t>Example</w:t>
+      </w:r>
+    </w:p>
+    <w:p>
+      <w:pPr>
+        <w:tabs>
+          <w:tab w:val="left" w:pos="6067"/>
+        </w:tabs>
+      </w:pPr>
+      <w:r>
+        <w:t>Suppose your Deployment specifies:</w:t>
+      </w:r>
+    </w:p>
+    <w:p>
+      <w:pPr>
+        <w:tabs>
+          <w:tab w:val="left" w:pos="6067"/>
+        </w:tabs>
+      </w:pPr>
+      <w:r>
+        <w:drawing>
+          <wp:inline distT="0" distB="0" distL="0" distR="0" wp14:anchorId="40541BD6" wp14:editId="489C3420">
+            <wp:extent cx="5731510" cy="767715"/>
+            <wp:effectExtent l="0" t="0" r="2540" b="0"/>
+            <wp:docPr id="877902754" name="Picture 1"/>
+            <wp:cNvGraphicFramePr>
+              <a:graphicFrameLocks xmlns:a="http://schemas.openxmlformats.org/drawingml/2006/main" noChangeAspect="1"/>
+            </wp:cNvGraphicFramePr>
+            <a:graphic xmlns:a="http://schemas.openxmlformats.org/drawingml/2006/main">
+              <a:graphicData uri="http://schemas.openxmlformats.org/drawingml/2006/picture">
+                <pic:pic xmlns:pic="http://schemas.openxmlformats.org/drawingml/2006/picture">
+                  <pic:nvPicPr>
+                    <pic:cNvPr id="877902754" name=""/>
+                    <pic:cNvPicPr/>
+                  </pic:nvPicPr>
+                  <pic:blipFill>
+                    <a:blip r:embed="rId31"/>
+                    <a:stretch>
+                      <a:fillRect/>
+                    </a:stretch>
+                  </pic:blipFill>
+                  <pic:spPr>
+                    <a:xfrm>
+                      <a:off x="0" y="0"/>
+                      <a:ext cx="5731510" cy="767715"/>
+                    </a:xfrm>
+                    <a:prstGeom prst="rect">
+                      <a:avLst/>
+                    </a:prstGeom>
+                  </pic:spPr>
+                </pic:pic>
+              </a:graphicData>
+            </a:graphic>
+          </wp:inline>
+        </w:drawing>
+      </w:r>
+      <w:r>
+        <w:t xml:space="preserve">The Deployment creates a </w:t>
+      </w:r>
+      <w:proofErr w:type="spellStart"/>
+      <w:r>
+        <w:t>ReplicaSet</w:t>
+      </w:r>
+      <w:proofErr w:type="spellEnd"/>
+      <w:r>
+        <w:t xml:space="preserve">, and the </w:t>
+      </w:r>
+      <w:proofErr w:type="spellStart"/>
+      <w:r>
+        <w:t>ReplicaSet</w:t>
+      </w:r>
+      <w:proofErr w:type="spellEnd"/>
+      <w:r>
+        <w:t xml:space="preserve"> ensures that </w:t>
+      </w:r>
+      <w:r>
+        <w:rPr>
+          <w:b/>
+          <w:bCs/>
+        </w:rPr>
+        <w:t>3 Pods are always running</w:t>
+      </w:r>
+      <w:r>
+        <w:t>:</w:t>
+      </w:r>
+    </w:p>
+    <w:p>
+      <w:pPr>
+        <w:tabs>
+          <w:tab w:val="left" w:pos="6067"/>
+        </w:tabs>
+      </w:pPr>
+      <w:r>
+        <w:t xml:space="preserve">        </w:t>
+      </w:r>
+      <w:r>
+        <w:t xml:space="preserve">                           </w:t>
+      </w:r>
+      <w:r>
+        <w:t>Deployment</w:t>
+      </w:r>
+    </w:p>
+    <w:p>
+      <w:pPr>
+        <w:tabs>
+          <w:tab w:val="left" w:pos="6067"/>
+        </w:tabs>
+      </w:pPr>
+      <w:r>
+        <w:t xml:space="preserve">             </w:t>
+      </w:r>
+      <w:r>
+        <w:t xml:space="preserve">                              </w:t>
+      </w:r>
+      <w:r>
+        <w:t>↓</w:t>
+      </w:r>
+    </w:p>
+    <w:p>
+      <w:pPr>
+        <w:tabs>
+          <w:tab w:val="left" w:pos="6067"/>
+        </w:tabs>
+      </w:pPr>
+      <w:r>
+        <w:t xml:space="preserve">        </w:t>
+      </w:r>
+      <w:r>
+        <w:t xml:space="preserve">                           </w:t>
+      </w:r>
+      <w:proofErr w:type="spellStart"/>
+      <w:r>
+        <w:t>ReplicaSet</w:t>
+      </w:r>
+      <w:proofErr w:type="spellEnd"/>
+    </w:p>
+    <w:p>
+      <w:pPr>
+        <w:tabs>
+          <w:tab w:val="left" w:pos="6067"/>
+        </w:tabs>
+      </w:pPr>
+      <w:r>
+        <w:t xml:space="preserve">             </w:t>
+      </w:r>
+      <w:r>
+        <w:t xml:space="preserve">                              </w:t>
+      </w:r>
+      <w:r>
+        <w:t>↓</w:t>
+      </w:r>
+    </w:p>
+    <w:p>
+      <w:pPr>
+        <w:tabs>
+          <w:tab w:val="left" w:pos="6067"/>
+        </w:tabs>
+      </w:pPr>
+      <w:r>
+        <w:t xml:space="preserve">      </w:t>
+      </w:r>
+      <w:r>
+        <w:t xml:space="preserve">                      </w:t>
+      </w:r>
+      <w:r>
+        <w:t>┌──────</w:t>
+      </w:r>
+      <w:r>
+        <w:rPr>
+          <w:rFonts w:ascii="MS Gothic" w:eastAsia="MS Gothic" w:hAnsi="MS Gothic" w:cs="MS Gothic" w:hint="eastAsia"/>
+        </w:rPr>
+        <w:t>┼</w:t>
+      </w:r>
+      <w:r>
+        <w:rPr>
+          <w:rFonts w:ascii="Calibri" w:hAnsi="Calibri" w:cs="Calibri"/>
+        </w:rPr>
+        <w:t>──────┐</w:t>
+      </w:r>
+    </w:p>
+    <w:p>
+      <w:pPr>
+        <w:tabs>
+          <w:tab w:val="left" w:pos="6067"/>
+        </w:tabs>
+      </w:pPr>
+      <w:r>
+        <w:t xml:space="preserve">      </w:t>
+      </w:r>
+      <w:r>
+        <w:t xml:space="preserve">                     </w:t>
+      </w:r>
+      <w:r>
+        <w:t xml:space="preserve">↓      </w:t>
+      </w:r>
+      <w:r>
+        <w:t xml:space="preserve">       </w:t>
+      </w:r>
+      <w:r>
+        <w:t xml:space="preserve">↓      </w:t>
+      </w:r>
+      <w:r>
+        <w:t xml:space="preserve">      </w:t>
+      </w:r>
+      <w:r>
+        <w:t>↓</w:t>
+      </w:r>
+    </w:p>
+    <w:p>
+      <w:pPr>
+        <w:tabs>
+          <w:tab w:val="left" w:pos="6067"/>
+        </w:tabs>
+      </w:pPr>
+      <w:r>
+        <w:t xml:space="preserve">   </w:t>
+      </w:r>
+      <w:r>
+        <w:t xml:space="preserve">                    </w:t>
+      </w:r>
+      <w:r>
+        <w:t xml:space="preserve"> Pod 1  </w:t>
+      </w:r>
+      <w:r>
+        <w:t xml:space="preserve">      </w:t>
+      </w:r>
+      <w:r>
+        <w:t xml:space="preserve">Pod 2 </w:t>
+      </w:r>
+      <w:r>
+        <w:t xml:space="preserve">    </w:t>
+      </w:r>
+      <w:r>
+        <w:t xml:space="preserve"> Pod 3</w:t>
+      </w:r>
+    </w:p>
+    <w:p>
+      <w:pPr>
+        <w:tabs>
+          <w:tab w:val="left" w:pos="6067"/>
+        </w:tabs>
+      </w:pPr>
+    </w:p>
+    <w:p>
+      <w:pPr>
+        <w:tabs>
+          <w:tab w:val="left" w:pos="6067"/>
+        </w:tabs>
+      </w:pPr>
+      <w:r>
+        <w:t>Q.) What if pod is deleted?</w:t>
+      </w:r>
+    </w:p>
+    <w:p>
+      <w:pPr>
+        <w:tabs>
+          <w:tab w:val="left" w:pos="6067"/>
+        </w:tabs>
+      </w:pPr>
+      <w:r>
+        <w:t>Answer:</w:t>
+      </w:r>
+    </w:p>
+    <w:p>
+      <w:pPr>
+        <w:tabs>
+          <w:tab w:val="left" w:pos="6067"/>
+        </w:tabs>
+      </w:pPr>
+      <w:r>
+        <w:t xml:space="preserve">If a </w:t>
+      </w:r>
+      <w:r>
+        <w:rPr>
+          <w:b/>
+          <w:bCs/>
+        </w:rPr>
+        <w:t>Pod is deleted</w:t>
+      </w:r>
+      <w:r>
+        <w:t xml:space="preserve">, what happens depends on </w:t>
+      </w:r>
+      <w:r>
+        <w:rPr>
+          <w:b/>
+          <w:bCs/>
+        </w:rPr>
+        <w:t>who created/managed the Pod</w:t>
+      </w:r>
+      <w:r>
+        <w:t>.</w:t>
+      </w:r>
+    </w:p>
+    <w:p>
+      <w:pPr>
+        <w:tabs>
+          <w:tab w:val="left" w:pos="6067"/>
+        </w:tabs>
+        <w:rPr>
+          <w:b/>
+          <w:bCs/>
+        </w:rPr>
+      </w:pPr>
+      <w:r>
+        <w:rPr>
+          <w:b/>
+          <w:bCs/>
+        </w:rPr>
+        <w:t>If Pod is managed by a Deployment</w:t>
+      </w:r>
+    </w:p>
+    <w:p>
+      <w:pPr>
+        <w:tabs>
+          <w:tab w:val="left" w:pos="6067"/>
+        </w:tabs>
+      </w:pPr>
+      <w:r>
+        <w:t>Suppose:</w:t>
+      </w:r>
+    </w:p>
+    <w:p>
+      <w:pPr>
+        <w:tabs>
+          <w:tab w:val="left" w:pos="6067"/>
+        </w:tabs>
+        <w:ind w:left="720"/>
+      </w:pPr>
+      <w:r>
+        <w:t>Deployment</w:t>
+      </w:r>
+    </w:p>
+    <w:p>
+      <w:pPr>
+        <w:tabs>
+          <w:tab w:val="left" w:pos="6067"/>
+        </w:tabs>
+        <w:ind w:left="720"/>
+      </w:pPr>
+      <w:r>
+        <w:t xml:space="preserve">    ↓</w:t>
+      </w:r>
+    </w:p>
+    <w:p>
+      <w:pPr>
+        <w:tabs>
+          <w:tab w:val="left" w:pos="6067"/>
+        </w:tabs>
+        <w:ind w:left="720"/>
+      </w:pPr>
+      <w:proofErr w:type="spellStart"/>
+      <w:r>
+        <w:t>ReplicaSet</w:t>
+      </w:r>
+      <w:proofErr w:type="spellEnd"/>
+    </w:p>
+    <w:p>
+      <w:pPr>
+        <w:tabs>
+          <w:tab w:val="left" w:pos="6067"/>
+        </w:tabs>
+        <w:ind w:left="720"/>
+      </w:pPr>
+      <w:r>
+        <w:t xml:space="preserve">    ↓</w:t>
+      </w:r>
+    </w:p>
+    <w:p>
+      <w:pPr>
+        <w:tabs>
+          <w:tab w:val="left" w:pos="6067"/>
+        </w:tabs>
+        <w:ind w:left="720"/>
+      </w:pPr>
+      <w:r>
+        <w:t>Pod 1</w:t>
+      </w:r>
+    </w:p>
+    <w:p>
+      <w:pPr>
+        <w:tabs>
+          <w:tab w:val="left" w:pos="6067"/>
+        </w:tabs>
+        <w:ind w:left="720"/>
+      </w:pPr>
+      <w:r>
+        <w:t>Pod 2</w:t>
+      </w:r>
+    </w:p>
+    <w:p>
+      <w:pPr>
+        <w:tabs>
+          <w:tab w:val="left" w:pos="6067"/>
+        </w:tabs>
+        <w:ind w:left="720"/>
+      </w:pPr>
+      <w:r>
+        <w:t>Pod 3</w:t>
+      </w:r>
+    </w:p>
+    <w:p>
+      <w:pPr>
+        <w:tabs>
+          <w:tab w:val="left" w:pos="6067"/>
+        </w:tabs>
+      </w:pPr>
+      <w:r>
+        <w:lastRenderedPageBreak/>
+        <w:t>You have:</w:t>
+      </w:r>
+    </w:p>
+    <w:p>
+      <w:pPr>
+        <w:tabs>
+          <w:tab w:val="left" w:pos="6067"/>
+        </w:tabs>
+      </w:pPr>
+      <w:r>
+        <w:drawing>
+          <wp:inline distT="0" distB="0" distL="0" distR="0" wp14:anchorId="1D3C125C" wp14:editId="24990E8B">
+            <wp:extent cx="1486029" cy="891617"/>
+            <wp:effectExtent l="0" t="0" r="0" b="3810"/>
+            <wp:docPr id="2103633987" name="Picture 1"/>
+            <wp:cNvGraphicFramePr>
+              <a:graphicFrameLocks xmlns:a="http://schemas.openxmlformats.org/drawingml/2006/main" noChangeAspect="1"/>
+            </wp:cNvGraphicFramePr>
+            <a:graphic xmlns:a="http://schemas.openxmlformats.org/drawingml/2006/main">
+              <a:graphicData uri="http://schemas.openxmlformats.org/drawingml/2006/picture">
+                <pic:pic xmlns:pic="http://schemas.openxmlformats.org/drawingml/2006/picture">
+                  <pic:nvPicPr>
+                    <pic:cNvPr id="2103633987" name=""/>
+                    <pic:cNvPicPr/>
+                  </pic:nvPicPr>
+                  <pic:blipFill>
+                    <a:blip r:embed="rId32"/>
+                    <a:stretch>
+                      <a:fillRect/>
+                    </a:stretch>
+                  </pic:blipFill>
+                  <pic:spPr>
+                    <a:xfrm>
+                      <a:off x="0" y="0"/>
+                      <a:ext cx="1486029" cy="891617"/>
+                    </a:xfrm>
+                    <a:prstGeom prst="rect">
+                      <a:avLst/>
+                    </a:prstGeom>
+                  </pic:spPr>
+                </pic:pic>
+              </a:graphicData>
+            </a:graphic>
+          </wp:inline>
+        </w:drawing>
+      </w:r>
+    </w:p>
+    <w:p>
+      <w:pPr>
+        <w:tabs>
+          <w:tab w:val="left" w:pos="6067"/>
+        </w:tabs>
+      </w:pPr>
+      <w:r>
+        <w:t>Now you delete Pod 2:</w:t>
+      </w:r>
+    </w:p>
+    <w:p>
+      <w:pPr>
+        <w:tabs>
+          <w:tab w:val="left" w:pos="6067"/>
+        </w:tabs>
+      </w:pPr>
+      <w:r>
+        <w:drawing>
+          <wp:inline distT="0" distB="0" distL="0" distR="0" wp14:anchorId="79D83D7A" wp14:editId="77BB5AE4">
+            <wp:extent cx="2095682" cy="746825"/>
+            <wp:effectExtent l="0" t="0" r="0" b="0"/>
+            <wp:docPr id="609440669" name="Picture 1"/>
+            <wp:cNvGraphicFramePr>
+              <a:graphicFrameLocks xmlns:a="http://schemas.openxmlformats.org/drawingml/2006/main" noChangeAspect="1"/>
+            </wp:cNvGraphicFramePr>
+            <a:graphic xmlns:a="http://schemas.openxmlformats.org/drawingml/2006/main">
+              <a:graphicData uri="http://schemas.openxmlformats.org/drawingml/2006/picture">
+                <pic:pic xmlns:pic="http://schemas.openxmlformats.org/drawingml/2006/picture">
+                  <pic:nvPicPr>
+                    <pic:cNvPr id="609440669" name=""/>
+                    <pic:cNvPicPr/>
+                  </pic:nvPicPr>
+                  <pic:blipFill>
+                    <a:blip r:embed="rId33"/>
+                    <a:stretch>
+                      <a:fillRect/>
+                    </a:stretch>
+                  </pic:blipFill>
+                  <pic:spPr>
+                    <a:xfrm>
+                      <a:off x="0" y="0"/>
+                      <a:ext cx="2095682" cy="746825"/>
+                    </a:xfrm>
+                    <a:prstGeom prst="rect">
+                      <a:avLst/>
+                    </a:prstGeom>
+                  </pic:spPr>
+                </pic:pic>
+              </a:graphicData>
+            </a:graphic>
+          </wp:inline>
+        </w:drawing>
+      </w:r>
+    </w:p>
+    <w:p>
+      <w:pPr>
+        <w:tabs>
+          <w:tab w:val="left" w:pos="6067"/>
+        </w:tabs>
+      </w:pPr>
+      <w:r>
+        <w:t xml:space="preserve">The </w:t>
+      </w:r>
+      <w:proofErr w:type="spellStart"/>
+      <w:r>
+        <w:t>ReplicaSet</w:t>
+      </w:r>
+      <w:proofErr w:type="spellEnd"/>
+      <w:r>
+        <w:t xml:space="preserve"> detects:</w:t>
+      </w:r>
+    </w:p>
+    <w:p>
+      <w:pPr>
+        <w:tabs>
+          <w:tab w:val="left" w:pos="6067"/>
+        </w:tabs>
+      </w:pPr>
+      <w:r>
+        <w:drawing>
+          <wp:inline distT="0" distB="0" distL="0" distR="0" wp14:anchorId="6690E055" wp14:editId="5EFB0BFF">
+            <wp:extent cx="1333616" cy="617273"/>
+            <wp:effectExtent l="0" t="0" r="0" b="0"/>
+            <wp:docPr id="178120818" name="Picture 1"/>
+            <wp:cNvGraphicFramePr>
+              <a:graphicFrameLocks xmlns:a="http://schemas.openxmlformats.org/drawingml/2006/main" noChangeAspect="1"/>
+            </wp:cNvGraphicFramePr>
+            <a:graphic xmlns:a="http://schemas.openxmlformats.org/drawingml/2006/main">
+              <a:graphicData uri="http://schemas.openxmlformats.org/drawingml/2006/picture">
+                <pic:pic xmlns:pic="http://schemas.openxmlformats.org/drawingml/2006/picture">
+                  <pic:nvPicPr>
+                    <pic:cNvPr id="178120818" name=""/>
+                    <pic:cNvPicPr/>
+                  </pic:nvPicPr>
+                  <pic:blipFill>
+                    <a:blip r:embed="rId34"/>
+                    <a:stretch>
+                      <a:fillRect/>
+                    </a:stretch>
+                  </pic:blipFill>
+                  <pic:spPr>
+                    <a:xfrm>
+                      <a:off x="0" y="0"/>
+                      <a:ext cx="1333616" cy="617273"/>
+                    </a:xfrm>
+                    <a:prstGeom prst="rect">
+                      <a:avLst/>
+                    </a:prstGeom>
+                  </pic:spPr>
+                </pic:pic>
+              </a:graphicData>
+            </a:graphic>
+          </wp:inline>
+        </w:drawing>
+      </w:r>
+    </w:p>
+    <w:p>
+      <w:pPr>
+        <w:tabs>
+          <w:tab w:val="left" w:pos="6067"/>
+        </w:tabs>
+      </w:pPr>
+      <w:proofErr w:type="gramStart"/>
+      <w:r>
+        <w:t>So</w:t>
+      </w:r>
+      <w:proofErr w:type="gramEnd"/>
+      <w:r>
+        <w:t xml:space="preserve"> it automatically creates a </w:t>
+      </w:r>
+      <w:r>
+        <w:rPr>
+          <w:b/>
+          <w:bCs/>
+        </w:rPr>
+        <w:t>new Pod</w:t>
+      </w:r>
+      <w:r>
+        <w:t>:</w:t>
+      </w:r>
+    </w:p>
+    <w:p>
+      <w:pPr>
+        <w:tabs>
+          <w:tab w:val="left" w:pos="6067"/>
+        </w:tabs>
+        <w:ind w:left="720"/>
+      </w:pPr>
+      <w:r>
+        <w:t>Deployment</w:t>
+      </w:r>
+    </w:p>
+    <w:p>
+      <w:pPr>
+        <w:tabs>
+          <w:tab w:val="left" w:pos="6067"/>
+        </w:tabs>
+        <w:ind w:left="720"/>
+      </w:pPr>
+      <w:r>
+        <w:t xml:space="preserve">    ↓</w:t>
+      </w:r>
+    </w:p>
+    <w:p>
+      <w:pPr>
+        <w:tabs>
+          <w:tab w:val="left" w:pos="6067"/>
+        </w:tabs>
+        <w:ind w:left="720"/>
+      </w:pPr>
+      <w:proofErr w:type="spellStart"/>
+      <w:r>
+        <w:t>ReplicaSet</w:t>
+      </w:r>
+      <w:proofErr w:type="spellEnd"/>
+    </w:p>
+    <w:p>
+      <w:pPr>
+        <w:tabs>
+          <w:tab w:val="left" w:pos="6067"/>
+        </w:tabs>
+        <w:ind w:left="720"/>
+      </w:pPr>
+      <w:r>
+        <w:t xml:space="preserve">    ↓</w:t>
+      </w:r>
+    </w:p>
+    <w:p>
+      <w:pPr>
+        <w:tabs>
+          <w:tab w:val="left" w:pos="6067"/>
+        </w:tabs>
+        <w:ind w:left="720"/>
+      </w:pPr>
+      <w:r>
+        <w:t>Pod 1</w:t>
+      </w:r>
+    </w:p>
+    <w:p>
+      <w:pPr>
+        <w:tabs>
+          <w:tab w:val="left" w:pos="6067"/>
+        </w:tabs>
+        <w:ind w:left="720"/>
+      </w:pPr>
+      <w:r>
+        <w:t>Pod 3</w:t>
+      </w:r>
+    </w:p>
+    <w:p>
+      <w:pPr>
+        <w:tabs>
+          <w:tab w:val="left" w:pos="6067"/>
+        </w:tabs>
+        <w:ind w:left="720"/>
+      </w:pPr>
+      <w:r>
+        <w:t>Pod 4 ← new Pod</w:t>
+      </w:r>
+    </w:p>
+    <w:p>
+      <w:pPr>
+        <w:tabs>
+          <w:tab w:val="left" w:pos="6067"/>
+        </w:tabs>
+      </w:pPr>
+      <w:r>
+        <w:t xml:space="preserve">The new Pod will usually have a </w:t>
+      </w:r>
+      <w:r>
+        <w:rPr>
+          <w:b/>
+          <w:bCs/>
+        </w:rPr>
+        <w:t>different name and IP address</w:t>
+      </w:r>
+      <w:r>
+        <w:t>.</w:t>
+      </w:r>
+    </w:p>
+    <w:p>
+      <w:pPr>
+        <w:tabs>
+          <w:tab w:val="left" w:pos="6067"/>
+        </w:tabs>
+      </w:pPr>
+      <w:r>
+        <w:rPr>
+          <w:b/>
+          <w:bCs/>
+        </w:rPr>
+        <w:t>Important</w:t>
+      </w:r>
+      <w:r>
+        <w:rPr>
+          <w:b/>
+          <w:bCs/>
+        </w:rPr>
+        <w:t xml:space="preserve">: </w:t>
+      </w:r>
+      <w:r>
+        <w:t xml:space="preserve">The </w:t>
+      </w:r>
+      <w:proofErr w:type="spellStart"/>
+      <w:r>
+        <w:t>ReplicaSet</w:t>
+      </w:r>
+      <w:proofErr w:type="spellEnd"/>
+      <w:r>
+        <w:t xml:space="preserve"> does NOT recover the same Pod.</w:t>
+      </w:r>
+      <w:r>
+        <w:t xml:space="preserve"> </w:t>
+      </w:r>
+      <w:r>
+        <w:t>It creates a new Pod to maintain the desired replica count.</w:t>
+      </w:r>
+    </w:p>
+    <w:p>
+      <w:pPr>
+        <w:tabs>
+          <w:tab w:val="left" w:pos="6067"/>
+        </w:tabs>
+      </w:pPr>
+    </w:p>
+    <w:p>
+      <w:pPr>
+        <w:tabs>
+          <w:tab w:val="left" w:pos="6067"/>
+        </w:tabs>
+      </w:pPr>
+      <w:r>
+        <w:t xml:space="preserve">Q.) </w:t>
+      </w:r>
+      <w:r>
+        <w:t xml:space="preserve">What if pod is created </w:t>
+      </w:r>
+      <w:proofErr w:type="spellStart"/>
+      <w:r>
+        <w:t>manully</w:t>
+      </w:r>
+      <w:proofErr w:type="spellEnd"/>
+      <w:r>
+        <w:t xml:space="preserve"> and deleted</w:t>
+      </w:r>
+      <w:r>
+        <w:t>?</w:t>
+      </w:r>
+    </w:p>
+    <w:p>
+      <w:pPr>
+        <w:tabs>
+          <w:tab w:val="left" w:pos="6067"/>
+        </w:tabs>
+      </w:pPr>
+      <w:proofErr w:type="spellStart"/>
+      <w:r>
+        <w:t>Asnwer</w:t>
+      </w:r>
+      <w:proofErr w:type="spellEnd"/>
+      <w:r>
+        <w:t xml:space="preserve">: </w:t>
+      </w:r>
+      <w:r>
+        <w:t xml:space="preserve">If you create a </w:t>
+      </w:r>
+      <w:r>
+        <w:rPr>
+          <w:b/>
+          <w:bCs/>
+        </w:rPr>
+        <w:t>Pod manually</w:t>
+      </w:r>
+      <w:r>
+        <w:t xml:space="preserve"> and then delete it, </w:t>
+      </w:r>
+      <w:r>
+        <w:rPr>
+          <w:b/>
+          <w:bCs/>
+        </w:rPr>
+        <w:t>Kubernetes will NOT recreate it</w:t>
+      </w:r>
+      <w:r>
+        <w:t>.</w:t>
+      </w:r>
+    </w:p>
+    <w:p>
+      <w:pPr>
+        <w:tabs>
+          <w:tab w:val="left" w:pos="6067"/>
+        </w:tabs>
+        <w:rPr>
+          <w:b/>
+          <w:bCs/>
+        </w:rPr>
+      </w:pPr>
+      <w:r>
+        <w:rPr>
+          <w:b/>
+          <w:bCs/>
+        </w:rPr>
+        <w:t>NOTE:</w:t>
+      </w:r>
+      <w:r>
+        <w:t xml:space="preserve"> This is the major advantage of deployment over manual pod creation</w:t>
+      </w:r>
+    </w:p>
+    <w:p>
+      <w:pPr>
+        <w:tabs>
+          <w:tab w:val="left" w:pos="6067"/>
+        </w:tabs>
+      </w:pPr>
     </w:p>
     <w:sectPr>
-      <w:footerReference w:type="default" r:id="rId25"/>
+      <w:footerReference w:type="default" r:id="rId35"/>
       <w:pgSz w:w="11906" w:h="16838"/>
       <w:pgMar w:top="1440" w:right="1440" w:bottom="1440" w:left="1440" w:header="708" w:footer="708" w:gutter="0"/>
       <w:pgBorders w:offsetFrom="page">
@@ -15889,6 +18985,155 @@
     </w:lvl>
   </w:abstractNum>
   <w:abstractNum w:abstractNumId="19" w15:restartNumberingAfterBreak="0">
+    <w:nsid w:val="58770D80"/>
+    <w:multiLevelType w:val="multilevel"/>
+    <w:tmpl w:val="3F40E1EE"/>
+    <w:lvl w:ilvl="0">
+      <w:start w:val="1"/>
+      <w:numFmt w:val="bullet"/>
+      <w:lvlText w:val=""/>
+      <w:lvlJc w:val="left"/>
+      <w:pPr>
+        <w:tabs>
+          <w:tab w:val="num" w:pos="720"/>
+        </w:tabs>
+        <w:ind w:left="720" w:hanging="360"/>
+      </w:pPr>
+      <w:rPr>
+        <w:rFonts w:ascii="Symbol" w:hAnsi="Symbol" w:hint="default"/>
+        <w:sz w:val="20"/>
+      </w:rPr>
+    </w:lvl>
+    <w:lvl w:ilvl="1" w:tentative="1">
+      <w:start w:val="1"/>
+      <w:numFmt w:val="bullet"/>
+      <w:lvlText w:val="o"/>
+      <w:lvlJc w:val="left"/>
+      <w:pPr>
+        <w:tabs>
+          <w:tab w:val="num" w:pos="1440"/>
+        </w:tabs>
+        <w:ind w:left="1440" w:hanging="360"/>
+      </w:pPr>
+      <w:rPr>
+        <w:rFonts w:ascii="Courier New" w:hAnsi="Courier New" w:hint="default"/>
+        <w:sz w:val="20"/>
+      </w:rPr>
+    </w:lvl>
+    <w:lvl w:ilvl="2" w:tentative="1">
+      <w:start w:val="1"/>
+      <w:numFmt w:val="bullet"/>
+      <w:lvlText w:val=""/>
+      <w:lvlJc w:val="left"/>
+      <w:pPr>
+        <w:tabs>
+          <w:tab w:val="num" w:pos="2160"/>
+        </w:tabs>
+        <w:ind w:left="2160" w:hanging="360"/>
+      </w:pPr>
+      <w:rPr>
+        <w:rFonts w:ascii="Wingdings" w:hAnsi="Wingdings" w:hint="default"/>
+        <w:sz w:val="20"/>
+      </w:rPr>
+    </w:lvl>
+    <w:lvl w:ilvl="3" w:tentative="1">
+      <w:start w:val="1"/>
+      <w:numFmt w:val="bullet"/>
+      <w:lvlText w:val=""/>
+      <w:lvlJc w:val="left"/>
+      <w:pPr>
+        <w:tabs>
+          <w:tab w:val="num" w:pos="2880"/>
+        </w:tabs>
+        <w:ind w:left="2880" w:hanging="360"/>
+      </w:pPr>
+      <w:rPr>
+        <w:rFonts w:ascii="Wingdings" w:hAnsi="Wingdings" w:hint="default"/>
+        <w:sz w:val="20"/>
+      </w:rPr>
+    </w:lvl>
+    <w:lvl w:ilvl="4" w:tentative="1">
+      <w:start w:val="1"/>
+      <w:numFmt w:val="bullet"/>
+      <w:lvlText w:val=""/>
+      <w:lvlJc w:val="left"/>
+      <w:pPr>
+        <w:tabs>
+          <w:tab w:val="num" w:pos="3600"/>
+        </w:tabs>
+        <w:ind w:left="3600" w:hanging="360"/>
+      </w:pPr>
+      <w:rPr>
+        <w:rFonts w:ascii="Wingdings" w:hAnsi="Wingdings" w:hint="default"/>
+        <w:sz w:val="20"/>
+      </w:rPr>
+    </w:lvl>
+    <w:lvl w:ilvl="5" w:tentative="1">
+      <w:start w:val="1"/>
+      <w:numFmt w:val="bullet"/>
+      <w:lvlText w:val=""/>
+      <w:lvlJc w:val="left"/>
+      <w:pPr>
+        <w:tabs>
+          <w:tab w:val="num" w:pos="4320"/>
+        </w:tabs>
+        <w:ind w:left="4320" w:hanging="360"/>
+      </w:pPr>
+      <w:rPr>
+        <w:rFonts w:ascii="Wingdings" w:hAnsi="Wingdings" w:hint="default"/>
+        <w:sz w:val="20"/>
+      </w:rPr>
+    </w:lvl>
+    <w:lvl w:ilvl="6" w:tentative="1">
+      <w:start w:val="1"/>
+      <w:numFmt w:val="bullet"/>
+      <w:lvlText w:val=""/>
+      <w:lvlJc w:val="left"/>
+      <w:pPr>
+        <w:tabs>
+          <w:tab w:val="num" w:pos="5040"/>
+        </w:tabs>
+        <w:ind w:left="5040" w:hanging="360"/>
+      </w:pPr>
+      <w:rPr>
+        <w:rFonts w:ascii="Wingdings" w:hAnsi="Wingdings" w:hint="default"/>
+        <w:sz w:val="20"/>
+      </w:rPr>
+    </w:lvl>
+    <w:lvl w:ilvl="7" w:tentative="1">
+      <w:start w:val="1"/>
+      <w:numFmt w:val="bullet"/>
+      <w:lvlText w:val=""/>
+      <w:lvlJc w:val="left"/>
+      <w:pPr>
+        <w:tabs>
+          <w:tab w:val="num" w:pos="5760"/>
+        </w:tabs>
+        <w:ind w:left="5760" w:hanging="360"/>
+      </w:pPr>
+      <w:rPr>
+        <w:rFonts w:ascii="Wingdings" w:hAnsi="Wingdings" w:hint="default"/>
+        <w:sz w:val="20"/>
+      </w:rPr>
+    </w:lvl>
+    <w:lvl w:ilvl="8" w:tentative="1">
+      <w:start w:val="1"/>
+      <w:numFmt w:val="bullet"/>
+      <w:lvlText w:val=""/>
+      <w:lvlJc w:val="left"/>
+      <w:pPr>
+        <w:tabs>
+          <w:tab w:val="num" w:pos="6480"/>
+        </w:tabs>
+        <w:ind w:left="6480" w:hanging="360"/>
+      </w:pPr>
+      <w:rPr>
+        <w:rFonts w:ascii="Wingdings" w:hAnsi="Wingdings" w:hint="default"/>
+        <w:sz w:val="20"/>
+      </w:rPr>
+    </w:lvl>
+  </w:abstractNum>
+  <w:abstractNum w:abstractNumId="20" w15:restartNumberingAfterBreak="0">
     <w:nsid w:val="61802EC5"/>
     <w:multiLevelType w:val="multilevel"/>
     <w:tmpl w:val="E59AE44C"/>
@@ -16037,7 +19282,156 @@
       </w:rPr>
     </w:lvl>
   </w:abstractNum>
-  <w:abstractNum w:abstractNumId="20" w15:restartNumberingAfterBreak="0">
+  <w:abstractNum w:abstractNumId="21" w15:restartNumberingAfterBreak="0">
+    <w:nsid w:val="6C276F4B"/>
+    <w:multiLevelType w:val="multilevel"/>
+    <w:tmpl w:val="E5080600"/>
+    <w:lvl w:ilvl="0">
+      <w:start w:val="1"/>
+      <w:numFmt w:val="bullet"/>
+      <w:lvlText w:val=""/>
+      <w:lvlJc w:val="left"/>
+      <w:pPr>
+        <w:tabs>
+          <w:tab w:val="num" w:pos="720"/>
+        </w:tabs>
+        <w:ind w:left="720" w:hanging="360"/>
+      </w:pPr>
+      <w:rPr>
+        <w:rFonts w:ascii="Symbol" w:hAnsi="Symbol" w:hint="default"/>
+        <w:sz w:val="20"/>
+      </w:rPr>
+    </w:lvl>
+    <w:lvl w:ilvl="1" w:tentative="1">
+      <w:start w:val="1"/>
+      <w:numFmt w:val="bullet"/>
+      <w:lvlText w:val="o"/>
+      <w:lvlJc w:val="left"/>
+      <w:pPr>
+        <w:tabs>
+          <w:tab w:val="num" w:pos="1440"/>
+        </w:tabs>
+        <w:ind w:left="1440" w:hanging="360"/>
+      </w:pPr>
+      <w:rPr>
+        <w:rFonts w:ascii="Courier New" w:hAnsi="Courier New" w:hint="default"/>
+        <w:sz w:val="20"/>
+      </w:rPr>
+    </w:lvl>
+    <w:lvl w:ilvl="2" w:tentative="1">
+      <w:start w:val="1"/>
+      <w:numFmt w:val="bullet"/>
+      <w:lvlText w:val=""/>
+      <w:lvlJc w:val="left"/>
+      <w:pPr>
+        <w:tabs>
+          <w:tab w:val="num" w:pos="2160"/>
+        </w:tabs>
+        <w:ind w:left="2160" w:hanging="360"/>
+      </w:pPr>
+      <w:rPr>
+        <w:rFonts w:ascii="Wingdings" w:hAnsi="Wingdings" w:hint="default"/>
+        <w:sz w:val="20"/>
+      </w:rPr>
+    </w:lvl>
+    <w:lvl w:ilvl="3" w:tentative="1">
+      <w:start w:val="1"/>
+      <w:numFmt w:val="bullet"/>
+      <w:lvlText w:val=""/>
+      <w:lvlJc w:val="left"/>
+      <w:pPr>
+        <w:tabs>
+          <w:tab w:val="num" w:pos="2880"/>
+        </w:tabs>
+        <w:ind w:left="2880" w:hanging="360"/>
+      </w:pPr>
+      <w:rPr>
+        <w:rFonts w:ascii="Wingdings" w:hAnsi="Wingdings" w:hint="default"/>
+        <w:sz w:val="20"/>
+      </w:rPr>
+    </w:lvl>
+    <w:lvl w:ilvl="4" w:tentative="1">
+      <w:start w:val="1"/>
+      <w:numFmt w:val="bullet"/>
+      <w:lvlText w:val=""/>
+      <w:lvlJc w:val="left"/>
+      <w:pPr>
+        <w:tabs>
+          <w:tab w:val="num" w:pos="3600"/>
+        </w:tabs>
+        <w:ind w:left="3600" w:hanging="360"/>
+      </w:pPr>
+      <w:rPr>
+        <w:rFonts w:ascii="Wingdings" w:hAnsi="Wingdings" w:hint="default"/>
+        <w:sz w:val="20"/>
+      </w:rPr>
+    </w:lvl>
+    <w:lvl w:ilvl="5" w:tentative="1">
+      <w:start w:val="1"/>
+      <w:numFmt w:val="bullet"/>
+      <w:lvlText w:val=""/>
+      <w:lvlJc w:val="left"/>
+      <w:pPr>
+        <w:tabs>
+          <w:tab w:val="num" w:pos="4320"/>
+        </w:tabs>
+        <w:ind w:left="4320" w:hanging="360"/>
+      </w:pPr>
+      <w:rPr>
+        <w:rFonts w:ascii="Wingdings" w:hAnsi="Wingdings" w:hint="default"/>
+        <w:sz w:val="20"/>
+      </w:rPr>
+    </w:lvl>
+    <w:lvl w:ilvl="6" w:tentative="1">
+      <w:start w:val="1"/>
+      <w:numFmt w:val="bullet"/>
+      <w:lvlText w:val=""/>
+      <w:lvlJc w:val="left"/>
+      <w:pPr>
+        <w:tabs>
+          <w:tab w:val="num" w:pos="5040"/>
+        </w:tabs>
+        <w:ind w:left="5040" w:hanging="360"/>
+      </w:pPr>
+      <w:rPr>
+        <w:rFonts w:ascii="Wingdings" w:hAnsi="Wingdings" w:hint="default"/>
+        <w:sz w:val="20"/>
+      </w:rPr>
+    </w:lvl>
+    <w:lvl w:ilvl="7" w:tentative="1">
+      <w:start w:val="1"/>
+      <w:numFmt w:val="bullet"/>
+      <w:lvlText w:val=""/>
+      <w:lvlJc w:val="left"/>
+      <w:pPr>
+        <w:tabs>
+          <w:tab w:val="num" w:pos="5760"/>
+        </w:tabs>
+        <w:ind w:left="5760" w:hanging="360"/>
+      </w:pPr>
+      <w:rPr>
+        <w:rFonts w:ascii="Wingdings" w:hAnsi="Wingdings" w:hint="default"/>
+        <w:sz w:val="20"/>
+      </w:rPr>
+    </w:lvl>
+    <w:lvl w:ilvl="8" w:tentative="1">
+      <w:start w:val="1"/>
+      <w:numFmt w:val="bullet"/>
+      <w:lvlText w:val=""/>
+      <w:lvlJc w:val="left"/>
+      <w:pPr>
+        <w:tabs>
+          <w:tab w:val="num" w:pos="6480"/>
+        </w:tabs>
+        <w:ind w:left="6480" w:hanging="360"/>
+      </w:pPr>
+      <w:rPr>
+        <w:rFonts w:ascii="Wingdings" w:hAnsi="Wingdings" w:hint="default"/>
+        <w:sz w:val="20"/>
+      </w:rPr>
+    </w:lvl>
+  </w:abstractNum>
+  <w:abstractNum w:abstractNumId="22" w15:restartNumberingAfterBreak="0">
     <w:nsid w:val="77931688"/>
     <w:multiLevelType w:val="multilevel"/>
     <w:tmpl w:val="2C066EF4"/>
@@ -16186,7 +19580,7 @@
       </w:rPr>
     </w:lvl>
   </w:abstractNum>
-  <w:abstractNum w:abstractNumId="21" w15:restartNumberingAfterBreak="0">
+  <w:abstractNum w:abstractNumId="23" w15:restartNumberingAfterBreak="0">
     <w:nsid w:val="7C5A4B44"/>
     <w:multiLevelType w:val="multilevel"/>
     <w:tmpl w:val="87CE6E58"/>
@@ -16333,6 +19727,244 @@
         <w:rFonts w:ascii="Wingdings" w:hAnsi="Wingdings" w:hint="default"/>
         <w:sz w:val="20"/>
       </w:rPr>
+    </w:lvl>
+  </w:abstractNum>
+  <w:abstractNum w:abstractNumId="24" w15:restartNumberingAfterBreak="0">
+    <w:nsid w:val="7E205C08"/>
+    <w:multiLevelType w:val="multilevel"/>
+    <w:tmpl w:val="ED12898E"/>
+    <w:lvl w:ilvl="0">
+      <w:start w:val="1"/>
+      <w:numFmt w:val="bullet"/>
+      <w:lvlText w:val=""/>
+      <w:lvlJc w:val="left"/>
+      <w:pPr>
+        <w:tabs>
+          <w:tab w:val="num" w:pos="720"/>
+        </w:tabs>
+        <w:ind w:left="720" w:hanging="360"/>
+      </w:pPr>
+      <w:rPr>
+        <w:rFonts w:ascii="Symbol" w:hAnsi="Symbol" w:hint="default"/>
+        <w:sz w:val="20"/>
+      </w:rPr>
+    </w:lvl>
+    <w:lvl w:ilvl="1">
+      <w:start w:val="1"/>
+      <w:numFmt w:val="bullet"/>
+      <w:lvlText w:val="o"/>
+      <w:lvlJc w:val="left"/>
+      <w:pPr>
+        <w:tabs>
+          <w:tab w:val="num" w:pos="1440"/>
+        </w:tabs>
+        <w:ind w:left="1440" w:hanging="360"/>
+      </w:pPr>
+      <w:rPr>
+        <w:rFonts w:ascii="Courier New" w:hAnsi="Courier New" w:hint="default"/>
+        <w:sz w:val="20"/>
+      </w:rPr>
+    </w:lvl>
+    <w:lvl w:ilvl="2" w:tentative="1">
+      <w:start w:val="1"/>
+      <w:numFmt w:val="bullet"/>
+      <w:lvlText w:val=""/>
+      <w:lvlJc w:val="left"/>
+      <w:pPr>
+        <w:tabs>
+          <w:tab w:val="num" w:pos="2160"/>
+        </w:tabs>
+        <w:ind w:left="2160" w:hanging="360"/>
+      </w:pPr>
+      <w:rPr>
+        <w:rFonts w:ascii="Wingdings" w:hAnsi="Wingdings" w:hint="default"/>
+        <w:sz w:val="20"/>
+      </w:rPr>
+    </w:lvl>
+    <w:lvl w:ilvl="3" w:tentative="1">
+      <w:start w:val="1"/>
+      <w:numFmt w:val="bullet"/>
+      <w:lvlText w:val=""/>
+      <w:lvlJc w:val="left"/>
+      <w:pPr>
+        <w:tabs>
+          <w:tab w:val="num" w:pos="2880"/>
+        </w:tabs>
+        <w:ind w:left="2880" w:hanging="360"/>
+      </w:pPr>
+      <w:rPr>
+        <w:rFonts w:ascii="Wingdings" w:hAnsi="Wingdings" w:hint="default"/>
+        <w:sz w:val="20"/>
+      </w:rPr>
+    </w:lvl>
+    <w:lvl w:ilvl="4" w:tentative="1">
+      <w:start w:val="1"/>
+      <w:numFmt w:val="bullet"/>
+      <w:lvlText w:val=""/>
+      <w:lvlJc w:val="left"/>
+      <w:pPr>
+        <w:tabs>
+          <w:tab w:val="num" w:pos="3600"/>
+        </w:tabs>
+        <w:ind w:left="3600" w:hanging="360"/>
+      </w:pPr>
+      <w:rPr>
+        <w:rFonts w:ascii="Wingdings" w:hAnsi="Wingdings" w:hint="default"/>
+        <w:sz w:val="20"/>
+      </w:rPr>
+    </w:lvl>
+    <w:lvl w:ilvl="5" w:tentative="1">
+      <w:start w:val="1"/>
+      <w:numFmt w:val="bullet"/>
+      <w:lvlText w:val=""/>
+      <w:lvlJc w:val="left"/>
+      <w:pPr>
+        <w:tabs>
+          <w:tab w:val="num" w:pos="4320"/>
+        </w:tabs>
+        <w:ind w:left="4320" w:hanging="360"/>
+      </w:pPr>
+      <w:rPr>
+        <w:rFonts w:ascii="Wingdings" w:hAnsi="Wingdings" w:hint="default"/>
+        <w:sz w:val="20"/>
+      </w:rPr>
+    </w:lvl>
+    <w:lvl w:ilvl="6" w:tentative="1">
+      <w:start w:val="1"/>
+      <w:numFmt w:val="bullet"/>
+      <w:lvlText w:val=""/>
+      <w:lvlJc w:val="left"/>
+      <w:pPr>
+        <w:tabs>
+          <w:tab w:val="num" w:pos="5040"/>
+        </w:tabs>
+        <w:ind w:left="5040" w:hanging="360"/>
+      </w:pPr>
+      <w:rPr>
+        <w:rFonts w:ascii="Wingdings" w:hAnsi="Wingdings" w:hint="default"/>
+        <w:sz w:val="20"/>
+      </w:rPr>
+    </w:lvl>
+    <w:lvl w:ilvl="7" w:tentative="1">
+      <w:start w:val="1"/>
+      <w:numFmt w:val="bullet"/>
+      <w:lvlText w:val=""/>
+      <w:lvlJc w:val="left"/>
+      <w:pPr>
+        <w:tabs>
+          <w:tab w:val="num" w:pos="5760"/>
+        </w:tabs>
+        <w:ind w:left="5760" w:hanging="360"/>
+      </w:pPr>
+      <w:rPr>
+        <w:rFonts w:ascii="Wingdings" w:hAnsi="Wingdings" w:hint="default"/>
+        <w:sz w:val="20"/>
+      </w:rPr>
+    </w:lvl>
+    <w:lvl w:ilvl="8" w:tentative="1">
+      <w:start w:val="1"/>
+      <w:numFmt w:val="bullet"/>
+      <w:lvlText w:val=""/>
+      <w:lvlJc w:val="left"/>
+      <w:pPr>
+        <w:tabs>
+          <w:tab w:val="num" w:pos="6480"/>
+        </w:tabs>
+        <w:ind w:left="6480" w:hanging="360"/>
+      </w:pPr>
+      <w:rPr>
+        <w:rFonts w:ascii="Wingdings" w:hAnsi="Wingdings" w:hint="default"/>
+        <w:sz w:val="20"/>
+      </w:rPr>
+    </w:lvl>
+  </w:abstractNum>
+  <w:abstractNum w:abstractNumId="25" w15:restartNumberingAfterBreak="0">
+    <w:nsid w:val="7E780D13"/>
+    <w:multiLevelType w:val="hybridMultilevel"/>
+    <w:tmpl w:val="65A28AC2"/>
+    <w:lvl w:ilvl="0" w:tplc="0472ED12">
+      <w:start w:val="1"/>
+      <w:numFmt w:val="lowerRoman"/>
+      <w:lvlText w:val="%1.)"/>
+      <w:lvlJc w:val="left"/>
+      <w:pPr>
+        <w:ind w:left="1080" w:hanging="720"/>
+      </w:pPr>
+      <w:rPr>
+        <w:rFonts w:hint="default"/>
+      </w:rPr>
+    </w:lvl>
+    <w:lvl w:ilvl="1" w:tplc="40090019" w:tentative="1">
+      <w:start w:val="1"/>
+      <w:numFmt w:val="lowerLetter"/>
+      <w:lvlText w:val="%2."/>
+      <w:lvlJc w:val="left"/>
+      <w:pPr>
+        <w:ind w:left="1440" w:hanging="360"/>
+      </w:pPr>
+    </w:lvl>
+    <w:lvl w:ilvl="2" w:tplc="4009001B" w:tentative="1">
+      <w:start w:val="1"/>
+      <w:numFmt w:val="lowerRoman"/>
+      <w:lvlText w:val="%3."/>
+      <w:lvlJc w:val="right"/>
+      <w:pPr>
+        <w:ind w:left="2160" w:hanging="180"/>
+      </w:pPr>
+    </w:lvl>
+    <w:lvl w:ilvl="3" w:tplc="4009000F" w:tentative="1">
+      <w:start w:val="1"/>
+      <w:numFmt w:val="decimal"/>
+      <w:lvlText w:val="%4."/>
+      <w:lvlJc w:val="left"/>
+      <w:pPr>
+        <w:ind w:left="2880" w:hanging="360"/>
+      </w:pPr>
+    </w:lvl>
+    <w:lvl w:ilvl="4" w:tplc="40090019" w:tentative="1">
+      <w:start w:val="1"/>
+      <w:numFmt w:val="lowerLetter"/>
+      <w:lvlText w:val="%5."/>
+      <w:lvlJc w:val="left"/>
+      <w:pPr>
+        <w:ind w:left="3600" w:hanging="360"/>
+      </w:pPr>
+    </w:lvl>
+    <w:lvl w:ilvl="5" w:tplc="4009001B" w:tentative="1">
+      <w:start w:val="1"/>
+      <w:numFmt w:val="lowerRoman"/>
+      <w:lvlText w:val="%6."/>
+      <w:lvlJc w:val="right"/>
+      <w:pPr>
+        <w:ind w:left="4320" w:hanging="180"/>
+      </w:pPr>
+    </w:lvl>
+    <w:lvl w:ilvl="6" w:tplc="4009000F" w:tentative="1">
+      <w:start w:val="1"/>
+      <w:numFmt w:val="decimal"/>
+      <w:lvlText w:val="%7."/>
+      <w:lvlJc w:val="left"/>
+      <w:pPr>
+        <w:ind w:left="5040" w:hanging="360"/>
+      </w:pPr>
+    </w:lvl>
+    <w:lvl w:ilvl="7" w:tplc="40090019" w:tentative="1">
+      <w:start w:val="1"/>
+      <w:numFmt w:val="lowerLetter"/>
+      <w:lvlText w:val="%8."/>
+      <w:lvlJc w:val="left"/>
+      <w:pPr>
+        <w:ind w:left="5760" w:hanging="360"/>
+      </w:pPr>
+    </w:lvl>
+    <w:lvl w:ilvl="8" w:tplc="4009001B" w:tentative="1">
+      <w:start w:val="1"/>
+      <w:numFmt w:val="lowerRoman"/>
+      <w:lvlText w:val="%9."/>
+      <w:lvlJc w:val="right"/>
+      <w:pPr>
+        <w:ind w:left="6480" w:hanging="180"/>
+      </w:pPr>
     </w:lvl>
   </w:abstractNum>
   <w:num w:numId="1" w16cid:durableId="1541429971">
@@ -16342,7 +19974,7 @@
     <w:abstractNumId w:val="10"/>
   </w:num>
   <w:num w:numId="3" w16cid:durableId="1685402643">
-    <w:abstractNumId w:val="19"/>
+    <w:abstractNumId w:val="20"/>
   </w:num>
   <w:num w:numId="4" w16cid:durableId="1926112215">
     <w:abstractNumId w:val="4"/>
@@ -16363,7 +19995,7 @@
     <w:abstractNumId w:val="7"/>
   </w:num>
   <w:num w:numId="10" w16cid:durableId="74253472">
-    <w:abstractNumId w:val="20"/>
+    <w:abstractNumId w:val="22"/>
   </w:num>
   <w:num w:numId="11" w16cid:durableId="2143768663">
     <w:abstractNumId w:val="8"/>
@@ -16384,7 +20016,7 @@
     <w:abstractNumId w:val="18"/>
   </w:num>
   <w:num w:numId="17" w16cid:durableId="1118259855">
-    <w:abstractNumId w:val="21"/>
+    <w:abstractNumId w:val="23"/>
   </w:num>
   <w:num w:numId="18" w16cid:durableId="1522664256">
     <w:abstractNumId w:val="17"/>
@@ -16400,6 +20032,18 @@
   </w:num>
   <w:num w:numId="22" w16cid:durableId="731464448">
     <w:abstractNumId w:val="2"/>
+  </w:num>
+  <w:num w:numId="23" w16cid:durableId="245311802">
+    <w:abstractNumId w:val="19"/>
+  </w:num>
+  <w:num w:numId="24" w16cid:durableId="1087113050">
+    <w:abstractNumId w:val="24"/>
+  </w:num>
+  <w:num w:numId="25" w16cid:durableId="1378433363">
+    <w:abstractNumId w:val="21"/>
+  </w:num>
+  <w:num w:numId="26" w16cid:durableId="1990671213">
+    <w:abstractNumId w:val="25"/>
   </w:num>
 </w:numbering>
 </file>

</xml_diff>

<commit_message>
We create pods using deployments
</commit_message>
<xml_diff>
--- a/Kubernetes/Kubernetes.docx
+++ b/Kubernetes/Kubernetes.docx
@@ -11,7 +11,6 @@
           <w:szCs w:val="26"/>
         </w:rPr>
       </w:pPr>
-      <w:proofErr w:type="spellStart"/>
       <w:r>
         <w:rPr>
           <w:b/>
@@ -19,17 +18,7 @@
           <w:sz w:val="26"/>
           <w:szCs w:val="26"/>
         </w:rPr>
-        <w:t>CheatSheet</w:t>
-      </w:r>
-      <w:proofErr w:type="spellEnd"/>
-      <w:r>
-        <w:rPr>
-          <w:b/>
-          <w:bCs/>
-          <w:sz w:val="26"/>
-          <w:szCs w:val="26"/>
-        </w:rPr>
-        <w:t xml:space="preserve">: </w:t>
+        <w:t xml:space="preserve">CheatSheet: </w:t>
       </w:r>
       <w:hyperlink r:id="rId7" w:history="1">
         <w:r>
@@ -1138,21 +1127,8 @@
     </w:p>
     <w:p>
       <w:r>
-        <w:t xml:space="preserve">     Containers                                 </w:t>
-      </w:r>
-      <w:proofErr w:type="spellStart"/>
-      <w:r>
-        <w:t>Containers</w:t>
-      </w:r>
-      <w:proofErr w:type="spellEnd"/>
-      <w:r>
-        <w:t xml:space="preserve">                                          </w:t>
-      </w:r>
-      <w:proofErr w:type="spellStart"/>
-      <w:r>
-        <w:t>Containers</w:t>
-      </w:r>
-      <w:proofErr w:type="spellEnd"/>
+        <w:t xml:space="preserve">     Containers                                 Containers                                          Containers</w:t>
+      </w:r>
     </w:p>
     <w:p/>
     <w:p>
@@ -1196,15 +1172,7 @@
         <w:sym w:font="Wingdings" w:char="F0E0"/>
       </w:r>
       <w:r>
-        <w:t xml:space="preserve"> In Kubernetes, containers and Pods are considered ephemeral because they can be </w:t>
-      </w:r>
-      <w:proofErr w:type="gramStart"/>
-      <w:r>
-        <w:t>created,  destroyed</w:t>
-      </w:r>
-      <w:proofErr w:type="gramEnd"/>
-      <w:r>
-        <w:t>, and replaced at any time.</w:t>
+        <w:t xml:space="preserve"> In Kubernetes, containers and Pods are considered ephemeral because they can be created,  destroyed, and replaced at any time.</w:t>
       </w:r>
     </w:p>
     <w:p>
@@ -1855,21 +1823,8 @@
     </w:p>
     <w:p>
       <w:r>
-        <w:t xml:space="preserve">                                                                                                 Pod                  </w:t>
-      </w:r>
-      <w:proofErr w:type="spellStart"/>
-      <w:r>
-        <w:t>Pod</w:t>
-      </w:r>
-      <w:proofErr w:type="spellEnd"/>
-      <w:r>
-        <w:t xml:space="preserve">                </w:t>
-      </w:r>
-      <w:proofErr w:type="spellStart"/>
-      <w:r>
-        <w:t>Pod</w:t>
-      </w:r>
-      <w:proofErr w:type="spellEnd"/>
+        <w:t xml:space="preserve">                                                                                                 Pod                  Pod                Pod</w:t>
+      </w:r>
     </w:p>
     <w:p>
       <w:pPr>
@@ -1968,7 +1923,6 @@
           <w:numId w:val="4"/>
         </w:numPr>
       </w:pPr>
-      <w:proofErr w:type="spellStart"/>
       <w:r>
         <w:rPr>
           <w:b/>
@@ -1976,7 +1930,6 @@
         </w:rPr>
         <w:t>etcd</w:t>
       </w:r>
-      <w:proofErr w:type="spellEnd"/>
       <w:r>
         <w:t xml:space="preserve"> → stores cluster state and configuration </w:t>
       </w:r>
@@ -2023,7 +1976,6 @@
           <w:numId w:val="5"/>
         </w:numPr>
       </w:pPr>
-      <w:proofErr w:type="spellStart"/>
       <w:r>
         <w:rPr>
           <w:b/>
@@ -2031,7 +1983,6 @@
         </w:rPr>
         <w:t>kubelet</w:t>
       </w:r>
-      <w:proofErr w:type="spellEnd"/>
       <w:r>
         <w:t xml:space="preserve"> → communicates with Control Plane </w:t>
       </w:r>
@@ -2061,21 +2012,12 @@
           <w:numId w:val="5"/>
         </w:numPr>
       </w:pPr>
-      <w:proofErr w:type="spellStart"/>
-      <w:r>
-        <w:rPr>
-          <w:b/>
-          <w:bCs/>
-        </w:rPr>
-        <w:t>kube</w:t>
-      </w:r>
-      <w:proofErr w:type="spellEnd"/>
-      <w:r>
-        <w:rPr>
-          <w:b/>
-          <w:bCs/>
-        </w:rPr>
-        <w:t>-proxy</w:t>
+      <w:r>
+        <w:rPr>
+          <w:b/>
+          <w:bCs/>
+        </w:rPr>
+        <w:t>kube-proxy</w:t>
       </w:r>
       <w:r>
         <w:t xml:space="preserve"> → handles networking</w:t>
@@ -2784,23 +2726,7 @@
         </w:tabs>
       </w:pPr>
       <w:r>
-        <w:t xml:space="preserve">         (</w:t>
-      </w:r>
-      <w:proofErr w:type="gramStart"/>
-      <w:r>
-        <w:t xml:space="preserve">Master)   </w:t>
-      </w:r>
-      <w:proofErr w:type="gramEnd"/>
-      <w:r>
-        <w:t xml:space="preserve">                                                                                                            </w:t>
-      </w:r>
-      <w:proofErr w:type="gramStart"/>
-      <w:r>
-        <w:t xml:space="preserve">   (</w:t>
-      </w:r>
-      <w:proofErr w:type="gramEnd"/>
-      <w:r>
-        <w:t>Workers)</w:t>
+        <w:t xml:space="preserve">         (Master)                                                                                                                  (Workers)</w:t>
       </w:r>
     </w:p>
     <w:p>
@@ -3015,66 +2941,222 @@
         <w:t>──</w:t>
       </w:r>
       <w:r>
+        <w:t xml:space="preserve"> etcd</w:t>
+      </w:r>
+    </w:p>
+    <w:p>
+      <w:pPr>
+        <w:tabs>
+          <w:tab w:val="left" w:pos="6067"/>
+        </w:tabs>
+      </w:pPr>
+      <w:r>
+        <w:rPr>
+          <w:rFonts w:ascii="MS Gothic" w:eastAsia="MS Gothic" w:hAnsi="MS Gothic" w:cs="MS Gothic" w:hint="eastAsia"/>
+        </w:rPr>
+        <w:t>├</w:t>
+      </w:r>
+      <w:r>
+        <w:rPr>
+          <w:rFonts w:ascii="Calibri" w:hAnsi="Calibri" w:cs="Calibri"/>
+        </w:rPr>
+        <w:t>──</w:t>
+      </w:r>
+      <w:r>
+        <w:t xml:space="preserve"> Scheduler</w:t>
+      </w:r>
+    </w:p>
+    <w:p>
+      <w:pPr>
+        <w:tabs>
+          <w:tab w:val="left" w:pos="6067"/>
+        </w:tabs>
+      </w:pPr>
+      <w:r>
+        <w:rPr>
+          <w:rFonts w:ascii="MS Gothic" w:eastAsia="MS Gothic" w:hAnsi="MS Gothic" w:cs="MS Gothic" w:hint="eastAsia"/>
+        </w:rPr>
+        <w:t>├</w:t>
+      </w:r>
+      <w:r>
+        <w:rPr>
+          <w:rFonts w:ascii="Calibri" w:hAnsi="Calibri" w:cs="Calibri"/>
+        </w:rPr>
+        <w:t>──</w:t>
+      </w:r>
+      <w:r>
+        <w:t xml:space="preserve"> Controller Manager</w:t>
+      </w:r>
+    </w:p>
+    <w:p>
+      <w:pPr>
+        <w:tabs>
+          <w:tab w:val="left" w:pos="6067"/>
+        </w:tabs>
+      </w:pPr>
+      <w:r>
+        <w:t>└── Cloud Controller Manager</w:t>
+      </w:r>
+    </w:p>
+    <w:p>
+      <w:pPr>
+        <w:tabs>
+          <w:tab w:val="left" w:pos="6067"/>
+        </w:tabs>
+        <w:rPr>
+          <w:b/>
+          <w:bCs/>
+        </w:rPr>
+      </w:pPr>
+      <w:r>
+        <w:rPr>
+          <w:rFonts w:ascii="Segoe UI Emoji" w:hAnsi="Segoe UI Emoji" w:cs="Segoe UI Emoji"/>
+          <w:b/>
+          <w:bCs/>
+        </w:rPr>
+        <w:t>🔹</w:t>
+      </w:r>
+      <w:r>
+        <w:rPr>
+          <w:b/>
+          <w:bCs/>
+        </w:rPr>
+        <w:t xml:space="preserve"> API Server</w:t>
+      </w:r>
+    </w:p>
+    <w:p>
+      <w:pPr>
+        <w:tabs>
+          <w:tab w:val="left" w:pos="6067"/>
+        </w:tabs>
+      </w:pPr>
+      <w:r>
+        <w:t xml:space="preserve">The </w:t>
+      </w:r>
+      <w:r>
+        <w:rPr>
+          <w:b/>
+          <w:bCs/>
+        </w:rPr>
+        <w:t>API Server is the main entry point</w:t>
+      </w:r>
+      <w:r>
+        <w:t xml:space="preserve"> to Kubernetes.</w:t>
+      </w:r>
+    </w:p>
+    <w:p>
+      <w:pPr>
+        <w:tabs>
+          <w:tab w:val="left" w:pos="6067"/>
+        </w:tabs>
+      </w:pPr>
+      <w:r>
+        <w:t>For example:</w:t>
+      </w:r>
+      <w:r>
         <w:t xml:space="preserve"> </w:t>
       </w:r>
-      <w:proofErr w:type="spellStart"/>
-      <w:r>
-        <w:t>etcd</w:t>
-      </w:r>
-      <w:proofErr w:type="spellEnd"/>
-    </w:p>
-    <w:p>
-      <w:pPr>
-        <w:tabs>
-          <w:tab w:val="left" w:pos="6067"/>
-        </w:tabs>
-      </w:pPr>
-      <w:r>
-        <w:rPr>
-          <w:rFonts w:ascii="MS Gothic" w:eastAsia="MS Gothic" w:hAnsi="MS Gothic" w:cs="MS Gothic" w:hint="eastAsia"/>
-        </w:rPr>
-        <w:t>├</w:t>
-      </w:r>
-      <w:r>
-        <w:rPr>
-          <w:rFonts w:ascii="Calibri" w:hAnsi="Calibri" w:cs="Calibri"/>
-        </w:rPr>
-        <w:t>──</w:t>
-      </w:r>
-      <w:r>
-        <w:t xml:space="preserve"> Scheduler</w:t>
-      </w:r>
-    </w:p>
-    <w:p>
-      <w:pPr>
-        <w:tabs>
-          <w:tab w:val="left" w:pos="6067"/>
-        </w:tabs>
-      </w:pPr>
-      <w:r>
-        <w:rPr>
-          <w:rFonts w:ascii="MS Gothic" w:eastAsia="MS Gothic" w:hAnsi="MS Gothic" w:cs="MS Gothic" w:hint="eastAsia"/>
-        </w:rPr>
-        <w:t>├</w:t>
-      </w:r>
-      <w:r>
-        <w:rPr>
-          <w:rFonts w:ascii="Calibri" w:hAnsi="Calibri" w:cs="Calibri"/>
-        </w:rPr>
-        <w:t>──</w:t>
-      </w:r>
-      <w:r>
-        <w:t xml:space="preserve"> Controller Manager</w:t>
-      </w:r>
-    </w:p>
-    <w:p>
-      <w:pPr>
-        <w:tabs>
-          <w:tab w:val="left" w:pos="6067"/>
-        </w:tabs>
-      </w:pPr>
-      <w:r>
-        <w:t>└── Cloud Controller Manager</w:t>
+    </w:p>
+    <w:p>
+      <w:pPr>
+        <w:tabs>
+          <w:tab w:val="left" w:pos="6067"/>
+        </w:tabs>
+      </w:pPr>
+      <w:r>
+        <w:t xml:space="preserve">           </w:t>
+      </w:r>
+      <w:r>
+        <w:t>kubectl create deployment nginx --image=nginx</w:t>
+      </w:r>
+    </w:p>
+    <w:p>
+      <w:pPr>
+        <w:tabs>
+          <w:tab w:val="left" w:pos="6067"/>
+        </w:tabs>
+      </w:pPr>
+      <w:r>
+        <w:t xml:space="preserve">Flow: </w:t>
+      </w:r>
+    </w:p>
+    <w:p>
+      <w:pPr>
+        <w:tabs>
+          <w:tab w:val="left" w:pos="6067"/>
+        </w:tabs>
+        <w:ind w:left="720"/>
+      </w:pPr>
+      <w:r>
+        <w:t>kubectl</w:t>
+      </w:r>
+    </w:p>
+    <w:p>
+      <w:pPr>
+        <w:tabs>
+          <w:tab w:val="left" w:pos="6067"/>
+        </w:tabs>
+        <w:ind w:left="720"/>
+      </w:pPr>
+      <w:r>
+        <w:t xml:space="preserve">   ↓</w:t>
+      </w:r>
+    </w:p>
+    <w:p>
+      <w:pPr>
+        <w:tabs>
+          <w:tab w:val="left" w:pos="6067"/>
+        </w:tabs>
+        <w:ind w:left="720"/>
+      </w:pPr>
+      <w:r>
+        <w:t>API Server</w:t>
+      </w:r>
+    </w:p>
+    <w:p>
+      <w:pPr>
+        <w:tabs>
+          <w:tab w:val="left" w:pos="6067"/>
+        </w:tabs>
+        <w:ind w:left="720"/>
+      </w:pPr>
+      <w:r>
+        <w:t xml:space="preserve">   ↓</w:t>
+      </w:r>
+    </w:p>
+    <w:p>
+      <w:pPr>
+        <w:tabs>
+          <w:tab w:val="left" w:pos="6067"/>
+        </w:tabs>
+        <w:ind w:left="720"/>
+      </w:pPr>
+      <w:r>
+        <w:t>Kubernetes</w:t>
+      </w:r>
+    </w:p>
+    <w:p>
+      <w:pPr>
+        <w:tabs>
+          <w:tab w:val="left" w:pos="6067"/>
+        </w:tabs>
+      </w:pPr>
+      <w:r>
+        <w:t>Almost all communication with the cluster goes through the API Server.</w:t>
+      </w:r>
+    </w:p>
+    <w:p>
+      <w:pPr>
+        <w:tabs>
+          <w:tab w:val="left" w:pos="6067"/>
+        </w:tabs>
+      </w:pPr>
+      <w:r>
+        <w:rPr>
+          <w:b/>
+          <w:bCs/>
+        </w:rPr>
+        <w:t>API Server = Gateway/Entry point</w:t>
       </w:r>
     </w:p>
     <w:p>
@@ -3100,199 +3182,17 @@
           <w:b/>
           <w:bCs/>
         </w:rPr>
-        <w:t xml:space="preserve"> API Server</w:t>
-      </w:r>
-    </w:p>
-    <w:p>
-      <w:pPr>
-        <w:tabs>
-          <w:tab w:val="left" w:pos="6067"/>
-        </w:tabs>
-      </w:pPr>
-      <w:r>
-        <w:t xml:space="preserve">The </w:t>
-      </w:r>
-      <w:r>
-        <w:rPr>
-          <w:b/>
-          <w:bCs/>
-        </w:rPr>
-        <w:t>API Server is the main entry point</w:t>
-      </w:r>
-      <w:r>
-        <w:t xml:space="preserve"> to Kubernetes.</w:t>
-      </w:r>
-    </w:p>
-    <w:p>
-      <w:pPr>
-        <w:tabs>
-          <w:tab w:val="left" w:pos="6067"/>
-        </w:tabs>
-      </w:pPr>
-      <w:r>
-        <w:t>For example:</w:t>
-      </w:r>
-      <w:r>
-        <w:t xml:space="preserve"> </w:t>
-      </w:r>
-    </w:p>
-    <w:p>
-      <w:pPr>
-        <w:tabs>
-          <w:tab w:val="left" w:pos="6067"/>
-        </w:tabs>
-      </w:pPr>
-      <w:r>
-        <w:t xml:space="preserve">           </w:t>
-      </w:r>
-      <w:proofErr w:type="spellStart"/>
-      <w:r>
-        <w:t>kubectl</w:t>
-      </w:r>
-      <w:proofErr w:type="spellEnd"/>
-      <w:r>
-        <w:t xml:space="preserve"> create deployment nginx --image=nginx</w:t>
-      </w:r>
-    </w:p>
-    <w:p>
-      <w:pPr>
-        <w:tabs>
-          <w:tab w:val="left" w:pos="6067"/>
-        </w:tabs>
-      </w:pPr>
-      <w:r>
-        <w:t xml:space="preserve">Flow: </w:t>
-      </w:r>
-    </w:p>
-    <w:p>
-      <w:pPr>
-        <w:tabs>
-          <w:tab w:val="left" w:pos="6067"/>
-        </w:tabs>
-        <w:ind w:left="720"/>
-      </w:pPr>
-      <w:proofErr w:type="spellStart"/>
-      <w:r>
-        <w:t>kubectl</w:t>
-      </w:r>
-      <w:proofErr w:type="spellEnd"/>
-    </w:p>
-    <w:p>
-      <w:pPr>
-        <w:tabs>
-          <w:tab w:val="left" w:pos="6067"/>
-        </w:tabs>
-        <w:ind w:left="720"/>
-      </w:pPr>
-      <w:r>
-        <w:t xml:space="preserve">   ↓</w:t>
-      </w:r>
-    </w:p>
-    <w:p>
-      <w:pPr>
-        <w:tabs>
-          <w:tab w:val="left" w:pos="6067"/>
-        </w:tabs>
-        <w:ind w:left="720"/>
-      </w:pPr>
-      <w:r>
-        <w:t>API Server</w:t>
-      </w:r>
-    </w:p>
-    <w:p>
-      <w:pPr>
-        <w:tabs>
-          <w:tab w:val="left" w:pos="6067"/>
-        </w:tabs>
-        <w:ind w:left="720"/>
-      </w:pPr>
-      <w:r>
-        <w:t xml:space="preserve">   ↓</w:t>
-      </w:r>
-    </w:p>
-    <w:p>
-      <w:pPr>
-        <w:tabs>
-          <w:tab w:val="left" w:pos="6067"/>
-        </w:tabs>
-        <w:ind w:left="720"/>
-      </w:pPr>
-      <w:r>
-        <w:t>Kubernetes</w:t>
-      </w:r>
-    </w:p>
-    <w:p>
-      <w:pPr>
-        <w:tabs>
-          <w:tab w:val="left" w:pos="6067"/>
-        </w:tabs>
-      </w:pPr>
-      <w:r>
-        <w:t>Almost all communication with the cluster goes through the API Server.</w:t>
-      </w:r>
-    </w:p>
-    <w:p>
-      <w:pPr>
-        <w:tabs>
-          <w:tab w:val="left" w:pos="6067"/>
-        </w:tabs>
-      </w:pPr>
-      <w:r>
-        <w:rPr>
-          <w:b/>
-          <w:bCs/>
-        </w:rPr>
-        <w:t>API Server = Gateway/Entry point</w:t>
-      </w:r>
-    </w:p>
-    <w:p>
-      <w:pPr>
-        <w:tabs>
-          <w:tab w:val="left" w:pos="6067"/>
-        </w:tabs>
-        <w:rPr>
-          <w:b/>
-          <w:bCs/>
-        </w:rPr>
-      </w:pPr>
-      <w:r>
-        <w:rPr>
-          <w:rFonts w:ascii="Segoe UI Emoji" w:hAnsi="Segoe UI Emoji" w:cs="Segoe UI Emoji"/>
-          <w:b/>
-          <w:bCs/>
-        </w:rPr>
-        <w:t>🔹</w:t>
-      </w:r>
-      <w:r>
-        <w:rPr>
-          <w:b/>
-          <w:bCs/>
-        </w:rPr>
-        <w:t xml:space="preserve"> </w:t>
-      </w:r>
-      <w:proofErr w:type="spellStart"/>
-      <w:r>
-        <w:rPr>
-          <w:b/>
-          <w:bCs/>
-        </w:rPr>
-        <w:t>etcd</w:t>
-      </w:r>
-      <w:proofErr w:type="spellEnd"/>
-    </w:p>
-    <w:p>
-      <w:pPr>
-        <w:tabs>
-          <w:tab w:val="left" w:pos="6067"/>
-        </w:tabs>
-      </w:pPr>
-      <w:proofErr w:type="spellStart"/>
-      <w:r>
-        <w:t>etcd</w:t>
-      </w:r>
-      <w:proofErr w:type="spellEnd"/>
-      <w:r>
-        <w:t xml:space="preserve"> is Kubernetes' </w:t>
+        <w:t xml:space="preserve"> etcd</w:t>
+      </w:r>
+    </w:p>
+    <w:p>
+      <w:pPr>
+        <w:tabs>
+          <w:tab w:val="left" w:pos="6067"/>
+        </w:tabs>
+      </w:pPr>
+      <w:r>
+        <w:t xml:space="preserve">etcd is Kubernetes' </w:t>
       </w:r>
       <w:r>
         <w:rPr>
@@ -3416,13 +3316,8 @@
         <w:ind w:left="360"/>
       </w:pPr>
       <w:r>
-        <w:t xml:space="preserve">    </w:t>
-      </w:r>
-      <w:proofErr w:type="spellStart"/>
-      <w:r>
-        <w:t>etcd</w:t>
-      </w:r>
-      <w:proofErr w:type="spellEnd"/>
+        <w:t xml:space="preserve">    etcd</w:t>
+      </w:r>
     </w:p>
     <w:p>
       <w:pPr>
@@ -3452,13 +3347,8 @@
           <w:tab w:val="left" w:pos="6067"/>
         </w:tabs>
       </w:pPr>
-      <w:proofErr w:type="spellStart"/>
-      <w:r>
-        <w:t>etcd</w:t>
-      </w:r>
-      <w:proofErr w:type="spellEnd"/>
-      <w:r>
-        <w:t xml:space="preserve"> = Database/Storage of cluster state</w:t>
+      <w:r>
+        <w:t>etcd = Database/Storage of cluster state</w:t>
       </w:r>
     </w:p>
     <w:p>
@@ -3715,13 +3605,8 @@
         </w:tabs>
         <w:ind w:left="720"/>
       </w:pPr>
-      <w:proofErr w:type="gramStart"/>
-      <w:r>
-        <w:t>Actual  =</w:t>
-      </w:r>
-      <w:proofErr w:type="gramEnd"/>
-      <w:r>
-        <w:t xml:space="preserve"> 2 Pods</w:t>
+      <w:r>
+        <w:t>Actual  = 2 Pods</w:t>
       </w:r>
     </w:p>
     <w:p>
@@ -3814,17 +3699,8 @@
           <w:b/>
           <w:bCs/>
         </w:rPr>
-        <w:t xml:space="preserve">self-healing/reconciliation </w:t>
-      </w:r>
-      <w:proofErr w:type="spellStart"/>
-      <w:r>
-        <w:rPr>
-          <w:b/>
-          <w:bCs/>
-        </w:rPr>
-        <w:t>behavior</w:t>
-      </w:r>
-      <w:proofErr w:type="spellEnd"/>
+        <w:t>self-healing/reconciliation behavior</w:t>
+      </w:r>
       <w:r>
         <w:t>.</w:t>
       </w:r>
@@ -4063,13 +3939,8 @@
         <w:t>──</w:t>
       </w:r>
       <w:r>
-        <w:t xml:space="preserve"> </w:t>
-      </w:r>
-      <w:proofErr w:type="spellStart"/>
-      <w:r>
-        <w:t>kubelet</w:t>
-      </w:r>
-      <w:proofErr w:type="spellEnd"/>
+        <w:t xml:space="preserve"> kubelet</w:t>
+      </w:r>
     </w:p>
     <w:p>
       <w:pPr>
@@ -4091,15 +3962,7 @@
         <w:t>──</w:t>
       </w:r>
       <w:r>
-        <w:t xml:space="preserve"> </w:t>
-      </w:r>
-      <w:proofErr w:type="spellStart"/>
-      <w:r>
-        <w:t>kube</w:t>
-      </w:r>
-      <w:proofErr w:type="spellEnd"/>
-      <w:r>
-        <w:t>-proxy</w:t>
+        <w:t xml:space="preserve"> kube-proxy</w:t>
       </w:r>
     </w:p>
     <w:p>
@@ -4158,31 +4021,17 @@
           <w:b/>
           <w:bCs/>
         </w:rPr>
-        <w:t xml:space="preserve"> </w:t>
-      </w:r>
-      <w:proofErr w:type="spellStart"/>
-      <w:r>
-        <w:rPr>
-          <w:b/>
-          <w:bCs/>
-        </w:rPr>
-        <w:t>kubelet</w:t>
-      </w:r>
-      <w:proofErr w:type="spellEnd"/>
-    </w:p>
-    <w:p>
-      <w:pPr>
-        <w:tabs>
-          <w:tab w:val="left" w:pos="6067"/>
-        </w:tabs>
-      </w:pPr>
-      <w:proofErr w:type="spellStart"/>
-      <w:r>
-        <w:t>kubelet</w:t>
-      </w:r>
-      <w:proofErr w:type="spellEnd"/>
-      <w:r>
-        <w:t xml:space="preserve"> is an </w:t>
+        <w:t xml:space="preserve"> kubelet</w:t>
+      </w:r>
+    </w:p>
+    <w:p>
+      <w:pPr>
+        <w:tabs>
+          <w:tab w:val="left" w:pos="6067"/>
+        </w:tabs>
+      </w:pPr>
+      <w:r>
+        <w:t xml:space="preserve">kubelet is an </w:t>
       </w:r>
       <w:r>
         <w:rPr>
@@ -4235,13 +4084,8 @@
         <w:ind w:left="720"/>
       </w:pPr>
       <w:r>
-        <w:t xml:space="preserve">   </w:t>
-      </w:r>
-      <w:proofErr w:type="spellStart"/>
-      <w:r>
-        <w:t>kubelet</w:t>
-      </w:r>
-      <w:proofErr w:type="spellEnd"/>
+        <w:t xml:space="preserve">   kubelet</w:t>
+      </w:r>
     </w:p>
     <w:p>
       <w:pPr>
@@ -4294,13 +4138,8 @@
           <w:tab w:val="left" w:pos="6067"/>
         </w:tabs>
       </w:pPr>
-      <w:proofErr w:type="spellStart"/>
-      <w:r>
-        <w:t>kubelet</w:t>
-      </w:r>
-      <w:proofErr w:type="spellEnd"/>
-      <w:r>
-        <w:t xml:space="preserve"> = Worker Node agent</w:t>
+      <w:r>
+        <w:t>kubelet = Worker Node agent</w:t>
       </w:r>
     </w:p>
     <w:p>
@@ -4376,13 +4215,8 @@
           <w:tab w:val="left" w:pos="6067"/>
         </w:tabs>
       </w:pPr>
-      <w:proofErr w:type="spellStart"/>
-      <w:r>
-        <w:t>containerd</w:t>
-      </w:r>
-      <w:proofErr w:type="spellEnd"/>
-      <w:r>
-        <w:t xml:space="preserve"> </w:t>
+      <w:r>
+        <w:t xml:space="preserve">containerd </w:t>
       </w:r>
     </w:p>
     <w:p>
@@ -4509,61 +4343,31 @@
           <w:b/>
           <w:bCs/>
         </w:rPr>
-        <w:t xml:space="preserve"> </w:t>
-      </w:r>
-      <w:proofErr w:type="spellStart"/>
-      <w:r>
-        <w:rPr>
-          <w:b/>
-          <w:bCs/>
-        </w:rPr>
-        <w:t>kube</w:t>
-      </w:r>
-      <w:proofErr w:type="spellEnd"/>
-      <w:r>
-        <w:rPr>
-          <w:b/>
-          <w:bCs/>
-        </w:rPr>
-        <w:t>-proxy</w:t>
-      </w:r>
-    </w:p>
-    <w:p>
-      <w:pPr>
-        <w:tabs>
-          <w:tab w:val="left" w:pos="6067"/>
-        </w:tabs>
-      </w:pPr>
-      <w:proofErr w:type="spellStart"/>
-      <w:r>
-        <w:t>kube</w:t>
-      </w:r>
-      <w:proofErr w:type="spellEnd"/>
-      <w:r>
-        <w:t>-proxy provides networking functionality on Worker Nodes and helps direct traffic to the appropriate Pods.</w:t>
-      </w:r>
-    </w:p>
-    <w:p>
-      <w:pPr>
-        <w:tabs>
-          <w:tab w:val="left" w:pos="6067"/>
-        </w:tabs>
-      </w:pPr>
-      <w:proofErr w:type="spellStart"/>
-      <w:r>
-        <w:rPr>
-          <w:b/>
-          <w:bCs/>
-        </w:rPr>
-        <w:t>kube</w:t>
-      </w:r>
-      <w:proofErr w:type="spellEnd"/>
-      <w:r>
-        <w:rPr>
-          <w:b/>
-          <w:bCs/>
-        </w:rPr>
-        <w:t>-proxy = Networking</w:t>
+        <w:t xml:space="preserve"> kube-proxy</w:t>
+      </w:r>
+    </w:p>
+    <w:p>
+      <w:pPr>
+        <w:tabs>
+          <w:tab w:val="left" w:pos="6067"/>
+        </w:tabs>
+      </w:pPr>
+      <w:r>
+        <w:t>kube-proxy provides networking functionality on Worker Nodes and helps direct traffic to the appropriate Pods.</w:t>
+      </w:r>
+    </w:p>
+    <w:p>
+      <w:pPr>
+        <w:tabs>
+          <w:tab w:val="left" w:pos="6067"/>
+        </w:tabs>
+      </w:pPr>
+      <w:r>
+        <w:rPr>
+          <w:b/>
+          <w:bCs/>
+        </w:rPr>
+        <w:t>kube-proxy = Networking</w:t>
       </w:r>
     </w:p>
     <w:p>
@@ -4800,34 +4604,17 @@
           <w:b/>
           <w:bCs/>
         </w:rPr>
-        <w:t xml:space="preserve">6. Example: Deploying an </w:t>
-      </w:r>
-      <w:proofErr w:type="gramStart"/>
-      <w:r>
-        <w:rPr>
-          <w:b/>
-          <w:bCs/>
-        </w:rPr>
-        <w:t>Application</w:t>
-      </w:r>
-      <w:proofErr w:type="gramEnd"/>
-    </w:p>
-    <w:p>
-      <w:pPr>
-        <w:tabs>
-          <w:tab w:val="left" w:pos="6067"/>
-        </w:tabs>
-      </w:pPr>
-      <w:r>
-        <w:t xml:space="preserve">Suppose you want to deploy </w:t>
-      </w:r>
-      <w:proofErr w:type="gramStart"/>
-      <w:r>
-        <w:t>an</w:t>
-      </w:r>
-      <w:proofErr w:type="gramEnd"/>
-      <w:r>
-        <w:t xml:space="preserve"> Nginx application.</w:t>
+        <w:t>6. Example: Deploying an Application</w:t>
+      </w:r>
+    </w:p>
+    <w:p>
+      <w:pPr>
+        <w:tabs>
+          <w:tab w:val="left" w:pos="6067"/>
+        </w:tabs>
+      </w:pPr>
+      <w:r>
+        <w:t>Suppose you want to deploy an Nginx application.</w:t>
       </w:r>
     </w:p>
     <w:p>
@@ -4859,11 +4646,9 @@
         </w:tabs>
         <w:ind w:left="720"/>
       </w:pPr>
-      <w:proofErr w:type="spellStart"/>
       <w:r>
         <w:t>kubectl</w:t>
       </w:r>
-      <w:proofErr w:type="spellEnd"/>
     </w:p>
     <w:p>
       <w:pPr>
@@ -4949,11 +4734,9 @@
         </w:tabs>
         <w:ind w:left="720"/>
       </w:pPr>
-      <w:proofErr w:type="spellStart"/>
       <w:r>
         <w:t>kubelet</w:t>
       </w:r>
-      <w:proofErr w:type="spellEnd"/>
     </w:p>
     <w:p>
       <w:pPr>
@@ -5038,11 +4821,9 @@
         </w:tabs>
         <w:ind w:left="720"/>
       </w:pPr>
-      <w:proofErr w:type="spellStart"/>
       <w:r>
         <w:t>etcd</w:t>
       </w:r>
-      <w:proofErr w:type="spellEnd"/>
     </w:p>
     <w:p>
       <w:pPr>
@@ -5123,337 +4904,307 @@
         </w:tabs>
         <w:ind w:left="720"/>
       </w:pPr>
-      <w:proofErr w:type="spellStart"/>
+      <w:r>
+        <w:t>kube-proxy</w:t>
+      </w:r>
+    </w:p>
+    <w:p>
+      <w:pPr>
+        <w:tabs>
+          <w:tab w:val="left" w:pos="6067"/>
+        </w:tabs>
+        <w:ind w:left="720"/>
+      </w:pPr>
+      <w:r>
+        <w:t xml:space="preserve"> ↓</w:t>
+      </w:r>
+    </w:p>
+    <w:p>
+      <w:pPr>
+        <w:tabs>
+          <w:tab w:val="left" w:pos="6067"/>
+        </w:tabs>
+        <w:ind w:left="720"/>
+      </w:pPr>
+      <w:r>
+        <w:t>Handles networking</w:t>
+      </w:r>
+    </w:p>
+    <w:p>
+      <w:pPr>
+        <w:tabs>
+          <w:tab w:val="left" w:pos="6067"/>
+        </w:tabs>
+      </w:pPr>
+    </w:p>
+    <w:p>
+      <w:pPr>
+        <w:tabs>
+          <w:tab w:val="left" w:pos="6067"/>
+        </w:tabs>
+      </w:pPr>
+      <w:r>
+        <w:t>7. Complete Architecture</w:t>
+      </w:r>
+    </w:p>
+    <w:p>
+      <w:pPr>
+        <w:tabs>
+          <w:tab w:val="left" w:pos="6067"/>
+        </w:tabs>
+      </w:pPr>
+      <w:r>
+        <w:t xml:space="preserve">                                                                             Kubernetes Cluster</w:t>
+      </w:r>
+    </w:p>
+    <w:p>
+      <w:pPr>
+        <w:tabs>
+          <w:tab w:val="left" w:pos="6067"/>
+        </w:tabs>
+      </w:pPr>
+      <w:r>
+        <w:t xml:space="preserve">                                                                                          │</w:t>
+      </w:r>
+    </w:p>
+    <w:p>
+      <w:pPr>
+        <w:tabs>
+          <w:tab w:val="left" w:pos="6067"/>
+        </w:tabs>
+      </w:pPr>
+      <w:r>
+        <w:t xml:space="preserve">          ┌───────────---------------------------------───</w:t>
+      </w:r>
+      <w:r>
+        <w:rPr>
+          <w:rFonts w:ascii="MS Gothic" w:eastAsia="MS Gothic" w:hAnsi="MS Gothic" w:cs="MS Gothic" w:hint="eastAsia"/>
+        </w:rPr>
+        <w:t>┴</w:t>
+      </w:r>
+      <w:r>
+        <w:rPr>
+          <w:rFonts w:ascii="Calibri" w:hAnsi="Calibri" w:cs="Calibri"/>
+        </w:rPr>
+        <w:t>─-----------------------─────────────┐</w:t>
+      </w:r>
+    </w:p>
+    <w:p>
+      <w:pPr>
+        <w:tabs>
+          <w:tab w:val="left" w:pos="6067"/>
+        </w:tabs>
+      </w:pPr>
+      <w:r>
+        <w:t xml:space="preserve">          │                                                                                                                                             │</w:t>
+      </w:r>
+    </w:p>
+    <w:p>
+      <w:pPr>
+        <w:tabs>
+          <w:tab w:val="left" w:pos="6067"/>
+        </w:tabs>
+      </w:pPr>
+      <w:r>
+        <w:t xml:space="preserve">     CONTROL PLANE                                                                                                         DATA PLANE</w:t>
+      </w:r>
+    </w:p>
+    <w:p>
+      <w:pPr>
+        <w:tabs>
+          <w:tab w:val="left" w:pos="6067"/>
+        </w:tabs>
+      </w:pPr>
+      <w:r>
+        <w:t xml:space="preserve">      (Master)                                                                                                                  (Worker Nodes)</w:t>
+      </w:r>
+    </w:p>
+    <w:p>
+      <w:pPr>
+        <w:tabs>
+          <w:tab w:val="left" w:pos="6067"/>
+        </w:tabs>
+      </w:pPr>
+      <w:r>
+        <w:t xml:space="preserve">          │                                                                                                                                          │</w:t>
+      </w:r>
+    </w:p>
+    <w:p>
+      <w:pPr>
+        <w:tabs>
+          <w:tab w:val="left" w:pos="6067"/>
+        </w:tabs>
+      </w:pPr>
+      <w:r>
+        <w:t xml:space="preserve">   ┌────</w:t>
+      </w:r>
+      <w:r>
+        <w:t>-------</w:t>
+      </w:r>
+      <w:r>
+        <w:t>──</w:t>
+      </w:r>
+      <w:r>
+        <w:rPr>
+          <w:rFonts w:ascii="MS Gothic" w:eastAsia="MS Gothic" w:hAnsi="MS Gothic" w:cs="MS Gothic" w:hint="eastAsia"/>
+        </w:rPr>
+        <w:t>┼</w:t>
+      </w:r>
+      <w:r>
+        <w:rPr>
+          <w:rFonts w:ascii="Calibri" w:hAnsi="Calibri" w:cs="Calibri"/>
+        </w:rPr>
+        <w:t>─────</w:t>
+      </w:r>
+      <w:r>
+        <w:rPr>
+          <w:rFonts w:ascii="Calibri" w:hAnsi="Calibri" w:cs="Calibri"/>
+        </w:rPr>
+        <w:t>--------</w:t>
+      </w:r>
+      <w:r>
+        <w:rPr>
+          <w:rFonts w:ascii="Calibri" w:hAnsi="Calibri" w:cs="Calibri"/>
+        </w:rPr>
+        <w:t>─┐</w:t>
+      </w:r>
+      <w:r>
+        <w:t xml:space="preserve">               </w:t>
+      </w:r>
+      <w:r>
+        <w:t xml:space="preserve">                                                  </w:t>
+      </w:r>
+      <w:r>
+        <w:rPr>
+          <w:rFonts w:ascii="Calibri" w:hAnsi="Calibri" w:cs="Calibri"/>
+        </w:rPr>
+        <w:t>┌─</w:t>
+      </w:r>
+      <w:r>
+        <w:rPr>
+          <w:rFonts w:ascii="Calibri" w:hAnsi="Calibri" w:cs="Calibri"/>
+        </w:rPr>
+        <w:t>-----</w:t>
+      </w:r>
+      <w:r>
+        <w:rPr>
+          <w:rFonts w:ascii="Calibri" w:hAnsi="Calibri" w:cs="Calibri"/>
+        </w:rPr>
+        <w:t>───</w:t>
+      </w:r>
+      <w:r>
+        <w:rPr>
+          <w:rFonts w:ascii="Calibri" w:hAnsi="Calibri" w:cs="Calibri"/>
+        </w:rPr>
+        <w:t>--</w:t>
+      </w:r>
+      <w:r>
+        <w:rPr>
+          <w:rFonts w:ascii="Calibri" w:hAnsi="Calibri" w:cs="Calibri"/>
+        </w:rPr>
+        <w:t>──</w:t>
+      </w:r>
+      <w:r>
+        <w:rPr>
+          <w:rFonts w:ascii="MS Gothic" w:eastAsia="MS Gothic" w:hAnsi="MS Gothic" w:cs="MS Gothic" w:hint="eastAsia"/>
+        </w:rPr>
+        <w:t>┼</w:t>
+      </w:r>
+      <w:r>
+        <w:rPr>
+          <w:rFonts w:ascii="Calibri" w:hAnsi="Calibri" w:cs="Calibri"/>
+        </w:rPr>
+        <w:t>──</w:t>
+      </w:r>
+      <w:r>
+        <w:rPr>
+          <w:rFonts w:ascii="Calibri" w:hAnsi="Calibri" w:cs="Calibri"/>
+        </w:rPr>
+        <w:t>------</w:t>
+      </w:r>
+      <w:r>
+        <w:rPr>
+          <w:rFonts w:ascii="Calibri" w:hAnsi="Calibri" w:cs="Calibri"/>
+        </w:rPr>
+        <w:t>────┐</w:t>
+      </w:r>
+    </w:p>
+    <w:p>
+      <w:pPr>
+        <w:tabs>
+          <w:tab w:val="left" w:pos="6067"/>
+        </w:tabs>
+      </w:pPr>
+      <w:r>
+        <w:t xml:space="preserve">   │      </w:t>
+      </w:r>
+      <w:r>
+        <w:t xml:space="preserve">                  </w:t>
+      </w:r>
+      <w:r>
+        <w:t xml:space="preserve">│      </w:t>
+      </w:r>
+      <w:r>
+        <w:t xml:space="preserve">                   </w:t>
+      </w:r>
+      <w:r>
+        <w:t xml:space="preserve">│               </w:t>
+      </w:r>
+      <w:r>
+        <w:t xml:space="preserve">                                                  </w:t>
+      </w:r>
+      <w:r>
+        <w:t>│</w:t>
+      </w:r>
+      <w:r>
+        <w:t xml:space="preserve">                  </w:t>
+      </w:r>
+      <w:r>
+        <w:t xml:space="preserve">      │  </w:t>
+      </w:r>
+      <w:r>
+        <w:t xml:space="preserve">                 </w:t>
+      </w:r>
+      <w:r>
+        <w:t xml:space="preserve">    │</w:t>
+      </w:r>
+    </w:p>
+    <w:p>
+      <w:pPr>
+        <w:tabs>
+          <w:tab w:val="left" w:pos="6067"/>
+        </w:tabs>
+      </w:pPr>
+      <w:r>
+        <w:t xml:space="preserve"> API  </w:t>
+      </w:r>
+      <w:r>
+        <w:t xml:space="preserve">             </w:t>
+      </w:r>
+      <w:r>
+        <w:t xml:space="preserve"> Scheduler </w:t>
+      </w:r>
+      <w:r>
+        <w:t xml:space="preserve">             </w:t>
+      </w:r>
+      <w:r>
+        <w:t xml:space="preserve">etcd          </w:t>
+      </w:r>
+      <w:r>
+        <w:t xml:space="preserve">                                              </w:t>
+      </w:r>
+      <w:r>
+        <w:t>kubelet</w:t>
+      </w:r>
+      <w:r>
+        <w:t xml:space="preserve">         </w:t>
+      </w:r>
       <w:r>
         <w:t>kube</w:t>
       </w:r>
-      <w:proofErr w:type="spellEnd"/>
-      <w:r>
-        <w:t>-proxy</w:t>
-      </w:r>
-    </w:p>
-    <w:p>
-      <w:pPr>
-        <w:tabs>
-          <w:tab w:val="left" w:pos="6067"/>
-        </w:tabs>
-        <w:ind w:left="720"/>
-      </w:pPr>
-      <w:r>
-        <w:t xml:space="preserve"> ↓</w:t>
-      </w:r>
-    </w:p>
-    <w:p>
-      <w:pPr>
-        <w:tabs>
-          <w:tab w:val="left" w:pos="6067"/>
-        </w:tabs>
-        <w:ind w:left="720"/>
-      </w:pPr>
-      <w:r>
-        <w:t>Handles networking</w:t>
-      </w:r>
-    </w:p>
-    <w:p>
-      <w:pPr>
-        <w:tabs>
-          <w:tab w:val="left" w:pos="6067"/>
-        </w:tabs>
-      </w:pPr>
-    </w:p>
-    <w:p>
-      <w:pPr>
-        <w:tabs>
-          <w:tab w:val="left" w:pos="6067"/>
-        </w:tabs>
-      </w:pPr>
-      <w:r>
-        <w:t>7. Complete Architecture</w:t>
-      </w:r>
-    </w:p>
-    <w:p>
-      <w:pPr>
-        <w:tabs>
-          <w:tab w:val="left" w:pos="6067"/>
-        </w:tabs>
-      </w:pPr>
-      <w:r>
-        <w:t xml:space="preserve">                                                                             Kubernetes Cluster</w:t>
-      </w:r>
-    </w:p>
-    <w:p>
-      <w:pPr>
-        <w:tabs>
-          <w:tab w:val="left" w:pos="6067"/>
-        </w:tabs>
-      </w:pPr>
-      <w:r>
-        <w:t xml:space="preserve">                                                                                          │</w:t>
-      </w:r>
-    </w:p>
-    <w:p>
-      <w:pPr>
-        <w:tabs>
-          <w:tab w:val="left" w:pos="6067"/>
-        </w:tabs>
-      </w:pPr>
-      <w:r>
-        <w:t xml:space="preserve">          ┌───────────---------------------------------───</w:t>
-      </w:r>
-      <w:r>
-        <w:rPr>
-          <w:rFonts w:ascii="MS Gothic" w:eastAsia="MS Gothic" w:hAnsi="MS Gothic" w:cs="MS Gothic" w:hint="eastAsia"/>
-        </w:rPr>
-        <w:t>┴</w:t>
-      </w:r>
-      <w:r>
-        <w:rPr>
-          <w:rFonts w:ascii="Calibri" w:hAnsi="Calibri" w:cs="Calibri"/>
-        </w:rPr>
-        <w:t>─-----------------------─────────────┐</w:t>
-      </w:r>
-    </w:p>
-    <w:p>
-      <w:pPr>
-        <w:tabs>
-          <w:tab w:val="left" w:pos="6067"/>
-        </w:tabs>
-      </w:pPr>
-      <w:r>
-        <w:t xml:space="preserve">          │                                                                                                                                             │</w:t>
-      </w:r>
-    </w:p>
-    <w:p>
-      <w:pPr>
-        <w:tabs>
-          <w:tab w:val="left" w:pos="6067"/>
-        </w:tabs>
-      </w:pPr>
-      <w:r>
-        <w:t xml:space="preserve">     CONTROL PLANE                                                                                                         DATA PLANE</w:t>
-      </w:r>
-    </w:p>
-    <w:p>
-      <w:pPr>
-        <w:tabs>
-          <w:tab w:val="left" w:pos="6067"/>
-        </w:tabs>
-      </w:pPr>
-      <w:r>
-        <w:t xml:space="preserve">      (</w:t>
-      </w:r>
-      <w:proofErr w:type="gramStart"/>
-      <w:r>
-        <w:t xml:space="preserve">Master)   </w:t>
-      </w:r>
-      <w:proofErr w:type="gramEnd"/>
-      <w:r>
-        <w:t xml:space="preserve">                                                                                                            </w:t>
-      </w:r>
-      <w:proofErr w:type="gramStart"/>
-      <w:r>
-        <w:t xml:space="preserve">   (</w:t>
-      </w:r>
-      <w:proofErr w:type="gramEnd"/>
-      <w:r>
-        <w:t>Worker Nodes)</w:t>
-      </w:r>
-    </w:p>
-    <w:p>
-      <w:pPr>
-        <w:tabs>
-          <w:tab w:val="left" w:pos="6067"/>
-        </w:tabs>
-      </w:pPr>
-      <w:r>
-        <w:t xml:space="preserve">          │                                                                                                                                          │</w:t>
-      </w:r>
-    </w:p>
-    <w:p>
-      <w:pPr>
-        <w:tabs>
-          <w:tab w:val="left" w:pos="6067"/>
-        </w:tabs>
-      </w:pPr>
-      <w:r>
-        <w:t xml:space="preserve">   ┌────</w:t>
-      </w:r>
-      <w:r>
-        <w:t>-------</w:t>
-      </w:r>
-      <w:r>
-        <w:t>──</w:t>
-      </w:r>
-      <w:r>
-        <w:rPr>
-          <w:rFonts w:ascii="MS Gothic" w:eastAsia="MS Gothic" w:hAnsi="MS Gothic" w:cs="MS Gothic" w:hint="eastAsia"/>
-        </w:rPr>
-        <w:t>┼</w:t>
-      </w:r>
-      <w:r>
-        <w:rPr>
-          <w:rFonts w:ascii="Calibri" w:hAnsi="Calibri" w:cs="Calibri"/>
-        </w:rPr>
-        <w:t>─────</w:t>
-      </w:r>
-      <w:r>
-        <w:rPr>
-          <w:rFonts w:ascii="Calibri" w:hAnsi="Calibri" w:cs="Calibri"/>
-        </w:rPr>
-        <w:t>--------</w:t>
-      </w:r>
-      <w:r>
-        <w:rPr>
-          <w:rFonts w:ascii="Calibri" w:hAnsi="Calibri" w:cs="Calibri"/>
-        </w:rPr>
-        <w:t>─┐</w:t>
-      </w:r>
-      <w:r>
-        <w:t xml:space="preserve">               </w:t>
-      </w:r>
-      <w:r>
-        <w:t xml:space="preserve">                                                  </w:t>
-      </w:r>
-      <w:r>
-        <w:rPr>
-          <w:rFonts w:ascii="Calibri" w:hAnsi="Calibri" w:cs="Calibri"/>
-        </w:rPr>
-        <w:t>┌─</w:t>
-      </w:r>
-      <w:r>
-        <w:rPr>
-          <w:rFonts w:ascii="Calibri" w:hAnsi="Calibri" w:cs="Calibri"/>
-        </w:rPr>
-        <w:t>-----</w:t>
-      </w:r>
-      <w:r>
-        <w:rPr>
-          <w:rFonts w:ascii="Calibri" w:hAnsi="Calibri" w:cs="Calibri"/>
-        </w:rPr>
-        <w:t>───</w:t>
-      </w:r>
-      <w:r>
-        <w:rPr>
-          <w:rFonts w:ascii="Calibri" w:hAnsi="Calibri" w:cs="Calibri"/>
-        </w:rPr>
-        <w:t>--</w:t>
-      </w:r>
-      <w:r>
-        <w:rPr>
-          <w:rFonts w:ascii="Calibri" w:hAnsi="Calibri" w:cs="Calibri"/>
-        </w:rPr>
-        <w:t>──</w:t>
-      </w:r>
-      <w:r>
-        <w:rPr>
-          <w:rFonts w:ascii="MS Gothic" w:eastAsia="MS Gothic" w:hAnsi="MS Gothic" w:cs="MS Gothic" w:hint="eastAsia"/>
-        </w:rPr>
-        <w:t>┼</w:t>
-      </w:r>
-      <w:r>
-        <w:rPr>
-          <w:rFonts w:ascii="Calibri" w:hAnsi="Calibri" w:cs="Calibri"/>
-        </w:rPr>
-        <w:t>──</w:t>
-      </w:r>
-      <w:r>
-        <w:rPr>
-          <w:rFonts w:ascii="Calibri" w:hAnsi="Calibri" w:cs="Calibri"/>
-        </w:rPr>
-        <w:t>------</w:t>
-      </w:r>
-      <w:r>
-        <w:rPr>
-          <w:rFonts w:ascii="Calibri" w:hAnsi="Calibri" w:cs="Calibri"/>
-        </w:rPr>
-        <w:t>────┐</w:t>
-      </w:r>
-    </w:p>
-    <w:p>
-      <w:pPr>
-        <w:tabs>
-          <w:tab w:val="left" w:pos="6067"/>
-        </w:tabs>
-      </w:pPr>
-      <w:r>
-        <w:t xml:space="preserve">   │      </w:t>
-      </w:r>
-      <w:r>
-        <w:t xml:space="preserve">                  </w:t>
-      </w:r>
-      <w:r>
-        <w:t xml:space="preserve">│      </w:t>
-      </w:r>
-      <w:r>
-        <w:t xml:space="preserve">                   </w:t>
-      </w:r>
-      <w:r>
-        <w:t xml:space="preserve">│               </w:t>
-      </w:r>
-      <w:r>
-        <w:t xml:space="preserve">                                                  </w:t>
-      </w:r>
-      <w:r>
-        <w:t>│</w:t>
-      </w:r>
-      <w:r>
-        <w:t xml:space="preserve">                  </w:t>
-      </w:r>
-      <w:r>
-        <w:t xml:space="preserve">      │  </w:t>
-      </w:r>
-      <w:r>
-        <w:t xml:space="preserve">                 </w:t>
-      </w:r>
-      <w:r>
-        <w:t xml:space="preserve">    │</w:t>
-      </w:r>
-    </w:p>
-    <w:p>
-      <w:pPr>
-        <w:tabs>
-          <w:tab w:val="left" w:pos="6067"/>
-        </w:tabs>
-      </w:pPr>
-      <w:r>
-        <w:t xml:space="preserve"> API  </w:t>
-      </w:r>
-      <w:r>
-        <w:t xml:space="preserve">             </w:t>
-      </w:r>
-      <w:r>
-        <w:t xml:space="preserve"> Scheduler </w:t>
-      </w:r>
-      <w:r>
-        <w:t xml:space="preserve">             </w:t>
-      </w:r>
-      <w:proofErr w:type="spellStart"/>
-      <w:r>
-        <w:t>etcd</w:t>
-      </w:r>
-      <w:proofErr w:type="spellEnd"/>
-      <w:r>
-        <w:t xml:space="preserve">          </w:t>
-      </w:r>
-      <w:r>
-        <w:t xml:space="preserve">                                              </w:t>
-      </w:r>
-      <w:proofErr w:type="spellStart"/>
-      <w:r>
-        <w:t>kubelet</w:t>
-      </w:r>
-      <w:proofErr w:type="spellEnd"/>
-      <w:r>
-        <w:t xml:space="preserve">         </w:t>
-      </w:r>
-      <w:proofErr w:type="spellStart"/>
-      <w:r>
-        <w:t>kube</w:t>
-      </w:r>
       <w:r>
         <w:t>proxy</w:t>
       </w:r>
-      <w:proofErr w:type="spellEnd"/>
       <w:r>
         <w:t xml:space="preserve">  </w:t>
       </w:r>
@@ -5673,15 +5424,7 @@
               <w:t>🚪</w:t>
             </w:r>
             <w:r>
-              <w:t xml:space="preserve"> Entry point; receives requests from </w:t>
-            </w:r>
-            <w:proofErr w:type="spellStart"/>
-            <w:r>
-              <w:t>kubectl</w:t>
-            </w:r>
-            <w:proofErr w:type="spellEnd"/>
-            <w:r>
-              <w:t xml:space="preserve"> and other components.</w:t>
+              <w:t xml:space="preserve"> Entry point; receives requests from kubectl and other components.</w:t>
             </w:r>
           </w:p>
         </w:tc>
@@ -5702,7 +5445,6 @@
                 <w:tab w:val="left" w:pos="6067"/>
               </w:tabs>
             </w:pPr>
-            <w:proofErr w:type="spellStart"/>
             <w:r>
               <w:rPr>
                 <w:b/>
@@ -5711,7 +5453,6 @@
               <w:lastRenderedPageBreak/>
               <w:t>etcd</w:t>
             </w:r>
-            <w:proofErr w:type="spellEnd"/>
           </w:p>
         </w:tc>
         <w:tc>
@@ -5941,7 +5682,6 @@
                 <w:tab w:val="left" w:pos="6067"/>
               </w:tabs>
             </w:pPr>
-            <w:proofErr w:type="spellStart"/>
             <w:r>
               <w:rPr>
                 <w:b/>
@@ -5949,7 +5689,6 @@
               </w:rPr>
               <w:t>kubelet</w:t>
             </w:r>
-            <w:proofErr w:type="spellEnd"/>
           </w:p>
         </w:tc>
         <w:tc>
@@ -6002,21 +5741,12 @@
                 <w:tab w:val="left" w:pos="6067"/>
               </w:tabs>
             </w:pPr>
-            <w:proofErr w:type="spellStart"/>
             <w:r>
               <w:rPr>
                 <w:b/>
                 <w:bCs/>
               </w:rPr>
-              <w:t>kube</w:t>
-            </w:r>
-            <w:proofErr w:type="spellEnd"/>
-            <w:r>
-              <w:rPr>
-                <w:b/>
-                <w:bCs/>
-              </w:rPr>
-              <w:t>-proxy</w:t>
+              <w:t>kube-proxy</w:t>
             </w:r>
           </w:p>
         </w:tc>
@@ -6108,15 +5838,7 @@
               <w:t>runs containers</w:t>
             </w:r>
             <w:r>
-              <w:t xml:space="preserve"> (</w:t>
-            </w:r>
-            <w:proofErr w:type="spellStart"/>
-            <w:r>
-              <w:t>containerd</w:t>
-            </w:r>
-            <w:proofErr w:type="spellEnd"/>
-            <w:r>
-              <w:t>, CRI-O).</w:t>
+              <w:t xml:space="preserve"> (containerd, CRI-O).</w:t>
             </w:r>
           </w:p>
         </w:tc>
@@ -6232,14 +5954,7 @@
       </w:r>
       <w:r>
         <w:br/>
-      </w:r>
-      <w:proofErr w:type="spellStart"/>
-      <w:r>
-        <w:t>etcd</w:t>
-      </w:r>
-      <w:proofErr w:type="spellEnd"/>
-      <w:r>
-        <w:t xml:space="preserve"> → Store</w:t>
+        <w:t>etcd → Store</w:t>
       </w:r>
       <w:r>
         <w:br/>
@@ -6251,25 +5966,11 @@
       </w:r>
       <w:r>
         <w:br/>
-      </w:r>
-      <w:proofErr w:type="spellStart"/>
-      <w:r>
-        <w:t>kubelet</w:t>
-      </w:r>
-      <w:proofErr w:type="spellEnd"/>
-      <w:r>
-        <w:t xml:space="preserve"> → Manage Pods</w:t>
+        <w:t>kubelet → Manage Pods</w:t>
       </w:r>
       <w:r>
         <w:br/>
-      </w:r>
-      <w:proofErr w:type="spellStart"/>
-      <w:r>
-        <w:t>kube</w:t>
-      </w:r>
-      <w:proofErr w:type="spellEnd"/>
-      <w:r>
-        <w:t>-proxy → Network</w:t>
+        <w:t>kube-proxy → Network</w:t>
       </w:r>
       <w:r>
         <w:br/>
@@ -6396,27 +6097,7 @@
           <w:sz w:val="32"/>
           <w:szCs w:val="32"/>
         </w:rPr>
-        <w:t xml:space="preserve">3.) How to Manage Hundreds of Kubernetes </w:t>
-      </w:r>
-      <w:proofErr w:type="gramStart"/>
-      <w:r>
-        <w:rPr>
-          <w:b/>
-          <w:bCs/>
-          <w:sz w:val="32"/>
-          <w:szCs w:val="32"/>
-        </w:rPr>
-        <w:t>clusters ???</w:t>
-      </w:r>
-      <w:proofErr w:type="gramEnd"/>
-      <w:r>
-        <w:rPr>
-          <w:b/>
-          <w:bCs/>
-          <w:sz w:val="32"/>
-          <w:szCs w:val="32"/>
-        </w:rPr>
-        <w:t xml:space="preserve"> | KOPS</w:t>
+        <w:t>3.) How to Manage Hundreds of Kubernetes clusters ??? | KOPS</w:t>
       </w:r>
     </w:p>
     <w:p>
@@ -6457,13 +6138,8 @@
           <w:tab w:val="left" w:pos="6067"/>
         </w:tabs>
       </w:pPr>
-      <w:proofErr w:type="spellStart"/>
-      <w:r>
-        <w:t>Minikube</w:t>
-      </w:r>
-      <w:proofErr w:type="spellEnd"/>
-      <w:r>
-        <w:t xml:space="preserve"> </w:t>
+      <w:r>
+        <w:t xml:space="preserve">Minikube </w:t>
       </w:r>
     </w:p>
     <w:p>
@@ -6670,13 +6346,8 @@
           <w:tab w:val="left" w:pos="6067"/>
         </w:tabs>
       </w:pPr>
-      <w:proofErr w:type="gramStart"/>
-      <w:r>
-        <w:t>So</w:t>
-      </w:r>
-      <w:proofErr w:type="gramEnd"/>
-      <w:r>
-        <w:t xml:space="preserve"> a DevOps engineer needs tools that can manage the </w:t>
+      <w:r>
+        <w:t xml:space="preserve">So a DevOps engineer needs tools that can manage the </w:t>
       </w:r>
       <w:r>
         <w:rPr>
@@ -6796,11 +6467,9 @@
                 <w:tab w:val="left" w:pos="6067"/>
               </w:tabs>
             </w:pPr>
-            <w:proofErr w:type="spellStart"/>
             <w:r>
               <w:t>Minikube</w:t>
             </w:r>
-            <w:proofErr w:type="spellEnd"/>
           </w:p>
         </w:tc>
         <w:tc>
@@ -6838,13 +6507,8 @@
                 <w:tab w:val="left" w:pos="6067"/>
               </w:tabs>
             </w:pPr>
-            <w:proofErr w:type="gramStart"/>
             <w:r>
-              <w:t>Usually</w:t>
-            </w:r>
-            <w:proofErr w:type="gramEnd"/>
-            <w:r>
-              <w:t xml:space="preserve"> single node</w:t>
+              <w:t>Usually single node</w:t>
             </w:r>
           </w:p>
         </w:tc>
@@ -7062,13 +6726,8 @@
               </w:tabs>
             </w:pPr>
             <w:r>
-              <w:t xml:space="preserve">Cloud / Data </w:t>
+              <w:t>Cloud / Data Center</w:t>
             </w:r>
-            <w:proofErr w:type="spellStart"/>
-            <w:r>
-              <w:t>Center</w:t>
-            </w:r>
-            <w:proofErr w:type="spellEnd"/>
           </w:p>
         </w:tc>
       </w:tr>
@@ -7097,28 +6756,18 @@
         </w:rPr>
         <w:t xml:space="preserve">: </w:t>
       </w:r>
-      <w:proofErr w:type="spellStart"/>
-      <w:r>
-        <w:t>Minikube</w:t>
-      </w:r>
-      <w:proofErr w:type="spellEnd"/>
-      <w:r>
-        <w:t xml:space="preserve"> is NOT a replacement for a production Kubernetes cluster.</w:t>
-      </w:r>
-    </w:p>
-    <w:p>
-      <w:pPr>
-        <w:tabs>
-          <w:tab w:val="left" w:pos="6067"/>
-        </w:tabs>
-      </w:pPr>
-      <w:proofErr w:type="spellStart"/>
-      <w:r>
-        <w:t>Minikube</w:t>
-      </w:r>
-      <w:proofErr w:type="spellEnd"/>
-      <w:r>
-        <w:t xml:space="preserve"> is excellent for learning Kubernetes concepts, but production environments require much more infrastructure.</w:t>
+      <w:r>
+        <w:t>Minikube is NOT a replacement for a production Kubernetes cluster.</w:t>
+      </w:r>
+    </w:p>
+    <w:p>
+      <w:pPr>
+        <w:tabs>
+          <w:tab w:val="left" w:pos="6067"/>
+        </w:tabs>
+      </w:pPr>
+      <w:r>
+        <w:t>Minikube is excellent for learning Kubernetes concepts, but production environments require much more infrastructure.</w:t>
       </w:r>
     </w:p>
     <w:p>
@@ -7868,21 +7517,8 @@
         </w:tabs>
       </w:pPr>
       <w:r>
-        <w:t xml:space="preserve">    Workers                                                              </w:t>
-      </w:r>
-      <w:proofErr w:type="spellStart"/>
-      <w:r>
-        <w:t>Workers</w:t>
-      </w:r>
-      <w:proofErr w:type="spellEnd"/>
-      <w:r>
-        <w:t xml:space="preserve">                                                                </w:t>
-      </w:r>
-      <w:proofErr w:type="spellStart"/>
-      <w:r>
-        <w:t>Workers</w:t>
-      </w:r>
-      <w:proofErr w:type="spellEnd"/>
+        <w:t xml:space="preserve">    Workers                                                              Workers                                                                Workers</w:t>
+      </w:r>
     </w:p>
     <w:p>
       <w:pPr>
@@ -8136,11 +7772,9 @@
         </w:tabs>
         <w:ind w:left="2880"/>
       </w:pPr>
-      <w:proofErr w:type="spellStart"/>
       <w:r>
         <w:t>etcd</w:t>
       </w:r>
-      <w:proofErr w:type="spellEnd"/>
     </w:p>
     <w:p>
       <w:pPr>
@@ -9065,13 +8699,8 @@
       <w:r>
         <w:t xml:space="preserve"> </w:t>
       </w:r>
-      <w:proofErr w:type="spellStart"/>
-      <w:r>
-        <w:t>aws</w:t>
-      </w:r>
-      <w:proofErr w:type="spellEnd"/>
-      <w:r>
-        <w:t xml:space="preserve"> configure</w:t>
+      <w:r>
+        <w:t>aws configure</w:t>
       </w:r>
     </w:p>
     <w:p>
@@ -9214,11 +8843,9 @@
         </w:tabs>
         <w:ind w:left="720"/>
       </w:pPr>
-      <w:proofErr w:type="spellStart"/>
       <w:r>
         <w:t>kubectl</w:t>
       </w:r>
-      <w:proofErr w:type="spellEnd"/>
     </w:p>
     <w:p>
       <w:pPr>
@@ -9358,25 +8985,18 @@
         </w:tabs>
         <w:ind w:left="720"/>
       </w:pPr>
-      <w:proofErr w:type="spellStart"/>
       <w:r>
         <w:t>Kubectl</w:t>
       </w:r>
-      <w:proofErr w:type="spellEnd"/>
-    </w:p>
-    <w:p>
-      <w:pPr>
-        <w:tabs>
-          <w:tab w:val="left" w:pos="6067"/>
-        </w:tabs>
-      </w:pPr>
-      <w:proofErr w:type="spellStart"/>
-      <w:r>
-        <w:t>kubectl</w:t>
-      </w:r>
-      <w:proofErr w:type="spellEnd"/>
-      <w:r>
-        <w:t xml:space="preserve"> is used to interact with the Kubernetes cluster after it is available.</w:t>
+    </w:p>
+    <w:p>
+      <w:pPr>
+        <w:tabs>
+          <w:tab w:val="left" w:pos="6067"/>
+        </w:tabs>
+      </w:pPr>
+      <w:r>
+        <w:t>kubectl is used to interact with the Kubernetes cluster after it is available.</w:t>
       </w:r>
     </w:p>
     <w:p>
@@ -10737,94 +10357,71 @@
           <w:b/>
           <w:bCs/>
         </w:rPr>
-        <w:t xml:space="preserve">7. What is </w:t>
-      </w:r>
-      <w:proofErr w:type="spellStart"/>
-      <w:r>
-        <w:rPr>
-          <w:b/>
-          <w:bCs/>
-        </w:rPr>
+        <w:t>7. What is kubectl?</w:t>
+      </w:r>
+    </w:p>
+    <w:p>
+      <w:pPr>
+        <w:tabs>
+          <w:tab w:val="left" w:pos="6067"/>
+        </w:tabs>
+      </w:pPr>
+      <w:r>
+        <w:t xml:space="preserve">kubectl is the </w:t>
+      </w:r>
+      <w:r>
+        <w:rPr>
+          <w:b/>
+          <w:bCs/>
+        </w:rPr>
+        <w:t>command-line tool used to communicate with and manage a Kubernetes cluster</w:t>
+      </w:r>
+      <w:r>
+        <w:t>.</w:t>
+      </w:r>
+    </w:p>
+    <w:p>
+      <w:pPr>
+        <w:tabs>
+          <w:tab w:val="left" w:pos="6067"/>
+        </w:tabs>
+      </w:pPr>
+      <w:r>
+        <w:t>Think of it as:</w:t>
+      </w:r>
+    </w:p>
+    <w:p>
+      <w:pPr>
+        <w:tabs>
+          <w:tab w:val="left" w:pos="6067"/>
+        </w:tabs>
+        <w:ind w:left="720"/>
+      </w:pPr>
+      <w:r>
+        <w:t>You</w:t>
+      </w:r>
+    </w:p>
+    <w:p>
+      <w:pPr>
+        <w:tabs>
+          <w:tab w:val="left" w:pos="6067"/>
+        </w:tabs>
+        <w:ind w:left="720"/>
+      </w:pPr>
+      <w:r>
+        <w:t xml:space="preserve"> |</w:t>
+      </w:r>
+    </w:p>
+    <w:p>
+      <w:pPr>
+        <w:tabs>
+          <w:tab w:val="left" w:pos="6067"/>
+        </w:tabs>
+        <w:ind w:left="720"/>
+      </w:pPr>
+      <w:r>
         <w:t>kubectl</w:t>
       </w:r>
-      <w:proofErr w:type="spellEnd"/>
-      <w:r>
-        <w:rPr>
-          <w:b/>
-          <w:bCs/>
-        </w:rPr>
-        <w:t>?</w:t>
-      </w:r>
-    </w:p>
-    <w:p>
-      <w:pPr>
-        <w:tabs>
-          <w:tab w:val="left" w:pos="6067"/>
-        </w:tabs>
-      </w:pPr>
-      <w:proofErr w:type="spellStart"/>
-      <w:r>
-        <w:t>kubectl</w:t>
-      </w:r>
-      <w:proofErr w:type="spellEnd"/>
-      <w:r>
-        <w:t xml:space="preserve"> is the </w:t>
-      </w:r>
-      <w:r>
-        <w:rPr>
-          <w:b/>
-          <w:bCs/>
-        </w:rPr>
-        <w:t>command-line tool used to communicate with and manage a Kubernetes cluster</w:t>
-      </w:r>
-      <w:r>
-        <w:t>.</w:t>
-      </w:r>
-    </w:p>
-    <w:p>
-      <w:pPr>
-        <w:tabs>
-          <w:tab w:val="left" w:pos="6067"/>
-        </w:tabs>
-      </w:pPr>
-      <w:r>
-        <w:t>Think of it as:</w:t>
-      </w:r>
-    </w:p>
-    <w:p>
-      <w:pPr>
-        <w:tabs>
-          <w:tab w:val="left" w:pos="6067"/>
-        </w:tabs>
-        <w:ind w:left="720"/>
-      </w:pPr>
-      <w:r>
-        <w:t>You</w:t>
-      </w:r>
-    </w:p>
-    <w:p>
-      <w:pPr>
-        <w:tabs>
-          <w:tab w:val="left" w:pos="6067"/>
-        </w:tabs>
-        <w:ind w:left="720"/>
-      </w:pPr>
-      <w:r>
-        <w:t xml:space="preserve"> |</w:t>
-      </w:r>
-    </w:p>
-    <w:p>
-      <w:pPr>
-        <w:tabs>
-          <w:tab w:val="left" w:pos="6067"/>
-        </w:tabs>
-        <w:ind w:left="720"/>
-      </w:pPr>
-      <w:proofErr w:type="spellStart"/>
-      <w:r>
-        <w:t>kubectl</w:t>
-      </w:r>
-      <w:proofErr w:type="spellEnd"/>
     </w:p>
     <w:p>
       <w:pPr>
@@ -10891,13 +10488,8 @@
           <w:tab w:val="left" w:pos="6067"/>
         </w:tabs>
       </w:pPr>
-      <w:proofErr w:type="spellStart"/>
-      <w:r>
-        <w:t>kubectl</w:t>
-      </w:r>
-      <w:proofErr w:type="spellEnd"/>
-      <w:r>
-        <w:t xml:space="preserve"> get pods</w:t>
+      <w:r>
+        <w:t>kubectl get pods</w:t>
       </w:r>
     </w:p>
     <w:p>
@@ -10911,13 +10503,8 @@
           <w:tab w:val="left" w:pos="6067"/>
         </w:tabs>
       </w:pPr>
-      <w:proofErr w:type="spellStart"/>
-      <w:r>
-        <w:t>kubectl</w:t>
-      </w:r>
-      <w:proofErr w:type="spellEnd"/>
-      <w:r>
-        <w:t xml:space="preserve"> create pod</w:t>
+      <w:r>
+        <w:t>kubectl create pod</w:t>
       </w:r>
     </w:p>
     <w:p>
@@ -10931,13 +10518,8 @@
           <w:tab w:val="left" w:pos="6067"/>
         </w:tabs>
       </w:pPr>
-      <w:proofErr w:type="spellStart"/>
-      <w:r>
-        <w:t>kubectl</w:t>
-      </w:r>
-      <w:proofErr w:type="spellEnd"/>
-      <w:r>
-        <w:t xml:space="preserve"> describe pod</w:t>
+      <w:r>
+        <w:t>kubectl describe pod</w:t>
       </w:r>
     </w:p>
     <w:p>
@@ -10951,13 +10533,8 @@
           <w:tab w:val="left" w:pos="6067"/>
         </w:tabs>
       </w:pPr>
-      <w:proofErr w:type="spellStart"/>
-      <w:r>
-        <w:t>kubectl</w:t>
-      </w:r>
-      <w:proofErr w:type="spellEnd"/>
-      <w:r>
-        <w:t xml:space="preserve"> logs</w:t>
+      <w:r>
+        <w:t>kubectl logs</w:t>
       </w:r>
     </w:p>
     <w:p>
@@ -10971,54 +10548,33 @@
           <w:tab w:val="left" w:pos="6067"/>
         </w:tabs>
       </w:pPr>
-      <w:proofErr w:type="spellStart"/>
-      <w:r>
-        <w:t>kubectl</w:t>
-      </w:r>
-      <w:proofErr w:type="spellEnd"/>
-      <w:r>
-        <w:t xml:space="preserve"> delete pod</w:t>
-      </w:r>
-    </w:p>
-    <w:p>
-      <w:pPr>
-        <w:tabs>
-          <w:tab w:val="left" w:pos="6067"/>
-        </w:tabs>
-      </w:pPr>
-    </w:p>
-    <w:p>
-      <w:pPr>
-        <w:tabs>
-          <w:tab w:val="left" w:pos="6067"/>
-        </w:tabs>
-        <w:rPr>
-          <w:b/>
-          <w:bCs/>
-        </w:rPr>
-      </w:pPr>
-      <w:r>
-        <w:rPr>
-          <w:b/>
-          <w:bCs/>
-        </w:rPr>
-        <w:t xml:space="preserve">8. </w:t>
-      </w:r>
-      <w:proofErr w:type="spellStart"/>
-      <w:r>
-        <w:rPr>
-          <w:b/>
-          <w:bCs/>
-        </w:rPr>
-        <w:t>kubectl</w:t>
-      </w:r>
-      <w:proofErr w:type="spellEnd"/>
-      <w:r>
-        <w:rPr>
-          <w:b/>
-          <w:bCs/>
-        </w:rPr>
-        <w:t xml:space="preserve"> get pods</w:t>
+      <w:r>
+        <w:t>kubectl delete pod</w:t>
+      </w:r>
+    </w:p>
+    <w:p>
+      <w:pPr>
+        <w:tabs>
+          <w:tab w:val="left" w:pos="6067"/>
+        </w:tabs>
+      </w:pPr>
+    </w:p>
+    <w:p>
+      <w:pPr>
+        <w:tabs>
+          <w:tab w:val="left" w:pos="6067"/>
+        </w:tabs>
+        <w:rPr>
+          <w:b/>
+          <w:bCs/>
+        </w:rPr>
+      </w:pPr>
+      <w:r>
+        <w:rPr>
+          <w:b/>
+          <w:bCs/>
+        </w:rPr>
+        <w:t>8. kubectl get pods</w:t>
       </w:r>
     </w:p>
     <w:p>
@@ -11041,13 +10597,8 @@
         </w:tabs>
         <w:ind w:left="720"/>
       </w:pPr>
-      <w:proofErr w:type="spellStart"/>
-      <w:r>
-        <w:t>kubectl</w:t>
-      </w:r>
-      <w:proofErr w:type="spellEnd"/>
-      <w:r>
-        <w:t xml:space="preserve"> get pods</w:t>
+      <w:r>
+        <w:t>kubectl get pods</w:t>
       </w:r>
     </w:p>
     <w:p>
@@ -11068,13 +10619,8 @@
         </w:tabs>
         <w:ind w:left="720"/>
       </w:pPr>
-      <w:proofErr w:type="spellStart"/>
-      <w:r>
-        <w:t>Kubectl</w:t>
-      </w:r>
-      <w:proofErr w:type="spellEnd"/>
-      <w:r>
-        <w:t xml:space="preserve"> get pod</w:t>
+      <w:r>
+        <w:t>Kubectl get pod</w:t>
       </w:r>
     </w:p>
     <w:p>
@@ -11496,32 +11042,22 @@
         </w:tabs>
       </w:pPr>
       <w:r>
-        <w:t xml:space="preserve">9. What is </w:t>
-      </w:r>
-      <w:proofErr w:type="spellStart"/>
-      <w:r>
+        <w:t>9. What is Minikube?</w:t>
+      </w:r>
+    </w:p>
+    <w:p>
+      <w:pPr>
+        <w:tabs>
+          <w:tab w:val="left" w:pos="6067"/>
+        </w:tabs>
+      </w:pPr>
+      <w:r>
+        <w:rPr>
+          <w:b/>
+          <w:bCs/>
+        </w:rPr>
         <w:t>Minikube</w:t>
       </w:r>
-      <w:proofErr w:type="spellEnd"/>
-      <w:r>
-        <w:t>?</w:t>
-      </w:r>
-    </w:p>
-    <w:p>
-      <w:pPr>
-        <w:tabs>
-          <w:tab w:val="left" w:pos="6067"/>
-        </w:tabs>
-      </w:pPr>
-      <w:proofErr w:type="spellStart"/>
-      <w:r>
-        <w:rPr>
-          <w:b/>
-          <w:bCs/>
-        </w:rPr>
-        <w:t>Minikube</w:t>
-      </w:r>
-      <w:proofErr w:type="spellEnd"/>
       <w:r>
         <w:t xml:space="preserve"> is used to run a Kubernetes cluster locally.</w:t>
       </w:r>
@@ -11544,13 +11080,8 @@
         <w:ind w:left="720"/>
       </w:pPr>
       <w:r>
-        <w:t xml:space="preserve">Your </w:t>
-      </w:r>
-      <w:proofErr w:type="gramStart"/>
-      <w:r>
-        <w:t>Laptop</w:t>
-      </w:r>
-      <w:proofErr w:type="gramEnd"/>
+        <w:t>Your Laptop</w:t>
+      </w:r>
     </w:p>
     <w:p>
       <w:pPr>
@@ -11571,13 +11102,8 @@
         <w:ind w:left="720"/>
       </w:pPr>
       <w:r>
-        <w:t xml:space="preserve"> </w:t>
-      </w:r>
-      <w:proofErr w:type="spellStart"/>
-      <w:r>
-        <w:t>Minikube</w:t>
-      </w:r>
-      <w:proofErr w:type="spellEnd"/>
+        <w:t xml:space="preserve"> Minikube</w:t>
+      </w:r>
     </w:p>
     <w:p>
       <w:pPr>
@@ -11755,13 +11281,8 @@
           <w:tab w:val="left" w:pos="6067"/>
         </w:tabs>
       </w:pPr>
-      <w:proofErr w:type="spellStart"/>
-      <w:r>
-        <w:t>minikube</w:t>
-      </w:r>
-      <w:proofErr w:type="spellEnd"/>
-      <w:r>
-        <w:t xml:space="preserve"> start</w:t>
+      <w:r>
+        <w:t>minikube start</w:t>
       </w:r>
     </w:p>
     <w:p>
@@ -11775,13 +11296,8 @@
           <w:tab w:val="left" w:pos="6067"/>
         </w:tabs>
       </w:pPr>
-      <w:proofErr w:type="spellStart"/>
-      <w:r>
-        <w:t>kubectl</w:t>
-      </w:r>
-      <w:proofErr w:type="spellEnd"/>
-      <w:r>
-        <w:t xml:space="preserve"> get nodes</w:t>
+      <w:r>
+        <w:t>kubectl get nodes</w:t>
       </w:r>
       <w:r>
         <w:t xml:space="preserve"> </w:t>
@@ -11824,15 +11340,7 @@
         <w:sym w:font="Wingdings" w:char="F0E0"/>
       </w:r>
       <w:r>
-        <w:t xml:space="preserve"> copy the .</w:t>
-      </w:r>
-      <w:proofErr w:type="spellStart"/>
-      <w:r>
-        <w:t>yaml</w:t>
-      </w:r>
-      <w:proofErr w:type="spellEnd"/>
-      <w:r>
-        <w:t xml:space="preserve"> file </w:t>
+        <w:t xml:space="preserve"> copy the .yaml file </w:t>
       </w:r>
       <w:r>
         <w:sym w:font="Wingdings" w:char="F0E0"/>
@@ -11844,50 +11352,19 @@
         <w:sym w:font="Wingdings" w:char="F0E0"/>
       </w:r>
       <w:r>
-        <w:t xml:space="preserve"> </w:t>
-      </w:r>
-      <w:proofErr w:type="spellStart"/>
-      <w:r>
-        <w:t>Cloud_computing</w:t>
-      </w:r>
-      <w:proofErr w:type="spellEnd"/>
-      <w:r>
-        <w:t xml:space="preserve">/Kubernetes folder </w:t>
+        <w:t xml:space="preserve"> Cloud_computing/Kubernetes folder </w:t>
       </w:r>
       <w:r>
         <w:sym w:font="Wingdings" w:char="F0E0"/>
       </w:r>
       <w:r>
-        <w:t xml:space="preserve"> In </w:t>
-      </w:r>
-      <w:proofErr w:type="spellStart"/>
-      <w:r>
-        <w:t>cmd</w:t>
-      </w:r>
-      <w:proofErr w:type="spellEnd"/>
-      <w:r>
-        <w:t xml:space="preserve"> write “</w:t>
-      </w:r>
-      <w:r>
-        <w:t xml:space="preserve">notepad </w:t>
-      </w:r>
-      <w:proofErr w:type="spellStart"/>
-      <w:proofErr w:type="gramStart"/>
-      <w:r>
-        <w:t>pod.yaml</w:t>
-      </w:r>
-      <w:proofErr w:type="spellEnd"/>
-      <w:proofErr w:type="gramEnd"/>
-      <w:r>
-        <w:t>” to create .</w:t>
-      </w:r>
-      <w:proofErr w:type="spellStart"/>
-      <w:r>
-        <w:t>yaml</w:t>
-      </w:r>
-      <w:proofErr w:type="spellEnd"/>
-      <w:r>
-        <w:t xml:space="preserve"> file </w:t>
+        <w:t xml:space="preserve"> In cmd write “</w:t>
+      </w:r>
+      <w:r>
+        <w:t>notepad pod.yaml</w:t>
+      </w:r>
+      <w:r>
+        <w:t xml:space="preserve">” to create .yaml file </w:t>
       </w:r>
       <w:r>
         <w:sym w:font="Wingdings" w:char="F0E0"/>
@@ -11900,16 +11377,8 @@
           <w:rPr>
             <w:rStyle w:val="Hyperlink"/>
           </w:rPr>
-          <w:t>pods/simple-</w:t>
+          <w:t>pods/simple-pod.yaml</w:t>
         </w:r>
-        <w:proofErr w:type="spellStart"/>
-        <w:r>
-          <w:rPr>
-            <w:rStyle w:val="Hyperlink"/>
-          </w:rPr>
-          <w:t>pod.yaml</w:t>
-        </w:r>
-        <w:proofErr w:type="spellEnd"/>
       </w:hyperlink>
       <w:r>
         <w:t xml:space="preserve"> into it </w:t>
@@ -11940,16 +11409,8 @@
           <w:rPr>
             <w:rStyle w:val="Hyperlink"/>
           </w:rPr>
-          <w:t>pods/simple-</w:t>
+          <w:t>pods/simple-pod.yaml</w:t>
         </w:r>
-        <w:proofErr w:type="spellStart"/>
-        <w:r>
-          <w:rPr>
-            <w:rStyle w:val="Hyperlink"/>
-          </w:rPr>
-          <w:t>pod.yaml</w:t>
-        </w:r>
-        <w:proofErr w:type="spellEnd"/>
       </w:hyperlink>
       <w:r>
         <w:t xml:space="preserve"> file</w:t>
@@ -11966,52 +11427,14 @@
           <w:tab w:val="left" w:pos="6067"/>
         </w:tabs>
       </w:pPr>
-      <w:proofErr w:type="spellStart"/>
-      <w:r>
-        <w:t>kubectl</w:t>
-      </w:r>
-      <w:proofErr w:type="spellEnd"/>
-      <w:r>
-        <w:t xml:space="preserve"> create -f </w:t>
-      </w:r>
-      <w:proofErr w:type="spellStart"/>
-      <w:proofErr w:type="gramStart"/>
-      <w:r>
-        <w:t>pod.yaml</w:t>
-      </w:r>
-      <w:proofErr w:type="spellEnd"/>
-      <w:proofErr w:type="gramEnd"/>
-      <w:r>
-        <w:t xml:space="preserve">: This will </w:t>
-      </w:r>
-      <w:proofErr w:type="gramStart"/>
-      <w:r>
-        <w:t>creates</w:t>
-      </w:r>
-      <w:proofErr w:type="gramEnd"/>
-      <w:r>
-        <w:t xml:space="preserve"> the pod</w:t>
-      </w:r>
-      <w:r>
-        <w:t>. We can also use “</w:t>
-      </w:r>
-      <w:proofErr w:type="spellStart"/>
-      <w:r>
-        <w:t>kubectl</w:t>
-      </w:r>
-      <w:proofErr w:type="spellEnd"/>
-      <w:r>
-        <w:t xml:space="preserve"> apply -f </w:t>
-      </w:r>
-      <w:proofErr w:type="spellStart"/>
-      <w:proofErr w:type="gramStart"/>
-      <w:r>
-        <w:t>pod.yaml</w:t>
-      </w:r>
-      <w:proofErr w:type="spellEnd"/>
-      <w:proofErr w:type="gramEnd"/>
-      <w:r>
-        <w:t>”</w:t>
+      <w:r>
+        <w:t>kubectl create -f pod.yaml</w:t>
+      </w:r>
+      <w:r>
+        <w:t>: This will creates the pod</w:t>
+      </w:r>
+      <w:r>
+        <w:t>. We can also use “kubectl apply -f pod.yaml”</w:t>
       </w:r>
     </w:p>
     <w:p>
@@ -12025,13 +11448,8 @@
           <w:tab w:val="left" w:pos="6067"/>
         </w:tabs>
       </w:pPr>
-      <w:proofErr w:type="spellStart"/>
-      <w:r>
-        <w:t>kubectl</w:t>
-      </w:r>
-      <w:proofErr w:type="spellEnd"/>
-      <w:r>
-        <w:t xml:space="preserve"> get pods</w:t>
+      <w:r>
+        <w:t>kubectl get pods</w:t>
       </w:r>
       <w:r>
         <w:t>: This will verify the pod is created or not</w:t>
@@ -12096,13 +11514,8 @@
           <w:tab w:val="left" w:pos="6067"/>
         </w:tabs>
       </w:pPr>
-      <w:proofErr w:type="spellStart"/>
-      <w:r>
-        <w:t>kubectl</w:t>
-      </w:r>
-      <w:proofErr w:type="spellEnd"/>
-      <w:r>
-        <w:t xml:space="preserve"> get pods</w:t>
+      <w:r>
+        <w:t>kubectl get pods</w:t>
       </w:r>
       <w:r>
         <w:t xml:space="preserve"> -o wide: </w:t>
@@ -12170,13 +11583,8 @@
       <w:r>
         <w:t>Login to the cluster using “</w:t>
       </w:r>
-      <w:proofErr w:type="spellStart"/>
-      <w:r>
-        <w:t>minikube</w:t>
-      </w:r>
-      <w:proofErr w:type="spellEnd"/>
-      <w:r>
-        <w:t xml:space="preserve"> ssh</w:t>
+      <w:r>
+        <w:t>minikube ssh</w:t>
       </w:r>
       <w:r>
         <w:t>”</w:t>
@@ -12242,15 +11650,7 @@
         </w:tabs>
       </w:pPr>
       <w:r>
-        <w:t>curl &lt;</w:t>
-      </w:r>
-      <w:proofErr w:type="spellStart"/>
-      <w:r>
-        <w:t>IP_address</w:t>
-      </w:r>
-      <w:proofErr w:type="spellEnd"/>
-      <w:r>
-        <w:t>&gt;</w:t>
+        <w:t>curl &lt;IP_address&gt;</w:t>
       </w:r>
       <w:r>
         <w:t xml:space="preserve">: </w:t>
@@ -12346,15 +11746,7 @@
         </w:tabs>
       </w:pPr>
       <w:r>
-        <w:t xml:space="preserve">exit: To exit from </w:t>
-      </w:r>
-      <w:proofErr w:type="spellStart"/>
-      <w:r>
-        <w:t>minikube</w:t>
-      </w:r>
-      <w:proofErr w:type="spellEnd"/>
-      <w:r>
-        <w:t xml:space="preserve"> ssh</w:t>
+        <w:t>exit: To exit from minikube ssh</w:t>
       </w:r>
     </w:p>
     <w:p>
@@ -12416,21 +11808,8 @@
           <w:tab w:val="left" w:pos="6067"/>
         </w:tabs>
       </w:pPr>
-      <w:proofErr w:type="spellStart"/>
-      <w:r>
-        <w:t>kubectl</w:t>
-      </w:r>
-      <w:proofErr w:type="spellEnd"/>
-      <w:r>
-        <w:t xml:space="preserve"> delete pod “</w:t>
-      </w:r>
-      <w:proofErr w:type="spellStart"/>
-      <w:r>
-        <w:t>pod_name</w:t>
-      </w:r>
-      <w:proofErr w:type="spellEnd"/>
-      <w:r>
-        <w:t>”</w:t>
+      <w:r>
+        <w:t>kubectl delete pod “pod_name”</w:t>
       </w:r>
     </w:p>
     <w:p>
@@ -12441,15 +11820,7 @@
         </w:tabs>
       </w:pPr>
       <w:r>
-        <w:t xml:space="preserve">ex: </w:t>
-      </w:r>
-      <w:proofErr w:type="spellStart"/>
-      <w:r>
-        <w:t>kubectl</w:t>
-      </w:r>
-      <w:proofErr w:type="spellEnd"/>
-      <w:r>
-        <w:t xml:space="preserve"> delete pod nginx</w:t>
+        <w:t>ex: kubectl delete pod nginx</w:t>
       </w:r>
     </w:p>
     <w:p>
@@ -12512,25 +11883,7 @@
         </w:tabs>
       </w:pPr>
       <w:r>
-        <w:t xml:space="preserve">In </w:t>
-      </w:r>
-      <w:proofErr w:type="spellStart"/>
-      <w:proofErr w:type="gramStart"/>
-      <w:r>
-        <w:t>pod.yaml</w:t>
-      </w:r>
-      <w:proofErr w:type="spellEnd"/>
-      <w:proofErr w:type="gramEnd"/>
-      <w:r>
-        <w:t xml:space="preserve">, we can also add volumes, </w:t>
-      </w:r>
-      <w:proofErr w:type="spellStart"/>
-      <w:r>
-        <w:t>volumeMounts</w:t>
-      </w:r>
-      <w:proofErr w:type="spellEnd"/>
-      <w:r>
-        <w:t>, etc…</w:t>
+        <w:t>In pod.yaml, we can also add volumes, volumeMounts, etc…</w:t>
       </w:r>
     </w:p>
     <w:p>
@@ -12544,38 +11897,17 @@
           <w:tab w:val="left" w:pos="6067"/>
         </w:tabs>
       </w:pPr>
-      <w:proofErr w:type="spellStart"/>
-      <w:r>
-        <w:t>kubectl</w:t>
-      </w:r>
-      <w:proofErr w:type="spellEnd"/>
-      <w:r>
-        <w:t xml:space="preserve"> logs </w:t>
-      </w:r>
-      <w:r>
-        <w:t>&lt;</w:t>
-      </w:r>
-      <w:proofErr w:type="spellStart"/>
-      <w:r>
-        <w:t>pod_name</w:t>
-      </w:r>
-      <w:proofErr w:type="spellEnd"/>
-      <w:r>
-        <w:t xml:space="preserve">&gt;: </w:t>
+      <w:r>
+        <w:t xml:space="preserve">kubectl logs </w:t>
+      </w:r>
+      <w:r>
+        <w:t xml:space="preserve">&lt;pod_name&gt;: </w:t>
       </w:r>
       <w:r>
         <w:t xml:space="preserve">Shows the logs generated by the </w:t>
       </w:r>
       <w:r>
-        <w:t>&lt;</w:t>
-      </w:r>
-      <w:proofErr w:type="spellStart"/>
-      <w:r>
-        <w:t>pod_name</w:t>
-      </w:r>
-      <w:proofErr w:type="spellEnd"/>
-      <w:r>
-        <w:t>&gt;</w:t>
+        <w:t>&lt;pod_name&gt;</w:t>
       </w:r>
       <w:r>
         <w:t xml:space="preserve"> Pod.</w:t>
@@ -12589,15 +11921,7 @@
         </w:tabs>
       </w:pPr>
       <w:r>
-        <w:t xml:space="preserve">ex: </w:t>
-      </w:r>
-      <w:proofErr w:type="spellStart"/>
-      <w:r>
-        <w:t>kubectl</w:t>
-      </w:r>
-      <w:proofErr w:type="spellEnd"/>
-      <w:r>
-        <w:t xml:space="preserve"> logs nginx</w:t>
+        <w:t>ex: kubectl logs nginx</w:t>
       </w:r>
     </w:p>
     <w:p>
@@ -12660,23 +11984,7 @@
         </w:tabs>
       </w:pPr>
       <w:r>
-        <w:t xml:space="preserve">If </w:t>
-      </w:r>
-      <w:proofErr w:type="spellStart"/>
-      <w:r>
-        <w:t>kubectl</w:t>
-      </w:r>
-      <w:proofErr w:type="spellEnd"/>
-      <w:r>
-        <w:t xml:space="preserve"> logs nginx returns nothing, that's normal for some images/apps that haven't written anything to </w:t>
-      </w:r>
-      <w:proofErr w:type="spellStart"/>
-      <w:r>
-        <w:t>stdout</w:t>
-      </w:r>
-      <w:proofErr w:type="spellEnd"/>
-      <w:r>
-        <w:t>/stderr.</w:t>
+        <w:t>If kubectl logs nginx returns nothing, that's normal for some images/apps that haven't written anything to stdout/stderr.</w:t>
       </w:r>
     </w:p>
     <w:p>
@@ -12690,21 +11998,8 @@
           <w:tab w:val="left" w:pos="6067"/>
         </w:tabs>
       </w:pPr>
-      <w:proofErr w:type="spellStart"/>
-      <w:r>
-        <w:t>kubectl</w:t>
-      </w:r>
-      <w:proofErr w:type="spellEnd"/>
-      <w:r>
-        <w:t xml:space="preserve"> describe pod &lt;</w:t>
-      </w:r>
-      <w:proofErr w:type="spellStart"/>
-      <w:r>
-        <w:t>pod_name</w:t>
-      </w:r>
-      <w:proofErr w:type="spellEnd"/>
-      <w:r>
-        <w:t>&gt;</w:t>
+      <w:r>
+        <w:t>kubectl describe pod &lt;pod_name&gt;</w:t>
       </w:r>
       <w:r>
         <w:t xml:space="preserve">:  </w:t>
@@ -12743,13 +12038,8 @@
         </w:tabs>
         <w:ind w:left="1440"/>
       </w:pPr>
-      <w:proofErr w:type="spellStart"/>
-      <w:r>
-        <w:t>kubectl</w:t>
-      </w:r>
-      <w:proofErr w:type="spellEnd"/>
-      <w:r>
-        <w:t xml:space="preserve"> → Kubernetes CLI </w:t>
+      <w:r>
+        <w:t xml:space="preserve">kubectl → Kubernetes CLI </w:t>
       </w:r>
     </w:p>
     <w:p>
@@ -12785,15 +12075,7 @@
         <w:ind w:left="1440"/>
       </w:pPr>
       <w:r>
-        <w:t>&lt;</w:t>
-      </w:r>
-      <w:proofErr w:type="spellStart"/>
-      <w:r>
-        <w:t>pod_name</w:t>
-      </w:r>
-      <w:proofErr w:type="spellEnd"/>
-      <w:r>
-        <w:t>&gt; → Name of the Pod</w:t>
+        <w:t>&lt;pod_name&gt; → Name of the Pod</w:t>
       </w:r>
     </w:p>
     <w:p>
@@ -12845,31 +12127,7 @@
         </w:tabs>
       </w:pPr>
       <w:r>
-        <w:t>Answer: Use commands like “</w:t>
-      </w:r>
-      <w:proofErr w:type="spellStart"/>
-      <w:r>
-        <w:t>kubectl</w:t>
-      </w:r>
-      <w:proofErr w:type="spellEnd"/>
-      <w:r>
-        <w:t xml:space="preserve"> describe pod &lt;</w:t>
-      </w:r>
-      <w:proofErr w:type="spellStart"/>
-      <w:r>
-        <w:t>pod_name</w:t>
-      </w:r>
-      <w:proofErr w:type="spellEnd"/>
-      <w:r>
-        <w:t>” and “</w:t>
-      </w:r>
-      <w:proofErr w:type="spellStart"/>
-      <w:r>
-        <w:t>kubectl</w:t>
-      </w:r>
-      <w:proofErr w:type="spellEnd"/>
-      <w:r>
-        <w:t xml:space="preserve"> logs &lt;pod_name&gt;</w:t>
+        <w:t>Answer: Use commands like “kubectl describe pod &lt;pod_name” and “kubectl logs &lt;pod_name&gt;</w:t>
       </w:r>
     </w:p>
     <w:p>
@@ -13174,13 +12432,8 @@
         <w:ind w:left="720"/>
       </w:pPr>
       <w:r>
-        <w:t xml:space="preserve">            </w:t>
-      </w:r>
-      <w:proofErr w:type="spellStart"/>
-      <w:r>
-        <w:t>ReplicaSet</w:t>
-      </w:r>
-      <w:proofErr w:type="spellEnd"/>
+        <w:t xml:space="preserve">            ReplicaSet</w:t>
+      </w:r>
     </w:p>
     <w:p>
       <w:pPr>
@@ -13349,15 +12602,7 @@
         </w:tabs>
       </w:pPr>
       <w:r>
-        <w:t>Usually created using Docker/</w:t>
-      </w:r>
-      <w:proofErr w:type="spellStart"/>
-      <w:r>
-        <w:t>Containerd</w:t>
-      </w:r>
-      <w:proofErr w:type="spellEnd"/>
-      <w:r>
-        <w:t xml:space="preserve">. </w:t>
+        <w:t xml:space="preserve">Usually created using Docker/Containerd. </w:t>
       </w:r>
     </w:p>
     <w:p>
@@ -14822,13 +14067,8 @@
           <w:tab w:val="left" w:pos="6067"/>
         </w:tabs>
       </w:pPr>
-      <w:proofErr w:type="spellStart"/>
-      <w:r>
-        <w:t>kubectl</w:t>
-      </w:r>
-      <w:proofErr w:type="spellEnd"/>
-      <w:r>
-        <w:t xml:space="preserve"> get all</w:t>
+      <w:r>
+        <w:t>kubectl get all</w:t>
       </w:r>
     </w:p>
     <w:p>
@@ -14842,13 +14082,8 @@
           <w:tab w:val="left" w:pos="6067"/>
         </w:tabs>
       </w:pPr>
-      <w:proofErr w:type="spellStart"/>
-      <w:r>
-        <w:t>kubectl</w:t>
-      </w:r>
-      <w:proofErr w:type="spellEnd"/>
-      <w:r>
-        <w:t xml:space="preserve"> get all -A</w:t>
+      <w:r>
+        <w:t>kubectl get all -A</w:t>
       </w:r>
     </w:p>
     <w:p>
@@ -14909,6 +14144,9 @@
         <w:ind w:left="360"/>
       </w:pPr>
       <w:r>
+        <w:rPr>
+          <w:noProof/>
+        </w:rPr>
         <w:drawing>
           <wp:inline distT="0" distB="0" distL="0" distR="0" wp14:anchorId="7F7FFC1D" wp14:editId="6BF7CF28">
             <wp:extent cx="4320914" cy="502964"/>
@@ -14969,6 +14207,9 @@
         <w:ind w:left="360"/>
       </w:pPr>
       <w:r>
+        <w:rPr>
+          <w:noProof/>
+        </w:rPr>
         <w:drawing>
           <wp:inline distT="0" distB="0" distL="0" distR="0" wp14:anchorId="034219CA" wp14:editId="08E817C4">
             <wp:extent cx="5731510" cy="1188085"/>
@@ -15029,6 +14270,9 @@
         <w:ind w:left="360"/>
       </w:pPr>
       <w:r>
+        <w:rPr>
+          <w:noProof/>
+        </w:rPr>
         <w:drawing>
           <wp:inline distT="0" distB="0" distL="0" distR="0" wp14:anchorId="51340E35" wp14:editId="4B51DC31">
             <wp:extent cx="5731510" cy="1136015"/>
@@ -15078,30 +14322,10 @@
         </w:tabs>
       </w:pPr>
       <w:r>
-        <w:t>Create “</w:t>
-      </w:r>
-      <w:proofErr w:type="spellStart"/>
-      <w:proofErr w:type="gramStart"/>
-      <w:r>
-        <w:t>deployment.yaml</w:t>
-      </w:r>
-      <w:proofErr w:type="spellEnd"/>
-      <w:proofErr w:type="gramEnd"/>
-      <w:r>
-        <w:t>” file using (“</w:t>
-      </w:r>
-      <w:r>
-        <w:t>notepad "</w:t>
-      </w:r>
-      <w:proofErr w:type="spellStart"/>
-      <w:proofErr w:type="gramStart"/>
-      <w:r>
-        <w:t>deployment.yaml</w:t>
-      </w:r>
-      <w:proofErr w:type="spellEnd"/>
-      <w:proofErr w:type="gramEnd"/>
-      <w:r>
-        <w:t>"</w:t>
+        <w:t>Create “deployment.yaml” file using (“</w:t>
+      </w:r>
+      <w:r>
+        <w:t>notepad "deployment.yaml"</w:t>
       </w:r>
       <w:r>
         <w:t xml:space="preserve">) </w:t>
@@ -15136,31 +14360,37 @@
         <w:t xml:space="preserve"> </w:t>
       </w:r>
       <w:r>
-        <w:t>Copy the content of controllers/nginx-</w:t>
-      </w:r>
-      <w:proofErr w:type="spellStart"/>
-      <w:r>
-        <w:t>deployment.yaml</w:t>
-      </w:r>
-      <w:proofErr w:type="spellEnd"/>
-      <w:r>
-        <w:t xml:space="preserve"> and paste in </w:t>
-      </w:r>
-      <w:proofErr w:type="spellStart"/>
-      <w:proofErr w:type="gramStart"/>
-      <w:r>
-        <w:t>deployment.yaml</w:t>
-      </w:r>
-      <w:proofErr w:type="spellEnd"/>
-      <w:proofErr w:type="gramEnd"/>
+        <w:t xml:space="preserve">Copy the content of controllers/nginx-deployment.yaml and paste in deployment.yaml </w:t>
+      </w:r>
+      <w:r>
+        <w:sym w:font="Wingdings" w:char="F0E0"/>
+      </w:r>
       <w:r>
         <w:t xml:space="preserve"> </w:t>
       </w:r>
+    </w:p>
+    <w:p>
+      <w:pPr>
+        <w:pStyle w:val="ListParagraph"/>
+        <w:tabs>
+          <w:tab w:val="left" w:pos="6067"/>
+        </w:tabs>
+        <w:ind w:left="1080"/>
+      </w:pPr>
+      <w:r>
+        <w:t xml:space="preserve">crtl + S </w:t>
+      </w:r>
       <w:r>
         <w:sym w:font="Wingdings" w:char="F0E0"/>
       </w:r>
       <w:r>
-        <w:t xml:space="preserve"> </w:t>
+        <w:t xml:space="preserve"> In CMD run “kubectl apply -f deployment.yaml” </w:t>
+      </w:r>
+      <w:r>
+        <w:sym w:font="Wingdings" w:char="F0E0"/>
+      </w:r>
+      <w:r>
+        <w:t xml:space="preserve"> In the we will see the pod is created automatically</w:t>
       </w:r>
     </w:p>
     <w:p>
@@ -15169,55 +14399,11 @@
         <w:tabs>
           <w:tab w:val="left" w:pos="6067"/>
         </w:tabs>
-        <w:ind w:left="1080"/>
-      </w:pPr>
-      <w:proofErr w:type="spellStart"/>
-      <w:r>
-        <w:t>crtl</w:t>
-      </w:r>
-      <w:proofErr w:type="spellEnd"/>
-      <w:r>
-        <w:t xml:space="preserve"> + S </w:t>
-      </w:r>
-      <w:r>
-        <w:sym w:font="Wingdings" w:char="F0E0"/>
-      </w:r>
-      <w:r>
-        <w:t xml:space="preserve"> In CMD run “</w:t>
-      </w:r>
-      <w:proofErr w:type="spellStart"/>
-      <w:r>
-        <w:t>kubectl</w:t>
-      </w:r>
-      <w:proofErr w:type="spellEnd"/>
-      <w:r>
-        <w:t xml:space="preserve"> apply -f </w:t>
-      </w:r>
-      <w:proofErr w:type="spellStart"/>
-      <w:proofErr w:type="gramStart"/>
-      <w:r>
-        <w:t>deployment.yaml</w:t>
-      </w:r>
-      <w:proofErr w:type="spellEnd"/>
-      <w:proofErr w:type="gramEnd"/>
-      <w:r>
-        <w:t xml:space="preserve">” </w:t>
-      </w:r>
-      <w:r>
-        <w:sym w:font="Wingdings" w:char="F0E0"/>
-      </w:r>
-      <w:r>
-        <w:t xml:space="preserve"> In the we will see the pod is created automatically</w:t>
-      </w:r>
-    </w:p>
-    <w:p>
-      <w:pPr>
-        <w:pStyle w:val="ListParagraph"/>
-        <w:tabs>
-          <w:tab w:val="left" w:pos="6067"/>
-        </w:tabs>
-      </w:pPr>
-      <w:r>
+      </w:pPr>
+      <w:r>
+        <w:rPr>
+          <w:noProof/>
+        </w:rPr>
         <w:drawing>
           <wp:inline distT="0" distB="0" distL="0" distR="0" wp14:anchorId="6F431C68" wp14:editId="162BA1F1">
             <wp:extent cx="5731510" cy="2385695"/>
@@ -15289,19 +14475,9 @@
           <w:tab w:val="left" w:pos="6067"/>
         </w:tabs>
       </w:pPr>
-      <w:proofErr w:type="spellStart"/>
-      <w:r>
-        <w:t>kubectl</w:t>
-      </w:r>
-      <w:proofErr w:type="spellEnd"/>
-      <w:r>
-        <w:t xml:space="preserve"> get </w:t>
-      </w:r>
-      <w:proofErr w:type="spellStart"/>
-      <w:r>
-        <w:t>rs</w:t>
-      </w:r>
-      <w:proofErr w:type="spellEnd"/>
+      <w:r>
+        <w:t>kubectl get rs</w:t>
+      </w:r>
     </w:p>
     <w:p>
       <w:pPr>
@@ -15311,6 +14487,9 @@
         <w:ind w:left="360"/>
       </w:pPr>
       <w:r>
+        <w:rPr>
+          <w:noProof/>
+        </w:rPr>
         <w:lastRenderedPageBreak/>
         <w:drawing>
           <wp:inline distT="0" distB="0" distL="0" distR="0" wp14:anchorId="1F29DB4A" wp14:editId="2F5A329E">
@@ -15371,21 +14550,12 @@
       <w:r>
         <w:t xml:space="preserve">A </w:t>
       </w:r>
-      <w:proofErr w:type="spellStart"/>
-      <w:r>
-        <w:rPr>
-          <w:b/>
-          <w:bCs/>
-        </w:rPr>
-        <w:t>ReplicaSet's</w:t>
-      </w:r>
-      <w:proofErr w:type="spellEnd"/>
-      <w:r>
-        <w:rPr>
-          <w:b/>
-          <w:bCs/>
-        </w:rPr>
-        <w:t xml:space="preserve"> main purpose is to maintain the desired number of Pods</w:t>
+      <w:r>
+        <w:rPr>
+          <w:b/>
+          <w:bCs/>
+        </w:rPr>
+        <w:t>ReplicaSet's main purpose is to maintain the desired number of Pods</w:t>
       </w:r>
       <w:r>
         <w:t xml:space="preserve"> created by a Deployment.</w:t>
@@ -15426,6 +14596,9 @@
         </w:tabs>
       </w:pPr>
       <w:r>
+        <w:rPr>
+          <w:noProof/>
+        </w:rPr>
         <w:drawing>
           <wp:inline distT="0" distB="0" distL="0" distR="0" wp14:anchorId="40541BD6" wp14:editId="489C3420">
             <wp:extent cx="5731510" cy="767715"/>
@@ -15463,304 +14636,284 @@
         </w:drawing>
       </w:r>
       <w:r>
-        <w:t xml:space="preserve">The Deployment creates a </w:t>
-      </w:r>
-      <w:proofErr w:type="spellStart"/>
+        <w:t xml:space="preserve">The Deployment creates a ReplicaSet, and the ReplicaSet ensures that </w:t>
+      </w:r>
+      <w:r>
+        <w:rPr>
+          <w:b/>
+          <w:bCs/>
+        </w:rPr>
+        <w:t>3 Pods are always running</w:t>
+      </w:r>
+      <w:r>
+        <w:t>:</w:t>
+      </w:r>
+    </w:p>
+    <w:p>
+      <w:pPr>
+        <w:tabs>
+          <w:tab w:val="left" w:pos="6067"/>
+        </w:tabs>
+      </w:pPr>
+      <w:r>
+        <w:t xml:space="preserve">        </w:t>
+      </w:r>
+      <w:r>
+        <w:t xml:space="preserve">                           </w:t>
+      </w:r>
+      <w:r>
+        <w:t>Deployment</w:t>
+      </w:r>
+    </w:p>
+    <w:p>
+      <w:pPr>
+        <w:tabs>
+          <w:tab w:val="left" w:pos="6067"/>
+        </w:tabs>
+      </w:pPr>
+      <w:r>
+        <w:t xml:space="preserve">             </w:t>
+      </w:r>
+      <w:r>
+        <w:t xml:space="preserve">                              </w:t>
+      </w:r>
+      <w:r>
+        <w:t>↓</w:t>
+      </w:r>
+    </w:p>
+    <w:p>
+      <w:pPr>
+        <w:tabs>
+          <w:tab w:val="left" w:pos="6067"/>
+        </w:tabs>
+      </w:pPr>
+      <w:r>
+        <w:t xml:space="preserve">        </w:t>
+      </w:r>
+      <w:r>
+        <w:t xml:space="preserve">                           </w:t>
+      </w:r>
       <w:r>
         <w:t>ReplicaSet</w:t>
       </w:r>
-      <w:proofErr w:type="spellEnd"/>
-      <w:r>
-        <w:t xml:space="preserve">, and the </w:t>
-      </w:r>
-      <w:proofErr w:type="spellStart"/>
+    </w:p>
+    <w:p>
+      <w:pPr>
+        <w:tabs>
+          <w:tab w:val="left" w:pos="6067"/>
+        </w:tabs>
+      </w:pPr>
+      <w:r>
+        <w:t xml:space="preserve">             </w:t>
+      </w:r>
+      <w:r>
+        <w:t xml:space="preserve">                              </w:t>
+      </w:r>
+      <w:r>
+        <w:t>↓</w:t>
+      </w:r>
+    </w:p>
+    <w:p>
+      <w:pPr>
+        <w:tabs>
+          <w:tab w:val="left" w:pos="6067"/>
+        </w:tabs>
+      </w:pPr>
+      <w:r>
+        <w:t xml:space="preserve">      </w:t>
+      </w:r>
+      <w:r>
+        <w:t xml:space="preserve">                      </w:t>
+      </w:r>
+      <w:r>
+        <w:t>┌──────</w:t>
+      </w:r>
+      <w:r>
+        <w:rPr>
+          <w:rFonts w:ascii="MS Gothic" w:eastAsia="MS Gothic" w:hAnsi="MS Gothic" w:cs="MS Gothic" w:hint="eastAsia"/>
+        </w:rPr>
+        <w:t>┼</w:t>
+      </w:r>
+      <w:r>
+        <w:rPr>
+          <w:rFonts w:ascii="Calibri" w:hAnsi="Calibri" w:cs="Calibri"/>
+        </w:rPr>
+        <w:t>──────┐</w:t>
+      </w:r>
+    </w:p>
+    <w:p>
+      <w:pPr>
+        <w:tabs>
+          <w:tab w:val="left" w:pos="6067"/>
+        </w:tabs>
+      </w:pPr>
+      <w:r>
+        <w:t xml:space="preserve">      </w:t>
+      </w:r>
+      <w:r>
+        <w:t xml:space="preserve">                     </w:t>
+      </w:r>
+      <w:r>
+        <w:t xml:space="preserve">↓      </w:t>
+      </w:r>
+      <w:r>
+        <w:t xml:space="preserve">       </w:t>
+      </w:r>
+      <w:r>
+        <w:t xml:space="preserve">↓      </w:t>
+      </w:r>
+      <w:r>
+        <w:t xml:space="preserve">      </w:t>
+      </w:r>
+      <w:r>
+        <w:t>↓</w:t>
+      </w:r>
+    </w:p>
+    <w:p>
+      <w:pPr>
+        <w:tabs>
+          <w:tab w:val="left" w:pos="6067"/>
+        </w:tabs>
+      </w:pPr>
+      <w:r>
+        <w:t xml:space="preserve">   </w:t>
+      </w:r>
+      <w:r>
+        <w:t xml:space="preserve">                    </w:t>
+      </w:r>
+      <w:r>
+        <w:t xml:space="preserve"> Pod 1  </w:t>
+      </w:r>
+      <w:r>
+        <w:t xml:space="preserve">      </w:t>
+      </w:r>
+      <w:r>
+        <w:t xml:space="preserve">Pod 2 </w:t>
+      </w:r>
+      <w:r>
+        <w:t xml:space="preserve">    </w:t>
+      </w:r>
+      <w:r>
+        <w:t xml:space="preserve"> Pod 3</w:t>
+      </w:r>
+    </w:p>
+    <w:p>
+      <w:pPr>
+        <w:tabs>
+          <w:tab w:val="left" w:pos="6067"/>
+        </w:tabs>
+      </w:pPr>
+    </w:p>
+    <w:p>
+      <w:pPr>
+        <w:tabs>
+          <w:tab w:val="left" w:pos="6067"/>
+        </w:tabs>
+      </w:pPr>
+      <w:r>
+        <w:t>Q.) What if pod is deleted?</w:t>
+      </w:r>
+    </w:p>
+    <w:p>
+      <w:pPr>
+        <w:tabs>
+          <w:tab w:val="left" w:pos="6067"/>
+        </w:tabs>
+      </w:pPr>
+      <w:r>
+        <w:t>Answer:</w:t>
+      </w:r>
+    </w:p>
+    <w:p>
+      <w:pPr>
+        <w:tabs>
+          <w:tab w:val="left" w:pos="6067"/>
+        </w:tabs>
+      </w:pPr>
+      <w:r>
+        <w:t xml:space="preserve">If a </w:t>
+      </w:r>
+      <w:r>
+        <w:rPr>
+          <w:b/>
+          <w:bCs/>
+        </w:rPr>
+        <w:t>Pod is deleted</w:t>
+      </w:r>
+      <w:r>
+        <w:t xml:space="preserve">, what happens depends on </w:t>
+      </w:r>
+      <w:r>
+        <w:rPr>
+          <w:b/>
+          <w:bCs/>
+        </w:rPr>
+        <w:t>who created/managed the Pod</w:t>
+      </w:r>
+      <w:r>
+        <w:t>.</w:t>
+      </w:r>
+    </w:p>
+    <w:p>
+      <w:pPr>
+        <w:tabs>
+          <w:tab w:val="left" w:pos="6067"/>
+        </w:tabs>
+        <w:rPr>
+          <w:b/>
+          <w:bCs/>
+        </w:rPr>
+      </w:pPr>
+      <w:r>
+        <w:rPr>
+          <w:b/>
+          <w:bCs/>
+        </w:rPr>
+        <w:t>If Pod is managed by a Deployment</w:t>
+      </w:r>
+    </w:p>
+    <w:p>
+      <w:pPr>
+        <w:tabs>
+          <w:tab w:val="left" w:pos="6067"/>
+        </w:tabs>
+      </w:pPr>
+      <w:r>
+        <w:t>Suppose:</w:t>
+      </w:r>
+    </w:p>
+    <w:p>
+      <w:pPr>
+        <w:tabs>
+          <w:tab w:val="left" w:pos="6067"/>
+        </w:tabs>
+        <w:ind w:left="720"/>
+      </w:pPr>
+      <w:r>
+        <w:t>Deployment</w:t>
+      </w:r>
+    </w:p>
+    <w:p>
+      <w:pPr>
+        <w:tabs>
+          <w:tab w:val="left" w:pos="6067"/>
+        </w:tabs>
+        <w:ind w:left="720"/>
+      </w:pPr>
+      <w:r>
+        <w:t xml:space="preserve">    ↓</w:t>
+      </w:r>
+    </w:p>
+    <w:p>
+      <w:pPr>
+        <w:tabs>
+          <w:tab w:val="left" w:pos="6067"/>
+        </w:tabs>
+        <w:ind w:left="720"/>
+      </w:pPr>
       <w:r>
         <w:t>ReplicaSet</w:t>
       </w:r>
-      <w:proofErr w:type="spellEnd"/>
-      <w:r>
-        <w:t xml:space="preserve"> ensures that </w:t>
-      </w:r>
-      <w:r>
-        <w:rPr>
-          <w:b/>
-          <w:bCs/>
-        </w:rPr>
-        <w:t>3 Pods are always running</w:t>
-      </w:r>
-      <w:r>
-        <w:t>:</w:t>
-      </w:r>
-    </w:p>
-    <w:p>
-      <w:pPr>
-        <w:tabs>
-          <w:tab w:val="left" w:pos="6067"/>
-        </w:tabs>
-      </w:pPr>
-      <w:r>
-        <w:t xml:space="preserve">        </w:t>
-      </w:r>
-      <w:r>
-        <w:t xml:space="preserve">                           </w:t>
-      </w:r>
-      <w:r>
-        <w:t>Deployment</w:t>
-      </w:r>
-    </w:p>
-    <w:p>
-      <w:pPr>
-        <w:tabs>
-          <w:tab w:val="left" w:pos="6067"/>
-        </w:tabs>
-      </w:pPr>
-      <w:r>
-        <w:t xml:space="preserve">             </w:t>
-      </w:r>
-      <w:r>
-        <w:t xml:space="preserve">                              </w:t>
-      </w:r>
-      <w:r>
-        <w:t>↓</w:t>
-      </w:r>
-    </w:p>
-    <w:p>
-      <w:pPr>
-        <w:tabs>
-          <w:tab w:val="left" w:pos="6067"/>
-        </w:tabs>
-      </w:pPr>
-      <w:r>
-        <w:t xml:space="preserve">        </w:t>
-      </w:r>
-      <w:r>
-        <w:t xml:space="preserve">                           </w:t>
-      </w:r>
-      <w:proofErr w:type="spellStart"/>
-      <w:r>
-        <w:t>ReplicaSet</w:t>
-      </w:r>
-      <w:proofErr w:type="spellEnd"/>
-    </w:p>
-    <w:p>
-      <w:pPr>
-        <w:tabs>
-          <w:tab w:val="left" w:pos="6067"/>
-        </w:tabs>
-      </w:pPr>
-      <w:r>
-        <w:t xml:space="preserve">             </w:t>
-      </w:r>
-      <w:r>
-        <w:t xml:space="preserve">                              </w:t>
-      </w:r>
-      <w:r>
-        <w:t>↓</w:t>
-      </w:r>
-    </w:p>
-    <w:p>
-      <w:pPr>
-        <w:tabs>
-          <w:tab w:val="left" w:pos="6067"/>
-        </w:tabs>
-      </w:pPr>
-      <w:r>
-        <w:t xml:space="preserve">      </w:t>
-      </w:r>
-      <w:r>
-        <w:t xml:space="preserve">                      </w:t>
-      </w:r>
-      <w:r>
-        <w:t>┌──────</w:t>
-      </w:r>
-      <w:r>
-        <w:rPr>
-          <w:rFonts w:ascii="MS Gothic" w:eastAsia="MS Gothic" w:hAnsi="MS Gothic" w:cs="MS Gothic" w:hint="eastAsia"/>
-        </w:rPr>
-        <w:t>┼</w:t>
-      </w:r>
-      <w:r>
-        <w:rPr>
-          <w:rFonts w:ascii="Calibri" w:hAnsi="Calibri" w:cs="Calibri"/>
-        </w:rPr>
-        <w:t>──────┐</w:t>
-      </w:r>
-    </w:p>
-    <w:p>
-      <w:pPr>
-        <w:tabs>
-          <w:tab w:val="left" w:pos="6067"/>
-        </w:tabs>
-      </w:pPr>
-      <w:r>
-        <w:t xml:space="preserve">      </w:t>
-      </w:r>
-      <w:r>
-        <w:t xml:space="preserve">                     </w:t>
-      </w:r>
-      <w:r>
-        <w:t xml:space="preserve">↓      </w:t>
-      </w:r>
-      <w:r>
-        <w:t xml:space="preserve">       </w:t>
-      </w:r>
-      <w:r>
-        <w:t xml:space="preserve">↓      </w:t>
-      </w:r>
-      <w:r>
-        <w:t xml:space="preserve">      </w:t>
-      </w:r>
-      <w:r>
-        <w:t>↓</w:t>
-      </w:r>
-    </w:p>
-    <w:p>
-      <w:pPr>
-        <w:tabs>
-          <w:tab w:val="left" w:pos="6067"/>
-        </w:tabs>
-      </w:pPr>
-      <w:r>
-        <w:t xml:space="preserve">   </w:t>
-      </w:r>
-      <w:r>
-        <w:t xml:space="preserve">                    </w:t>
-      </w:r>
-      <w:r>
-        <w:t xml:space="preserve"> Pod 1  </w:t>
-      </w:r>
-      <w:r>
-        <w:t xml:space="preserve">      </w:t>
-      </w:r>
-      <w:r>
-        <w:t xml:space="preserve">Pod 2 </w:t>
-      </w:r>
-      <w:r>
-        <w:t xml:space="preserve">    </w:t>
-      </w:r>
-      <w:r>
-        <w:t xml:space="preserve"> Pod 3</w:t>
-      </w:r>
-    </w:p>
-    <w:p>
-      <w:pPr>
-        <w:tabs>
-          <w:tab w:val="left" w:pos="6067"/>
-        </w:tabs>
-      </w:pPr>
-    </w:p>
-    <w:p>
-      <w:pPr>
-        <w:tabs>
-          <w:tab w:val="left" w:pos="6067"/>
-        </w:tabs>
-      </w:pPr>
-      <w:r>
-        <w:t>Q.) What if pod is deleted?</w:t>
-      </w:r>
-    </w:p>
-    <w:p>
-      <w:pPr>
-        <w:tabs>
-          <w:tab w:val="left" w:pos="6067"/>
-        </w:tabs>
-      </w:pPr>
-      <w:r>
-        <w:t>Answer:</w:t>
-      </w:r>
-    </w:p>
-    <w:p>
-      <w:pPr>
-        <w:tabs>
-          <w:tab w:val="left" w:pos="6067"/>
-        </w:tabs>
-      </w:pPr>
-      <w:r>
-        <w:t xml:space="preserve">If a </w:t>
-      </w:r>
-      <w:r>
-        <w:rPr>
-          <w:b/>
-          <w:bCs/>
-        </w:rPr>
-        <w:t>Pod is deleted</w:t>
-      </w:r>
-      <w:r>
-        <w:t xml:space="preserve">, what happens depends on </w:t>
-      </w:r>
-      <w:r>
-        <w:rPr>
-          <w:b/>
-          <w:bCs/>
-        </w:rPr>
-        <w:t>who created/managed the Pod</w:t>
-      </w:r>
-      <w:r>
-        <w:t>.</w:t>
-      </w:r>
-    </w:p>
-    <w:p>
-      <w:pPr>
-        <w:tabs>
-          <w:tab w:val="left" w:pos="6067"/>
-        </w:tabs>
-        <w:rPr>
-          <w:b/>
-          <w:bCs/>
-        </w:rPr>
-      </w:pPr>
-      <w:r>
-        <w:rPr>
-          <w:b/>
-          <w:bCs/>
-        </w:rPr>
-        <w:t>If Pod is managed by a Deployment</w:t>
-      </w:r>
-    </w:p>
-    <w:p>
-      <w:pPr>
-        <w:tabs>
-          <w:tab w:val="left" w:pos="6067"/>
-        </w:tabs>
-      </w:pPr>
-      <w:r>
-        <w:t>Suppose:</w:t>
-      </w:r>
-    </w:p>
-    <w:p>
-      <w:pPr>
-        <w:tabs>
-          <w:tab w:val="left" w:pos="6067"/>
-        </w:tabs>
-        <w:ind w:left="720"/>
-      </w:pPr>
-      <w:r>
-        <w:t>Deployment</w:t>
-      </w:r>
-    </w:p>
-    <w:p>
-      <w:pPr>
-        <w:tabs>
-          <w:tab w:val="left" w:pos="6067"/>
-        </w:tabs>
-        <w:ind w:left="720"/>
-      </w:pPr>
-      <w:r>
-        <w:t xml:space="preserve">    ↓</w:t>
-      </w:r>
-    </w:p>
-    <w:p>
-      <w:pPr>
-        <w:tabs>
-          <w:tab w:val="left" w:pos="6067"/>
-        </w:tabs>
-        <w:ind w:left="720"/>
-      </w:pPr>
-      <w:proofErr w:type="spellStart"/>
-      <w:r>
-        <w:t>ReplicaSet</w:t>
-      </w:r>
-      <w:proofErr w:type="spellEnd"/>
     </w:p>
     <w:p>
       <w:pPr>
@@ -15824,6 +14977,9 @@
         </w:tabs>
       </w:pPr>
       <w:r>
+        <w:rPr>
+          <w:noProof/>
+        </w:rPr>
         <w:drawing>
           <wp:inline distT="0" distB="0" distL="0" distR="0" wp14:anchorId="1D3C125C" wp14:editId="24990E8B">
             <wp:extent cx="1486029" cy="891617"/>
@@ -15878,6 +15034,9 @@
         </w:tabs>
       </w:pPr>
       <w:r>
+        <w:rPr>
+          <w:noProof/>
+        </w:rPr>
         <w:drawing>
           <wp:inline distT="0" distB="0" distL="0" distR="0" wp14:anchorId="79D83D7A" wp14:editId="77BB5AE4">
             <wp:extent cx="2095682" cy="746825"/>
@@ -15922,24 +15081,19 @@
         </w:tabs>
       </w:pPr>
       <w:r>
-        <w:t xml:space="preserve">The </w:t>
-      </w:r>
-      <w:proofErr w:type="spellStart"/>
-      <w:r>
-        <w:t>ReplicaSet</w:t>
-      </w:r>
-      <w:proofErr w:type="spellEnd"/>
-      <w:r>
-        <w:t xml:space="preserve"> detects:</w:t>
-      </w:r>
-    </w:p>
-    <w:p>
-      <w:pPr>
-        <w:tabs>
-          <w:tab w:val="left" w:pos="6067"/>
-        </w:tabs>
-      </w:pPr>
-      <w:r>
+        <w:t>The ReplicaSet detects:</w:t>
+      </w:r>
+    </w:p>
+    <w:p>
+      <w:pPr>
+        <w:tabs>
+          <w:tab w:val="left" w:pos="6067"/>
+        </w:tabs>
+      </w:pPr>
+      <w:r>
+        <w:rPr>
+          <w:noProof/>
+        </w:rPr>
         <w:drawing>
           <wp:inline distT="0" distB="0" distL="0" distR="0" wp14:anchorId="6690E055" wp14:editId="5EFB0BFF">
             <wp:extent cx="1333616" cy="617273"/>
@@ -15983,13 +15137,8 @@
           <w:tab w:val="left" w:pos="6067"/>
         </w:tabs>
       </w:pPr>
-      <w:proofErr w:type="gramStart"/>
-      <w:r>
-        <w:t>So</w:t>
-      </w:r>
-      <w:proofErr w:type="gramEnd"/>
-      <w:r>
-        <w:t xml:space="preserve"> it automatically creates a </w:t>
+      <w:r>
+        <w:t xml:space="preserve">So it automatically creates a </w:t>
       </w:r>
       <w:r>
         <w:rPr>
@@ -16031,11 +15180,9 @@
         </w:tabs>
         <w:ind w:left="720"/>
       </w:pPr>
-      <w:proofErr w:type="spellStart"/>
       <w:r>
         <w:t>ReplicaSet</w:t>
       </w:r>
-      <w:proofErr w:type="spellEnd"/>
     </w:p>
     <w:p>
       <w:pPr>
@@ -16122,21 +15269,7 @@
         <w:t xml:space="preserve">: </w:t>
       </w:r>
       <w:r>
-        <w:t xml:space="preserve">The </w:t>
-      </w:r>
-      <w:proofErr w:type="spellStart"/>
-      <w:r>
-        <w:t>ReplicaSet</w:t>
-      </w:r>
-      <w:proofErr w:type="spellEnd"/>
-      <w:r>
-        <w:t xml:space="preserve"> does NOT recover the same Pod.</w:t>
-      </w:r>
-      <w:r>
-        <w:t xml:space="preserve"> </w:t>
-      </w:r>
-      <w:r>
-        <w:t>It creates a new Pod to maintain the desired replica count.</w:t>
+        <w:t>The ReplicaSet does NOT recover the same Pod. It creates a new Pod to maintain the desired replica count.</w:t>
       </w:r>
     </w:p>
     <w:p>
@@ -16156,15 +15289,13 @@
         <w:t xml:space="preserve">Q.) </w:t>
       </w:r>
       <w:r>
-        <w:t xml:space="preserve">What if pod is created </w:t>
-      </w:r>
-      <w:proofErr w:type="spellStart"/>
-      <w:r>
-        <w:t>manully</w:t>
-      </w:r>
-      <w:proofErr w:type="spellEnd"/>
-      <w:r>
-        <w:t xml:space="preserve"> and deleted</w:t>
+        <w:t>What if pod is created manu</w:t>
+      </w:r>
+      <w:r>
+        <w:t>a</w:t>
+      </w:r>
+      <w:r>
+        <w:t>lly and deleted</w:t>
       </w:r>
       <w:r>
         <w:t>?</w:t>
@@ -16176,13 +15307,8 @@
           <w:tab w:val="left" w:pos="6067"/>
         </w:tabs>
       </w:pPr>
-      <w:proofErr w:type="spellStart"/>
-      <w:r>
-        <w:t>Asnwer</w:t>
-      </w:r>
-      <w:proofErr w:type="spellEnd"/>
-      <w:r>
-        <w:t xml:space="preserve">: </w:t>
+      <w:r>
+        <w:t xml:space="preserve">Asnwer: </w:t>
       </w:r>
       <w:r>
         <w:t xml:space="preserve">If you create a </w:t>
@@ -16213,10 +15339,6 @@
         <w:tabs>
           <w:tab w:val="left" w:pos="6067"/>
         </w:tabs>
-        <w:rPr>
-          <w:b/>
-          <w:bCs/>
-        </w:rPr>
       </w:pPr>
       <w:r>
         <w:rPr>
@@ -16227,6 +15349,23 @@
       </w:r>
       <w:r>
         <w:t xml:space="preserve"> This is the major advantage of deployment over manual pod creation</w:t>
+      </w:r>
+      <w:r>
+        <w:t>.</w:t>
+      </w:r>
+    </w:p>
+    <w:p>
+      <w:pPr>
+        <w:tabs>
+          <w:tab w:val="left" w:pos="6067"/>
+        </w:tabs>
+        <w:rPr>
+          <w:b/>
+          <w:bCs/>
+        </w:rPr>
+      </w:pPr>
+      <w:r>
+        <w:t>NOTE: In real world we never create pod manually. We create pods using deployments.</w:t>
       </w:r>
     </w:p>
     <w:p>
@@ -20651,6 +19790,7 @@
   <w:style w:type="character" w:default="1" w:styleId="DefaultParagraphFont">
     <w:name w:val="Default Paragraph Font"/>
     <w:uiPriority w:val="1"/>
+    <w:semiHidden/>
     <w:unhideWhenUsed/>
   </w:style>
   <w:style w:type="table" w:default="1" w:styleId="TableNormal">

</xml_diff>